<commit_message>
Add gem property facts appendix with sample test readings to the user manual; show sources in the facts table
</commit_message>
<xml_diff>
--- a/gem_expert/docs/Gemstone_Identification_Assistant_Report.docx
+++ b/gem_expert/docs/Gemstone_Identification_Assistant_Report.docx
@@ -224,7 +224,7 @@
         </w:rPr>
         <w:br w:type="page"/>
       </w:r>
-      <w:bookmarkStart w:id="0" w:name="_Toc241587580"/>
+      <w:bookmarkStart w:id="0" w:name="_Toc241589306"/>
       <w:r>
         <w:rPr>
           <w:rFonts w:eastAsia="Times New Roman"/>
@@ -454,7 +454,7 @@
         <w:rPr>
           <w:noProof/>
         </w:rPr>
-        <w:instrText xml:space="preserve"> PAGEREF _Toc241587580 \h </w:instrText>
+        <w:instrText xml:space="preserve"> PAGEREF _Toc241589306 \h </w:instrText>
       </w:r>
       <w:r>
         <w:rPr>
@@ -517,7 +517,7 @@
         <w:rPr>
           <w:noProof/>
         </w:rPr>
-        <w:instrText xml:space="preserve"> PAGEREF _Toc241587581 \h </w:instrText>
+        <w:instrText xml:space="preserve"> PAGEREF _Toc241589307 \h </w:instrText>
       </w:r>
       <w:r>
         <w:rPr>
@@ -580,7 +580,7 @@
         <w:rPr>
           <w:noProof/>
         </w:rPr>
-        <w:instrText xml:space="preserve"> PAGEREF _Toc241587582 \h </w:instrText>
+        <w:instrText xml:space="preserve"> PAGEREF _Toc241589308 \h </w:instrText>
       </w:r>
       <w:r>
         <w:rPr>
@@ -643,7 +643,7 @@
         <w:rPr>
           <w:noProof/>
         </w:rPr>
-        <w:instrText xml:space="preserve"> PAGEREF _Toc241587583 \h </w:instrText>
+        <w:instrText xml:space="preserve"> PAGEREF _Toc241589309 \h </w:instrText>
       </w:r>
       <w:r>
         <w:rPr>
@@ -706,7 +706,7 @@
         <w:rPr>
           <w:noProof/>
         </w:rPr>
-        <w:instrText xml:space="preserve"> PAGEREF _Toc241587584 \h </w:instrText>
+        <w:instrText xml:space="preserve"> PAGEREF _Toc241589310 \h </w:instrText>
       </w:r>
       <w:r>
         <w:rPr>
@@ -769,7 +769,7 @@
         <w:rPr>
           <w:noProof/>
         </w:rPr>
-        <w:instrText xml:space="preserve"> PAGEREF _Toc241587585 \h </w:instrText>
+        <w:instrText xml:space="preserve"> PAGEREF _Toc241589311 \h </w:instrText>
       </w:r>
       <w:r>
         <w:rPr>
@@ -832,7 +832,7 @@
         <w:rPr>
           <w:noProof/>
         </w:rPr>
-        <w:instrText xml:space="preserve"> PAGEREF _Toc241587586 \h </w:instrText>
+        <w:instrText xml:space="preserve"> PAGEREF _Toc241589312 \h </w:instrText>
       </w:r>
       <w:r>
         <w:rPr>
@@ -895,7 +895,7 @@
         <w:rPr>
           <w:noProof/>
         </w:rPr>
-        <w:instrText xml:space="preserve"> PAGEREF _Toc241587587 \h </w:instrText>
+        <w:instrText xml:space="preserve"> PAGEREF _Toc241589313 \h </w:instrText>
       </w:r>
       <w:r>
         <w:rPr>
@@ -958,7 +958,7 @@
         <w:rPr>
           <w:noProof/>
         </w:rPr>
-        <w:instrText xml:space="preserve"> PAGEREF _Toc241587588 \h </w:instrText>
+        <w:instrText xml:space="preserve"> PAGEREF _Toc241589314 \h </w:instrText>
       </w:r>
       <w:r>
         <w:rPr>
@@ -1021,7 +1021,7 @@
         <w:rPr>
           <w:noProof/>
         </w:rPr>
-        <w:instrText xml:space="preserve"> PAGEREF _Toc241587589 \h </w:instrText>
+        <w:instrText xml:space="preserve"> PAGEREF _Toc241589315 \h </w:instrText>
       </w:r>
       <w:r>
         <w:rPr>
@@ -1084,7 +1084,7 @@
         <w:rPr>
           <w:noProof/>
         </w:rPr>
-        <w:instrText xml:space="preserve"> PAGEREF _Toc241587590 \h </w:instrText>
+        <w:instrText xml:space="preserve"> PAGEREF _Toc241589316 \h </w:instrText>
       </w:r>
       <w:r>
         <w:rPr>
@@ -1147,7 +1147,7 @@
         <w:rPr>
           <w:noProof/>
         </w:rPr>
-        <w:instrText xml:space="preserve"> PAGEREF _Toc241587591 \h </w:instrText>
+        <w:instrText xml:space="preserve"> PAGEREF _Toc241589317 \h </w:instrText>
       </w:r>
       <w:r>
         <w:rPr>
@@ -1210,7 +1210,7 @@
         <w:rPr>
           <w:noProof/>
         </w:rPr>
-        <w:instrText xml:space="preserve"> PAGEREF _Toc241587592 \h </w:instrText>
+        <w:instrText xml:space="preserve"> PAGEREF _Toc241589318 \h </w:instrText>
       </w:r>
       <w:r>
         <w:rPr>
@@ -1273,7 +1273,7 @@
         <w:rPr>
           <w:noProof/>
         </w:rPr>
-        <w:instrText xml:space="preserve"> PAGEREF _Toc241587593 \h </w:instrText>
+        <w:instrText xml:space="preserve"> PAGEREF _Toc241589319 \h </w:instrText>
       </w:r>
       <w:r>
         <w:rPr>
@@ -1336,7 +1336,7 @@
         <w:rPr>
           <w:noProof/>
         </w:rPr>
-        <w:instrText xml:space="preserve"> PAGEREF _Toc241587594 \h </w:instrText>
+        <w:instrText xml:space="preserve"> PAGEREF _Toc241589320 \h </w:instrText>
       </w:r>
       <w:r>
         <w:rPr>
@@ -1399,7 +1399,7 @@
         <w:rPr>
           <w:noProof/>
         </w:rPr>
-        <w:instrText xml:space="preserve"> PAGEREF _Toc241587595 \h </w:instrText>
+        <w:instrText xml:space="preserve"> PAGEREF _Toc241589321 \h </w:instrText>
       </w:r>
       <w:r>
         <w:rPr>
@@ -1462,7 +1462,7 @@
         <w:rPr>
           <w:noProof/>
         </w:rPr>
-        <w:instrText xml:space="preserve"> PAGEREF _Toc241587596 \h </w:instrText>
+        <w:instrText xml:space="preserve"> PAGEREF _Toc241589322 \h </w:instrText>
       </w:r>
       <w:r>
         <w:rPr>
@@ -1525,7 +1525,7 @@
         <w:rPr>
           <w:noProof/>
         </w:rPr>
-        <w:instrText xml:space="preserve"> PAGEREF _Toc241587597 \h </w:instrText>
+        <w:instrText xml:space="preserve"> PAGEREF _Toc241589323 \h </w:instrText>
       </w:r>
       <w:r>
         <w:rPr>
@@ -1588,7 +1588,7 @@
         <w:rPr>
           <w:noProof/>
         </w:rPr>
-        <w:instrText xml:space="preserve"> PAGEREF _Toc241587598 \h </w:instrText>
+        <w:instrText xml:space="preserve"> PAGEREF _Toc241589324 \h </w:instrText>
       </w:r>
       <w:r>
         <w:rPr>
@@ -1651,7 +1651,7 @@
         <w:rPr>
           <w:noProof/>
         </w:rPr>
-        <w:instrText xml:space="preserve"> PAGEREF _Toc241587599 \h </w:instrText>
+        <w:instrText xml:space="preserve"> PAGEREF _Toc241589325 \h </w:instrText>
       </w:r>
       <w:r>
         <w:rPr>
@@ -1714,7 +1714,7 @@
         <w:rPr>
           <w:noProof/>
         </w:rPr>
-        <w:instrText xml:space="preserve"> PAGEREF _Toc241587600 \h </w:instrText>
+        <w:instrText xml:space="preserve"> PAGEREF _Toc241589326 \h </w:instrText>
       </w:r>
       <w:r>
         <w:rPr>
@@ -1777,7 +1777,7 @@
         <w:rPr>
           <w:noProof/>
         </w:rPr>
-        <w:instrText xml:space="preserve"> PAGEREF _Toc241587601 \h </w:instrText>
+        <w:instrText xml:space="preserve"> PAGEREF _Toc241589327 \h </w:instrText>
       </w:r>
       <w:r>
         <w:rPr>
@@ -1840,7 +1840,7 @@
         <w:rPr>
           <w:noProof/>
         </w:rPr>
-        <w:instrText xml:space="preserve"> PAGEREF _Toc241587602 \h </w:instrText>
+        <w:instrText xml:space="preserve"> PAGEREF _Toc241589328 \h </w:instrText>
       </w:r>
       <w:r>
         <w:rPr>
@@ -1903,7 +1903,7 @@
         <w:rPr>
           <w:noProof/>
         </w:rPr>
-        <w:instrText xml:space="preserve"> PAGEREF _Toc241587603 \h </w:instrText>
+        <w:instrText xml:space="preserve"> PAGEREF _Toc241589329 \h </w:instrText>
       </w:r>
       <w:r>
         <w:rPr>
@@ -1966,7 +1966,7 @@
         <w:rPr>
           <w:noProof/>
         </w:rPr>
-        <w:instrText xml:space="preserve"> PAGEREF _Toc241587604 \h </w:instrText>
+        <w:instrText xml:space="preserve"> PAGEREF _Toc241589330 \h </w:instrText>
       </w:r>
       <w:r>
         <w:rPr>
@@ -2029,7 +2029,7 @@
         <w:rPr>
           <w:noProof/>
         </w:rPr>
-        <w:instrText xml:space="preserve"> PAGEREF _Toc241587605 \h </w:instrText>
+        <w:instrText xml:space="preserve"> PAGEREF _Toc241589331 \h </w:instrText>
       </w:r>
       <w:r>
         <w:rPr>
@@ -2092,7 +2092,7 @@
         <w:rPr>
           <w:noProof/>
         </w:rPr>
-        <w:instrText xml:space="preserve"> PAGEREF _Toc241587606 \h </w:instrText>
+        <w:instrText xml:space="preserve"> PAGEREF _Toc241589332 \h </w:instrText>
       </w:r>
       <w:r>
         <w:rPr>
@@ -2155,7 +2155,7 @@
         <w:rPr>
           <w:noProof/>
         </w:rPr>
-        <w:instrText xml:space="preserve"> PAGEREF _Toc241587607 \h </w:instrText>
+        <w:instrText xml:space="preserve"> PAGEREF _Toc241589333 \h </w:instrText>
       </w:r>
       <w:r>
         <w:rPr>
@@ -2218,7 +2218,7 @@
         <w:rPr>
           <w:noProof/>
         </w:rPr>
-        <w:instrText xml:space="preserve"> PAGEREF _Toc241587608 \h </w:instrText>
+        <w:instrText xml:space="preserve"> PAGEREF _Toc241589334 \h </w:instrText>
       </w:r>
       <w:r>
         <w:rPr>
@@ -2281,7 +2281,7 @@
         <w:rPr>
           <w:noProof/>
         </w:rPr>
-        <w:instrText xml:space="preserve"> PAGEREF _Toc241587609 \h </w:instrText>
+        <w:instrText xml:space="preserve"> PAGEREF _Toc241589335 \h </w:instrText>
       </w:r>
       <w:r>
         <w:rPr>
@@ -2344,7 +2344,7 @@
         <w:rPr>
           <w:noProof/>
         </w:rPr>
-        <w:instrText xml:space="preserve"> PAGEREF _Toc241587610 \h </w:instrText>
+        <w:instrText xml:space="preserve"> PAGEREF _Toc241589336 \h </w:instrText>
       </w:r>
       <w:r>
         <w:rPr>
@@ -2407,7 +2407,7 @@
         <w:rPr>
           <w:noProof/>
         </w:rPr>
-        <w:instrText xml:space="preserve"> PAGEREF _Toc241587611 \h </w:instrText>
+        <w:instrText xml:space="preserve"> PAGEREF _Toc241589337 \h </w:instrText>
       </w:r>
       <w:r>
         <w:rPr>
@@ -2470,7 +2470,7 @@
         <w:rPr>
           <w:noProof/>
         </w:rPr>
-        <w:instrText xml:space="preserve"> PAGEREF _Toc241587612 \h </w:instrText>
+        <w:instrText xml:space="preserve"> PAGEREF _Toc241589338 \h </w:instrText>
       </w:r>
       <w:r>
         <w:rPr>
@@ -2533,7 +2533,7 @@
         <w:rPr>
           <w:noProof/>
         </w:rPr>
-        <w:instrText xml:space="preserve"> PAGEREF _Toc241587613 \h </w:instrText>
+        <w:instrText xml:space="preserve"> PAGEREF _Toc241589339 \h </w:instrText>
       </w:r>
       <w:r>
         <w:rPr>
@@ -2596,7 +2596,7 @@
         <w:rPr>
           <w:noProof/>
         </w:rPr>
-        <w:instrText xml:space="preserve"> PAGEREF _Toc241587614 \h </w:instrText>
+        <w:instrText xml:space="preserve"> PAGEREF _Toc241589340 \h </w:instrText>
       </w:r>
       <w:r>
         <w:rPr>
@@ -2659,7 +2659,7 @@
         <w:rPr>
           <w:noProof/>
         </w:rPr>
-        <w:instrText xml:space="preserve"> PAGEREF _Toc241587615 \h </w:instrText>
+        <w:instrText xml:space="preserve"> PAGEREF _Toc241589341 \h </w:instrText>
       </w:r>
       <w:r>
         <w:rPr>
@@ -2723,7 +2723,7 @@
         <w:rPr>
           <w:noProof/>
         </w:rPr>
-        <w:instrText xml:space="preserve"> PAGEREF _Toc241587616 \h </w:instrText>
+        <w:instrText xml:space="preserve"> PAGEREF _Toc241589342 \h </w:instrText>
       </w:r>
       <w:r>
         <w:rPr>
@@ -2786,7 +2786,7 @@
         <w:rPr>
           <w:noProof/>
         </w:rPr>
-        <w:instrText xml:space="preserve"> PAGEREF _Toc241587617 \h </w:instrText>
+        <w:instrText xml:space="preserve"> PAGEREF _Toc241589343 \h </w:instrText>
       </w:r>
       <w:r>
         <w:rPr>
@@ -2849,7 +2849,7 @@
         <w:rPr>
           <w:noProof/>
         </w:rPr>
-        <w:instrText xml:space="preserve"> PAGEREF _Toc241587618 \h </w:instrText>
+        <w:instrText xml:space="preserve"> PAGEREF _Toc241589344 \h </w:instrText>
       </w:r>
       <w:r>
         <w:rPr>
@@ -2912,7 +2912,7 @@
         <w:rPr>
           <w:noProof/>
         </w:rPr>
-        <w:instrText xml:space="preserve"> PAGEREF _Toc241587619 \h </w:instrText>
+        <w:instrText xml:space="preserve"> PAGEREF _Toc241589345 \h </w:instrText>
       </w:r>
       <w:r>
         <w:rPr>
@@ -2975,7 +2975,7 @@
         <w:rPr>
           <w:noProof/>
         </w:rPr>
-        <w:instrText xml:space="preserve"> PAGEREF _Toc241587620 \h </w:instrText>
+        <w:instrText xml:space="preserve"> PAGEREF _Toc241589346 \h </w:instrText>
       </w:r>
       <w:r>
         <w:rPr>
@@ -3038,7 +3038,7 @@
         <w:rPr>
           <w:noProof/>
         </w:rPr>
-        <w:instrText xml:space="preserve"> PAGEREF _Toc241587621 \h </w:instrText>
+        <w:instrText xml:space="preserve"> PAGEREF _Toc241589347 \h </w:instrText>
       </w:r>
       <w:r>
         <w:rPr>
@@ -3101,7 +3101,7 @@
         <w:rPr>
           <w:noProof/>
         </w:rPr>
-        <w:instrText xml:space="preserve"> PAGEREF _Toc241587622 \h </w:instrText>
+        <w:instrText xml:space="preserve"> PAGEREF _Toc241589348 \h </w:instrText>
       </w:r>
       <w:r>
         <w:rPr>
@@ -3164,7 +3164,7 @@
         <w:rPr>
           <w:noProof/>
         </w:rPr>
-        <w:instrText xml:space="preserve"> PAGEREF _Toc241587623 \h </w:instrText>
+        <w:instrText xml:space="preserve"> PAGEREF _Toc241589349 \h </w:instrText>
       </w:r>
       <w:r>
         <w:rPr>
@@ -3227,7 +3227,7 @@
         <w:rPr>
           <w:noProof/>
         </w:rPr>
-        <w:instrText xml:space="preserve"> PAGEREF _Toc241587624 \h </w:instrText>
+        <w:instrText xml:space="preserve"> PAGEREF _Toc241589350 \h </w:instrText>
       </w:r>
       <w:r>
         <w:rPr>
@@ -3290,7 +3290,7 @@
         </w:rPr>
         <w:br w:type="page"/>
       </w:r>
-      <w:bookmarkStart w:id="1" w:name="_Toc241587581"/>
+      <w:bookmarkStart w:id="1" w:name="_Toc241589307"/>
       <w:r>
         <w:rPr>
           <w:rFonts w:eastAsia="Times New Roman"/>
@@ -3307,7 +3307,7 @@
           <w:rFonts w:eastAsia="Times New Roman"/>
         </w:rPr>
       </w:pPr>
-      <w:bookmarkStart w:id="2" w:name="_Toc241587582"/>
+      <w:bookmarkStart w:id="2" w:name="_Toc241589308"/>
       <w:r>
         <w:rPr>
           <w:rFonts w:eastAsia="Times New Roman"/>
@@ -3352,7 +3352,7 @@
           <w:rFonts w:eastAsia="Times New Roman"/>
         </w:rPr>
       </w:pPr>
-      <w:bookmarkStart w:id="3" w:name="_Toc241587583"/>
+      <w:bookmarkStart w:id="3" w:name="_Toc241589309"/>
       <w:r>
         <w:rPr>
           <w:rFonts w:eastAsia="Times New Roman"/>
@@ -3417,7 +3417,7 @@
           <w:rFonts w:eastAsia="Times New Roman"/>
         </w:rPr>
       </w:pPr>
-      <w:bookmarkStart w:id="4" w:name="_Toc241587584"/>
+      <w:bookmarkStart w:id="4" w:name="_Toc241589310"/>
       <w:r>
         <w:rPr>
           <w:rFonts w:eastAsia="Times New Roman"/>
@@ -3621,7 +3621,7 @@
           <w:rFonts w:eastAsia="Times New Roman"/>
         </w:rPr>
       </w:pPr>
-      <w:bookmarkStart w:id="5" w:name="_Toc241587585"/>
+      <w:bookmarkStart w:id="5" w:name="_Toc241589311"/>
       <w:r>
         <w:rPr>
           <w:rFonts w:eastAsia="Times New Roman"/>
@@ -3666,7 +3666,7 @@
           <w:rFonts w:eastAsia="Times New Roman"/>
         </w:rPr>
       </w:pPr>
-      <w:bookmarkStart w:id="6" w:name="_Toc241587586"/>
+      <w:bookmarkStart w:id="6" w:name="_Toc241589312"/>
       <w:r>
         <w:rPr>
           <w:rFonts w:eastAsia="Times New Roman"/>
@@ -4557,7 +4557,7 @@
           <w:rFonts w:eastAsia="Times New Roman"/>
         </w:rPr>
       </w:pPr>
-      <w:bookmarkStart w:id="7" w:name="_Toc241587587"/>
+      <w:bookmarkStart w:id="7" w:name="_Toc241589313"/>
       <w:r>
         <w:rPr>
           <w:rFonts w:eastAsia="Times New Roman"/>
@@ -4622,7 +4622,7 @@
           <w:rFonts w:eastAsia="Times New Roman"/>
         </w:rPr>
       </w:pPr>
-      <w:bookmarkStart w:id="8" w:name="_Toc241587588"/>
+      <w:bookmarkStart w:id="8" w:name="_Toc241589314"/>
       <w:r>
         <w:rPr>
           <w:rFonts w:eastAsia="Times New Roman"/>
@@ -4671,7 +4671,7 @@
           <w:szCs w:val="22"/>
         </w:rPr>
         <w:drawing>
-          <wp:inline distT="0" distB="0" distL="0" distR="0" wp14:anchorId="27A6BDEB" wp14:editId="4E163851">
+          <wp:inline distT="0" distB="0" distL="0" distR="0" wp14:anchorId="2567BAAD" wp14:editId="4F814E2D">
             <wp:extent cx="5715000" cy="1272540"/>
             <wp:effectExtent l="0" t="0" r="0" b="3810"/>
             <wp:docPr id="1" name="Picture 1"/>
@@ -4742,7 +4742,7 @@
           <w:rFonts w:eastAsia="Times New Roman"/>
         </w:rPr>
       </w:pPr>
-      <w:bookmarkStart w:id="9" w:name="_Toc241587589"/>
+      <w:bookmarkStart w:id="9" w:name="_Toc241589315"/>
       <w:r>
         <w:rPr>
           <w:rFonts w:eastAsia="Times New Roman"/>
@@ -8145,7 +8145,7 @@
           <w:rFonts w:eastAsia="Times New Roman"/>
         </w:rPr>
       </w:pPr>
-      <w:bookmarkStart w:id="10" w:name="_Toc241587590"/>
+      <w:bookmarkStart w:id="10" w:name="_Toc241589316"/>
       <w:r>
         <w:rPr>
           <w:rFonts w:eastAsia="Times New Roman"/>
@@ -8552,7 +8552,7 @@
           <w:rFonts w:eastAsia="Times New Roman"/>
         </w:rPr>
       </w:pPr>
-      <w:bookmarkStart w:id="11" w:name="_Toc241587591"/>
+      <w:bookmarkStart w:id="11" w:name="_Toc241589317"/>
       <w:r>
         <w:rPr>
           <w:rFonts w:eastAsia="Times New Roman"/>
@@ -17027,7 +17027,7 @@
           <w:rFonts w:eastAsia="Times New Roman"/>
         </w:rPr>
       </w:pPr>
-      <w:bookmarkStart w:id="12" w:name="_Toc241587592"/>
+      <w:bookmarkStart w:id="12" w:name="_Toc241589318"/>
       <w:r>
         <w:rPr>
           <w:rFonts w:eastAsia="Times New Roman"/>
@@ -18673,7 +18673,7 @@
         </w:rPr>
         <w:lastRenderedPageBreak/>
         <w:drawing>
-          <wp:inline distT="0" distB="0" distL="0" distR="0" wp14:anchorId="5B98C5E4" wp14:editId="1BE57DC2">
+          <wp:inline distT="0" distB="0" distL="0" distR="0" wp14:anchorId="6D2E659D" wp14:editId="4410B1C9">
             <wp:extent cx="5524500" cy="3208020"/>
             <wp:effectExtent l="0" t="0" r="0" b="0"/>
             <wp:docPr id="2" name="Picture 2"/>
@@ -18959,7 +18959,7 @@
           <w:rFonts w:eastAsia="Times New Roman"/>
         </w:rPr>
       </w:pPr>
-      <w:bookmarkStart w:id="13" w:name="_Toc241587593"/>
+      <w:bookmarkStart w:id="13" w:name="_Toc241589319"/>
       <w:r>
         <w:rPr>
           <w:rFonts w:eastAsia="Times New Roman"/>
@@ -20085,7 +20085,7 @@
           <w:rFonts w:eastAsia="Times New Roman"/>
         </w:rPr>
       </w:pPr>
-      <w:bookmarkStart w:id="14" w:name="_Toc241587594"/>
+      <w:bookmarkStart w:id="14" w:name="_Toc241589320"/>
       <w:r>
         <w:rPr>
           <w:rFonts w:eastAsia="Times New Roman"/>
@@ -20101,7 +20101,7 @@
           <w:rFonts w:eastAsia="Times New Roman"/>
         </w:rPr>
       </w:pPr>
-      <w:bookmarkStart w:id="15" w:name="_Toc241587595"/>
+      <w:bookmarkStart w:id="15" w:name="_Toc241589321"/>
       <w:r>
         <w:rPr>
           <w:rFonts w:eastAsia="Times New Roman"/>
@@ -20168,7 +20168,7 @@
         </w:rPr>
         <w:lastRenderedPageBreak/>
         <w:drawing>
-          <wp:inline distT="0" distB="0" distL="0" distR="0" wp14:anchorId="29CB5E08" wp14:editId="67D61B62">
+          <wp:inline distT="0" distB="0" distL="0" distR="0" wp14:anchorId="376C1908" wp14:editId="608AB362">
             <wp:extent cx="5715000" cy="3954780"/>
             <wp:effectExtent l="0" t="0" r="0" b="7620"/>
             <wp:docPr id="3" name="Picture 3"/>
@@ -20982,7 +20982,7 @@
           <w:rFonts w:eastAsia="Times New Roman"/>
         </w:rPr>
       </w:pPr>
-      <w:bookmarkStart w:id="16" w:name="_Toc241587596"/>
+      <w:bookmarkStart w:id="16" w:name="_Toc241589322"/>
       <w:r>
         <w:rPr>
           <w:rFonts w:eastAsia="Times New Roman"/>
@@ -21344,7 +21344,7 @@
           <w:rFonts w:eastAsia="Times New Roman"/>
         </w:rPr>
       </w:pPr>
-      <w:bookmarkStart w:id="17" w:name="_Toc241587597"/>
+      <w:bookmarkStart w:id="17" w:name="_Toc241589323"/>
       <w:r>
         <w:rPr>
           <w:rFonts w:eastAsia="Times New Roman"/>
@@ -21584,7 +21584,7 @@
           <w:rFonts w:eastAsia="Times New Roman"/>
         </w:rPr>
       </w:pPr>
-      <w:bookmarkStart w:id="18" w:name="_Toc241587598"/>
+      <w:bookmarkStart w:id="18" w:name="_Toc241589324"/>
       <w:r>
         <w:rPr>
           <w:rFonts w:eastAsia="Times New Roman"/>
@@ -21805,7 +21805,7 @@
           <w:rFonts w:eastAsia="Times New Roman"/>
         </w:rPr>
       </w:pPr>
-      <w:bookmarkStart w:id="19" w:name="_Toc241587599"/>
+      <w:bookmarkStart w:id="19" w:name="_Toc241589325"/>
       <w:r>
         <w:rPr>
           <w:rFonts w:eastAsia="Times New Roman"/>
@@ -22021,7 +22021,7 @@
         </w:rPr>
         <w:lastRenderedPageBreak/>
         <w:drawing>
-          <wp:inline distT="0" distB="0" distL="0" distR="0" wp14:anchorId="174A92AC" wp14:editId="56821387">
+          <wp:inline distT="0" distB="0" distL="0" distR="0" wp14:anchorId="7AF9753E" wp14:editId="55D06188">
             <wp:extent cx="4480560" cy="4960620"/>
             <wp:effectExtent l="0" t="0" r="0" b="0"/>
             <wp:docPr id="4" name="Picture 4"/>
@@ -22092,7 +22092,7 @@
           <w:rFonts w:eastAsia="Times New Roman"/>
         </w:rPr>
       </w:pPr>
-      <w:bookmarkStart w:id="20" w:name="_Toc241587600"/>
+      <w:bookmarkStart w:id="20" w:name="_Toc241589326"/>
       <w:r>
         <w:rPr>
           <w:rFonts w:eastAsia="Times New Roman"/>
@@ -22303,7 +22303,7 @@
           <w:rFonts w:eastAsia="Times New Roman"/>
         </w:rPr>
       </w:pPr>
-      <w:bookmarkStart w:id="21" w:name="_Toc241587601"/>
+      <w:bookmarkStart w:id="21" w:name="_Toc241589327"/>
       <w:r>
         <w:rPr>
           <w:rFonts w:eastAsia="Times New Roman"/>
@@ -22680,7 +22680,7 @@
         </w:rPr>
         <w:lastRenderedPageBreak/>
         <w:drawing>
-          <wp:inline distT="0" distB="0" distL="0" distR="0" wp14:anchorId="7480BA23" wp14:editId="46CDFFAB">
+          <wp:inline distT="0" distB="0" distL="0" distR="0" wp14:anchorId="42D22F0B" wp14:editId="032C9632">
             <wp:extent cx="5334000" cy="3528060"/>
             <wp:effectExtent l="0" t="0" r="0" b="0"/>
             <wp:docPr id="5" name="Picture 5"/>
@@ -22765,7 +22765,7 @@
         </w:rPr>
         <w:lastRenderedPageBreak/>
         <w:drawing>
-          <wp:inline distT="0" distB="0" distL="0" distR="0" wp14:anchorId="6F03D222" wp14:editId="4560C96B">
+          <wp:inline distT="0" distB="0" distL="0" distR="0" wp14:anchorId="49EE19F5" wp14:editId="75EA446C">
             <wp:extent cx="4953000" cy="6492240"/>
             <wp:effectExtent l="0" t="0" r="0" b="3810"/>
             <wp:docPr id="6" name="Picture 6"/>
@@ -22850,7 +22850,7 @@
         </w:rPr>
         <w:lastRenderedPageBreak/>
         <w:drawing>
-          <wp:inline distT="0" distB="0" distL="0" distR="0" wp14:anchorId="46AE3D08" wp14:editId="6946AFC2">
+          <wp:inline distT="0" distB="0" distL="0" distR="0" wp14:anchorId="554DE61C" wp14:editId="54B1CDAE">
             <wp:extent cx="4480560" cy="3589020"/>
             <wp:effectExtent l="0" t="0" r="0" b="0"/>
             <wp:docPr id="7" name="Picture 7"/>
@@ -22934,7 +22934,7 @@
           <w:szCs w:val="22"/>
         </w:rPr>
         <w:drawing>
-          <wp:inline distT="0" distB="0" distL="0" distR="0" wp14:anchorId="2813F259" wp14:editId="5B341F92">
+          <wp:inline distT="0" distB="0" distL="0" distR="0" wp14:anchorId="1214B333" wp14:editId="17D3497D">
             <wp:extent cx="5334000" cy="3314700"/>
             <wp:effectExtent l="0" t="0" r="0" b="0"/>
             <wp:docPr id="8" name="Picture 8"/>
@@ -23005,7 +23005,7 @@
           <w:rFonts w:eastAsia="Times New Roman"/>
         </w:rPr>
       </w:pPr>
-      <w:bookmarkStart w:id="22" w:name="_Toc241587602"/>
+      <w:bookmarkStart w:id="22" w:name="_Toc241589328"/>
       <w:r>
         <w:rPr>
           <w:rFonts w:eastAsia="Times New Roman"/>
@@ -24323,7 +24323,7 @@
           <w:rFonts w:eastAsia="Times New Roman"/>
         </w:rPr>
       </w:pPr>
-      <w:bookmarkStart w:id="23" w:name="_Toc241587603"/>
+      <w:bookmarkStart w:id="23" w:name="_Toc241589329"/>
       <w:r>
         <w:rPr>
           <w:rFonts w:eastAsia="Times New Roman"/>
@@ -24379,7 +24379,7 @@
           <w:rFonts w:eastAsia="Times New Roman"/>
         </w:rPr>
       </w:pPr>
-      <w:bookmarkStart w:id="24" w:name="_Toc241587604"/>
+      <w:bookmarkStart w:id="24" w:name="_Toc241589330"/>
       <w:r>
         <w:rPr>
           <w:rFonts w:eastAsia="Times New Roman"/>
@@ -24744,7 +24744,7 @@
           <w:szCs w:val="22"/>
         </w:rPr>
         <w:drawing>
-          <wp:inline distT="0" distB="0" distL="0" distR="0" wp14:anchorId="10B758F6" wp14:editId="6362B940">
+          <wp:inline distT="0" distB="0" distL="0" distR="0" wp14:anchorId="007ABD6C" wp14:editId="060A2673">
             <wp:extent cx="4480560" cy="5646420"/>
             <wp:effectExtent l="0" t="0" r="0" b="0"/>
             <wp:docPr id="9" name="Picture 9"/>
@@ -24815,7 +24815,7 @@
           <w:rFonts w:eastAsia="Times New Roman"/>
         </w:rPr>
       </w:pPr>
-      <w:bookmarkStart w:id="25" w:name="_Toc241587605"/>
+      <w:bookmarkStart w:id="25" w:name="_Toc241589331"/>
       <w:r>
         <w:rPr>
           <w:rFonts w:eastAsia="Times New Roman"/>
@@ -24955,7 +24955,7 @@
           <w:szCs w:val="22"/>
         </w:rPr>
         <w:drawing>
-          <wp:inline distT="0" distB="0" distL="0" distR="0" wp14:anchorId="7AF09E58" wp14:editId="1693AFB1">
+          <wp:inline distT="0" distB="0" distL="0" distR="0" wp14:anchorId="41559D0E" wp14:editId="7E5C9241">
             <wp:extent cx="4290060" cy="2926080"/>
             <wp:effectExtent l="0" t="0" r="0" b="7620"/>
             <wp:docPr id="10" name="Picture 10"/>
@@ -25026,7 +25026,7 @@
           <w:rFonts w:eastAsia="Times New Roman"/>
         </w:rPr>
       </w:pPr>
-      <w:bookmarkStart w:id="26" w:name="_Toc241587606"/>
+      <w:bookmarkStart w:id="26" w:name="_Toc241589332"/>
       <w:r>
         <w:rPr>
           <w:rFonts w:eastAsia="Times New Roman"/>
@@ -25095,7 +25095,7 @@
           <w:szCs w:val="22"/>
         </w:rPr>
         <w:drawing>
-          <wp:inline distT="0" distB="0" distL="0" distR="0" wp14:anchorId="651D9E29" wp14:editId="7AF93EEA">
+          <wp:inline distT="0" distB="0" distL="0" distR="0" wp14:anchorId="4B2D0A76" wp14:editId="5805B7A4">
             <wp:extent cx="4480560" cy="1325880"/>
             <wp:effectExtent l="0" t="0" r="0" b="7620"/>
             <wp:docPr id="11" name="Picture 11"/>
@@ -25166,7 +25166,7 @@
           <w:rFonts w:eastAsia="Times New Roman"/>
         </w:rPr>
       </w:pPr>
-      <w:bookmarkStart w:id="27" w:name="_Toc241587607"/>
+      <w:bookmarkStart w:id="27" w:name="_Toc241589333"/>
       <w:r>
         <w:rPr>
           <w:rFonts w:eastAsia="Times New Roman"/>
@@ -25225,7 +25225,7 @@
         </w:rPr>
         <w:lastRenderedPageBreak/>
         <w:drawing>
-          <wp:inline distT="0" distB="0" distL="0" distR="0" wp14:anchorId="67F20339" wp14:editId="1813142B">
+          <wp:inline distT="0" distB="0" distL="0" distR="0" wp14:anchorId="388A864F" wp14:editId="6860CE93">
             <wp:extent cx="4480560" cy="4655820"/>
             <wp:effectExtent l="0" t="0" r="0" b="0"/>
             <wp:docPr id="12" name="Picture 12"/>
@@ -25309,7 +25309,7 @@
           <w:szCs w:val="22"/>
         </w:rPr>
         <w:drawing>
-          <wp:inline distT="0" distB="0" distL="0" distR="0" wp14:anchorId="293ECA64" wp14:editId="3CBB670E">
+          <wp:inline distT="0" distB="0" distL="0" distR="0" wp14:anchorId="3F07BB88" wp14:editId="41F242D6">
             <wp:extent cx="4480560" cy="3733800"/>
             <wp:effectExtent l="0" t="0" r="0" b="0"/>
             <wp:docPr id="13" name="Picture 13"/>
@@ -25380,7 +25380,7 @@
           <w:rFonts w:eastAsia="Times New Roman"/>
         </w:rPr>
       </w:pPr>
-      <w:bookmarkStart w:id="28" w:name="_Toc241587608"/>
+      <w:bookmarkStart w:id="28" w:name="_Toc241589334"/>
       <w:r>
         <w:rPr>
           <w:rFonts w:eastAsia="Times New Roman"/>
@@ -25397,7 +25397,7 @@
           <w:rFonts w:eastAsia="Times New Roman"/>
         </w:rPr>
       </w:pPr>
-      <w:bookmarkStart w:id="29" w:name="_Toc241587609"/>
+      <w:bookmarkStart w:id="29" w:name="_Toc241589335"/>
       <w:r>
         <w:rPr>
           <w:rFonts w:eastAsia="Times New Roman"/>
@@ -25433,7 +25433,7 @@
           <w:rFonts w:eastAsia="Times New Roman"/>
         </w:rPr>
       </w:pPr>
-      <w:bookmarkStart w:id="30" w:name="_Toc241587610"/>
+      <w:bookmarkStart w:id="30" w:name="_Toc241589336"/>
       <w:r>
         <w:rPr>
           <w:rFonts w:eastAsia="Times New Roman"/>
@@ -31169,7 +31169,7 @@
           <w:rFonts w:eastAsia="Times New Roman"/>
         </w:rPr>
       </w:pPr>
-      <w:bookmarkStart w:id="31" w:name="_Toc241587611"/>
+      <w:bookmarkStart w:id="31" w:name="_Toc241589337"/>
       <w:r>
         <w:rPr>
           <w:rFonts w:eastAsia="Times New Roman"/>
@@ -31956,7 +31956,7 @@
           <w:rFonts w:eastAsia="Times New Roman"/>
         </w:rPr>
       </w:pPr>
-      <w:bookmarkStart w:id="32" w:name="_Toc241587612"/>
+      <w:bookmarkStart w:id="32" w:name="_Toc241589338"/>
       <w:r>
         <w:rPr>
           <w:rFonts w:eastAsia="Times New Roman"/>
@@ -32968,7 +32968,7 @@
           <w:rFonts w:eastAsia="Times New Roman"/>
         </w:rPr>
       </w:pPr>
-      <w:bookmarkStart w:id="33" w:name="_Toc241587613"/>
+      <w:bookmarkStart w:id="33" w:name="_Toc241589339"/>
       <w:r>
         <w:rPr>
           <w:rFonts w:eastAsia="Times New Roman"/>
@@ -33979,7 +33979,7 @@
           <w:rFonts w:eastAsia="Times New Roman"/>
         </w:rPr>
       </w:pPr>
-      <w:bookmarkStart w:id="34" w:name="_Toc241587614"/>
+      <w:bookmarkStart w:id="34" w:name="_Toc241589340"/>
       <w:r>
         <w:rPr>
           <w:rFonts w:eastAsia="Times New Roman"/>
@@ -34035,7 +34035,7 @@
           <w:rFonts w:eastAsia="Times New Roman"/>
         </w:rPr>
       </w:pPr>
-      <w:bookmarkStart w:id="35" w:name="_Toc241587615"/>
+      <w:bookmarkStart w:id="35" w:name="_Toc241589341"/>
       <w:r>
         <w:rPr>
           <w:rFonts w:eastAsia="Times New Roman"/>
@@ -34052,7 +34052,7 @@
           <w:rFonts w:eastAsia="Times New Roman"/>
         </w:rPr>
       </w:pPr>
-      <w:bookmarkStart w:id="36" w:name="_Toc241587616"/>
+      <w:bookmarkStart w:id="36" w:name="_Toc241589342"/>
       <w:r>
         <w:rPr>
           <w:rFonts w:eastAsia="Times New Roman"/>
@@ -34128,7 +34128,7 @@
           <w:rFonts w:eastAsia="Times New Roman"/>
         </w:rPr>
       </w:pPr>
-      <w:bookmarkStart w:id="37" w:name="_Toc241587617"/>
+      <w:bookmarkStart w:id="37" w:name="_Toc241589343"/>
       <w:r>
         <w:rPr>
           <w:rFonts w:eastAsia="Times New Roman"/>
@@ -34202,7 +34202,7 @@
           <w:rFonts w:eastAsia="Times New Roman"/>
         </w:rPr>
       </w:pPr>
-      <w:bookmarkStart w:id="38" w:name="_Toc241587618"/>
+      <w:bookmarkStart w:id="38" w:name="_Toc241589344"/>
       <w:r>
         <w:rPr>
           <w:rFonts w:eastAsia="Times New Roman"/>
@@ -34526,7 +34526,7 @@
           <w:rFonts w:eastAsia="Times New Roman"/>
         </w:rPr>
       </w:pPr>
-      <w:bookmarkStart w:id="39" w:name="_Toc241587619"/>
+      <w:bookmarkStart w:id="39" w:name="_Toc241589345"/>
       <w:r>
         <w:rPr>
           <w:rFonts w:eastAsia="Times New Roman"/>
@@ -34662,7 +34662,7 @@
           <w:rFonts w:eastAsia="Times New Roman"/>
         </w:rPr>
       </w:pPr>
-      <w:bookmarkStart w:id="40" w:name="_Toc241587620"/>
+      <w:bookmarkStart w:id="40" w:name="_Toc241589346"/>
       <w:r>
         <w:rPr>
           <w:rFonts w:eastAsia="Times New Roman"/>
@@ -34725,7 +34725,7 @@
         </w:rPr>
         <w:br w:type="page"/>
       </w:r>
-      <w:bookmarkStart w:id="41" w:name="_Toc241587621"/>
+      <w:bookmarkStart w:id="41" w:name="_Toc241589347"/>
       <w:r>
         <w:rPr>
           <w:rFonts w:eastAsia="Times New Roman"/>
@@ -35513,7 +35513,7 @@
         </w:rPr>
         <w:br w:type="page"/>
       </w:r>
-      <w:bookmarkStart w:id="42" w:name="_Toc241587622"/>
+      <w:bookmarkStart w:id="42" w:name="_Toc241589348"/>
       <w:r>
         <w:rPr>
           <w:rFonts w:eastAsia="Times New Roman"/>
@@ -47713,7 +47713,7 @@
         </w:rPr>
         <w:br w:type="page"/>
       </w:r>
-      <w:bookmarkStart w:id="43" w:name="_Toc241587623"/>
+      <w:bookmarkStart w:id="43" w:name="_Toc241589349"/>
       <w:r>
         <w:rPr>
           <w:rFonts w:eastAsia="Times New Roman"/>
@@ -48543,7 +48543,7 @@
           <w:rFonts w:eastAsia="Times New Roman"/>
         </w:rPr>
       </w:pPr>
-      <w:bookmarkStart w:id="44" w:name="_Toc241587624"/>
+      <w:bookmarkStart w:id="44" w:name="_Toc241589350"/>
       <w:r>
         <w:rPr>
           <w:rFonts w:eastAsia="Times New Roman"/>
@@ -49273,122 +49273,9 @@
 <file path=word/numbering.xml><?xml version="1.0" encoding="utf-8"?>
 <w:numbering xmlns:wpc="http://schemas.microsoft.com/office/word/2010/wordprocessingCanvas" xmlns:cx="http://schemas.microsoft.com/office/drawing/2014/chartex" xmlns:cx1="http://schemas.microsoft.com/office/drawing/2015/9/8/chartex" xmlns:cx2="http://schemas.microsoft.com/office/drawing/2015/10/21/chartex" xmlns:cx3="http://schemas.microsoft.com/office/drawing/2016/5/9/chartex" xmlns:cx4="http://schemas.microsoft.com/office/drawing/2016/5/10/chartex" xmlns:cx5="http://schemas.microsoft.com/office/drawing/2016/5/11/chartex" xmlns:cx6="http://schemas.microsoft.com/office/drawing/2016/5/12/chartex" xmlns:cx7="http://schemas.microsoft.com/office/drawing/2016/5/13/chartex" xmlns:cx8="http://schemas.microsoft.com/office/drawing/2016/5/14/chartex" xmlns:mc="http://schemas.openxmlformats.org/markup-compatibility/2006" xmlns:aink="http://schemas.microsoft.com/office/drawing/2016/ink" xmlns:am3d="http://schemas.microsoft.com/office/drawing/2017/model3d" xmlns:o="urn:schemas-microsoft-com:office:office" xmlns:oel="http://schemas.microsoft.com/office/2019/extlst" xmlns:r="http://schemas.openxmlformats.org/officeDocument/2006/relationships" xmlns:m="http://schemas.openxmlformats.org/officeDocument/2006/math" xmlns:v="urn:schemas-microsoft-com:vml" xmlns:wp14="http://schemas.microsoft.com/office/word/2010/wordprocessingDrawing" xmlns:wp="http://schemas.openxmlformats.org/drawingml/2006/wordprocessingDrawing" xmlns:w10="urn:schemas-microsoft-com:office:word" xmlns:w="http://schemas.openxmlformats.org/wordprocessingml/2006/main" xmlns:w14="http://schemas.microsoft.com/office/word/2010/wordml" xmlns:w15="http://schemas.microsoft.com/office/word/2012/wordml" xmlns:w16cex="http://schemas.microsoft.com/office/word/2018/wordml/cex" xmlns:w16cid="http://schemas.microsoft.com/office/word/2016/wordml/cid" xmlns:w16="http://schemas.microsoft.com/office/word/2018/wordml" xmlns:w16du="http://schemas.microsoft.com/office/word/2023/wordml/word16du" xmlns:w16sdtdh="http://schemas.microsoft.com/office/word/2020/wordml/sdtdatahash" xmlns:w16sdtfl="http://schemas.microsoft.com/office/word/2024/wordml/sdtformatlock" xmlns:w16se="http://schemas.microsoft.com/office/word/2015/wordml/symex" xmlns:wpg="http://schemas.microsoft.com/office/word/2010/wordprocessingGroup" xmlns:wpi="http://schemas.microsoft.com/office/word/2010/wordprocessingInk" xmlns:wne="http://schemas.microsoft.com/office/word/2006/wordml" xmlns:wps="http://schemas.microsoft.com/office/word/2010/wordprocessingShape" mc:Ignorable="w14 w15 w16se w16cid w16 w16cex w16sdtdh w16sdtfl w16du wp14">
   <w:abstractNum w:abstractNumId="0" w15:restartNumberingAfterBreak="0">
-    <w:nsid w:val="0B526DC7"/>
+    <w:nsid w:val="1596607A"/>
     <w:multiLevelType w:val="multilevel"/>
-    <w:tmpl w:val="C684679A"/>
-    <w:lvl w:ilvl="0">
-      <w:start w:val="1"/>
-      <w:numFmt w:val="decimal"/>
-      <w:lvlText w:val="%1."/>
-      <w:lvlJc w:val="left"/>
-      <w:pPr>
-        <w:tabs>
-          <w:tab w:val="num" w:pos="720"/>
-        </w:tabs>
-        <w:ind w:left="720" w:hanging="360"/>
-      </w:pPr>
-    </w:lvl>
-    <w:lvl w:ilvl="1" w:tentative="1">
-      <w:start w:val="1"/>
-      <w:numFmt w:val="decimal"/>
-      <w:lvlText w:val="%2."/>
-      <w:lvlJc w:val="left"/>
-      <w:pPr>
-        <w:tabs>
-          <w:tab w:val="num" w:pos="1440"/>
-        </w:tabs>
-        <w:ind w:left="1440" w:hanging="360"/>
-      </w:pPr>
-    </w:lvl>
-    <w:lvl w:ilvl="2" w:tentative="1">
-      <w:start w:val="1"/>
-      <w:numFmt w:val="decimal"/>
-      <w:lvlText w:val="%3."/>
-      <w:lvlJc w:val="left"/>
-      <w:pPr>
-        <w:tabs>
-          <w:tab w:val="num" w:pos="2160"/>
-        </w:tabs>
-        <w:ind w:left="2160" w:hanging="360"/>
-      </w:pPr>
-    </w:lvl>
-    <w:lvl w:ilvl="3" w:tentative="1">
-      <w:start w:val="1"/>
-      <w:numFmt w:val="decimal"/>
-      <w:lvlText w:val="%4."/>
-      <w:lvlJc w:val="left"/>
-      <w:pPr>
-        <w:tabs>
-          <w:tab w:val="num" w:pos="2880"/>
-        </w:tabs>
-        <w:ind w:left="2880" w:hanging="360"/>
-      </w:pPr>
-    </w:lvl>
-    <w:lvl w:ilvl="4" w:tentative="1">
-      <w:start w:val="1"/>
-      <w:numFmt w:val="decimal"/>
-      <w:lvlText w:val="%5."/>
-      <w:lvlJc w:val="left"/>
-      <w:pPr>
-        <w:tabs>
-          <w:tab w:val="num" w:pos="3600"/>
-        </w:tabs>
-        <w:ind w:left="3600" w:hanging="360"/>
-      </w:pPr>
-    </w:lvl>
-    <w:lvl w:ilvl="5" w:tentative="1">
-      <w:start w:val="1"/>
-      <w:numFmt w:val="decimal"/>
-      <w:lvlText w:val="%6."/>
-      <w:lvlJc w:val="left"/>
-      <w:pPr>
-        <w:tabs>
-          <w:tab w:val="num" w:pos="4320"/>
-        </w:tabs>
-        <w:ind w:left="4320" w:hanging="360"/>
-      </w:pPr>
-    </w:lvl>
-    <w:lvl w:ilvl="6" w:tentative="1">
-      <w:start w:val="1"/>
-      <w:numFmt w:val="decimal"/>
-      <w:lvlText w:val="%7."/>
-      <w:lvlJc w:val="left"/>
-      <w:pPr>
-        <w:tabs>
-          <w:tab w:val="num" w:pos="5040"/>
-        </w:tabs>
-        <w:ind w:left="5040" w:hanging="360"/>
-      </w:pPr>
-    </w:lvl>
-    <w:lvl w:ilvl="7" w:tentative="1">
-      <w:start w:val="1"/>
-      <w:numFmt w:val="decimal"/>
-      <w:lvlText w:val="%8."/>
-      <w:lvlJc w:val="left"/>
-      <w:pPr>
-        <w:tabs>
-          <w:tab w:val="num" w:pos="5760"/>
-        </w:tabs>
-        <w:ind w:left="5760" w:hanging="360"/>
-      </w:pPr>
-    </w:lvl>
-    <w:lvl w:ilvl="8" w:tentative="1">
-      <w:start w:val="1"/>
-      <w:numFmt w:val="decimal"/>
-      <w:lvlText w:val="%9."/>
-      <w:lvlJc w:val="left"/>
-      <w:pPr>
-        <w:tabs>
-          <w:tab w:val="num" w:pos="6480"/>
-        </w:tabs>
-        <w:ind w:left="6480" w:hanging="360"/>
-      </w:pPr>
-    </w:lvl>
-  </w:abstractNum>
-  <w:abstractNum w:abstractNumId="1" w15:restartNumberingAfterBreak="0">
-    <w:nsid w:val="22B5243E"/>
-    <w:multiLevelType w:val="multilevel"/>
-    <w:tmpl w:val="3240224C"/>
+    <w:tmpl w:val="05E440BA"/>
     <w:lvl w:ilvl="0">
       <w:start w:val="1"/>
       <w:numFmt w:val="bullet"/>
@@ -49534,10 +49421,123 @@
       </w:rPr>
     </w:lvl>
   </w:abstractNum>
+  <w:abstractNum w:abstractNumId="1" w15:restartNumberingAfterBreak="0">
+    <w:nsid w:val="24A163BD"/>
+    <w:multiLevelType w:val="multilevel"/>
+    <w:tmpl w:val="4AF4E832"/>
+    <w:lvl w:ilvl="0">
+      <w:start w:val="1"/>
+      <w:numFmt w:val="decimal"/>
+      <w:lvlText w:val="%1."/>
+      <w:lvlJc w:val="left"/>
+      <w:pPr>
+        <w:tabs>
+          <w:tab w:val="num" w:pos="720"/>
+        </w:tabs>
+        <w:ind w:left="720" w:hanging="360"/>
+      </w:pPr>
+    </w:lvl>
+    <w:lvl w:ilvl="1" w:tentative="1">
+      <w:start w:val="1"/>
+      <w:numFmt w:val="decimal"/>
+      <w:lvlText w:val="%2."/>
+      <w:lvlJc w:val="left"/>
+      <w:pPr>
+        <w:tabs>
+          <w:tab w:val="num" w:pos="1440"/>
+        </w:tabs>
+        <w:ind w:left="1440" w:hanging="360"/>
+      </w:pPr>
+    </w:lvl>
+    <w:lvl w:ilvl="2" w:tentative="1">
+      <w:start w:val="1"/>
+      <w:numFmt w:val="decimal"/>
+      <w:lvlText w:val="%3."/>
+      <w:lvlJc w:val="left"/>
+      <w:pPr>
+        <w:tabs>
+          <w:tab w:val="num" w:pos="2160"/>
+        </w:tabs>
+        <w:ind w:left="2160" w:hanging="360"/>
+      </w:pPr>
+    </w:lvl>
+    <w:lvl w:ilvl="3" w:tentative="1">
+      <w:start w:val="1"/>
+      <w:numFmt w:val="decimal"/>
+      <w:lvlText w:val="%4."/>
+      <w:lvlJc w:val="left"/>
+      <w:pPr>
+        <w:tabs>
+          <w:tab w:val="num" w:pos="2880"/>
+        </w:tabs>
+        <w:ind w:left="2880" w:hanging="360"/>
+      </w:pPr>
+    </w:lvl>
+    <w:lvl w:ilvl="4" w:tentative="1">
+      <w:start w:val="1"/>
+      <w:numFmt w:val="decimal"/>
+      <w:lvlText w:val="%5."/>
+      <w:lvlJc w:val="left"/>
+      <w:pPr>
+        <w:tabs>
+          <w:tab w:val="num" w:pos="3600"/>
+        </w:tabs>
+        <w:ind w:left="3600" w:hanging="360"/>
+      </w:pPr>
+    </w:lvl>
+    <w:lvl w:ilvl="5" w:tentative="1">
+      <w:start w:val="1"/>
+      <w:numFmt w:val="decimal"/>
+      <w:lvlText w:val="%6."/>
+      <w:lvlJc w:val="left"/>
+      <w:pPr>
+        <w:tabs>
+          <w:tab w:val="num" w:pos="4320"/>
+        </w:tabs>
+        <w:ind w:left="4320" w:hanging="360"/>
+      </w:pPr>
+    </w:lvl>
+    <w:lvl w:ilvl="6" w:tentative="1">
+      <w:start w:val="1"/>
+      <w:numFmt w:val="decimal"/>
+      <w:lvlText w:val="%7."/>
+      <w:lvlJc w:val="left"/>
+      <w:pPr>
+        <w:tabs>
+          <w:tab w:val="num" w:pos="5040"/>
+        </w:tabs>
+        <w:ind w:left="5040" w:hanging="360"/>
+      </w:pPr>
+    </w:lvl>
+    <w:lvl w:ilvl="7" w:tentative="1">
+      <w:start w:val="1"/>
+      <w:numFmt w:val="decimal"/>
+      <w:lvlText w:val="%8."/>
+      <w:lvlJc w:val="left"/>
+      <w:pPr>
+        <w:tabs>
+          <w:tab w:val="num" w:pos="5760"/>
+        </w:tabs>
+        <w:ind w:left="5760" w:hanging="360"/>
+      </w:pPr>
+    </w:lvl>
+    <w:lvl w:ilvl="8" w:tentative="1">
+      <w:start w:val="1"/>
+      <w:numFmt w:val="decimal"/>
+      <w:lvlText w:val="%9."/>
+      <w:lvlJc w:val="left"/>
+      <w:pPr>
+        <w:tabs>
+          <w:tab w:val="num" w:pos="6480"/>
+        </w:tabs>
+        <w:ind w:left="6480" w:hanging="360"/>
+      </w:pPr>
+    </w:lvl>
+  </w:abstractNum>
   <w:abstractNum w:abstractNumId="2" w15:restartNumberingAfterBreak="0">
-    <w:nsid w:val="41DE2400"/>
+    <w:nsid w:val="5FF501D4"/>
     <w:multiLevelType w:val="multilevel"/>
-    <w:tmpl w:val="8D3E14CC"/>
+    <w:tmpl w:val="943A2180"/>
     <w:lvl w:ilvl="0">
       <w:start w:val="1"/>
       <w:numFmt w:val="bullet"/>
@@ -49684,122 +49684,9 @@
     </w:lvl>
   </w:abstractNum>
   <w:abstractNum w:abstractNumId="3" w15:restartNumberingAfterBreak="0">
-    <w:nsid w:val="4FCE66A3"/>
+    <w:nsid w:val="65EB4164"/>
     <w:multiLevelType w:val="multilevel"/>
-    <w:tmpl w:val="73A62250"/>
-    <w:lvl w:ilvl="0">
-      <w:start w:val="1"/>
-      <w:numFmt w:val="decimal"/>
-      <w:lvlText w:val="%1."/>
-      <w:lvlJc w:val="left"/>
-      <w:pPr>
-        <w:tabs>
-          <w:tab w:val="num" w:pos="720"/>
-        </w:tabs>
-        <w:ind w:left="720" w:hanging="360"/>
-      </w:pPr>
-    </w:lvl>
-    <w:lvl w:ilvl="1" w:tentative="1">
-      <w:start w:val="1"/>
-      <w:numFmt w:val="decimal"/>
-      <w:lvlText w:val="%2."/>
-      <w:lvlJc w:val="left"/>
-      <w:pPr>
-        <w:tabs>
-          <w:tab w:val="num" w:pos="1440"/>
-        </w:tabs>
-        <w:ind w:left="1440" w:hanging="360"/>
-      </w:pPr>
-    </w:lvl>
-    <w:lvl w:ilvl="2" w:tentative="1">
-      <w:start w:val="1"/>
-      <w:numFmt w:val="decimal"/>
-      <w:lvlText w:val="%3."/>
-      <w:lvlJc w:val="left"/>
-      <w:pPr>
-        <w:tabs>
-          <w:tab w:val="num" w:pos="2160"/>
-        </w:tabs>
-        <w:ind w:left="2160" w:hanging="360"/>
-      </w:pPr>
-    </w:lvl>
-    <w:lvl w:ilvl="3" w:tentative="1">
-      <w:start w:val="1"/>
-      <w:numFmt w:val="decimal"/>
-      <w:lvlText w:val="%4."/>
-      <w:lvlJc w:val="left"/>
-      <w:pPr>
-        <w:tabs>
-          <w:tab w:val="num" w:pos="2880"/>
-        </w:tabs>
-        <w:ind w:left="2880" w:hanging="360"/>
-      </w:pPr>
-    </w:lvl>
-    <w:lvl w:ilvl="4" w:tentative="1">
-      <w:start w:val="1"/>
-      <w:numFmt w:val="decimal"/>
-      <w:lvlText w:val="%5."/>
-      <w:lvlJc w:val="left"/>
-      <w:pPr>
-        <w:tabs>
-          <w:tab w:val="num" w:pos="3600"/>
-        </w:tabs>
-        <w:ind w:left="3600" w:hanging="360"/>
-      </w:pPr>
-    </w:lvl>
-    <w:lvl w:ilvl="5" w:tentative="1">
-      <w:start w:val="1"/>
-      <w:numFmt w:val="decimal"/>
-      <w:lvlText w:val="%6."/>
-      <w:lvlJc w:val="left"/>
-      <w:pPr>
-        <w:tabs>
-          <w:tab w:val="num" w:pos="4320"/>
-        </w:tabs>
-        <w:ind w:left="4320" w:hanging="360"/>
-      </w:pPr>
-    </w:lvl>
-    <w:lvl w:ilvl="6" w:tentative="1">
-      <w:start w:val="1"/>
-      <w:numFmt w:val="decimal"/>
-      <w:lvlText w:val="%7."/>
-      <w:lvlJc w:val="left"/>
-      <w:pPr>
-        <w:tabs>
-          <w:tab w:val="num" w:pos="5040"/>
-        </w:tabs>
-        <w:ind w:left="5040" w:hanging="360"/>
-      </w:pPr>
-    </w:lvl>
-    <w:lvl w:ilvl="7" w:tentative="1">
-      <w:start w:val="1"/>
-      <w:numFmt w:val="decimal"/>
-      <w:lvlText w:val="%8."/>
-      <w:lvlJc w:val="left"/>
-      <w:pPr>
-        <w:tabs>
-          <w:tab w:val="num" w:pos="5760"/>
-        </w:tabs>
-        <w:ind w:left="5760" w:hanging="360"/>
-      </w:pPr>
-    </w:lvl>
-    <w:lvl w:ilvl="8" w:tentative="1">
-      <w:start w:val="1"/>
-      <w:numFmt w:val="decimal"/>
-      <w:lvlText w:val="%9."/>
-      <w:lvlJc w:val="left"/>
-      <w:pPr>
-        <w:tabs>
-          <w:tab w:val="num" w:pos="6480"/>
-        </w:tabs>
-        <w:ind w:left="6480" w:hanging="360"/>
-      </w:pPr>
-    </w:lvl>
-  </w:abstractNum>
-  <w:abstractNum w:abstractNumId="4" w15:restartNumberingAfterBreak="0">
-    <w:nsid w:val="75D42A05"/>
-    <w:multiLevelType w:val="multilevel"/>
-    <w:tmpl w:val="8A847E9E"/>
+    <w:tmpl w:val="D8BC461E"/>
     <w:lvl w:ilvl="0">
       <w:start w:val="1"/>
       <w:numFmt w:val="bullet"/>
@@ -49945,10 +49832,123 @@
       </w:rPr>
     </w:lvl>
   </w:abstractNum>
+  <w:abstractNum w:abstractNumId="4" w15:restartNumberingAfterBreak="0">
+    <w:nsid w:val="76A2748C"/>
+    <w:multiLevelType w:val="multilevel"/>
+    <w:tmpl w:val="019AE238"/>
+    <w:lvl w:ilvl="0">
+      <w:start w:val="1"/>
+      <w:numFmt w:val="decimal"/>
+      <w:lvlText w:val="%1."/>
+      <w:lvlJc w:val="left"/>
+      <w:pPr>
+        <w:tabs>
+          <w:tab w:val="num" w:pos="720"/>
+        </w:tabs>
+        <w:ind w:left="720" w:hanging="360"/>
+      </w:pPr>
+    </w:lvl>
+    <w:lvl w:ilvl="1" w:tentative="1">
+      <w:start w:val="1"/>
+      <w:numFmt w:val="decimal"/>
+      <w:lvlText w:val="%2."/>
+      <w:lvlJc w:val="left"/>
+      <w:pPr>
+        <w:tabs>
+          <w:tab w:val="num" w:pos="1440"/>
+        </w:tabs>
+        <w:ind w:left="1440" w:hanging="360"/>
+      </w:pPr>
+    </w:lvl>
+    <w:lvl w:ilvl="2" w:tentative="1">
+      <w:start w:val="1"/>
+      <w:numFmt w:val="decimal"/>
+      <w:lvlText w:val="%3."/>
+      <w:lvlJc w:val="left"/>
+      <w:pPr>
+        <w:tabs>
+          <w:tab w:val="num" w:pos="2160"/>
+        </w:tabs>
+        <w:ind w:left="2160" w:hanging="360"/>
+      </w:pPr>
+    </w:lvl>
+    <w:lvl w:ilvl="3" w:tentative="1">
+      <w:start w:val="1"/>
+      <w:numFmt w:val="decimal"/>
+      <w:lvlText w:val="%4."/>
+      <w:lvlJc w:val="left"/>
+      <w:pPr>
+        <w:tabs>
+          <w:tab w:val="num" w:pos="2880"/>
+        </w:tabs>
+        <w:ind w:left="2880" w:hanging="360"/>
+      </w:pPr>
+    </w:lvl>
+    <w:lvl w:ilvl="4" w:tentative="1">
+      <w:start w:val="1"/>
+      <w:numFmt w:val="decimal"/>
+      <w:lvlText w:val="%5."/>
+      <w:lvlJc w:val="left"/>
+      <w:pPr>
+        <w:tabs>
+          <w:tab w:val="num" w:pos="3600"/>
+        </w:tabs>
+        <w:ind w:left="3600" w:hanging="360"/>
+      </w:pPr>
+    </w:lvl>
+    <w:lvl w:ilvl="5" w:tentative="1">
+      <w:start w:val="1"/>
+      <w:numFmt w:val="decimal"/>
+      <w:lvlText w:val="%6."/>
+      <w:lvlJc w:val="left"/>
+      <w:pPr>
+        <w:tabs>
+          <w:tab w:val="num" w:pos="4320"/>
+        </w:tabs>
+        <w:ind w:left="4320" w:hanging="360"/>
+      </w:pPr>
+    </w:lvl>
+    <w:lvl w:ilvl="6" w:tentative="1">
+      <w:start w:val="1"/>
+      <w:numFmt w:val="decimal"/>
+      <w:lvlText w:val="%7."/>
+      <w:lvlJc w:val="left"/>
+      <w:pPr>
+        <w:tabs>
+          <w:tab w:val="num" w:pos="5040"/>
+        </w:tabs>
+        <w:ind w:left="5040" w:hanging="360"/>
+      </w:pPr>
+    </w:lvl>
+    <w:lvl w:ilvl="7" w:tentative="1">
+      <w:start w:val="1"/>
+      <w:numFmt w:val="decimal"/>
+      <w:lvlText w:val="%8."/>
+      <w:lvlJc w:val="left"/>
+      <w:pPr>
+        <w:tabs>
+          <w:tab w:val="num" w:pos="5760"/>
+        </w:tabs>
+        <w:ind w:left="5760" w:hanging="360"/>
+      </w:pPr>
+    </w:lvl>
+    <w:lvl w:ilvl="8" w:tentative="1">
+      <w:start w:val="1"/>
+      <w:numFmt w:val="decimal"/>
+      <w:lvlText w:val="%9."/>
+      <w:lvlJc w:val="left"/>
+      <w:pPr>
+        <w:tabs>
+          <w:tab w:val="num" w:pos="6480"/>
+        </w:tabs>
+        <w:ind w:left="6480" w:hanging="360"/>
+      </w:pPr>
+    </w:lvl>
+  </w:abstractNum>
   <w:abstractNum w:abstractNumId="5" w15:restartNumberingAfterBreak="0">
-    <w:nsid w:val="7FA37725"/>
+    <w:nsid w:val="7C1930BB"/>
     <w:multiLevelType w:val="multilevel"/>
-    <w:tmpl w:val="523052BC"/>
+    <w:tmpl w:val="73F8822C"/>
     <w:lvl w:ilvl="0">
       <w:start w:val="1"/>
       <w:numFmt w:val="bullet"/>
@@ -50094,23 +50094,23 @@
       </w:rPr>
     </w:lvl>
   </w:abstractNum>
-  <w:num w:numId="1" w16cid:durableId="1882204050">
-    <w:abstractNumId w:val="0"/>
+  <w:num w:numId="1" w16cid:durableId="444934074">
+    <w:abstractNumId w:val="4"/>
   </w:num>
-  <w:num w:numId="2" w16cid:durableId="611979993">
+  <w:num w:numId="2" w16cid:durableId="1543713302">
+    <w:abstractNumId w:val="2"/>
+  </w:num>
+  <w:num w:numId="3" w16cid:durableId="649528728">
+    <w:abstractNumId w:val="1"/>
+  </w:num>
+  <w:num w:numId="4" w16cid:durableId="562955231">
     <w:abstractNumId w:val="5"/>
   </w:num>
-  <w:num w:numId="3" w16cid:durableId="1797022587">
+  <w:num w:numId="5" w16cid:durableId="695038700">
     <w:abstractNumId w:val="3"/>
   </w:num>
-  <w:num w:numId="4" w16cid:durableId="481000028">
-    <w:abstractNumId w:val="1"/>
-  </w:num>
-  <w:num w:numId="5" w16cid:durableId="685526317">
-    <w:abstractNumId w:val="2"/>
-  </w:num>
-  <w:num w:numId="6" w16cid:durableId="1868448077">
-    <w:abstractNumId w:val="4"/>
+  <w:num w:numId="6" w16cid:durableId="931815728">
+    <w:abstractNumId w:val="0"/>
   </w:num>
 </w:numbering>
 </file>
@@ -50806,7 +50806,7 @@
     <w:link w:val="HeaderChar"/>
     <w:uiPriority w:val="99"/>
     <w:unhideWhenUsed/>
-    <w:rsid w:val="0004777E"/>
+    <w:rsid w:val="00661026"/>
     <w:pPr>
       <w:tabs>
         <w:tab w:val="center" w:pos="4680"/>
@@ -50819,7 +50819,7 @@
     <w:basedOn w:val="DefaultParagraphFont"/>
     <w:link w:val="Header"/>
     <w:uiPriority w:val="99"/>
-    <w:rsid w:val="0004777E"/>
+    <w:rsid w:val="00661026"/>
     <w:rPr>
       <w:rFonts w:eastAsiaTheme="minorEastAsia"/>
       <w:sz w:val="24"/>
@@ -50832,7 +50832,7 @@
     <w:link w:val="FooterChar"/>
     <w:uiPriority w:val="99"/>
     <w:unhideWhenUsed/>
-    <w:rsid w:val="0004777E"/>
+    <w:rsid w:val="00661026"/>
     <w:pPr>
       <w:tabs>
         <w:tab w:val="center" w:pos="4680"/>
@@ -50845,7 +50845,7 @@
     <w:basedOn w:val="DefaultParagraphFont"/>
     <w:link w:val="Footer"/>
     <w:uiPriority w:val="99"/>
-    <w:rsid w:val="0004777E"/>
+    <w:rsid w:val="00661026"/>
     <w:rPr>
       <w:rFonts w:eastAsiaTheme="minorEastAsia"/>
       <w:sz w:val="24"/>
@@ -50858,7 +50858,7 @@
     <w:uiPriority w:val="99"/>
     <w:semiHidden/>
     <w:unhideWhenUsed/>
-    <w:rsid w:val="0004777E"/>
+    <w:rsid w:val="00661026"/>
   </w:style>
   <w:style w:type="paragraph" w:styleId="TOC1">
     <w:name w:val="toc 1"/>
@@ -50867,7 +50867,7 @@
     <w:autoRedefine/>
     <w:uiPriority w:val="39"/>
     <w:unhideWhenUsed/>
-    <w:rsid w:val="0004777E"/>
+    <w:rsid w:val="00661026"/>
     <w:pPr>
       <w:spacing w:after="100"/>
     </w:pPr>
@@ -50883,7 +50883,7 @@
     <w:autoRedefine/>
     <w:uiPriority w:val="39"/>
     <w:unhideWhenUsed/>
-    <w:rsid w:val="0004777E"/>
+    <w:rsid w:val="00661026"/>
     <w:pPr>
       <w:spacing w:after="100"/>
       <w:ind w:left="240"/>
@@ -50901,7 +50901,7 @@
     <w:uiPriority w:val="39"/>
     <w:semiHidden/>
     <w:unhideWhenUsed/>
-    <w:rsid w:val="0004777E"/>
+    <w:rsid w:val="00661026"/>
     <w:pPr>
       <w:spacing w:after="100"/>
       <w:ind w:left="480"/>

</xml_diff>

<commit_message>
Remove installer screenshot placeholder from the manual
</commit_message>
<xml_diff>
--- a/gem_expert/docs/Gemstone_Identification_Assistant_Report.docx
+++ b/gem_expert/docs/Gemstone_Identification_Assistant_Report.docx
@@ -145,7 +145,7 @@
         </w:rPr>
         <w:br w:type="page"/>
       </w:r>
-      <w:bookmarkStart w:id="0" w:name="_Toc241590739"/>
+      <w:bookmarkStart w:id="0" w:name="_Toc241593286"/>
       <w:r>
         <w:rPr>
           <w:rFonts w:eastAsia="Times New Roman"/>
@@ -285,7 +285,7 @@
         <w:rPr>
           <w:noProof/>
         </w:rPr>
-        <w:instrText xml:space="preserve"> PAGEREF _Toc241590739 \h </w:instrText>
+        <w:instrText xml:space="preserve"> PAGEREF _Toc241593286 \h </w:instrText>
       </w:r>
       <w:r>
         <w:rPr>
@@ -347,7 +347,7 @@
         <w:rPr>
           <w:noProof/>
         </w:rPr>
-        <w:instrText xml:space="preserve"> PAGEREF _Toc241590740 \h </w:instrText>
+        <w:instrText xml:space="preserve"> PAGEREF _Toc241593287 \h </w:instrText>
       </w:r>
       <w:r>
         <w:rPr>
@@ -409,7 +409,7 @@
         <w:rPr>
           <w:noProof/>
         </w:rPr>
-        <w:instrText xml:space="preserve"> PAGEREF _Toc241590741 \h </w:instrText>
+        <w:instrText xml:space="preserve"> PAGEREF _Toc241593288 \h </w:instrText>
       </w:r>
       <w:r>
         <w:rPr>
@@ -471,7 +471,7 @@
         <w:rPr>
           <w:noProof/>
         </w:rPr>
-        <w:instrText xml:space="preserve"> PAGEREF _Toc241590742 \h </w:instrText>
+        <w:instrText xml:space="preserve"> PAGEREF _Toc241593289 \h </w:instrText>
       </w:r>
       <w:r>
         <w:rPr>
@@ -533,7 +533,7 @@
         <w:rPr>
           <w:noProof/>
         </w:rPr>
-        <w:instrText xml:space="preserve"> PAGEREF _Toc241590743 \h </w:instrText>
+        <w:instrText xml:space="preserve"> PAGEREF _Toc241593290 \h </w:instrText>
       </w:r>
       <w:r>
         <w:rPr>
@@ -595,7 +595,7 @@
         <w:rPr>
           <w:noProof/>
         </w:rPr>
-        <w:instrText xml:space="preserve"> PAGEREF _Toc241590744 \h </w:instrText>
+        <w:instrText xml:space="preserve"> PAGEREF _Toc241593291 \h </w:instrText>
       </w:r>
       <w:r>
         <w:rPr>
@@ -657,7 +657,7 @@
         <w:rPr>
           <w:noProof/>
         </w:rPr>
-        <w:instrText xml:space="preserve"> PAGEREF _Toc241590745 \h </w:instrText>
+        <w:instrText xml:space="preserve"> PAGEREF _Toc241593292 \h </w:instrText>
       </w:r>
       <w:r>
         <w:rPr>
@@ -719,7 +719,7 @@
         <w:rPr>
           <w:noProof/>
         </w:rPr>
-        <w:instrText xml:space="preserve"> PAGEREF _Toc241590746 \h </w:instrText>
+        <w:instrText xml:space="preserve"> PAGEREF _Toc241593293 \h </w:instrText>
       </w:r>
       <w:r>
         <w:rPr>
@@ -781,7 +781,7 @@
         <w:rPr>
           <w:noProof/>
         </w:rPr>
-        <w:instrText xml:space="preserve"> PAGEREF _Toc241590747 \h </w:instrText>
+        <w:instrText xml:space="preserve"> PAGEREF _Toc241593294 \h </w:instrText>
       </w:r>
       <w:r>
         <w:rPr>
@@ -843,7 +843,7 @@
         <w:rPr>
           <w:noProof/>
         </w:rPr>
-        <w:instrText xml:space="preserve"> PAGEREF _Toc241590748 \h </w:instrText>
+        <w:instrText xml:space="preserve"> PAGEREF _Toc241593295 \h </w:instrText>
       </w:r>
       <w:r>
         <w:rPr>
@@ -905,7 +905,7 @@
         <w:rPr>
           <w:noProof/>
         </w:rPr>
-        <w:instrText xml:space="preserve"> PAGEREF _Toc241590749 \h </w:instrText>
+        <w:instrText xml:space="preserve"> PAGEREF _Toc241593296 \h </w:instrText>
       </w:r>
       <w:r>
         <w:rPr>
@@ -967,7 +967,7 @@
         <w:rPr>
           <w:noProof/>
         </w:rPr>
-        <w:instrText xml:space="preserve"> PAGEREF _Toc241590750 \h </w:instrText>
+        <w:instrText xml:space="preserve"> PAGEREF _Toc241593297 \h </w:instrText>
       </w:r>
       <w:r>
         <w:rPr>
@@ -1029,7 +1029,7 @@
         <w:rPr>
           <w:noProof/>
         </w:rPr>
-        <w:instrText xml:space="preserve"> PAGEREF _Toc241590751 \h </w:instrText>
+        <w:instrText xml:space="preserve"> PAGEREF _Toc241593298 \h </w:instrText>
       </w:r>
       <w:r>
         <w:rPr>
@@ -1091,7 +1091,7 @@
         <w:rPr>
           <w:noProof/>
         </w:rPr>
-        <w:instrText xml:space="preserve"> PAGEREF _Toc241590752 \h </w:instrText>
+        <w:instrText xml:space="preserve"> PAGEREF _Toc241593299 \h </w:instrText>
       </w:r>
       <w:r>
         <w:rPr>
@@ -1153,7 +1153,7 @@
         <w:rPr>
           <w:noProof/>
         </w:rPr>
-        <w:instrText xml:space="preserve"> PAGEREF _Toc241590753 \h </w:instrText>
+        <w:instrText xml:space="preserve"> PAGEREF _Toc241593300 \h </w:instrText>
       </w:r>
       <w:r>
         <w:rPr>
@@ -1215,7 +1215,7 @@
         <w:rPr>
           <w:noProof/>
         </w:rPr>
-        <w:instrText xml:space="preserve"> PAGEREF _Toc241590754 \h </w:instrText>
+        <w:instrText xml:space="preserve"> PAGEREF _Toc241593301 \h </w:instrText>
       </w:r>
       <w:r>
         <w:rPr>
@@ -1277,7 +1277,7 @@
         <w:rPr>
           <w:noProof/>
         </w:rPr>
-        <w:instrText xml:space="preserve"> PAGEREF _Toc241590755 \h </w:instrText>
+        <w:instrText xml:space="preserve"> PAGEREF _Toc241593302 \h </w:instrText>
       </w:r>
       <w:r>
         <w:rPr>
@@ -1339,7 +1339,7 @@
         <w:rPr>
           <w:noProof/>
         </w:rPr>
-        <w:instrText xml:space="preserve"> PAGEREF _Toc241590756 \h </w:instrText>
+        <w:instrText xml:space="preserve"> PAGEREF _Toc241593303 \h </w:instrText>
       </w:r>
       <w:r>
         <w:rPr>
@@ -1401,7 +1401,7 @@
         <w:rPr>
           <w:noProof/>
         </w:rPr>
-        <w:instrText xml:space="preserve"> PAGEREF _Toc241590757 \h </w:instrText>
+        <w:instrText xml:space="preserve"> PAGEREF _Toc241593304 \h </w:instrText>
       </w:r>
       <w:r>
         <w:rPr>
@@ -1463,7 +1463,7 @@
         <w:rPr>
           <w:noProof/>
         </w:rPr>
-        <w:instrText xml:space="preserve"> PAGEREF _Toc241590758 \h </w:instrText>
+        <w:instrText xml:space="preserve"> PAGEREF _Toc241593305 \h </w:instrText>
       </w:r>
       <w:r>
         <w:rPr>
@@ -1525,7 +1525,7 @@
         <w:rPr>
           <w:noProof/>
         </w:rPr>
-        <w:instrText xml:space="preserve"> PAGEREF _Toc241590759 \h </w:instrText>
+        <w:instrText xml:space="preserve"> PAGEREF _Toc241593306 \h </w:instrText>
       </w:r>
       <w:r>
         <w:rPr>
@@ -1587,7 +1587,7 @@
         <w:rPr>
           <w:noProof/>
         </w:rPr>
-        <w:instrText xml:space="preserve"> PAGEREF _Toc241590760 \h </w:instrText>
+        <w:instrText xml:space="preserve"> PAGEREF _Toc241593307 \h </w:instrText>
       </w:r>
       <w:r>
         <w:rPr>
@@ -1649,7 +1649,7 @@
         <w:rPr>
           <w:noProof/>
         </w:rPr>
-        <w:instrText xml:space="preserve"> PAGEREF _Toc241590761 \h </w:instrText>
+        <w:instrText xml:space="preserve"> PAGEREF _Toc241593308 \h </w:instrText>
       </w:r>
       <w:r>
         <w:rPr>
@@ -1711,7 +1711,7 @@
         <w:rPr>
           <w:noProof/>
         </w:rPr>
-        <w:instrText xml:space="preserve"> PAGEREF _Toc241590762 \h </w:instrText>
+        <w:instrText xml:space="preserve"> PAGEREF _Toc241593309 \h </w:instrText>
       </w:r>
       <w:r>
         <w:rPr>
@@ -1773,7 +1773,7 @@
         <w:rPr>
           <w:noProof/>
         </w:rPr>
-        <w:instrText xml:space="preserve"> PAGEREF _Toc241590763 \h </w:instrText>
+        <w:instrText xml:space="preserve"> PAGEREF _Toc241593310 \h </w:instrText>
       </w:r>
       <w:r>
         <w:rPr>
@@ -1835,7 +1835,7 @@
         <w:rPr>
           <w:noProof/>
         </w:rPr>
-        <w:instrText xml:space="preserve"> PAGEREF _Toc241590764 \h </w:instrText>
+        <w:instrText xml:space="preserve"> PAGEREF _Toc241593311 \h </w:instrText>
       </w:r>
       <w:r>
         <w:rPr>
@@ -1898,7 +1898,7 @@
         <w:rPr>
           <w:noProof/>
         </w:rPr>
-        <w:instrText xml:space="preserve"> PAGEREF _Toc241590765 \h </w:instrText>
+        <w:instrText xml:space="preserve"> PAGEREF _Toc241593312 \h </w:instrText>
       </w:r>
       <w:r>
         <w:rPr>
@@ -1960,7 +1960,7 @@
         <w:rPr>
           <w:noProof/>
         </w:rPr>
-        <w:instrText xml:space="preserve"> PAGEREF _Toc241590766 \h </w:instrText>
+        <w:instrText xml:space="preserve"> PAGEREF _Toc241593313 \h </w:instrText>
       </w:r>
       <w:r>
         <w:rPr>
@@ -2022,7 +2022,7 @@
         <w:rPr>
           <w:noProof/>
         </w:rPr>
-        <w:instrText xml:space="preserve"> PAGEREF _Toc241590767 \h </w:instrText>
+        <w:instrText xml:space="preserve"> PAGEREF _Toc241593314 \h </w:instrText>
       </w:r>
       <w:r>
         <w:rPr>
@@ -2084,7 +2084,7 @@
         <w:rPr>
           <w:noProof/>
         </w:rPr>
-        <w:instrText xml:space="preserve"> PAGEREF _Toc241590768 \h </w:instrText>
+        <w:instrText xml:space="preserve"> PAGEREF _Toc241593315 \h </w:instrText>
       </w:r>
       <w:r>
         <w:rPr>
@@ -2146,7 +2146,7 @@
         <w:rPr>
           <w:noProof/>
         </w:rPr>
-        <w:instrText xml:space="preserve"> PAGEREF _Toc241590769 \h </w:instrText>
+        <w:instrText xml:space="preserve"> PAGEREF _Toc241593316 \h </w:instrText>
       </w:r>
       <w:r>
         <w:rPr>
@@ -2208,7 +2208,7 @@
         <w:rPr>
           <w:noProof/>
         </w:rPr>
-        <w:instrText xml:space="preserve"> PAGEREF _Toc241590770 \h </w:instrText>
+        <w:instrText xml:space="preserve"> PAGEREF _Toc241593317 \h </w:instrText>
       </w:r>
       <w:r>
         <w:rPr>
@@ -2270,7 +2270,7 @@
         <w:rPr>
           <w:noProof/>
         </w:rPr>
-        <w:instrText xml:space="preserve"> PAGEREF _Toc241590771 \h </w:instrText>
+        <w:instrText xml:space="preserve"> PAGEREF _Toc241593318 \h </w:instrText>
       </w:r>
       <w:r>
         <w:rPr>
@@ -2332,7 +2332,7 @@
         <w:rPr>
           <w:noProof/>
         </w:rPr>
-        <w:instrText xml:space="preserve"> PAGEREF _Toc241590772 \h </w:instrText>
+        <w:instrText xml:space="preserve"> PAGEREF _Toc241593319 \h </w:instrText>
       </w:r>
       <w:r>
         <w:rPr>
@@ -2394,7 +2394,7 @@
         <w:rPr>
           <w:noProof/>
         </w:rPr>
-        <w:instrText xml:space="preserve"> PAGEREF _Toc241590773 \h </w:instrText>
+        <w:instrText xml:space="preserve"> PAGEREF _Toc241593320 \h </w:instrText>
       </w:r>
       <w:r>
         <w:rPr>
@@ -2456,7 +2456,7 @@
         <w:rPr>
           <w:noProof/>
         </w:rPr>
-        <w:instrText xml:space="preserve"> PAGEREF _Toc241590774 \h </w:instrText>
+        <w:instrText xml:space="preserve"> PAGEREF _Toc241593321 \h </w:instrText>
       </w:r>
       <w:r>
         <w:rPr>
@@ -2518,7 +2518,7 @@
         <w:rPr>
           <w:noProof/>
         </w:rPr>
-        <w:instrText xml:space="preserve"> PAGEREF _Toc241590775 \h </w:instrText>
+        <w:instrText xml:space="preserve"> PAGEREF _Toc241593322 \h </w:instrText>
       </w:r>
       <w:r>
         <w:rPr>
@@ -2580,7 +2580,7 @@
         <w:rPr>
           <w:noProof/>
         </w:rPr>
-        <w:instrText xml:space="preserve"> PAGEREF _Toc241590776 \h </w:instrText>
+        <w:instrText xml:space="preserve"> PAGEREF _Toc241593323 \h </w:instrText>
       </w:r>
       <w:r>
         <w:rPr>
@@ -2642,7 +2642,7 @@
         <w:rPr>
           <w:noProof/>
         </w:rPr>
-        <w:instrText xml:space="preserve"> PAGEREF _Toc241590777 \h </w:instrText>
+        <w:instrText xml:space="preserve"> PAGEREF _Toc241593324 \h </w:instrText>
       </w:r>
       <w:r>
         <w:rPr>
@@ -2704,7 +2704,7 @@
         <w:rPr>
           <w:noProof/>
         </w:rPr>
-        <w:instrText xml:space="preserve"> PAGEREF _Toc241590778 \h </w:instrText>
+        <w:instrText xml:space="preserve"> PAGEREF _Toc241593325 \h </w:instrText>
       </w:r>
       <w:r>
         <w:rPr>
@@ -2766,7 +2766,7 @@
         <w:rPr>
           <w:noProof/>
         </w:rPr>
-        <w:instrText xml:space="preserve"> PAGEREF _Toc241590779 \h </w:instrText>
+        <w:instrText xml:space="preserve"> PAGEREF _Toc241593326 \h </w:instrText>
       </w:r>
       <w:r>
         <w:rPr>
@@ -2828,7 +2828,7 @@
         <w:rPr>
           <w:noProof/>
         </w:rPr>
-        <w:instrText xml:space="preserve"> PAGEREF _Toc241590780 \h </w:instrText>
+        <w:instrText xml:space="preserve"> PAGEREF _Toc241593327 \h </w:instrText>
       </w:r>
       <w:r>
         <w:rPr>
@@ -2890,7 +2890,7 @@
         <w:rPr>
           <w:noProof/>
         </w:rPr>
-        <w:instrText xml:space="preserve"> PAGEREF _Toc241590781 \h </w:instrText>
+        <w:instrText xml:space="preserve"> PAGEREF _Toc241593328 \h </w:instrText>
       </w:r>
       <w:r>
         <w:rPr>
@@ -2952,7 +2952,7 @@
         <w:rPr>
           <w:noProof/>
         </w:rPr>
-        <w:instrText xml:space="preserve"> PAGEREF _Toc241590782 \h </w:instrText>
+        <w:instrText xml:space="preserve"> PAGEREF _Toc241593329 \h </w:instrText>
       </w:r>
       <w:r>
         <w:rPr>
@@ -3014,7 +3014,7 @@
         <w:rPr>
           <w:noProof/>
         </w:rPr>
-        <w:instrText xml:space="preserve"> PAGEREF _Toc241590783 \h </w:instrText>
+        <w:instrText xml:space="preserve"> PAGEREF _Toc241593330 \h </w:instrText>
       </w:r>
       <w:r>
         <w:rPr>
@@ -3062,7 +3062,7 @@
         </w:rPr>
         <w:br w:type="page"/>
       </w:r>
-      <w:bookmarkStart w:id="1" w:name="_Toc241590740"/>
+      <w:bookmarkStart w:id="1" w:name="_Toc241593287"/>
       <w:r>
         <w:rPr>
           <w:rFonts w:eastAsia="Times New Roman"/>
@@ -3079,7 +3079,7 @@
           <w:rFonts w:eastAsia="Times New Roman"/>
         </w:rPr>
       </w:pPr>
-      <w:bookmarkStart w:id="2" w:name="_Toc241590741"/>
+      <w:bookmarkStart w:id="2" w:name="_Toc241593288"/>
       <w:r>
         <w:rPr>
           <w:rFonts w:eastAsia="Times New Roman"/>
@@ -3106,7 +3106,7 @@
           <w:rFonts w:eastAsia="Times New Roman"/>
         </w:rPr>
       </w:pPr>
-      <w:bookmarkStart w:id="3" w:name="_Toc241590742"/>
+      <w:bookmarkStart w:id="3" w:name="_Toc241593289"/>
       <w:r>
         <w:rPr>
           <w:rFonts w:eastAsia="Times New Roman"/>
@@ -3143,7 +3143,7 @@
           <w:rFonts w:eastAsia="Times New Roman"/>
         </w:rPr>
       </w:pPr>
-      <w:bookmarkStart w:id="4" w:name="_Toc241590743"/>
+      <w:bookmarkStart w:id="4" w:name="_Toc241593290"/>
       <w:r>
         <w:rPr>
           <w:rFonts w:eastAsia="Times New Roman"/>
@@ -3301,7 +3301,7 @@
           <w:rFonts w:eastAsia="Times New Roman"/>
         </w:rPr>
       </w:pPr>
-      <w:bookmarkStart w:id="5" w:name="_Toc241590744"/>
+      <w:bookmarkStart w:id="5" w:name="_Toc241593291"/>
       <w:r>
         <w:rPr>
           <w:rFonts w:eastAsia="Times New Roman"/>
@@ -3328,7 +3328,7 @@
           <w:rFonts w:eastAsia="Times New Roman"/>
         </w:rPr>
       </w:pPr>
-      <w:bookmarkStart w:id="6" w:name="_Toc241590745"/>
+      <w:bookmarkStart w:id="6" w:name="_Toc241593292"/>
       <w:r>
         <w:rPr>
           <w:rFonts w:eastAsia="Times New Roman"/>
@@ -4178,7 +4178,7 @@
           <w:rFonts w:eastAsia="Times New Roman"/>
         </w:rPr>
       </w:pPr>
-      <w:bookmarkStart w:id="7" w:name="_Toc241590746"/>
+      <w:bookmarkStart w:id="7" w:name="_Toc241593293"/>
       <w:r>
         <w:rPr>
           <w:rFonts w:eastAsia="Times New Roman"/>
@@ -4216,7 +4216,7 @@
           <w:rFonts w:eastAsia="Times New Roman"/>
         </w:rPr>
       </w:pPr>
-      <w:bookmarkStart w:id="8" w:name="_Toc241590747"/>
+      <w:bookmarkStart w:id="8" w:name="_Toc241593294"/>
       <w:r>
         <w:rPr>
           <w:rFonts w:eastAsia="Times New Roman"/>
@@ -4243,7 +4243,7 @@
           <w:noProof/>
         </w:rPr>
         <w:drawing>
-          <wp:inline distT="0" distB="0" distL="0" distR="0" wp14:anchorId="61A7C955" wp14:editId="582973A1">
+          <wp:inline distT="0" distB="0" distL="0" distR="0" wp14:anchorId="64E12056" wp14:editId="07885726">
             <wp:extent cx="5715000" cy="1272540"/>
             <wp:effectExtent l="0" t="0" r="0" b="3810"/>
             <wp:docPr id="1" name="Picture 1"/>
@@ -4308,7 +4308,7 @@
           <w:rFonts w:eastAsia="Times New Roman"/>
         </w:rPr>
       </w:pPr>
-      <w:bookmarkStart w:id="9" w:name="_Toc241590748"/>
+      <w:bookmarkStart w:id="9" w:name="_Toc241593295"/>
       <w:r>
         <w:rPr>
           <w:rFonts w:eastAsia="Times New Roman"/>
@@ -7443,7 +7443,7 @@
           <w:rFonts w:eastAsia="Times New Roman"/>
         </w:rPr>
       </w:pPr>
-      <w:bookmarkStart w:id="10" w:name="_Toc241590749"/>
+      <w:bookmarkStart w:id="10" w:name="_Toc241593296"/>
       <w:r>
         <w:rPr>
           <w:rFonts w:eastAsia="Times New Roman"/>
@@ -7675,7 +7675,7 @@
           <w:rFonts w:eastAsia="Times New Roman"/>
         </w:rPr>
       </w:pPr>
-      <w:bookmarkStart w:id="11" w:name="_Toc241590750"/>
+      <w:bookmarkStart w:id="11" w:name="_Toc241593297"/>
       <w:r>
         <w:rPr>
           <w:rFonts w:eastAsia="Times New Roman"/>
@@ -15799,7 +15799,7 @@
           <w:rFonts w:eastAsia="Times New Roman"/>
         </w:rPr>
       </w:pPr>
-      <w:bookmarkStart w:id="12" w:name="_Toc241590751"/>
+      <w:bookmarkStart w:id="12" w:name="_Toc241593298"/>
       <w:r>
         <w:rPr>
           <w:rFonts w:eastAsia="Times New Roman"/>
@@ -17261,7 +17261,7 @@
           <w:noProof/>
         </w:rPr>
         <w:drawing>
-          <wp:inline distT="0" distB="0" distL="0" distR="0" wp14:anchorId="453B1819" wp14:editId="3A75E6F1">
+          <wp:inline distT="0" distB="0" distL="0" distR="0" wp14:anchorId="0EE53FC9" wp14:editId="3E275F85">
             <wp:extent cx="5524500" cy="3208020"/>
             <wp:effectExtent l="0" t="0" r="0" b="0"/>
             <wp:docPr id="2" name="Picture 2"/>
@@ -17435,7 +17435,7 @@
           <w:rFonts w:eastAsia="Times New Roman"/>
         </w:rPr>
       </w:pPr>
-      <w:bookmarkStart w:id="13" w:name="_Toc241590752"/>
+      <w:bookmarkStart w:id="13" w:name="_Toc241593299"/>
       <w:r>
         <w:rPr>
           <w:rFonts w:eastAsia="Times New Roman"/>
@@ -18403,7 +18403,7 @@
           <w:rFonts w:eastAsia="Times New Roman"/>
         </w:rPr>
       </w:pPr>
-      <w:bookmarkStart w:id="14" w:name="_Toc241590753"/>
+      <w:bookmarkStart w:id="14" w:name="_Toc241593300"/>
       <w:r>
         <w:rPr>
           <w:rFonts w:eastAsia="Times New Roman"/>
@@ -18419,7 +18419,7 @@
           <w:rFonts w:eastAsia="Times New Roman"/>
         </w:rPr>
       </w:pPr>
-      <w:bookmarkStart w:id="15" w:name="_Toc241590754"/>
+      <w:bookmarkStart w:id="15" w:name="_Toc241593301"/>
       <w:r>
         <w:rPr>
           <w:rFonts w:eastAsia="Times New Roman"/>
@@ -18456,7 +18456,7 @@
         </w:rPr>
         <w:lastRenderedPageBreak/>
         <w:drawing>
-          <wp:inline distT="0" distB="0" distL="0" distR="0" wp14:anchorId="4C2730EC" wp14:editId="1CBA8465">
+          <wp:inline distT="0" distB="0" distL="0" distR="0" wp14:anchorId="4A91B5D2" wp14:editId="58C950A3">
             <wp:extent cx="5715000" cy="3954780"/>
             <wp:effectExtent l="0" t="0" r="0" b="7620"/>
             <wp:docPr id="3" name="Picture 3"/>
@@ -19237,7 +19237,7 @@
           <w:rFonts w:eastAsia="Times New Roman"/>
         </w:rPr>
       </w:pPr>
-      <w:bookmarkStart w:id="16" w:name="_Toc241590755"/>
+      <w:bookmarkStart w:id="16" w:name="_Toc241593302"/>
       <w:r>
         <w:rPr>
           <w:rFonts w:eastAsia="Times New Roman"/>
@@ -19433,7 +19433,7 @@
           <w:rFonts w:eastAsia="Times New Roman"/>
         </w:rPr>
       </w:pPr>
-      <w:bookmarkStart w:id="17" w:name="_Toc241590756"/>
+      <w:bookmarkStart w:id="17" w:name="_Toc241593303"/>
       <w:r>
         <w:rPr>
           <w:rFonts w:eastAsia="Times New Roman"/>
@@ -19564,7 +19564,7 @@
           <w:rFonts w:eastAsia="Times New Roman"/>
         </w:rPr>
       </w:pPr>
-      <w:bookmarkStart w:id="18" w:name="_Toc241590757"/>
+      <w:bookmarkStart w:id="18" w:name="_Toc241593304"/>
       <w:r>
         <w:rPr>
           <w:rFonts w:eastAsia="Times New Roman"/>
@@ -19685,7 +19685,7 @@
           <w:rFonts w:eastAsia="Times New Roman"/>
         </w:rPr>
       </w:pPr>
-      <w:bookmarkStart w:id="19" w:name="_Toc241590758"/>
+      <w:bookmarkStart w:id="19" w:name="_Toc241593305"/>
       <w:r>
         <w:rPr>
           <w:rFonts w:eastAsia="Times New Roman"/>
@@ -19792,7 +19792,7 @@
         </w:rPr>
         <w:lastRenderedPageBreak/>
         <w:drawing>
-          <wp:inline distT="0" distB="0" distL="0" distR="0" wp14:anchorId="2CC646EC" wp14:editId="424CA07A">
+          <wp:inline distT="0" distB="0" distL="0" distR="0" wp14:anchorId="39E69913" wp14:editId="212372E3">
             <wp:extent cx="4480560" cy="4960620"/>
             <wp:effectExtent l="0" t="0" r="0" b="0"/>
             <wp:docPr id="4" name="Picture 4"/>
@@ -19857,7 +19857,7 @@
           <w:rFonts w:eastAsia="Times New Roman"/>
         </w:rPr>
       </w:pPr>
-      <w:bookmarkStart w:id="20" w:name="_Toc241590759"/>
+      <w:bookmarkStart w:id="20" w:name="_Toc241593306"/>
       <w:r>
         <w:rPr>
           <w:rFonts w:eastAsia="Times New Roman"/>
@@ -19977,7 +19977,7 @@
           <w:rFonts w:eastAsia="Times New Roman"/>
         </w:rPr>
       </w:pPr>
-      <w:bookmarkStart w:id="21" w:name="_Toc241590760"/>
+      <w:bookmarkStart w:id="21" w:name="_Toc241593307"/>
       <w:r>
         <w:rPr>
           <w:rFonts w:eastAsia="Times New Roman"/>
@@ -20244,7 +20244,7 @@
           <w:noProof/>
         </w:rPr>
         <w:drawing>
-          <wp:inline distT="0" distB="0" distL="0" distR="0" wp14:anchorId="63717502" wp14:editId="5C21EE29">
+          <wp:inline distT="0" distB="0" distL="0" distR="0" wp14:anchorId="1CB9FED3" wp14:editId="5396BC79">
             <wp:extent cx="5334000" cy="3528060"/>
             <wp:effectExtent l="0" t="0" r="0" b="0"/>
             <wp:docPr id="5" name="Picture 5"/>
@@ -20313,7 +20313,7 @@
         </w:rPr>
         <w:lastRenderedPageBreak/>
         <w:drawing>
-          <wp:inline distT="0" distB="0" distL="0" distR="0" wp14:anchorId="08C34C28" wp14:editId="684207EA">
+          <wp:inline distT="0" distB="0" distL="0" distR="0" wp14:anchorId="6FC071D4" wp14:editId="64A417DD">
             <wp:extent cx="4953000" cy="6492240"/>
             <wp:effectExtent l="0" t="0" r="0" b="3810"/>
             <wp:docPr id="6" name="Picture 6"/>
@@ -20382,7 +20382,7 @@
         </w:rPr>
         <w:lastRenderedPageBreak/>
         <w:drawing>
-          <wp:inline distT="0" distB="0" distL="0" distR="0" wp14:anchorId="7C576D27" wp14:editId="14E7177B">
+          <wp:inline distT="0" distB="0" distL="0" distR="0" wp14:anchorId="3F19CBBB" wp14:editId="4CF2D252">
             <wp:extent cx="4480560" cy="3589020"/>
             <wp:effectExtent l="0" t="0" r="0" b="0"/>
             <wp:docPr id="7" name="Picture 7"/>
@@ -20450,7 +20450,7 @@
           <w:noProof/>
         </w:rPr>
         <w:drawing>
-          <wp:inline distT="0" distB="0" distL="0" distR="0" wp14:anchorId="3BF8DD12" wp14:editId="72236064">
+          <wp:inline distT="0" distB="0" distL="0" distR="0" wp14:anchorId="144E4E57" wp14:editId="4DEF6BC7">
             <wp:extent cx="5334000" cy="3314700"/>
             <wp:effectExtent l="0" t="0" r="0" b="0"/>
             <wp:docPr id="8" name="Picture 8"/>
@@ -20515,7 +20515,7 @@
           <w:rFonts w:eastAsia="Times New Roman"/>
         </w:rPr>
       </w:pPr>
-      <w:bookmarkStart w:id="22" w:name="_Toc241590761"/>
+      <w:bookmarkStart w:id="22" w:name="_Toc241593308"/>
       <w:r>
         <w:rPr>
           <w:rFonts w:eastAsia="Times New Roman"/>
@@ -21737,7 +21737,7 @@
           <w:rFonts w:eastAsia="Times New Roman"/>
         </w:rPr>
       </w:pPr>
-      <w:bookmarkStart w:id="23" w:name="_Toc241590762"/>
+      <w:bookmarkStart w:id="23" w:name="_Toc241593309"/>
       <w:r>
         <w:rPr>
           <w:rFonts w:eastAsia="Times New Roman"/>
@@ -21771,7 +21771,7 @@
           <w:rFonts w:eastAsia="Times New Roman"/>
         </w:rPr>
       </w:pPr>
-      <w:bookmarkStart w:id="24" w:name="_Toc241590763"/>
+      <w:bookmarkStart w:id="24" w:name="_Toc241593310"/>
       <w:r>
         <w:rPr>
           <w:rFonts w:eastAsia="Times New Roman"/>
@@ -21975,7 +21975,7 @@
         </w:rPr>
         <w:lastRenderedPageBreak/>
         <w:drawing>
-          <wp:inline distT="0" distB="0" distL="0" distR="0" wp14:anchorId="7137B181" wp14:editId="2EB409DB">
+          <wp:inline distT="0" distB="0" distL="0" distR="0" wp14:anchorId="37FC04A3" wp14:editId="2A0BADEB">
             <wp:extent cx="4480560" cy="5646420"/>
             <wp:effectExtent l="0" t="0" r="0" b="0"/>
             <wp:docPr id="9" name="Picture 9"/>
@@ -22040,7 +22040,7 @@
           <w:rFonts w:eastAsia="Times New Roman"/>
         </w:rPr>
       </w:pPr>
-      <w:bookmarkStart w:id="25" w:name="_Toc241590764"/>
+      <w:bookmarkStart w:id="25" w:name="_Toc241593311"/>
       <w:r>
         <w:rPr>
           <w:rFonts w:eastAsia="Times New Roman"/>
@@ -22119,7 +22119,7 @@
         </w:rPr>
         <w:lastRenderedPageBreak/>
         <w:drawing>
-          <wp:inline distT="0" distB="0" distL="0" distR="0" wp14:anchorId="5368DCC8" wp14:editId="7731C885">
+          <wp:inline distT="0" distB="0" distL="0" distR="0" wp14:anchorId="0169A914" wp14:editId="0DD75B02">
             <wp:extent cx="4290060" cy="2926080"/>
             <wp:effectExtent l="0" t="0" r="0" b="7620"/>
             <wp:docPr id="10" name="Picture 10"/>
@@ -22184,7 +22184,7 @@
           <w:rFonts w:eastAsia="Times New Roman"/>
         </w:rPr>
       </w:pPr>
-      <w:bookmarkStart w:id="26" w:name="_Toc241590765"/>
+      <w:bookmarkStart w:id="26" w:name="_Toc241593312"/>
       <w:r>
         <w:rPr>
           <w:rFonts w:eastAsia="Times New Roman"/>
@@ -22221,7 +22221,7 @@
           <w:noProof/>
         </w:rPr>
         <w:drawing>
-          <wp:inline distT="0" distB="0" distL="0" distR="0" wp14:anchorId="627AF5AC" wp14:editId="3A7036CA">
+          <wp:inline distT="0" distB="0" distL="0" distR="0" wp14:anchorId="79C43D07" wp14:editId="5466E538">
             <wp:extent cx="4480560" cy="1325880"/>
             <wp:effectExtent l="0" t="0" r="0" b="7620"/>
             <wp:docPr id="11" name="Picture 11"/>
@@ -22286,7 +22286,7 @@
           <w:rFonts w:eastAsia="Times New Roman"/>
         </w:rPr>
       </w:pPr>
-      <w:bookmarkStart w:id="27" w:name="_Toc241590766"/>
+      <w:bookmarkStart w:id="27" w:name="_Toc241593313"/>
       <w:r>
         <w:rPr>
           <w:rFonts w:eastAsia="Times New Roman"/>
@@ -22317,7 +22317,7 @@
           <w:noProof/>
         </w:rPr>
         <w:drawing>
-          <wp:inline distT="0" distB="0" distL="0" distR="0" wp14:anchorId="1D2686F5" wp14:editId="38B0E01C">
+          <wp:inline distT="0" distB="0" distL="0" distR="0" wp14:anchorId="04ACEC30" wp14:editId="5E3A1771">
             <wp:extent cx="4480560" cy="4655820"/>
             <wp:effectExtent l="0" t="0" r="0" b="0"/>
             <wp:docPr id="12" name="Picture 12"/>
@@ -22386,7 +22386,7 @@
         </w:rPr>
         <w:lastRenderedPageBreak/>
         <w:drawing>
-          <wp:inline distT="0" distB="0" distL="0" distR="0" wp14:anchorId="235491D2" wp14:editId="78536602">
+          <wp:inline distT="0" distB="0" distL="0" distR="0" wp14:anchorId="5096336B" wp14:editId="3E83A610">
             <wp:extent cx="4480560" cy="3733800"/>
             <wp:effectExtent l="0" t="0" r="0" b="0"/>
             <wp:docPr id="13" name="Picture 13"/>
@@ -22451,7 +22451,7 @@
           <w:rFonts w:eastAsia="Times New Roman"/>
         </w:rPr>
       </w:pPr>
-      <w:bookmarkStart w:id="28" w:name="_Toc241590767"/>
+      <w:bookmarkStart w:id="28" w:name="_Toc241593314"/>
       <w:r>
         <w:rPr>
           <w:rFonts w:eastAsia="Times New Roman"/>
@@ -22467,7 +22467,7 @@
           <w:rFonts w:eastAsia="Times New Roman"/>
         </w:rPr>
       </w:pPr>
-      <w:bookmarkStart w:id="29" w:name="_Toc241590768"/>
+      <w:bookmarkStart w:id="29" w:name="_Toc241593315"/>
       <w:r>
         <w:rPr>
           <w:rFonts w:eastAsia="Times New Roman"/>
@@ -22491,7 +22491,7 @@
           <w:rFonts w:eastAsia="Times New Roman"/>
         </w:rPr>
       </w:pPr>
-      <w:bookmarkStart w:id="30" w:name="_Toc241590769"/>
+      <w:bookmarkStart w:id="30" w:name="_Toc241593316"/>
       <w:r>
         <w:rPr>
           <w:rFonts w:eastAsia="Times New Roman"/>
@@ -28055,7 +28055,7 @@
           <w:rFonts w:eastAsia="Times New Roman"/>
         </w:rPr>
       </w:pPr>
-      <w:bookmarkStart w:id="31" w:name="_Toc241590770"/>
+      <w:bookmarkStart w:id="31" w:name="_Toc241593317"/>
       <w:r>
         <w:rPr>
           <w:rFonts w:eastAsia="Times New Roman"/>
@@ -28800,7 +28800,7 @@
           <w:rFonts w:eastAsia="Times New Roman"/>
         </w:rPr>
       </w:pPr>
-      <w:bookmarkStart w:id="32" w:name="_Toc241590771"/>
+      <w:bookmarkStart w:id="32" w:name="_Toc241593318"/>
       <w:r>
         <w:rPr>
           <w:rFonts w:eastAsia="Times New Roman"/>
@@ -29766,7 +29766,7 @@
           <w:rFonts w:eastAsia="Times New Roman"/>
         </w:rPr>
       </w:pPr>
-      <w:bookmarkStart w:id="33" w:name="_Toc241590772"/>
+      <w:bookmarkStart w:id="33" w:name="_Toc241593319"/>
       <w:r>
         <w:rPr>
           <w:rFonts w:eastAsia="Times New Roman"/>
@@ -30732,7 +30732,7 @@
           <w:rFonts w:eastAsia="Times New Roman"/>
         </w:rPr>
       </w:pPr>
-      <w:bookmarkStart w:id="34" w:name="_Toc241590773"/>
+      <w:bookmarkStart w:id="34" w:name="_Toc241593320"/>
       <w:r>
         <w:rPr>
           <w:rFonts w:eastAsia="Times New Roman"/>
@@ -30766,7 +30766,7 @@
           <w:rFonts w:eastAsia="Times New Roman"/>
         </w:rPr>
       </w:pPr>
-      <w:bookmarkStart w:id="35" w:name="_Toc241590774"/>
+      <w:bookmarkStart w:id="35" w:name="_Toc241593321"/>
       <w:r>
         <w:rPr>
           <w:rFonts w:eastAsia="Times New Roman"/>
@@ -30782,7 +30782,7 @@
           <w:rFonts w:eastAsia="Times New Roman"/>
         </w:rPr>
       </w:pPr>
-      <w:bookmarkStart w:id="36" w:name="_Toc241590775"/>
+      <w:bookmarkStart w:id="36" w:name="_Toc241593322"/>
       <w:r>
         <w:rPr>
           <w:rFonts w:eastAsia="Times New Roman"/>
@@ -30828,7 +30828,7 @@
           <w:rFonts w:eastAsia="Times New Roman"/>
         </w:rPr>
       </w:pPr>
-      <w:bookmarkStart w:id="37" w:name="_Toc241590776"/>
+      <w:bookmarkStart w:id="37" w:name="_Toc241593323"/>
       <w:r>
         <w:rPr>
           <w:rFonts w:eastAsia="Times New Roman"/>
@@ -30868,7 +30868,7 @@
           <w:rFonts w:eastAsia="Times New Roman"/>
         </w:rPr>
       </w:pPr>
-      <w:bookmarkStart w:id="38" w:name="_Toc241590777"/>
+      <w:bookmarkStart w:id="38" w:name="_Toc241593324"/>
       <w:r>
         <w:rPr>
           <w:rFonts w:eastAsia="Times New Roman"/>
@@ -31119,7 +31119,7 @@
           <w:rFonts w:eastAsia="Times New Roman"/>
         </w:rPr>
       </w:pPr>
-      <w:bookmarkStart w:id="39" w:name="_Toc241590778"/>
+      <w:bookmarkStart w:id="39" w:name="_Toc241593325"/>
       <w:r>
         <w:rPr>
           <w:rFonts w:eastAsia="Times New Roman"/>
@@ -31230,7 +31230,7 @@
           <w:rFonts w:eastAsia="Times New Roman"/>
         </w:rPr>
       </w:pPr>
-      <w:bookmarkStart w:id="40" w:name="_Toc241590779"/>
+      <w:bookmarkStart w:id="40" w:name="_Toc241593326"/>
       <w:r>
         <w:rPr>
           <w:rFonts w:eastAsia="Times New Roman"/>
@@ -31276,7 +31276,7 @@
         </w:rPr>
         <w:br w:type="page"/>
       </w:r>
-      <w:bookmarkStart w:id="41" w:name="_Toc241590780"/>
+      <w:bookmarkStart w:id="41" w:name="_Toc241593327"/>
       <w:r>
         <w:rPr>
           <w:rFonts w:eastAsia="Times New Roman"/>
@@ -31649,7 +31649,7 @@
         </w:rPr>
         <w:br w:type="page"/>
       </w:r>
-      <w:bookmarkStart w:id="42" w:name="_Toc241590781"/>
+      <w:bookmarkStart w:id="42" w:name="_Toc241593328"/>
       <w:r>
         <w:rPr>
           <w:rFonts w:eastAsia="Times New Roman"/>
@@ -43514,7 +43514,7 @@
         </w:rPr>
         <w:br w:type="page"/>
       </w:r>
-      <w:bookmarkStart w:id="43" w:name="_Toc241590782"/>
+      <w:bookmarkStart w:id="43" w:name="_Toc241593329"/>
       <w:r>
         <w:rPr>
           <w:rFonts w:eastAsia="Times New Roman"/>
@@ -43996,7 +43996,7 @@
           <w:rFonts w:eastAsia="Times New Roman"/>
         </w:rPr>
       </w:pPr>
-      <w:bookmarkStart w:id="44" w:name="_Toc241590783"/>
+      <w:bookmarkStart w:id="44" w:name="_Toc241593330"/>
       <w:r>
         <w:rPr>
           <w:rFonts w:eastAsia="Times New Roman"/>
@@ -44508,235 +44508,9 @@
 <file path=word/numbering.xml><?xml version="1.0" encoding="utf-8"?>
 <w:numbering xmlns:wpc="http://schemas.microsoft.com/office/word/2010/wordprocessingCanvas" xmlns:cx="http://schemas.microsoft.com/office/drawing/2014/chartex" xmlns:cx1="http://schemas.microsoft.com/office/drawing/2015/9/8/chartex" xmlns:cx2="http://schemas.microsoft.com/office/drawing/2015/10/21/chartex" xmlns:cx3="http://schemas.microsoft.com/office/drawing/2016/5/9/chartex" xmlns:cx4="http://schemas.microsoft.com/office/drawing/2016/5/10/chartex" xmlns:cx5="http://schemas.microsoft.com/office/drawing/2016/5/11/chartex" xmlns:cx6="http://schemas.microsoft.com/office/drawing/2016/5/12/chartex" xmlns:cx7="http://schemas.microsoft.com/office/drawing/2016/5/13/chartex" xmlns:cx8="http://schemas.microsoft.com/office/drawing/2016/5/14/chartex" xmlns:mc="http://schemas.openxmlformats.org/markup-compatibility/2006" xmlns:aink="http://schemas.microsoft.com/office/drawing/2016/ink" xmlns:am3d="http://schemas.microsoft.com/office/drawing/2017/model3d" xmlns:o="urn:schemas-microsoft-com:office:office" xmlns:oel="http://schemas.microsoft.com/office/2019/extlst" xmlns:r="http://schemas.openxmlformats.org/officeDocument/2006/relationships" xmlns:m="http://schemas.openxmlformats.org/officeDocument/2006/math" xmlns:v="urn:schemas-microsoft-com:vml" xmlns:wp14="http://schemas.microsoft.com/office/word/2010/wordprocessingDrawing" xmlns:wp="http://schemas.openxmlformats.org/drawingml/2006/wordprocessingDrawing" xmlns:w10="urn:schemas-microsoft-com:office:word" xmlns:w="http://schemas.openxmlformats.org/wordprocessingml/2006/main" xmlns:w14="http://schemas.microsoft.com/office/word/2010/wordml" xmlns:w15="http://schemas.microsoft.com/office/word/2012/wordml" xmlns:w16cex="http://schemas.microsoft.com/office/word/2018/wordml/cex" xmlns:w16cid="http://schemas.microsoft.com/office/word/2016/wordml/cid" xmlns:w16="http://schemas.microsoft.com/office/word/2018/wordml" xmlns:w16du="http://schemas.microsoft.com/office/word/2023/wordml/word16du" xmlns:w16sdtdh="http://schemas.microsoft.com/office/word/2020/wordml/sdtdatahash" xmlns:w16sdtfl="http://schemas.microsoft.com/office/word/2024/wordml/sdtformatlock" xmlns:w16se="http://schemas.microsoft.com/office/word/2015/wordml/symex" xmlns:wpg="http://schemas.microsoft.com/office/word/2010/wordprocessingGroup" xmlns:wpi="http://schemas.microsoft.com/office/word/2010/wordprocessingInk" xmlns:wne="http://schemas.microsoft.com/office/word/2006/wordml" xmlns:wps="http://schemas.microsoft.com/office/word/2010/wordprocessingShape" mc:Ignorable="w14 w15 w16se w16cid w16 w16cex w16sdtdh w16sdtfl w16du wp14">
   <w:abstractNum w:abstractNumId="0" w15:restartNumberingAfterBreak="0">
-    <w:nsid w:val="30B01F2D"/>
+    <w:nsid w:val="235932FC"/>
     <w:multiLevelType w:val="multilevel"/>
-    <w:tmpl w:val="1B665D6A"/>
-    <w:lvl w:ilvl="0">
-      <w:start w:val="1"/>
-      <w:numFmt w:val="decimal"/>
-      <w:lvlText w:val="%1."/>
-      <w:lvlJc w:val="left"/>
-      <w:pPr>
-        <w:tabs>
-          <w:tab w:val="num" w:pos="720"/>
-        </w:tabs>
-        <w:ind w:left="720" w:hanging="360"/>
-      </w:pPr>
-    </w:lvl>
-    <w:lvl w:ilvl="1" w:tentative="1">
-      <w:start w:val="1"/>
-      <w:numFmt w:val="decimal"/>
-      <w:lvlText w:val="%2."/>
-      <w:lvlJc w:val="left"/>
-      <w:pPr>
-        <w:tabs>
-          <w:tab w:val="num" w:pos="1440"/>
-        </w:tabs>
-        <w:ind w:left="1440" w:hanging="360"/>
-      </w:pPr>
-    </w:lvl>
-    <w:lvl w:ilvl="2" w:tentative="1">
-      <w:start w:val="1"/>
-      <w:numFmt w:val="decimal"/>
-      <w:lvlText w:val="%3."/>
-      <w:lvlJc w:val="left"/>
-      <w:pPr>
-        <w:tabs>
-          <w:tab w:val="num" w:pos="2160"/>
-        </w:tabs>
-        <w:ind w:left="2160" w:hanging="360"/>
-      </w:pPr>
-    </w:lvl>
-    <w:lvl w:ilvl="3" w:tentative="1">
-      <w:start w:val="1"/>
-      <w:numFmt w:val="decimal"/>
-      <w:lvlText w:val="%4."/>
-      <w:lvlJc w:val="left"/>
-      <w:pPr>
-        <w:tabs>
-          <w:tab w:val="num" w:pos="2880"/>
-        </w:tabs>
-        <w:ind w:left="2880" w:hanging="360"/>
-      </w:pPr>
-    </w:lvl>
-    <w:lvl w:ilvl="4" w:tentative="1">
-      <w:start w:val="1"/>
-      <w:numFmt w:val="decimal"/>
-      <w:lvlText w:val="%5."/>
-      <w:lvlJc w:val="left"/>
-      <w:pPr>
-        <w:tabs>
-          <w:tab w:val="num" w:pos="3600"/>
-        </w:tabs>
-        <w:ind w:left="3600" w:hanging="360"/>
-      </w:pPr>
-    </w:lvl>
-    <w:lvl w:ilvl="5" w:tentative="1">
-      <w:start w:val="1"/>
-      <w:numFmt w:val="decimal"/>
-      <w:lvlText w:val="%6."/>
-      <w:lvlJc w:val="left"/>
-      <w:pPr>
-        <w:tabs>
-          <w:tab w:val="num" w:pos="4320"/>
-        </w:tabs>
-        <w:ind w:left="4320" w:hanging="360"/>
-      </w:pPr>
-    </w:lvl>
-    <w:lvl w:ilvl="6" w:tentative="1">
-      <w:start w:val="1"/>
-      <w:numFmt w:val="decimal"/>
-      <w:lvlText w:val="%7."/>
-      <w:lvlJc w:val="left"/>
-      <w:pPr>
-        <w:tabs>
-          <w:tab w:val="num" w:pos="5040"/>
-        </w:tabs>
-        <w:ind w:left="5040" w:hanging="360"/>
-      </w:pPr>
-    </w:lvl>
-    <w:lvl w:ilvl="7" w:tentative="1">
-      <w:start w:val="1"/>
-      <w:numFmt w:val="decimal"/>
-      <w:lvlText w:val="%8."/>
-      <w:lvlJc w:val="left"/>
-      <w:pPr>
-        <w:tabs>
-          <w:tab w:val="num" w:pos="5760"/>
-        </w:tabs>
-        <w:ind w:left="5760" w:hanging="360"/>
-      </w:pPr>
-    </w:lvl>
-    <w:lvl w:ilvl="8" w:tentative="1">
-      <w:start w:val="1"/>
-      <w:numFmt w:val="decimal"/>
-      <w:lvlText w:val="%9."/>
-      <w:lvlJc w:val="left"/>
-      <w:pPr>
-        <w:tabs>
-          <w:tab w:val="num" w:pos="6480"/>
-        </w:tabs>
-        <w:ind w:left="6480" w:hanging="360"/>
-      </w:pPr>
-    </w:lvl>
-  </w:abstractNum>
-  <w:abstractNum w:abstractNumId="1" w15:restartNumberingAfterBreak="0">
-    <w:nsid w:val="4F105387"/>
-    <w:multiLevelType w:val="multilevel"/>
-    <w:tmpl w:val="784EC03C"/>
-    <w:lvl w:ilvl="0">
-      <w:start w:val="1"/>
-      <w:numFmt w:val="decimal"/>
-      <w:lvlText w:val="%1."/>
-      <w:lvlJc w:val="left"/>
-      <w:pPr>
-        <w:tabs>
-          <w:tab w:val="num" w:pos="720"/>
-        </w:tabs>
-        <w:ind w:left="720" w:hanging="360"/>
-      </w:pPr>
-    </w:lvl>
-    <w:lvl w:ilvl="1" w:tentative="1">
-      <w:start w:val="1"/>
-      <w:numFmt w:val="decimal"/>
-      <w:lvlText w:val="%2."/>
-      <w:lvlJc w:val="left"/>
-      <w:pPr>
-        <w:tabs>
-          <w:tab w:val="num" w:pos="1440"/>
-        </w:tabs>
-        <w:ind w:left="1440" w:hanging="360"/>
-      </w:pPr>
-    </w:lvl>
-    <w:lvl w:ilvl="2" w:tentative="1">
-      <w:start w:val="1"/>
-      <w:numFmt w:val="decimal"/>
-      <w:lvlText w:val="%3."/>
-      <w:lvlJc w:val="left"/>
-      <w:pPr>
-        <w:tabs>
-          <w:tab w:val="num" w:pos="2160"/>
-        </w:tabs>
-        <w:ind w:left="2160" w:hanging="360"/>
-      </w:pPr>
-    </w:lvl>
-    <w:lvl w:ilvl="3" w:tentative="1">
-      <w:start w:val="1"/>
-      <w:numFmt w:val="decimal"/>
-      <w:lvlText w:val="%4."/>
-      <w:lvlJc w:val="left"/>
-      <w:pPr>
-        <w:tabs>
-          <w:tab w:val="num" w:pos="2880"/>
-        </w:tabs>
-        <w:ind w:left="2880" w:hanging="360"/>
-      </w:pPr>
-    </w:lvl>
-    <w:lvl w:ilvl="4" w:tentative="1">
-      <w:start w:val="1"/>
-      <w:numFmt w:val="decimal"/>
-      <w:lvlText w:val="%5."/>
-      <w:lvlJc w:val="left"/>
-      <w:pPr>
-        <w:tabs>
-          <w:tab w:val="num" w:pos="3600"/>
-        </w:tabs>
-        <w:ind w:left="3600" w:hanging="360"/>
-      </w:pPr>
-    </w:lvl>
-    <w:lvl w:ilvl="5" w:tentative="1">
-      <w:start w:val="1"/>
-      <w:numFmt w:val="decimal"/>
-      <w:lvlText w:val="%6."/>
-      <w:lvlJc w:val="left"/>
-      <w:pPr>
-        <w:tabs>
-          <w:tab w:val="num" w:pos="4320"/>
-        </w:tabs>
-        <w:ind w:left="4320" w:hanging="360"/>
-      </w:pPr>
-    </w:lvl>
-    <w:lvl w:ilvl="6" w:tentative="1">
-      <w:start w:val="1"/>
-      <w:numFmt w:val="decimal"/>
-      <w:lvlText w:val="%7."/>
-      <w:lvlJc w:val="left"/>
-      <w:pPr>
-        <w:tabs>
-          <w:tab w:val="num" w:pos="5040"/>
-        </w:tabs>
-        <w:ind w:left="5040" w:hanging="360"/>
-      </w:pPr>
-    </w:lvl>
-    <w:lvl w:ilvl="7" w:tentative="1">
-      <w:start w:val="1"/>
-      <w:numFmt w:val="decimal"/>
-      <w:lvlText w:val="%8."/>
-      <w:lvlJc w:val="left"/>
-      <w:pPr>
-        <w:tabs>
-          <w:tab w:val="num" w:pos="5760"/>
-        </w:tabs>
-        <w:ind w:left="5760" w:hanging="360"/>
-      </w:pPr>
-    </w:lvl>
-    <w:lvl w:ilvl="8" w:tentative="1">
-      <w:start w:val="1"/>
-      <w:numFmt w:val="decimal"/>
-      <w:lvlText w:val="%9."/>
-      <w:lvlJc w:val="left"/>
-      <w:pPr>
-        <w:tabs>
-          <w:tab w:val="num" w:pos="6480"/>
-        </w:tabs>
-        <w:ind w:left="6480" w:hanging="360"/>
-      </w:pPr>
-    </w:lvl>
-  </w:abstractNum>
-  <w:abstractNum w:abstractNumId="2" w15:restartNumberingAfterBreak="0">
-    <w:nsid w:val="4F8A17FA"/>
-    <w:multiLevelType w:val="multilevel"/>
-    <w:tmpl w:val="1D9EA194"/>
+    <w:tmpl w:val="6A5A6532"/>
     <w:lvl w:ilvl="0">
       <w:start w:val="1"/>
       <w:numFmt w:val="bullet"/>
@@ -44882,10 +44656,10 @@
       </w:rPr>
     </w:lvl>
   </w:abstractNum>
-  <w:abstractNum w:abstractNumId="3" w15:restartNumberingAfterBreak="0">
-    <w:nsid w:val="50657C96"/>
+  <w:abstractNum w:abstractNumId="1" w15:restartNumberingAfterBreak="0">
+    <w:nsid w:val="2BC31C90"/>
     <w:multiLevelType w:val="multilevel"/>
-    <w:tmpl w:val="C710476E"/>
+    <w:tmpl w:val="012C4966"/>
     <w:lvl w:ilvl="0">
       <w:start w:val="1"/>
       <w:numFmt w:val="bullet"/>
@@ -45031,10 +44805,236 @@
       </w:rPr>
     </w:lvl>
   </w:abstractNum>
+  <w:abstractNum w:abstractNumId="2" w15:restartNumberingAfterBreak="0">
+    <w:nsid w:val="30A56C84"/>
+    <w:multiLevelType w:val="multilevel"/>
+    <w:tmpl w:val="B9846B76"/>
+    <w:lvl w:ilvl="0">
+      <w:start w:val="1"/>
+      <w:numFmt w:val="decimal"/>
+      <w:lvlText w:val="%1."/>
+      <w:lvlJc w:val="left"/>
+      <w:pPr>
+        <w:tabs>
+          <w:tab w:val="num" w:pos="720"/>
+        </w:tabs>
+        <w:ind w:left="720" w:hanging="360"/>
+      </w:pPr>
+    </w:lvl>
+    <w:lvl w:ilvl="1" w:tentative="1">
+      <w:start w:val="1"/>
+      <w:numFmt w:val="decimal"/>
+      <w:lvlText w:val="%2."/>
+      <w:lvlJc w:val="left"/>
+      <w:pPr>
+        <w:tabs>
+          <w:tab w:val="num" w:pos="1440"/>
+        </w:tabs>
+        <w:ind w:left="1440" w:hanging="360"/>
+      </w:pPr>
+    </w:lvl>
+    <w:lvl w:ilvl="2" w:tentative="1">
+      <w:start w:val="1"/>
+      <w:numFmt w:val="decimal"/>
+      <w:lvlText w:val="%3."/>
+      <w:lvlJc w:val="left"/>
+      <w:pPr>
+        <w:tabs>
+          <w:tab w:val="num" w:pos="2160"/>
+        </w:tabs>
+        <w:ind w:left="2160" w:hanging="360"/>
+      </w:pPr>
+    </w:lvl>
+    <w:lvl w:ilvl="3" w:tentative="1">
+      <w:start w:val="1"/>
+      <w:numFmt w:val="decimal"/>
+      <w:lvlText w:val="%4."/>
+      <w:lvlJc w:val="left"/>
+      <w:pPr>
+        <w:tabs>
+          <w:tab w:val="num" w:pos="2880"/>
+        </w:tabs>
+        <w:ind w:left="2880" w:hanging="360"/>
+      </w:pPr>
+    </w:lvl>
+    <w:lvl w:ilvl="4" w:tentative="1">
+      <w:start w:val="1"/>
+      <w:numFmt w:val="decimal"/>
+      <w:lvlText w:val="%5."/>
+      <w:lvlJc w:val="left"/>
+      <w:pPr>
+        <w:tabs>
+          <w:tab w:val="num" w:pos="3600"/>
+        </w:tabs>
+        <w:ind w:left="3600" w:hanging="360"/>
+      </w:pPr>
+    </w:lvl>
+    <w:lvl w:ilvl="5" w:tentative="1">
+      <w:start w:val="1"/>
+      <w:numFmt w:val="decimal"/>
+      <w:lvlText w:val="%6."/>
+      <w:lvlJc w:val="left"/>
+      <w:pPr>
+        <w:tabs>
+          <w:tab w:val="num" w:pos="4320"/>
+        </w:tabs>
+        <w:ind w:left="4320" w:hanging="360"/>
+      </w:pPr>
+    </w:lvl>
+    <w:lvl w:ilvl="6" w:tentative="1">
+      <w:start w:val="1"/>
+      <w:numFmt w:val="decimal"/>
+      <w:lvlText w:val="%7."/>
+      <w:lvlJc w:val="left"/>
+      <w:pPr>
+        <w:tabs>
+          <w:tab w:val="num" w:pos="5040"/>
+        </w:tabs>
+        <w:ind w:left="5040" w:hanging="360"/>
+      </w:pPr>
+    </w:lvl>
+    <w:lvl w:ilvl="7" w:tentative="1">
+      <w:start w:val="1"/>
+      <w:numFmt w:val="decimal"/>
+      <w:lvlText w:val="%8."/>
+      <w:lvlJc w:val="left"/>
+      <w:pPr>
+        <w:tabs>
+          <w:tab w:val="num" w:pos="5760"/>
+        </w:tabs>
+        <w:ind w:left="5760" w:hanging="360"/>
+      </w:pPr>
+    </w:lvl>
+    <w:lvl w:ilvl="8" w:tentative="1">
+      <w:start w:val="1"/>
+      <w:numFmt w:val="decimal"/>
+      <w:lvlText w:val="%9."/>
+      <w:lvlJc w:val="left"/>
+      <w:pPr>
+        <w:tabs>
+          <w:tab w:val="num" w:pos="6480"/>
+        </w:tabs>
+        <w:ind w:left="6480" w:hanging="360"/>
+      </w:pPr>
+    </w:lvl>
+  </w:abstractNum>
+  <w:abstractNum w:abstractNumId="3" w15:restartNumberingAfterBreak="0">
+    <w:nsid w:val="4FDD070E"/>
+    <w:multiLevelType w:val="multilevel"/>
+    <w:tmpl w:val="84A086F4"/>
+    <w:lvl w:ilvl="0">
+      <w:start w:val="1"/>
+      <w:numFmt w:val="decimal"/>
+      <w:lvlText w:val="%1."/>
+      <w:lvlJc w:val="left"/>
+      <w:pPr>
+        <w:tabs>
+          <w:tab w:val="num" w:pos="720"/>
+        </w:tabs>
+        <w:ind w:left="720" w:hanging="360"/>
+      </w:pPr>
+    </w:lvl>
+    <w:lvl w:ilvl="1" w:tentative="1">
+      <w:start w:val="1"/>
+      <w:numFmt w:val="decimal"/>
+      <w:lvlText w:val="%2."/>
+      <w:lvlJc w:val="left"/>
+      <w:pPr>
+        <w:tabs>
+          <w:tab w:val="num" w:pos="1440"/>
+        </w:tabs>
+        <w:ind w:left="1440" w:hanging="360"/>
+      </w:pPr>
+    </w:lvl>
+    <w:lvl w:ilvl="2" w:tentative="1">
+      <w:start w:val="1"/>
+      <w:numFmt w:val="decimal"/>
+      <w:lvlText w:val="%3."/>
+      <w:lvlJc w:val="left"/>
+      <w:pPr>
+        <w:tabs>
+          <w:tab w:val="num" w:pos="2160"/>
+        </w:tabs>
+        <w:ind w:left="2160" w:hanging="360"/>
+      </w:pPr>
+    </w:lvl>
+    <w:lvl w:ilvl="3" w:tentative="1">
+      <w:start w:val="1"/>
+      <w:numFmt w:val="decimal"/>
+      <w:lvlText w:val="%4."/>
+      <w:lvlJc w:val="left"/>
+      <w:pPr>
+        <w:tabs>
+          <w:tab w:val="num" w:pos="2880"/>
+        </w:tabs>
+        <w:ind w:left="2880" w:hanging="360"/>
+      </w:pPr>
+    </w:lvl>
+    <w:lvl w:ilvl="4" w:tentative="1">
+      <w:start w:val="1"/>
+      <w:numFmt w:val="decimal"/>
+      <w:lvlText w:val="%5."/>
+      <w:lvlJc w:val="left"/>
+      <w:pPr>
+        <w:tabs>
+          <w:tab w:val="num" w:pos="3600"/>
+        </w:tabs>
+        <w:ind w:left="3600" w:hanging="360"/>
+      </w:pPr>
+    </w:lvl>
+    <w:lvl w:ilvl="5" w:tentative="1">
+      <w:start w:val="1"/>
+      <w:numFmt w:val="decimal"/>
+      <w:lvlText w:val="%6."/>
+      <w:lvlJc w:val="left"/>
+      <w:pPr>
+        <w:tabs>
+          <w:tab w:val="num" w:pos="4320"/>
+        </w:tabs>
+        <w:ind w:left="4320" w:hanging="360"/>
+      </w:pPr>
+    </w:lvl>
+    <w:lvl w:ilvl="6" w:tentative="1">
+      <w:start w:val="1"/>
+      <w:numFmt w:val="decimal"/>
+      <w:lvlText w:val="%7."/>
+      <w:lvlJc w:val="left"/>
+      <w:pPr>
+        <w:tabs>
+          <w:tab w:val="num" w:pos="5040"/>
+        </w:tabs>
+        <w:ind w:left="5040" w:hanging="360"/>
+      </w:pPr>
+    </w:lvl>
+    <w:lvl w:ilvl="7" w:tentative="1">
+      <w:start w:val="1"/>
+      <w:numFmt w:val="decimal"/>
+      <w:lvlText w:val="%8."/>
+      <w:lvlJc w:val="left"/>
+      <w:pPr>
+        <w:tabs>
+          <w:tab w:val="num" w:pos="5760"/>
+        </w:tabs>
+        <w:ind w:left="5760" w:hanging="360"/>
+      </w:pPr>
+    </w:lvl>
+    <w:lvl w:ilvl="8" w:tentative="1">
+      <w:start w:val="1"/>
+      <w:numFmt w:val="decimal"/>
+      <w:lvlText w:val="%9."/>
+      <w:lvlJc w:val="left"/>
+      <w:pPr>
+        <w:tabs>
+          <w:tab w:val="num" w:pos="6480"/>
+        </w:tabs>
+        <w:ind w:left="6480" w:hanging="360"/>
+      </w:pPr>
+    </w:lvl>
+  </w:abstractNum>
   <w:abstractNum w:abstractNumId="4" w15:restartNumberingAfterBreak="0">
-    <w:nsid w:val="54B90074"/>
+    <w:nsid w:val="5C3F25DD"/>
     <w:multiLevelType w:val="multilevel"/>
-    <w:tmpl w:val="33C8D8A4"/>
+    <w:tmpl w:val="A650E5CE"/>
     <w:lvl w:ilvl="0">
       <w:start w:val="1"/>
       <w:numFmt w:val="bullet"/>
@@ -45181,9 +45181,9 @@
     </w:lvl>
   </w:abstractNum>
   <w:abstractNum w:abstractNumId="5" w15:restartNumberingAfterBreak="0">
-    <w:nsid w:val="751907D0"/>
+    <w:nsid w:val="71BE5531"/>
     <w:multiLevelType w:val="multilevel"/>
-    <w:tmpl w:val="DB8AB930"/>
+    <w:tmpl w:val="F0404A30"/>
     <w:lvl w:ilvl="0">
       <w:start w:val="1"/>
       <w:numFmt w:val="bullet"/>
@@ -45329,22 +45329,22 @@
       </w:rPr>
     </w:lvl>
   </w:abstractNum>
-  <w:num w:numId="1" w16cid:durableId="314535505">
+  <w:num w:numId="1" w16cid:durableId="324938149">
+    <w:abstractNumId w:val="2"/>
+  </w:num>
+  <w:num w:numId="2" w16cid:durableId="1470786181">
     <w:abstractNumId w:val="0"/>
   </w:num>
-  <w:num w:numId="2" w16cid:durableId="1420907063">
+  <w:num w:numId="3" w16cid:durableId="1563442319">
     <w:abstractNumId w:val="3"/>
   </w:num>
-  <w:num w:numId="3" w16cid:durableId="551884521">
+  <w:num w:numId="4" w16cid:durableId="306201086">
     <w:abstractNumId w:val="1"/>
   </w:num>
-  <w:num w:numId="4" w16cid:durableId="1638803092">
+  <w:num w:numId="5" w16cid:durableId="1598757301">
     <w:abstractNumId w:val="4"/>
   </w:num>
-  <w:num w:numId="5" w16cid:durableId="283583833">
-    <w:abstractNumId w:val="2"/>
-  </w:num>
-  <w:num w:numId="6" w16cid:durableId="1998419229">
+  <w:num w:numId="6" w16cid:durableId="1287349334">
     <w:abstractNumId w:val="5"/>
   </w:num>
 </w:numbering>
@@ -46092,7 +46092,7 @@
     <w:link w:val="HeaderChar"/>
     <w:uiPriority w:val="99"/>
     <w:unhideWhenUsed/>
-    <w:rsid w:val="00C73511"/>
+    <w:rsid w:val="00C65E15"/>
     <w:pPr>
       <w:tabs>
         <w:tab w:val="center" w:pos="4680"/>
@@ -46105,7 +46105,7 @@
     <w:basedOn w:val="DefaultParagraphFont"/>
     <w:link w:val="Header"/>
     <w:uiPriority w:val="99"/>
-    <w:rsid w:val="00C73511"/>
+    <w:rsid w:val="00C65E15"/>
     <w:rPr>
       <w:rFonts w:eastAsiaTheme="minorEastAsia"/>
       <w:sz w:val="24"/>
@@ -46118,7 +46118,7 @@
     <w:link w:val="FooterChar"/>
     <w:uiPriority w:val="99"/>
     <w:unhideWhenUsed/>
-    <w:rsid w:val="00C73511"/>
+    <w:rsid w:val="00C65E15"/>
     <w:pPr>
       <w:tabs>
         <w:tab w:val="center" w:pos="4680"/>
@@ -46131,7 +46131,7 @@
     <w:basedOn w:val="DefaultParagraphFont"/>
     <w:link w:val="Footer"/>
     <w:uiPriority w:val="99"/>
-    <w:rsid w:val="00C73511"/>
+    <w:rsid w:val="00C65E15"/>
     <w:rPr>
       <w:rFonts w:eastAsiaTheme="minorEastAsia"/>
       <w:sz w:val="24"/>
@@ -46144,7 +46144,7 @@
     <w:uiPriority w:val="99"/>
     <w:semiHidden/>
     <w:unhideWhenUsed/>
-    <w:rsid w:val="00C73511"/>
+    <w:rsid w:val="00C65E15"/>
   </w:style>
   <w:style w:type="character" w:styleId="Hyperlink">
     <w:name w:val="Hyperlink"/>
@@ -46152,7 +46152,7 @@
     <w:uiPriority w:val="99"/>
     <w:semiHidden/>
     <w:unhideWhenUsed/>
-    <w:rsid w:val="00C73511"/>
+    <w:rsid w:val="00C65E15"/>
     <w:rPr>
       <w:color w:val="auto"/>
       <w:u w:val="single"/>
@@ -46165,7 +46165,7 @@
     <w:autoRedefine/>
     <w:uiPriority w:val="39"/>
     <w:unhideWhenUsed/>
-    <w:rsid w:val="00C73511"/>
+    <w:rsid w:val="00C65E15"/>
     <w:pPr>
       <w:spacing w:after="100" w:line="360" w:lineRule="auto"/>
     </w:pPr>
@@ -46177,7 +46177,7 @@
     <w:autoRedefine/>
     <w:uiPriority w:val="39"/>
     <w:unhideWhenUsed/>
-    <w:rsid w:val="00C73511"/>
+    <w:rsid w:val="00C65E15"/>
     <w:pPr>
       <w:spacing w:after="100" w:line="360" w:lineRule="auto"/>
       <w:ind w:left="240"/>
@@ -46191,7 +46191,7 @@
     <w:uiPriority w:val="39"/>
     <w:semiHidden/>
     <w:unhideWhenUsed/>
-    <w:rsid w:val="00C73511"/>
+    <w:rsid w:val="00C65E15"/>
     <w:pPr>
       <w:spacing w:after="100" w:line="360" w:lineRule="auto"/>
       <w:ind w:left="480"/>

</xml_diff>

<commit_message>
Update document screenshots and text for optic tiles and normal-range hints
</commit_message>
<xml_diff>
--- a/gem_expert/docs/Gemstone_Identification_Assistant_Report.docx
+++ b/gem_expert/docs/Gemstone_Identification_Assistant_Report.docx
@@ -145,7 +145,7 @@
         </w:rPr>
         <w:br w:type="page"/>
       </w:r>
-      <w:bookmarkStart w:id="0" w:name="_Toc241593286"/>
+      <w:bookmarkStart w:id="0" w:name="_Toc241595785"/>
       <w:r>
         <w:rPr>
           <w:rFonts w:eastAsia="Times New Roman"/>
@@ -285,7 +285,7 @@
         <w:rPr>
           <w:noProof/>
         </w:rPr>
-        <w:instrText xml:space="preserve"> PAGEREF _Toc241593286 \h </w:instrText>
+        <w:instrText xml:space="preserve"> PAGEREF _Toc241595785 \h </w:instrText>
       </w:r>
       <w:r>
         <w:rPr>
@@ -347,7 +347,7 @@
         <w:rPr>
           <w:noProof/>
         </w:rPr>
-        <w:instrText xml:space="preserve"> PAGEREF _Toc241593287 \h </w:instrText>
+        <w:instrText xml:space="preserve"> PAGEREF _Toc241595786 \h </w:instrText>
       </w:r>
       <w:r>
         <w:rPr>
@@ -409,7 +409,7 @@
         <w:rPr>
           <w:noProof/>
         </w:rPr>
-        <w:instrText xml:space="preserve"> PAGEREF _Toc241593288 \h </w:instrText>
+        <w:instrText xml:space="preserve"> PAGEREF _Toc241595787 \h </w:instrText>
       </w:r>
       <w:r>
         <w:rPr>
@@ -471,7 +471,7 @@
         <w:rPr>
           <w:noProof/>
         </w:rPr>
-        <w:instrText xml:space="preserve"> PAGEREF _Toc241593289 \h </w:instrText>
+        <w:instrText xml:space="preserve"> PAGEREF _Toc241595788 \h </w:instrText>
       </w:r>
       <w:r>
         <w:rPr>
@@ -533,7 +533,7 @@
         <w:rPr>
           <w:noProof/>
         </w:rPr>
-        <w:instrText xml:space="preserve"> PAGEREF _Toc241593290 \h </w:instrText>
+        <w:instrText xml:space="preserve"> PAGEREF _Toc241595789 \h </w:instrText>
       </w:r>
       <w:r>
         <w:rPr>
@@ -595,7 +595,7 @@
         <w:rPr>
           <w:noProof/>
         </w:rPr>
-        <w:instrText xml:space="preserve"> PAGEREF _Toc241593291 \h </w:instrText>
+        <w:instrText xml:space="preserve"> PAGEREF _Toc241595790 \h </w:instrText>
       </w:r>
       <w:r>
         <w:rPr>
@@ -657,7 +657,7 @@
         <w:rPr>
           <w:noProof/>
         </w:rPr>
-        <w:instrText xml:space="preserve"> PAGEREF _Toc241593292 \h </w:instrText>
+        <w:instrText xml:space="preserve"> PAGEREF _Toc241595791 \h </w:instrText>
       </w:r>
       <w:r>
         <w:rPr>
@@ -719,7 +719,7 @@
         <w:rPr>
           <w:noProof/>
         </w:rPr>
-        <w:instrText xml:space="preserve"> PAGEREF _Toc241593293 \h </w:instrText>
+        <w:instrText xml:space="preserve"> PAGEREF _Toc241595792 \h </w:instrText>
       </w:r>
       <w:r>
         <w:rPr>
@@ -781,7 +781,7 @@
         <w:rPr>
           <w:noProof/>
         </w:rPr>
-        <w:instrText xml:space="preserve"> PAGEREF _Toc241593294 \h </w:instrText>
+        <w:instrText xml:space="preserve"> PAGEREF _Toc241595793 \h </w:instrText>
       </w:r>
       <w:r>
         <w:rPr>
@@ -843,7 +843,7 @@
         <w:rPr>
           <w:noProof/>
         </w:rPr>
-        <w:instrText xml:space="preserve"> PAGEREF _Toc241593295 \h </w:instrText>
+        <w:instrText xml:space="preserve"> PAGEREF _Toc241595794 \h </w:instrText>
       </w:r>
       <w:r>
         <w:rPr>
@@ -905,7 +905,7 @@
         <w:rPr>
           <w:noProof/>
         </w:rPr>
-        <w:instrText xml:space="preserve"> PAGEREF _Toc241593296 \h </w:instrText>
+        <w:instrText xml:space="preserve"> PAGEREF _Toc241595795 \h </w:instrText>
       </w:r>
       <w:r>
         <w:rPr>
@@ -967,7 +967,7 @@
         <w:rPr>
           <w:noProof/>
         </w:rPr>
-        <w:instrText xml:space="preserve"> PAGEREF _Toc241593297 \h </w:instrText>
+        <w:instrText xml:space="preserve"> PAGEREF _Toc241595796 \h </w:instrText>
       </w:r>
       <w:r>
         <w:rPr>
@@ -1029,7 +1029,7 @@
         <w:rPr>
           <w:noProof/>
         </w:rPr>
-        <w:instrText xml:space="preserve"> PAGEREF _Toc241593298 \h </w:instrText>
+        <w:instrText xml:space="preserve"> PAGEREF _Toc241595797 \h </w:instrText>
       </w:r>
       <w:r>
         <w:rPr>
@@ -1091,7 +1091,7 @@
         <w:rPr>
           <w:noProof/>
         </w:rPr>
-        <w:instrText xml:space="preserve"> PAGEREF _Toc241593299 \h </w:instrText>
+        <w:instrText xml:space="preserve"> PAGEREF _Toc241595798 \h </w:instrText>
       </w:r>
       <w:r>
         <w:rPr>
@@ -1153,7 +1153,7 @@
         <w:rPr>
           <w:noProof/>
         </w:rPr>
-        <w:instrText xml:space="preserve"> PAGEREF _Toc241593300 \h </w:instrText>
+        <w:instrText xml:space="preserve"> PAGEREF _Toc241595799 \h </w:instrText>
       </w:r>
       <w:r>
         <w:rPr>
@@ -1215,7 +1215,7 @@
         <w:rPr>
           <w:noProof/>
         </w:rPr>
-        <w:instrText xml:space="preserve"> PAGEREF _Toc241593301 \h </w:instrText>
+        <w:instrText xml:space="preserve"> PAGEREF _Toc241595800 \h </w:instrText>
       </w:r>
       <w:r>
         <w:rPr>
@@ -1277,7 +1277,7 @@
         <w:rPr>
           <w:noProof/>
         </w:rPr>
-        <w:instrText xml:space="preserve"> PAGEREF _Toc241593302 \h </w:instrText>
+        <w:instrText xml:space="preserve"> PAGEREF _Toc241595801 \h </w:instrText>
       </w:r>
       <w:r>
         <w:rPr>
@@ -1339,7 +1339,7 @@
         <w:rPr>
           <w:noProof/>
         </w:rPr>
-        <w:instrText xml:space="preserve"> PAGEREF _Toc241593303 \h </w:instrText>
+        <w:instrText xml:space="preserve"> PAGEREF _Toc241595802 \h </w:instrText>
       </w:r>
       <w:r>
         <w:rPr>
@@ -1401,7 +1401,7 @@
         <w:rPr>
           <w:noProof/>
         </w:rPr>
-        <w:instrText xml:space="preserve"> PAGEREF _Toc241593304 \h </w:instrText>
+        <w:instrText xml:space="preserve"> PAGEREF _Toc241595803 \h </w:instrText>
       </w:r>
       <w:r>
         <w:rPr>
@@ -1463,7 +1463,7 @@
         <w:rPr>
           <w:noProof/>
         </w:rPr>
-        <w:instrText xml:space="preserve"> PAGEREF _Toc241593305 \h </w:instrText>
+        <w:instrText xml:space="preserve"> PAGEREF _Toc241595804 \h </w:instrText>
       </w:r>
       <w:r>
         <w:rPr>
@@ -1525,7 +1525,7 @@
         <w:rPr>
           <w:noProof/>
         </w:rPr>
-        <w:instrText xml:space="preserve"> PAGEREF _Toc241593306 \h </w:instrText>
+        <w:instrText xml:space="preserve"> PAGEREF _Toc241595805 \h </w:instrText>
       </w:r>
       <w:r>
         <w:rPr>
@@ -1587,7 +1587,7 @@
         <w:rPr>
           <w:noProof/>
         </w:rPr>
-        <w:instrText xml:space="preserve"> PAGEREF _Toc241593307 \h </w:instrText>
+        <w:instrText xml:space="preserve"> PAGEREF _Toc241595806 \h </w:instrText>
       </w:r>
       <w:r>
         <w:rPr>
@@ -1649,7 +1649,7 @@
         <w:rPr>
           <w:noProof/>
         </w:rPr>
-        <w:instrText xml:space="preserve"> PAGEREF _Toc241593308 \h </w:instrText>
+        <w:instrText xml:space="preserve"> PAGEREF _Toc241595807 \h </w:instrText>
       </w:r>
       <w:r>
         <w:rPr>
@@ -1711,7 +1711,7 @@
         <w:rPr>
           <w:noProof/>
         </w:rPr>
-        <w:instrText xml:space="preserve"> PAGEREF _Toc241593309 \h </w:instrText>
+        <w:instrText xml:space="preserve"> PAGEREF _Toc241595808 \h </w:instrText>
       </w:r>
       <w:r>
         <w:rPr>
@@ -1773,7 +1773,7 @@
         <w:rPr>
           <w:noProof/>
         </w:rPr>
-        <w:instrText xml:space="preserve"> PAGEREF _Toc241593310 \h </w:instrText>
+        <w:instrText xml:space="preserve"> PAGEREF _Toc241595809 \h </w:instrText>
       </w:r>
       <w:r>
         <w:rPr>
@@ -1835,7 +1835,7 @@
         <w:rPr>
           <w:noProof/>
         </w:rPr>
-        <w:instrText xml:space="preserve"> PAGEREF _Toc241593311 \h </w:instrText>
+        <w:instrText xml:space="preserve"> PAGEREF _Toc241595810 \h </w:instrText>
       </w:r>
       <w:r>
         <w:rPr>
@@ -1898,7 +1898,7 @@
         <w:rPr>
           <w:noProof/>
         </w:rPr>
-        <w:instrText xml:space="preserve"> PAGEREF _Toc241593312 \h </w:instrText>
+        <w:instrText xml:space="preserve"> PAGEREF _Toc241595811 \h </w:instrText>
       </w:r>
       <w:r>
         <w:rPr>
@@ -1960,7 +1960,7 @@
         <w:rPr>
           <w:noProof/>
         </w:rPr>
-        <w:instrText xml:space="preserve"> PAGEREF _Toc241593313 \h </w:instrText>
+        <w:instrText xml:space="preserve"> PAGEREF _Toc241595812 \h </w:instrText>
       </w:r>
       <w:r>
         <w:rPr>
@@ -2022,7 +2022,7 @@
         <w:rPr>
           <w:noProof/>
         </w:rPr>
-        <w:instrText xml:space="preserve"> PAGEREF _Toc241593314 \h </w:instrText>
+        <w:instrText xml:space="preserve"> PAGEREF _Toc241595813 \h </w:instrText>
       </w:r>
       <w:r>
         <w:rPr>
@@ -2084,7 +2084,7 @@
         <w:rPr>
           <w:noProof/>
         </w:rPr>
-        <w:instrText xml:space="preserve"> PAGEREF _Toc241593315 \h </w:instrText>
+        <w:instrText xml:space="preserve"> PAGEREF _Toc241595814 \h </w:instrText>
       </w:r>
       <w:r>
         <w:rPr>
@@ -2146,7 +2146,7 @@
         <w:rPr>
           <w:noProof/>
         </w:rPr>
-        <w:instrText xml:space="preserve"> PAGEREF _Toc241593316 \h </w:instrText>
+        <w:instrText xml:space="preserve"> PAGEREF _Toc241595815 \h </w:instrText>
       </w:r>
       <w:r>
         <w:rPr>
@@ -2208,7 +2208,7 @@
         <w:rPr>
           <w:noProof/>
         </w:rPr>
-        <w:instrText xml:space="preserve"> PAGEREF _Toc241593317 \h </w:instrText>
+        <w:instrText xml:space="preserve"> PAGEREF _Toc241595816 \h </w:instrText>
       </w:r>
       <w:r>
         <w:rPr>
@@ -2270,7 +2270,7 @@
         <w:rPr>
           <w:noProof/>
         </w:rPr>
-        <w:instrText xml:space="preserve"> PAGEREF _Toc241593318 \h </w:instrText>
+        <w:instrText xml:space="preserve"> PAGEREF _Toc241595817 \h </w:instrText>
       </w:r>
       <w:r>
         <w:rPr>
@@ -2332,7 +2332,7 @@
         <w:rPr>
           <w:noProof/>
         </w:rPr>
-        <w:instrText xml:space="preserve"> PAGEREF _Toc241593319 \h </w:instrText>
+        <w:instrText xml:space="preserve"> PAGEREF _Toc241595818 \h </w:instrText>
       </w:r>
       <w:r>
         <w:rPr>
@@ -2394,7 +2394,7 @@
         <w:rPr>
           <w:noProof/>
         </w:rPr>
-        <w:instrText xml:space="preserve"> PAGEREF _Toc241593320 \h </w:instrText>
+        <w:instrText xml:space="preserve"> PAGEREF _Toc241595819 \h </w:instrText>
       </w:r>
       <w:r>
         <w:rPr>
@@ -2456,7 +2456,7 @@
         <w:rPr>
           <w:noProof/>
         </w:rPr>
-        <w:instrText xml:space="preserve"> PAGEREF _Toc241593321 \h </w:instrText>
+        <w:instrText xml:space="preserve"> PAGEREF _Toc241595820 \h </w:instrText>
       </w:r>
       <w:r>
         <w:rPr>
@@ -2518,7 +2518,7 @@
         <w:rPr>
           <w:noProof/>
         </w:rPr>
-        <w:instrText xml:space="preserve"> PAGEREF _Toc241593322 \h </w:instrText>
+        <w:instrText xml:space="preserve"> PAGEREF _Toc241595821 \h </w:instrText>
       </w:r>
       <w:r>
         <w:rPr>
@@ -2580,7 +2580,7 @@
         <w:rPr>
           <w:noProof/>
         </w:rPr>
-        <w:instrText xml:space="preserve"> PAGEREF _Toc241593323 \h </w:instrText>
+        <w:instrText xml:space="preserve"> PAGEREF _Toc241595822 \h </w:instrText>
       </w:r>
       <w:r>
         <w:rPr>
@@ -2642,7 +2642,7 @@
         <w:rPr>
           <w:noProof/>
         </w:rPr>
-        <w:instrText xml:space="preserve"> PAGEREF _Toc241593324 \h </w:instrText>
+        <w:instrText xml:space="preserve"> PAGEREF _Toc241595823 \h </w:instrText>
       </w:r>
       <w:r>
         <w:rPr>
@@ -2704,7 +2704,7 @@
         <w:rPr>
           <w:noProof/>
         </w:rPr>
-        <w:instrText xml:space="preserve"> PAGEREF _Toc241593325 \h </w:instrText>
+        <w:instrText xml:space="preserve"> PAGEREF _Toc241595824 \h </w:instrText>
       </w:r>
       <w:r>
         <w:rPr>
@@ -2766,7 +2766,7 @@
         <w:rPr>
           <w:noProof/>
         </w:rPr>
-        <w:instrText xml:space="preserve"> PAGEREF _Toc241593326 \h </w:instrText>
+        <w:instrText xml:space="preserve"> PAGEREF _Toc241595825 \h </w:instrText>
       </w:r>
       <w:r>
         <w:rPr>
@@ -2828,7 +2828,7 @@
         <w:rPr>
           <w:noProof/>
         </w:rPr>
-        <w:instrText xml:space="preserve"> PAGEREF _Toc241593327 \h </w:instrText>
+        <w:instrText xml:space="preserve"> PAGEREF _Toc241595826 \h </w:instrText>
       </w:r>
       <w:r>
         <w:rPr>
@@ -2890,7 +2890,7 @@
         <w:rPr>
           <w:noProof/>
         </w:rPr>
-        <w:instrText xml:space="preserve"> PAGEREF _Toc241593328 \h </w:instrText>
+        <w:instrText xml:space="preserve"> PAGEREF _Toc241595827 \h </w:instrText>
       </w:r>
       <w:r>
         <w:rPr>
@@ -2952,7 +2952,7 @@
         <w:rPr>
           <w:noProof/>
         </w:rPr>
-        <w:instrText xml:space="preserve"> PAGEREF _Toc241593329 \h </w:instrText>
+        <w:instrText xml:space="preserve"> PAGEREF _Toc241595828 \h </w:instrText>
       </w:r>
       <w:r>
         <w:rPr>
@@ -3014,7 +3014,7 @@
         <w:rPr>
           <w:noProof/>
         </w:rPr>
-        <w:instrText xml:space="preserve"> PAGEREF _Toc241593330 \h </w:instrText>
+        <w:instrText xml:space="preserve"> PAGEREF _Toc241595829 \h </w:instrText>
       </w:r>
       <w:r>
         <w:rPr>
@@ -3062,7 +3062,7 @@
         </w:rPr>
         <w:br w:type="page"/>
       </w:r>
-      <w:bookmarkStart w:id="1" w:name="_Toc241593287"/>
+      <w:bookmarkStart w:id="1" w:name="_Toc241595786"/>
       <w:r>
         <w:rPr>
           <w:rFonts w:eastAsia="Times New Roman"/>
@@ -3079,7 +3079,7 @@
           <w:rFonts w:eastAsia="Times New Roman"/>
         </w:rPr>
       </w:pPr>
-      <w:bookmarkStart w:id="2" w:name="_Toc241593288"/>
+      <w:bookmarkStart w:id="2" w:name="_Toc241595787"/>
       <w:r>
         <w:rPr>
           <w:rFonts w:eastAsia="Times New Roman"/>
@@ -3106,7 +3106,7 @@
           <w:rFonts w:eastAsia="Times New Roman"/>
         </w:rPr>
       </w:pPr>
-      <w:bookmarkStart w:id="3" w:name="_Toc241593289"/>
+      <w:bookmarkStart w:id="3" w:name="_Toc241595788"/>
       <w:r>
         <w:rPr>
           <w:rFonts w:eastAsia="Times New Roman"/>
@@ -3143,7 +3143,7 @@
           <w:rFonts w:eastAsia="Times New Roman"/>
         </w:rPr>
       </w:pPr>
-      <w:bookmarkStart w:id="4" w:name="_Toc241593290"/>
+      <w:bookmarkStart w:id="4" w:name="_Toc241595789"/>
       <w:r>
         <w:rPr>
           <w:rFonts w:eastAsia="Times New Roman"/>
@@ -3301,7 +3301,7 @@
           <w:rFonts w:eastAsia="Times New Roman"/>
         </w:rPr>
       </w:pPr>
-      <w:bookmarkStart w:id="5" w:name="_Toc241593291"/>
+      <w:bookmarkStart w:id="5" w:name="_Toc241595790"/>
       <w:r>
         <w:rPr>
           <w:rFonts w:eastAsia="Times New Roman"/>
@@ -3328,7 +3328,7 @@
           <w:rFonts w:eastAsia="Times New Roman"/>
         </w:rPr>
       </w:pPr>
-      <w:bookmarkStart w:id="6" w:name="_Toc241593292"/>
+      <w:bookmarkStart w:id="6" w:name="_Toc241595791"/>
       <w:r>
         <w:rPr>
           <w:rFonts w:eastAsia="Times New Roman"/>
@@ -4178,7 +4178,7 @@
           <w:rFonts w:eastAsia="Times New Roman"/>
         </w:rPr>
       </w:pPr>
-      <w:bookmarkStart w:id="7" w:name="_Toc241593293"/>
+      <w:bookmarkStart w:id="7" w:name="_Toc241595792"/>
       <w:r>
         <w:rPr>
           <w:rFonts w:eastAsia="Times New Roman"/>
@@ -4216,7 +4216,7 @@
           <w:rFonts w:eastAsia="Times New Roman"/>
         </w:rPr>
       </w:pPr>
-      <w:bookmarkStart w:id="8" w:name="_Toc241593294"/>
+      <w:bookmarkStart w:id="8" w:name="_Toc241595793"/>
       <w:r>
         <w:rPr>
           <w:rFonts w:eastAsia="Times New Roman"/>
@@ -4243,7 +4243,7 @@
           <w:noProof/>
         </w:rPr>
         <w:drawing>
-          <wp:inline distT="0" distB="0" distL="0" distR="0" wp14:anchorId="64E12056" wp14:editId="07885726">
+          <wp:inline distT="0" distB="0" distL="0" distR="0" wp14:anchorId="2339DB77" wp14:editId="56DD297A">
             <wp:extent cx="5715000" cy="1272540"/>
             <wp:effectExtent l="0" t="0" r="0" b="3810"/>
             <wp:docPr id="1" name="Picture 1"/>
@@ -4308,7 +4308,7 @@
           <w:rFonts w:eastAsia="Times New Roman"/>
         </w:rPr>
       </w:pPr>
-      <w:bookmarkStart w:id="9" w:name="_Toc241593295"/>
+      <w:bookmarkStart w:id="9" w:name="_Toc241595794"/>
       <w:r>
         <w:rPr>
           <w:rFonts w:eastAsia="Times New Roman"/>
@@ -7443,7 +7443,7 @@
           <w:rFonts w:eastAsia="Times New Roman"/>
         </w:rPr>
       </w:pPr>
-      <w:bookmarkStart w:id="10" w:name="_Toc241593296"/>
+      <w:bookmarkStart w:id="10" w:name="_Toc241595795"/>
       <w:r>
         <w:rPr>
           <w:rFonts w:eastAsia="Times New Roman"/>
@@ -7675,7 +7675,7 @@
           <w:rFonts w:eastAsia="Times New Roman"/>
         </w:rPr>
       </w:pPr>
-      <w:bookmarkStart w:id="11" w:name="_Toc241593297"/>
+      <w:bookmarkStart w:id="11" w:name="_Toc241595796"/>
       <w:r>
         <w:rPr>
           <w:rFonts w:eastAsia="Times New Roman"/>
@@ -15799,7 +15799,7 @@
           <w:rFonts w:eastAsia="Times New Roman"/>
         </w:rPr>
       </w:pPr>
-      <w:bookmarkStart w:id="12" w:name="_Toc241593298"/>
+      <w:bookmarkStart w:id="12" w:name="_Toc241595797"/>
       <w:r>
         <w:rPr>
           <w:rFonts w:eastAsia="Times New Roman"/>
@@ -17261,7 +17261,7 @@
           <w:noProof/>
         </w:rPr>
         <w:drawing>
-          <wp:inline distT="0" distB="0" distL="0" distR="0" wp14:anchorId="0EE53FC9" wp14:editId="3E275F85">
+          <wp:inline distT="0" distB="0" distL="0" distR="0" wp14:anchorId="41E7484A" wp14:editId="34951897">
             <wp:extent cx="5524500" cy="3208020"/>
             <wp:effectExtent l="0" t="0" r="0" b="0"/>
             <wp:docPr id="2" name="Picture 2"/>
@@ -17435,7 +17435,7 @@
           <w:rFonts w:eastAsia="Times New Roman"/>
         </w:rPr>
       </w:pPr>
-      <w:bookmarkStart w:id="13" w:name="_Toc241593299"/>
+      <w:bookmarkStart w:id="13" w:name="_Toc241595798"/>
       <w:r>
         <w:rPr>
           <w:rFonts w:eastAsia="Times New Roman"/>
@@ -18403,7 +18403,7 @@
           <w:rFonts w:eastAsia="Times New Roman"/>
         </w:rPr>
       </w:pPr>
-      <w:bookmarkStart w:id="14" w:name="_Toc241593300"/>
+      <w:bookmarkStart w:id="14" w:name="_Toc241595799"/>
       <w:r>
         <w:rPr>
           <w:rFonts w:eastAsia="Times New Roman"/>
@@ -18419,7 +18419,7 @@
           <w:rFonts w:eastAsia="Times New Roman"/>
         </w:rPr>
       </w:pPr>
-      <w:bookmarkStart w:id="15" w:name="_Toc241593301"/>
+      <w:bookmarkStart w:id="15" w:name="_Toc241595800"/>
       <w:r>
         <w:rPr>
           <w:rFonts w:eastAsia="Times New Roman"/>
@@ -18456,7 +18456,7 @@
         </w:rPr>
         <w:lastRenderedPageBreak/>
         <w:drawing>
-          <wp:inline distT="0" distB="0" distL="0" distR="0" wp14:anchorId="4A91B5D2" wp14:editId="58C950A3">
+          <wp:inline distT="0" distB="0" distL="0" distR="0" wp14:anchorId="34AAE05E" wp14:editId="0804A0AF">
             <wp:extent cx="5715000" cy="3954780"/>
             <wp:effectExtent l="0" t="0" r="0" b="7620"/>
             <wp:docPr id="3" name="Picture 3"/>
@@ -19237,7 +19237,7 @@
           <w:rFonts w:eastAsia="Times New Roman"/>
         </w:rPr>
       </w:pPr>
-      <w:bookmarkStart w:id="16" w:name="_Toc241593302"/>
+      <w:bookmarkStart w:id="16" w:name="_Toc241595801"/>
       <w:r>
         <w:rPr>
           <w:rFonts w:eastAsia="Times New Roman"/>
@@ -19433,7 +19433,7 @@
           <w:rFonts w:eastAsia="Times New Roman"/>
         </w:rPr>
       </w:pPr>
-      <w:bookmarkStart w:id="17" w:name="_Toc241593303"/>
+      <w:bookmarkStart w:id="17" w:name="_Toc241595802"/>
       <w:r>
         <w:rPr>
           <w:rFonts w:eastAsia="Times New Roman"/>
@@ -19564,7 +19564,7 @@
           <w:rFonts w:eastAsia="Times New Roman"/>
         </w:rPr>
       </w:pPr>
-      <w:bookmarkStart w:id="18" w:name="_Toc241593304"/>
+      <w:bookmarkStart w:id="18" w:name="_Toc241595803"/>
       <w:r>
         <w:rPr>
           <w:rFonts w:eastAsia="Times New Roman"/>
@@ -19685,7 +19685,7 @@
           <w:rFonts w:eastAsia="Times New Roman"/>
         </w:rPr>
       </w:pPr>
-      <w:bookmarkStart w:id="19" w:name="_Toc241593305"/>
+      <w:bookmarkStart w:id="19" w:name="_Toc241595804"/>
       <w:r>
         <w:rPr>
           <w:rFonts w:eastAsia="Times New Roman"/>
@@ -19792,7 +19792,7 @@
         </w:rPr>
         <w:lastRenderedPageBreak/>
         <w:drawing>
-          <wp:inline distT="0" distB="0" distL="0" distR="0" wp14:anchorId="39E69913" wp14:editId="212372E3">
+          <wp:inline distT="0" distB="0" distL="0" distR="0" wp14:anchorId="1202D0FC" wp14:editId="766E19F0">
             <wp:extent cx="4480560" cy="4960620"/>
             <wp:effectExtent l="0" t="0" r="0" b="0"/>
             <wp:docPr id="4" name="Picture 4"/>
@@ -19857,7 +19857,7 @@
           <w:rFonts w:eastAsia="Times New Roman"/>
         </w:rPr>
       </w:pPr>
-      <w:bookmarkStart w:id="20" w:name="_Toc241593306"/>
+      <w:bookmarkStart w:id="20" w:name="_Toc241595805"/>
       <w:r>
         <w:rPr>
           <w:rFonts w:eastAsia="Times New Roman"/>
@@ -19977,7 +19977,7 @@
           <w:rFonts w:eastAsia="Times New Roman"/>
         </w:rPr>
       </w:pPr>
-      <w:bookmarkStart w:id="21" w:name="_Toc241593307"/>
+      <w:bookmarkStart w:id="21" w:name="_Toc241595806"/>
       <w:r>
         <w:rPr>
           <w:rFonts w:eastAsia="Times New Roman"/>
@@ -20029,7 +20029,7 @@
         <w:rPr>
           <w:rFonts w:eastAsia="Times New Roman"/>
         </w:rPr>
-        <w:t xml:space="preserve"> Colour is chosen from swatches, and optical effects and inclusions from small drawings of what they look like under a loupe, because a beginner may not know the words "silk" or "fingerprint" (Figure 6).</w:t>
+        <w:t xml:space="preserve"> Colour is chosen from swatches, optical effects and inclusions from small drawings of what they look like under a loupe, and the optic character from drawings of what is seen in the polariscope and conoscope ("stays dark", "blinks light and dark", "dark cross", "curved bars"), because a beginner may not know the words "silk", "fingerprint" or "biaxial" (Figure 6).</w:t>
       </w:r>
     </w:p>
     <w:p>
@@ -20056,13 +20056,7 @@
         <w:rPr>
           <w:rFonts w:eastAsia="Times New Roman"/>
         </w:rPr>
-        <w:t xml:space="preserve"> </w:t>
-      </w:r>
-      <w:r>
-        <w:rPr>
-          <w:rFonts w:eastAsia="Times New Roman"/>
-        </w:rPr>
-        <w:t>As an RI or SG value is entered, the page immediately says which gems it fits, warns about unusual values, and blocks impossible ones (Figure 8). The ranges are sent from the knowledge base, so the page and the rules always agree.</w:t>
+        <w:t xml:space="preserve"> As an RI or SG value is entered, the page immediately says which gems it fits, warns about unusual values, and blocks impossible ones once the box is left (Figure 8). Under each box a "normal range" line gives the range covered by the knowledge base, with a link to the range of every gem. The ranges are sent from the knowledge base, so the page and the rules always agree.</w:t>
       </w:r>
     </w:p>
     <w:p>
@@ -20089,7 +20083,13 @@
         <w:rPr>
           <w:rFonts w:eastAsia="Times New Roman"/>
         </w:rPr>
-        <w:t xml:space="preserve"> Every certainty factor is shown with a phrase such as "90% (very likely)" or "52% (possible)", and the scale is explained on request, including that a certainty factor is not a statistical probability.</w:t>
+        <w:t xml:space="preserve"> </w:t>
+      </w:r>
+      <w:r>
+        <w:rPr>
+          <w:rFonts w:eastAsia="Times New Roman"/>
+        </w:rPr>
+        <w:t>Every certainty factor is shown with a phrase such as "90% (very likely)" or "52% (possible)", and the scale is explained on request, including that a certainty factor is not a statistical probability.</w:t>
       </w:r>
     </w:p>
     <w:p>
@@ -20116,13 +20116,7 @@
         <w:rPr>
           <w:rFonts w:eastAsia="Times New Roman"/>
         </w:rPr>
-        <w:t xml:space="preserve"> </w:t>
-      </w:r>
-      <w:r>
-        <w:rPr>
-          <w:rFonts w:eastAsia="Times New Roman"/>
-        </w:rPr>
-        <w:t>for refractometer readings (Section 2.3).</w:t>
+        <w:t xml:space="preserve"> for refractometer readings (Section 2.3).</w:t>
       </w:r>
     </w:p>
     <w:p>
@@ -20170,13 +20164,20 @@
           <w:b/>
           <w:bCs/>
         </w:rPr>
+        <w:lastRenderedPageBreak/>
         <w:t>Consultation progress and Back.</w:t>
       </w:r>
       <w:r>
         <w:rPr>
           <w:rFonts w:eastAsia="Times New Roman"/>
         </w:rPr>
-        <w:t xml:space="preserve"> The step-by-step mode shows "Question 2 of at most 6" with a progress bar, and a Back button to change the previous answer.</w:t>
+        <w:t xml:space="preserve"> </w:t>
+      </w:r>
+      <w:r>
+        <w:rPr>
+          <w:rFonts w:eastAsia="Times New Roman"/>
+        </w:rPr>
+        <w:t>The step-by-step mode shows "Question 2 of at most 6" with a progress bar, and a Back button to change the previous answer.</w:t>
       </w:r>
     </w:p>
     <w:p>
@@ -20224,7 +20225,6 @@
           <w:b/>
           <w:bCs/>
         </w:rPr>
-        <w:lastRenderedPageBreak/>
         <w:t>Recent stones,</w:t>
       </w:r>
       <w:r>
@@ -20244,7 +20244,7 @@
           <w:noProof/>
         </w:rPr>
         <w:drawing>
-          <wp:inline distT="0" distB="0" distL="0" distR="0" wp14:anchorId="1CB9FED3" wp14:editId="5396BC79">
+          <wp:inline distT="0" distB="0" distL="0" distR="0" wp14:anchorId="650E1D9B" wp14:editId="47D66C46">
             <wp:extent cx="5334000" cy="3528060"/>
             <wp:effectExtent l="0" t="0" r="0" b="0"/>
             <wp:docPr id="5" name="Picture 5"/>
@@ -20313,9 +20313,9 @@
         </w:rPr>
         <w:lastRenderedPageBreak/>
         <w:drawing>
-          <wp:inline distT="0" distB="0" distL="0" distR="0" wp14:anchorId="6FC071D4" wp14:editId="64A417DD">
-            <wp:extent cx="4953000" cy="6492240"/>
-            <wp:effectExtent l="0" t="0" r="0" b="3810"/>
+          <wp:inline distT="0" distB="0" distL="0" distR="0" wp14:anchorId="38EE491D" wp14:editId="7B60C333">
+            <wp:extent cx="4953000" cy="7604760"/>
+            <wp:effectExtent l="0" t="0" r="0" b="0"/>
             <wp:docPr id="6" name="Picture 6"/>
             <wp:cNvGraphicFramePr>
               <a:graphicFrameLocks xmlns:a="http://schemas.openxmlformats.org/drawingml/2006/main" noChangeAspect="1"/>
@@ -20345,7 +20345,7 @@
                   <pic:spPr bwMode="auto">
                     <a:xfrm>
                       <a:off x="0" y="0"/>
-                      <a:ext cx="4953000" cy="6492240"/>
+                      <a:ext cx="4953000" cy="7604760"/>
                     </a:xfrm>
                     <a:prstGeom prst="rect">
                       <a:avLst/>
@@ -20368,7 +20368,7 @@
         <w:spacing w:before="0" w:beforeAutospacing="0"/>
       </w:pPr>
       <w:r>
-        <w:t>Figure 6. Input form: instrument readings, and picture choices for colour, optical effect and inclusions</w:t>
+        <w:t>Figure 6. Input form: instrument readings, and picture choices for optic character, colour, optical effect and inclusions</w:t>
       </w:r>
     </w:p>
     <w:p>
@@ -20382,7 +20382,7 @@
         </w:rPr>
         <w:lastRenderedPageBreak/>
         <w:drawing>
-          <wp:inline distT="0" distB="0" distL="0" distR="0" wp14:anchorId="3F19CBBB" wp14:editId="4CF2D252">
+          <wp:inline distT="0" distB="0" distL="0" distR="0" wp14:anchorId="14E2229E" wp14:editId="7C760FD8">
             <wp:extent cx="4480560" cy="3589020"/>
             <wp:effectExtent l="0" t="0" r="0" b="0"/>
             <wp:docPr id="7" name="Picture 7"/>
@@ -20450,9 +20450,9 @@
           <w:noProof/>
         </w:rPr>
         <w:drawing>
-          <wp:inline distT="0" distB="0" distL="0" distR="0" wp14:anchorId="144E4E57" wp14:editId="4DEF6BC7">
-            <wp:extent cx="5334000" cy="3314700"/>
-            <wp:effectExtent l="0" t="0" r="0" b="0"/>
+          <wp:inline distT="0" distB="0" distL="0" distR="0" wp14:anchorId="15B624C1" wp14:editId="26B7200C">
+            <wp:extent cx="5334000" cy="3268980"/>
+            <wp:effectExtent l="0" t="0" r="0" b="7620"/>
             <wp:docPr id="8" name="Picture 8"/>
             <wp:cNvGraphicFramePr>
               <a:graphicFrameLocks xmlns:a="http://schemas.openxmlformats.org/drawingml/2006/main" noChangeAspect="1"/>
@@ -20482,7 +20482,7 @@
                   <pic:spPr bwMode="auto">
                     <a:xfrm>
                       <a:off x="0" y="0"/>
-                      <a:ext cx="5334000" cy="3314700"/>
+                      <a:ext cx="5334000" cy="3268980"/>
                     </a:xfrm>
                     <a:prstGeom prst="rect">
                       <a:avLst/>
@@ -20515,7 +20515,7 @@
           <w:rFonts w:eastAsia="Times New Roman"/>
         </w:rPr>
       </w:pPr>
-      <w:bookmarkStart w:id="22" w:name="_Toc241593308"/>
+      <w:bookmarkStart w:id="22" w:name="_Toc241595807"/>
       <w:r>
         <w:rPr>
           <w:rFonts w:eastAsia="Times New Roman"/>
@@ -20816,15 +20816,7 @@
                 <w:sz w:val="20"/>
                 <w:szCs w:val="20"/>
               </w:rPr>
-              <w:t xml:space="preserve"> </w:t>
-            </w:r>
-            <w:r>
-              <w:rPr>
-                <w:rFonts w:eastAsia="Times New Roman"/>
-                <w:sz w:val="20"/>
-                <w:szCs w:val="20"/>
-              </w:rPr>
-              <w:t xml:space="preserve">(line 176) backtracks through rules and variable bindings until all conditions hold; </w:t>
+              <w:t xml:space="preserve"> (line 176) backtracks through rules and variable bindings until all conditions hold; </w:t>
             </w:r>
             <w:r>
               <w:rPr>
@@ -20967,7 +20959,15 @@
                 <w:sz w:val="20"/>
                 <w:szCs w:val="20"/>
               </w:rPr>
-              <w:t xml:space="preserve"> recurse over lists and trees.</w:t>
+              <w:t xml:space="preserve"> </w:t>
+            </w:r>
+            <w:r>
+              <w:rPr>
+                <w:rFonts w:eastAsia="Times New Roman"/>
+                <w:sz w:val="20"/>
+                <w:szCs w:val="20"/>
+              </w:rPr>
+              <w:t>recurse over lists and trees.</w:t>
             </w:r>
           </w:p>
         </w:tc>
@@ -21201,15 +21201,7 @@
                 <w:sz w:val="20"/>
                 <w:szCs w:val="20"/>
               </w:rPr>
-              <w:t xml:space="preserve"> </w:t>
-            </w:r>
-            <w:r>
-              <w:rPr>
-                <w:rFonts w:eastAsia="Times New Roman"/>
-                <w:sz w:val="20"/>
-                <w:szCs w:val="20"/>
-              </w:rPr>
-              <w:t xml:space="preserve">is changed with </w:t>
+              <w:t xml:space="preserve"> is changed with </w:t>
             </w:r>
             <w:r>
               <w:rPr>
@@ -21458,7 +21450,15 @@
                 <w:sz w:val="20"/>
                 <w:szCs w:val="20"/>
               </w:rPr>
-              <w:t xml:space="preserve"> from inside the proof (line 293) and catches it in </w:t>
+              <w:t xml:space="preserve"> </w:t>
+            </w:r>
+            <w:r>
+              <w:rPr>
+                <w:rFonts w:eastAsia="Times New Roman"/>
+                <w:sz w:val="20"/>
+                <w:szCs w:val="20"/>
+              </w:rPr>
+              <w:t xml:space="preserve">from inside the proof (line 293) and catches it in </w:t>
             </w:r>
             <w:r>
               <w:rPr>
@@ -21707,15 +21707,7 @@
                 <w:sz w:val="20"/>
                 <w:szCs w:val="20"/>
               </w:rPr>
-              <w:t xml:space="preserve"> </w:t>
-            </w:r>
-            <w:r>
-              <w:rPr>
-                <w:rFonts w:eastAsia="Times New Roman"/>
-                <w:sz w:val="20"/>
-                <w:szCs w:val="20"/>
-              </w:rPr>
-              <w:t>for collecting explanations and validating input.</w:t>
+              <w:t xml:space="preserve"> for collecting explanations and validating input.</w:t>
             </w:r>
           </w:p>
         </w:tc>
@@ -21737,7 +21729,7 @@
           <w:rFonts w:eastAsia="Times New Roman"/>
         </w:rPr>
       </w:pPr>
-      <w:bookmarkStart w:id="23" w:name="_Toc241593309"/>
+      <w:bookmarkStart w:id="23" w:name="_Toc241595808"/>
       <w:r>
         <w:rPr>
           <w:rFonts w:eastAsia="Times New Roman"/>
@@ -21758,7 +21750,14 @@
           <w:b/>
           <w:bCs/>
         </w:rPr>
-        <w:t>user input → facts → rules fired → reasoning → conclusion</w:t>
+        <w:t xml:space="preserve">user input → facts → </w:t>
+      </w:r>
+      <w:r>
+        <w:rPr>
+          <w:b/>
+          <w:bCs/>
+        </w:rPr>
+        <w:t>rules fired → reasoning → conclusion</w:t>
       </w:r>
       <w:r>
         <w:t>. The system provides this chain at two levels of detail, for users and for examiners, and answers the three classic explanation questions: How, Why and Why not [11], [12].</w:t>
@@ -21771,7 +21770,7 @@
           <w:rFonts w:eastAsia="Times New Roman"/>
         </w:rPr>
       </w:pPr>
-      <w:bookmarkStart w:id="24" w:name="_Toc241593310"/>
+      <w:bookmarkStart w:id="24" w:name="_Toc241595809"/>
       <w:r>
         <w:rPr>
           <w:rFonts w:eastAsia="Times New Roman"/>
@@ -21810,7 +21809,10 @@
         <w:pStyle w:val="HTMLPreformatted"/>
       </w:pPr>
       <w:r>
-        <w:t xml:space="preserve">   RI = 1.765 / SG = 4.0 / Optic character = uniaxial / Colour = blue / Inclusion = silk</w:t>
+        <w:t xml:space="preserve">   </w:t>
+      </w:r>
+      <w:r>
+        <w:t>RI = 1.765 / SG = 4.0 / Optic character = uniaxial / Colour = blue / Inclusion = silk</w:t>
       </w:r>
     </w:p>
     <w:p>
@@ -21859,10 +21861,7 @@
         <w:pStyle w:val="HTMLPreformatted"/>
       </w:pPr>
       <w:r>
-        <w:t xml:space="preserve">                </w:t>
-      </w:r>
-      <w:r>
-        <w:t>RI 1.765 lies in the corundum range 1.757-1.780 (+/-0.005)</w:t>
+        <w:t xml:space="preserve">                RI 1.765 lies in the corundum range 1.757-1.780 (+/-0.005)</w:t>
       </w:r>
     </w:p>
     <w:p>
@@ -21878,7 +21877,10 @@
         <w:pStyle w:val="HTMLPreformatted"/>
       </w:pPr>
       <w:r>
-        <w:t xml:space="preserve">       why: Corundum is doubly refractive (uniaxial) with RI about 1.762-1.770 and SG about 4.00. [source: gia]</w:t>
+        <w:t xml:space="preserve">       </w:t>
+      </w:r>
+      <w:r>
+        <w:t>why: Corundum is doubly refractive (uniaxial) with RI about 1.762-1.770 and SG about 4.00. [source: gia]</w:t>
       </w:r>
     </w:p>
     <w:p>
@@ -21918,10 +21920,7 @@
         <w:pStyle w:val="HTMLPreformatted"/>
       </w:pPr>
       <w:r>
-        <w:t xml:space="preserve">       </w:t>
-      </w:r>
-      <w:r>
-        <w:t>because: species(corundum) (established earlier); inclusion seen: silk</w:t>
+        <w:t xml:space="preserve">       because: species(corundum) (established earlier); inclusion seen: silk</w:t>
       </w:r>
     </w:p>
     <w:p>
@@ -21945,7 +21944,10 @@
         <w:pStyle w:val="HTMLPreformatted"/>
       </w:pPr>
       <w:r>
-        <w:t xml:space="preserve">   Blue sapphire (Corundum) - Strong match; Origin: Likely natural</w:t>
+        <w:t xml:space="preserve">   </w:t>
+      </w:r>
+      <w:r>
+        <w:t>Blue sapphire (Corundum) - Strong match; Origin: Likely natural</w:t>
       </w:r>
     </w:p>
     <w:p>
@@ -21975,7 +21977,7 @@
         </w:rPr>
         <w:lastRenderedPageBreak/>
         <w:drawing>
-          <wp:inline distT="0" distB="0" distL="0" distR="0" wp14:anchorId="37FC04A3" wp14:editId="2A0BADEB">
+          <wp:inline distT="0" distB="0" distL="0" distR="0" wp14:anchorId="0A0D5B87" wp14:editId="52BB914E">
             <wp:extent cx="4480560" cy="5646420"/>
             <wp:effectExtent l="0" t="0" r="0" b="0"/>
             <wp:docPr id="9" name="Picture 9"/>
@@ -22040,7 +22042,7 @@
           <w:rFonts w:eastAsia="Times New Roman"/>
         </w:rPr>
       </w:pPr>
-      <w:bookmarkStart w:id="25" w:name="_Toc241593311"/>
+      <w:bookmarkStart w:id="25" w:name="_Toc241595810"/>
       <w:r>
         <w:rPr>
           <w:rFonts w:eastAsia="Times New Roman"/>
@@ -22119,9 +22121,9 @@
         </w:rPr>
         <w:lastRenderedPageBreak/>
         <w:drawing>
-          <wp:inline distT="0" distB="0" distL="0" distR="0" wp14:anchorId="0169A914" wp14:editId="0DD75B02">
-            <wp:extent cx="4290060" cy="2926080"/>
-            <wp:effectExtent l="0" t="0" r="0" b="7620"/>
+          <wp:inline distT="0" distB="0" distL="0" distR="0" wp14:anchorId="7F786496" wp14:editId="6E6136D0">
+            <wp:extent cx="4290060" cy="3398520"/>
+            <wp:effectExtent l="0" t="0" r="0" b="0"/>
             <wp:docPr id="10" name="Picture 10"/>
             <wp:cNvGraphicFramePr>
               <a:graphicFrameLocks xmlns:a="http://schemas.openxmlformats.org/drawingml/2006/main" noChangeAspect="1"/>
@@ -22151,7 +22153,7 @@
                   <pic:spPr bwMode="auto">
                     <a:xfrm>
                       <a:off x="0" y="0"/>
-                      <a:ext cx="4290060" cy="2926080"/>
+                      <a:ext cx="4290060" cy="3398520"/>
                     </a:xfrm>
                     <a:prstGeom prst="rect">
                       <a:avLst/>
@@ -22184,7 +22186,7 @@
           <w:rFonts w:eastAsia="Times New Roman"/>
         </w:rPr>
       </w:pPr>
-      <w:bookmarkStart w:id="26" w:name="_Toc241593312"/>
+      <w:bookmarkStart w:id="26" w:name="_Toc241595811"/>
       <w:r>
         <w:rPr>
           <w:rFonts w:eastAsia="Times New Roman"/>
@@ -22221,7 +22223,7 @@
           <w:noProof/>
         </w:rPr>
         <w:drawing>
-          <wp:inline distT="0" distB="0" distL="0" distR="0" wp14:anchorId="79C43D07" wp14:editId="5466E538">
+          <wp:inline distT="0" distB="0" distL="0" distR="0" wp14:anchorId="506FBE2B" wp14:editId="331354CD">
             <wp:extent cx="4480560" cy="1325880"/>
             <wp:effectExtent l="0" t="0" r="0" b="7620"/>
             <wp:docPr id="11" name="Picture 11"/>
@@ -22286,7 +22288,7 @@
           <w:rFonts w:eastAsia="Times New Roman"/>
         </w:rPr>
       </w:pPr>
-      <w:bookmarkStart w:id="27" w:name="_Toc241593313"/>
+      <w:bookmarkStart w:id="27" w:name="_Toc241595812"/>
       <w:r>
         <w:rPr>
           <w:rFonts w:eastAsia="Times New Roman"/>
@@ -22300,11 +22302,14 @@
         <w:pStyle w:val="NormalWeb"/>
       </w:pPr>
       <w:r>
-        <w:t xml:space="preserve">Each result page includes a diagram generated from the actual reasoning for the user's own input, with Play, Back and Next controls that replay it one step at a time with a caption. The forward-chaining diagram (Figure 12) shows input facts at the top, each fired rule numbered in firing order, and the facts it added. The backward-chaining diagram (Figure 13) shows the goal </w:t>
+        <w:t xml:space="preserve">Each result page includes a diagram generated from the actual reasoning for the user's own input, with Play, Back and Next controls that replay it one step at a time with a caption. The forward-chaining diagram (Figure 12) shows input facts at the top, each fired rule numbered in </w:t>
       </w:r>
       <w:r>
         <w:lastRenderedPageBreak/>
-        <w:t>tree: the question, the rules tried, and each condition marked as proved, failed or never checked, which makes visible that backward chaining abandons a rule at its first failed condition.</w:t>
+        <w:t>firing order, and the facts it added. The backward-chaining diagram (Figure 13) shows the goal tree: the question, the rules tried, and each condition marked as proved, failed or never checked, which makes visible th</w:t>
+      </w:r>
+      <w:r>
+        <w:t>at backward chaining abandons a rule at its first failed condition.</w:t>
       </w:r>
     </w:p>
     <w:p>
@@ -22317,7 +22322,7 @@
           <w:noProof/>
         </w:rPr>
         <w:drawing>
-          <wp:inline distT="0" distB="0" distL="0" distR="0" wp14:anchorId="04ACEC30" wp14:editId="5E3A1771">
+          <wp:inline distT="0" distB="0" distL="0" distR="0" wp14:anchorId="3581A1D8" wp14:editId="3FFCCC79">
             <wp:extent cx="4480560" cy="4655820"/>
             <wp:effectExtent l="0" t="0" r="0" b="0"/>
             <wp:docPr id="12" name="Picture 12"/>
@@ -22386,7 +22391,7 @@
         </w:rPr>
         <w:lastRenderedPageBreak/>
         <w:drawing>
-          <wp:inline distT="0" distB="0" distL="0" distR="0" wp14:anchorId="5096336B" wp14:editId="3E83A610">
+          <wp:inline distT="0" distB="0" distL="0" distR="0" wp14:anchorId="05A2D313" wp14:editId="1BE672C9">
             <wp:extent cx="4480560" cy="3733800"/>
             <wp:effectExtent l="0" t="0" r="0" b="0"/>
             <wp:docPr id="13" name="Picture 13"/>
@@ -22451,7 +22456,7 @@
           <w:rFonts w:eastAsia="Times New Roman"/>
         </w:rPr>
       </w:pPr>
-      <w:bookmarkStart w:id="28" w:name="_Toc241593314"/>
+      <w:bookmarkStart w:id="28" w:name="_Toc241595813"/>
       <w:r>
         <w:rPr>
           <w:rFonts w:eastAsia="Times New Roman"/>
@@ -22467,7 +22472,7 @@
           <w:rFonts w:eastAsia="Times New Roman"/>
         </w:rPr>
       </w:pPr>
-      <w:bookmarkStart w:id="29" w:name="_Toc241593315"/>
+      <w:bookmarkStart w:id="29" w:name="_Toc241595814"/>
       <w:r>
         <w:rPr>
           <w:rFonts w:eastAsia="Times New Roman"/>
@@ -22491,7 +22496,7 @@
           <w:rFonts w:eastAsia="Times New Roman"/>
         </w:rPr>
       </w:pPr>
-      <w:bookmarkStart w:id="30" w:name="_Toc241593316"/>
+      <w:bookmarkStart w:id="30" w:name="_Toc241595815"/>
       <w:r>
         <w:rPr>
           <w:rFonts w:eastAsia="Times New Roman"/>
@@ -28055,7 +28060,7 @@
           <w:rFonts w:eastAsia="Times New Roman"/>
         </w:rPr>
       </w:pPr>
-      <w:bookmarkStart w:id="31" w:name="_Toc241593317"/>
+      <w:bookmarkStart w:id="31" w:name="_Toc241595816"/>
       <w:r>
         <w:rPr>
           <w:rFonts w:eastAsia="Times New Roman"/>
@@ -28800,7 +28805,7 @@
           <w:rFonts w:eastAsia="Times New Roman"/>
         </w:rPr>
       </w:pPr>
-      <w:bookmarkStart w:id="32" w:name="_Toc241593318"/>
+      <w:bookmarkStart w:id="32" w:name="_Toc241595817"/>
       <w:r>
         <w:rPr>
           <w:rFonts w:eastAsia="Times New Roman"/>
@@ -29766,7 +29771,7 @@
           <w:rFonts w:eastAsia="Times New Roman"/>
         </w:rPr>
       </w:pPr>
-      <w:bookmarkStart w:id="33" w:name="_Toc241593319"/>
+      <w:bookmarkStart w:id="33" w:name="_Toc241595818"/>
       <w:r>
         <w:rPr>
           <w:rFonts w:eastAsia="Times New Roman"/>
@@ -30732,7 +30737,7 @@
           <w:rFonts w:eastAsia="Times New Roman"/>
         </w:rPr>
       </w:pPr>
-      <w:bookmarkStart w:id="34" w:name="_Toc241593320"/>
+      <w:bookmarkStart w:id="34" w:name="_Toc241595819"/>
       <w:r>
         <w:rPr>
           <w:rFonts w:eastAsia="Times New Roman"/>
@@ -30766,7 +30771,7 @@
           <w:rFonts w:eastAsia="Times New Roman"/>
         </w:rPr>
       </w:pPr>
-      <w:bookmarkStart w:id="35" w:name="_Toc241593321"/>
+      <w:bookmarkStart w:id="35" w:name="_Toc241595820"/>
       <w:r>
         <w:rPr>
           <w:rFonts w:eastAsia="Times New Roman"/>
@@ -30782,7 +30787,7 @@
           <w:rFonts w:eastAsia="Times New Roman"/>
         </w:rPr>
       </w:pPr>
-      <w:bookmarkStart w:id="36" w:name="_Toc241593322"/>
+      <w:bookmarkStart w:id="36" w:name="_Toc241595821"/>
       <w:r>
         <w:rPr>
           <w:rFonts w:eastAsia="Times New Roman"/>
@@ -30828,7 +30833,7 @@
           <w:rFonts w:eastAsia="Times New Roman"/>
         </w:rPr>
       </w:pPr>
-      <w:bookmarkStart w:id="37" w:name="_Toc241593323"/>
+      <w:bookmarkStart w:id="37" w:name="_Toc241595822"/>
       <w:r>
         <w:rPr>
           <w:rFonts w:eastAsia="Times New Roman"/>
@@ -30868,7 +30873,7 @@
           <w:rFonts w:eastAsia="Times New Roman"/>
         </w:rPr>
       </w:pPr>
-      <w:bookmarkStart w:id="38" w:name="_Toc241593324"/>
+      <w:bookmarkStart w:id="38" w:name="_Toc241595823"/>
       <w:r>
         <w:rPr>
           <w:rFonts w:eastAsia="Times New Roman"/>
@@ -31119,7 +31124,7 @@
           <w:rFonts w:eastAsia="Times New Roman"/>
         </w:rPr>
       </w:pPr>
-      <w:bookmarkStart w:id="39" w:name="_Toc241593325"/>
+      <w:bookmarkStart w:id="39" w:name="_Toc241595824"/>
       <w:r>
         <w:rPr>
           <w:rFonts w:eastAsia="Times New Roman"/>
@@ -31230,7 +31235,7 @@
           <w:rFonts w:eastAsia="Times New Roman"/>
         </w:rPr>
       </w:pPr>
-      <w:bookmarkStart w:id="40" w:name="_Toc241593326"/>
+      <w:bookmarkStart w:id="40" w:name="_Toc241595825"/>
       <w:r>
         <w:rPr>
           <w:rFonts w:eastAsia="Times New Roman"/>
@@ -31244,23 +31249,20 @@
         <w:pStyle w:val="NormalWeb"/>
       </w:pPr>
       <w:r>
-        <w:t>This project designed and implemented a rule-based expert system that identifies common Sri Lankan gemstones, detects synthetics and imitations, and explains its reasoning. Knowledge from recognised gemmological sources was systematically acquired, documented and represented as 297 facts and 62 production rules in four chained layers, with a certainty factor and a literature source for every rule. One rule base supports three reasoning modes: forward chaining for identification, backward chaining for verify</w:t>
-      </w:r>
-      <w:r>
-        <w:t>ing a claim, and an interactive consultation that asks only for the facts it needs. A</w:t>
-      </w:r>
-      <w:r>
-        <w:t xml:space="preserve"> </w:t>
-      </w:r>
-      <w:r>
-        <w:t xml:space="preserve">full How, Why and Why-not explanation facility, reasoning diagrams, a plain-English question interface and a web interface make the reasoning transparent to non-experts, and features such as picture-based inputs, live checking </w:t>
+        <w:t>This project designed and implemented a rule-based expert system that identifies common Sri Lankan gemstones, detects synthetics and imitations, and explains its reasoning. Knowledge from recognised gemmological sources was systematically acquired, documented and represen</w:t>
+      </w:r>
+      <w:r>
+        <w:t>ted as 297 facts and 62 production rules in four chained layers, with a certainty factor and a literature source for every rule. One rule base supports three reasoning modes: forward chaining for identification, backward chaining for verifying a claim, and an interactive consultation that asks only for the facts it needs. A full How, Why and Why-not explanation facility, reasoning diagrams, a plain-English question interface and a web interface make the reasoning transparent to non-experts, and features suc</w:t>
+      </w:r>
+      <w:r>
+        <w:t xml:space="preserve">h as picture-based inputs, live checking </w:t>
       </w:r>
       <w:r>
         <w:lastRenderedPageBreak/>
-        <w:t>of readings and the next-measurement hint make it practical for people without gemmological training. All 20 documented test cases and 47 automated tests pass. The system meets its objectives as a tool for a first opinion. Its main limitations, the absence of real-world validation and</w:t>
-      </w:r>
-      <w:r>
-        <w:t xml:space="preserve"> several unmodelled gemmological properties, define clear next steps. Above all, the project shows why a transparent, explainable system is appropriate when a person's money depends on its answer.</w:t>
+        <w:t>of readings and the next-measurement hint make it practical for people without gemmological training. All 20 documented test cases and 47 automated tests pass. The system meets its objectives as a tool for a first opinion. Its main limitations, the absence of real-world validation and several unmodelled gemmological properties, define clear next steps. Above all, the project shows why a transparent, explainable system is appropriate when a person's money depends on i</w:t>
+      </w:r>
+      <w:r>
+        <w:t>ts answer.</w:t>
       </w:r>
     </w:p>
     <w:p>
@@ -31276,7 +31278,7 @@
         </w:rPr>
         <w:br w:type="page"/>
       </w:r>
-      <w:bookmarkStart w:id="41" w:name="_Toc241593327"/>
+      <w:bookmarkStart w:id="41" w:name="_Toc241595826"/>
       <w:r>
         <w:rPr>
           <w:rFonts w:eastAsia="Times New Roman"/>
@@ -31649,7 +31651,7 @@
         </w:rPr>
         <w:br w:type="page"/>
       </w:r>
-      <w:bookmarkStart w:id="42" w:name="_Toc241593328"/>
+      <w:bookmarkStart w:id="42" w:name="_Toc241595827"/>
       <w:r>
         <w:rPr>
           <w:rFonts w:eastAsia="Times New Roman"/>
@@ -43514,7 +43516,7 @@
         </w:rPr>
         <w:br w:type="page"/>
       </w:r>
-      <w:bookmarkStart w:id="43" w:name="_Toc241593329"/>
+      <w:bookmarkStart w:id="43" w:name="_Toc241595828"/>
       <w:r>
         <w:rPr>
           <w:rFonts w:eastAsia="Times New Roman"/>
@@ -43996,7 +43998,7 @@
           <w:rFonts w:eastAsia="Times New Roman"/>
         </w:rPr>
       </w:pPr>
-      <w:bookmarkStart w:id="44" w:name="_Toc241593330"/>
+      <w:bookmarkStart w:id="44" w:name="_Toc241595829"/>
       <w:r>
         <w:rPr>
           <w:rFonts w:eastAsia="Times New Roman"/>
@@ -44508,9 +44510,9 @@
 <file path=word/numbering.xml><?xml version="1.0" encoding="utf-8"?>
 <w:numbering xmlns:wpc="http://schemas.microsoft.com/office/word/2010/wordprocessingCanvas" xmlns:cx="http://schemas.microsoft.com/office/drawing/2014/chartex" xmlns:cx1="http://schemas.microsoft.com/office/drawing/2015/9/8/chartex" xmlns:cx2="http://schemas.microsoft.com/office/drawing/2015/10/21/chartex" xmlns:cx3="http://schemas.microsoft.com/office/drawing/2016/5/9/chartex" xmlns:cx4="http://schemas.microsoft.com/office/drawing/2016/5/10/chartex" xmlns:cx5="http://schemas.microsoft.com/office/drawing/2016/5/11/chartex" xmlns:cx6="http://schemas.microsoft.com/office/drawing/2016/5/12/chartex" xmlns:cx7="http://schemas.microsoft.com/office/drawing/2016/5/13/chartex" xmlns:cx8="http://schemas.microsoft.com/office/drawing/2016/5/14/chartex" xmlns:mc="http://schemas.openxmlformats.org/markup-compatibility/2006" xmlns:aink="http://schemas.microsoft.com/office/drawing/2016/ink" xmlns:am3d="http://schemas.microsoft.com/office/drawing/2017/model3d" xmlns:o="urn:schemas-microsoft-com:office:office" xmlns:oel="http://schemas.microsoft.com/office/2019/extlst" xmlns:r="http://schemas.openxmlformats.org/officeDocument/2006/relationships" xmlns:m="http://schemas.openxmlformats.org/officeDocument/2006/math" xmlns:v="urn:schemas-microsoft-com:vml" xmlns:wp14="http://schemas.microsoft.com/office/word/2010/wordprocessingDrawing" xmlns:wp="http://schemas.openxmlformats.org/drawingml/2006/wordprocessingDrawing" xmlns:w10="urn:schemas-microsoft-com:office:word" xmlns:w="http://schemas.openxmlformats.org/wordprocessingml/2006/main" xmlns:w14="http://schemas.microsoft.com/office/word/2010/wordml" xmlns:w15="http://schemas.microsoft.com/office/word/2012/wordml" xmlns:w16cex="http://schemas.microsoft.com/office/word/2018/wordml/cex" xmlns:w16cid="http://schemas.microsoft.com/office/word/2016/wordml/cid" xmlns:w16="http://schemas.microsoft.com/office/word/2018/wordml" xmlns:w16du="http://schemas.microsoft.com/office/word/2023/wordml/word16du" xmlns:w16sdtdh="http://schemas.microsoft.com/office/word/2020/wordml/sdtdatahash" xmlns:w16sdtfl="http://schemas.microsoft.com/office/word/2024/wordml/sdtformatlock" xmlns:w16se="http://schemas.microsoft.com/office/word/2015/wordml/symex" xmlns:wpg="http://schemas.microsoft.com/office/word/2010/wordprocessingGroup" xmlns:wpi="http://schemas.microsoft.com/office/word/2010/wordprocessingInk" xmlns:wne="http://schemas.microsoft.com/office/word/2006/wordml" xmlns:wps="http://schemas.microsoft.com/office/word/2010/wordprocessingShape" mc:Ignorable="w14 w15 w16se w16cid w16 w16cex w16sdtdh w16sdtfl w16du wp14">
   <w:abstractNum w:abstractNumId="0" w15:restartNumberingAfterBreak="0">
-    <w:nsid w:val="235932FC"/>
+    <w:nsid w:val="045D0714"/>
     <w:multiLevelType w:val="multilevel"/>
-    <w:tmpl w:val="6A5A6532"/>
+    <w:tmpl w:val="6D024AF6"/>
     <w:lvl w:ilvl="0">
       <w:start w:val="1"/>
       <w:numFmt w:val="bullet"/>
@@ -44657,9 +44659,9 @@
     </w:lvl>
   </w:abstractNum>
   <w:abstractNum w:abstractNumId="1" w15:restartNumberingAfterBreak="0">
-    <w:nsid w:val="2BC31C90"/>
+    <w:nsid w:val="0ABF658A"/>
     <w:multiLevelType w:val="multilevel"/>
-    <w:tmpl w:val="012C4966"/>
+    <w:tmpl w:val="3924A638"/>
     <w:lvl w:ilvl="0">
       <w:start w:val="1"/>
       <w:numFmt w:val="bullet"/>
@@ -44806,9 +44808,9 @@
     </w:lvl>
   </w:abstractNum>
   <w:abstractNum w:abstractNumId="2" w15:restartNumberingAfterBreak="0">
-    <w:nsid w:val="30A56C84"/>
+    <w:nsid w:val="0D2A3A57"/>
     <w:multiLevelType w:val="multilevel"/>
-    <w:tmpl w:val="B9846B76"/>
+    <w:tmpl w:val="A3347658"/>
     <w:lvl w:ilvl="0">
       <w:start w:val="1"/>
       <w:numFmt w:val="decimal"/>
@@ -44919,122 +44921,9 @@
     </w:lvl>
   </w:abstractNum>
   <w:abstractNum w:abstractNumId="3" w15:restartNumberingAfterBreak="0">
-    <w:nsid w:val="4FDD070E"/>
+    <w:nsid w:val="1DD0652D"/>
     <w:multiLevelType w:val="multilevel"/>
-    <w:tmpl w:val="84A086F4"/>
-    <w:lvl w:ilvl="0">
-      <w:start w:val="1"/>
-      <w:numFmt w:val="decimal"/>
-      <w:lvlText w:val="%1."/>
-      <w:lvlJc w:val="left"/>
-      <w:pPr>
-        <w:tabs>
-          <w:tab w:val="num" w:pos="720"/>
-        </w:tabs>
-        <w:ind w:left="720" w:hanging="360"/>
-      </w:pPr>
-    </w:lvl>
-    <w:lvl w:ilvl="1" w:tentative="1">
-      <w:start w:val="1"/>
-      <w:numFmt w:val="decimal"/>
-      <w:lvlText w:val="%2."/>
-      <w:lvlJc w:val="left"/>
-      <w:pPr>
-        <w:tabs>
-          <w:tab w:val="num" w:pos="1440"/>
-        </w:tabs>
-        <w:ind w:left="1440" w:hanging="360"/>
-      </w:pPr>
-    </w:lvl>
-    <w:lvl w:ilvl="2" w:tentative="1">
-      <w:start w:val="1"/>
-      <w:numFmt w:val="decimal"/>
-      <w:lvlText w:val="%3."/>
-      <w:lvlJc w:val="left"/>
-      <w:pPr>
-        <w:tabs>
-          <w:tab w:val="num" w:pos="2160"/>
-        </w:tabs>
-        <w:ind w:left="2160" w:hanging="360"/>
-      </w:pPr>
-    </w:lvl>
-    <w:lvl w:ilvl="3" w:tentative="1">
-      <w:start w:val="1"/>
-      <w:numFmt w:val="decimal"/>
-      <w:lvlText w:val="%4."/>
-      <w:lvlJc w:val="left"/>
-      <w:pPr>
-        <w:tabs>
-          <w:tab w:val="num" w:pos="2880"/>
-        </w:tabs>
-        <w:ind w:left="2880" w:hanging="360"/>
-      </w:pPr>
-    </w:lvl>
-    <w:lvl w:ilvl="4" w:tentative="1">
-      <w:start w:val="1"/>
-      <w:numFmt w:val="decimal"/>
-      <w:lvlText w:val="%5."/>
-      <w:lvlJc w:val="left"/>
-      <w:pPr>
-        <w:tabs>
-          <w:tab w:val="num" w:pos="3600"/>
-        </w:tabs>
-        <w:ind w:left="3600" w:hanging="360"/>
-      </w:pPr>
-    </w:lvl>
-    <w:lvl w:ilvl="5" w:tentative="1">
-      <w:start w:val="1"/>
-      <w:numFmt w:val="decimal"/>
-      <w:lvlText w:val="%6."/>
-      <w:lvlJc w:val="left"/>
-      <w:pPr>
-        <w:tabs>
-          <w:tab w:val="num" w:pos="4320"/>
-        </w:tabs>
-        <w:ind w:left="4320" w:hanging="360"/>
-      </w:pPr>
-    </w:lvl>
-    <w:lvl w:ilvl="6" w:tentative="1">
-      <w:start w:val="1"/>
-      <w:numFmt w:val="decimal"/>
-      <w:lvlText w:val="%7."/>
-      <w:lvlJc w:val="left"/>
-      <w:pPr>
-        <w:tabs>
-          <w:tab w:val="num" w:pos="5040"/>
-        </w:tabs>
-        <w:ind w:left="5040" w:hanging="360"/>
-      </w:pPr>
-    </w:lvl>
-    <w:lvl w:ilvl="7" w:tentative="1">
-      <w:start w:val="1"/>
-      <w:numFmt w:val="decimal"/>
-      <w:lvlText w:val="%8."/>
-      <w:lvlJc w:val="left"/>
-      <w:pPr>
-        <w:tabs>
-          <w:tab w:val="num" w:pos="5760"/>
-        </w:tabs>
-        <w:ind w:left="5760" w:hanging="360"/>
-      </w:pPr>
-    </w:lvl>
-    <w:lvl w:ilvl="8" w:tentative="1">
-      <w:start w:val="1"/>
-      <w:numFmt w:val="decimal"/>
-      <w:lvlText w:val="%9."/>
-      <w:lvlJc w:val="left"/>
-      <w:pPr>
-        <w:tabs>
-          <w:tab w:val="num" w:pos="6480"/>
-        </w:tabs>
-        <w:ind w:left="6480" w:hanging="360"/>
-      </w:pPr>
-    </w:lvl>
-  </w:abstractNum>
-  <w:abstractNum w:abstractNumId="4" w15:restartNumberingAfterBreak="0">
-    <w:nsid w:val="5C3F25DD"/>
-    <w:multiLevelType w:val="multilevel"/>
-    <w:tmpl w:val="A650E5CE"/>
+    <w:tmpl w:val="638452DE"/>
     <w:lvl w:ilvl="0">
       <w:start w:val="1"/>
       <w:numFmt w:val="bullet"/>
@@ -45180,10 +45069,123 @@
       </w:rPr>
     </w:lvl>
   </w:abstractNum>
+  <w:abstractNum w:abstractNumId="4" w15:restartNumberingAfterBreak="0">
+    <w:nsid w:val="1F110416"/>
+    <w:multiLevelType w:val="multilevel"/>
+    <w:tmpl w:val="D93A378E"/>
+    <w:lvl w:ilvl="0">
+      <w:start w:val="1"/>
+      <w:numFmt w:val="decimal"/>
+      <w:lvlText w:val="%1."/>
+      <w:lvlJc w:val="left"/>
+      <w:pPr>
+        <w:tabs>
+          <w:tab w:val="num" w:pos="720"/>
+        </w:tabs>
+        <w:ind w:left="720" w:hanging="360"/>
+      </w:pPr>
+    </w:lvl>
+    <w:lvl w:ilvl="1" w:tentative="1">
+      <w:start w:val="1"/>
+      <w:numFmt w:val="decimal"/>
+      <w:lvlText w:val="%2."/>
+      <w:lvlJc w:val="left"/>
+      <w:pPr>
+        <w:tabs>
+          <w:tab w:val="num" w:pos="1440"/>
+        </w:tabs>
+        <w:ind w:left="1440" w:hanging="360"/>
+      </w:pPr>
+    </w:lvl>
+    <w:lvl w:ilvl="2" w:tentative="1">
+      <w:start w:val="1"/>
+      <w:numFmt w:val="decimal"/>
+      <w:lvlText w:val="%3."/>
+      <w:lvlJc w:val="left"/>
+      <w:pPr>
+        <w:tabs>
+          <w:tab w:val="num" w:pos="2160"/>
+        </w:tabs>
+        <w:ind w:left="2160" w:hanging="360"/>
+      </w:pPr>
+    </w:lvl>
+    <w:lvl w:ilvl="3" w:tentative="1">
+      <w:start w:val="1"/>
+      <w:numFmt w:val="decimal"/>
+      <w:lvlText w:val="%4."/>
+      <w:lvlJc w:val="left"/>
+      <w:pPr>
+        <w:tabs>
+          <w:tab w:val="num" w:pos="2880"/>
+        </w:tabs>
+        <w:ind w:left="2880" w:hanging="360"/>
+      </w:pPr>
+    </w:lvl>
+    <w:lvl w:ilvl="4" w:tentative="1">
+      <w:start w:val="1"/>
+      <w:numFmt w:val="decimal"/>
+      <w:lvlText w:val="%5."/>
+      <w:lvlJc w:val="left"/>
+      <w:pPr>
+        <w:tabs>
+          <w:tab w:val="num" w:pos="3600"/>
+        </w:tabs>
+        <w:ind w:left="3600" w:hanging="360"/>
+      </w:pPr>
+    </w:lvl>
+    <w:lvl w:ilvl="5" w:tentative="1">
+      <w:start w:val="1"/>
+      <w:numFmt w:val="decimal"/>
+      <w:lvlText w:val="%6."/>
+      <w:lvlJc w:val="left"/>
+      <w:pPr>
+        <w:tabs>
+          <w:tab w:val="num" w:pos="4320"/>
+        </w:tabs>
+        <w:ind w:left="4320" w:hanging="360"/>
+      </w:pPr>
+    </w:lvl>
+    <w:lvl w:ilvl="6" w:tentative="1">
+      <w:start w:val="1"/>
+      <w:numFmt w:val="decimal"/>
+      <w:lvlText w:val="%7."/>
+      <w:lvlJc w:val="left"/>
+      <w:pPr>
+        <w:tabs>
+          <w:tab w:val="num" w:pos="5040"/>
+        </w:tabs>
+        <w:ind w:left="5040" w:hanging="360"/>
+      </w:pPr>
+    </w:lvl>
+    <w:lvl w:ilvl="7" w:tentative="1">
+      <w:start w:val="1"/>
+      <w:numFmt w:val="decimal"/>
+      <w:lvlText w:val="%8."/>
+      <w:lvlJc w:val="left"/>
+      <w:pPr>
+        <w:tabs>
+          <w:tab w:val="num" w:pos="5760"/>
+        </w:tabs>
+        <w:ind w:left="5760" w:hanging="360"/>
+      </w:pPr>
+    </w:lvl>
+    <w:lvl w:ilvl="8" w:tentative="1">
+      <w:start w:val="1"/>
+      <w:numFmt w:val="decimal"/>
+      <w:lvlText w:val="%9."/>
+      <w:lvlJc w:val="left"/>
+      <w:pPr>
+        <w:tabs>
+          <w:tab w:val="num" w:pos="6480"/>
+        </w:tabs>
+        <w:ind w:left="6480" w:hanging="360"/>
+      </w:pPr>
+    </w:lvl>
+  </w:abstractNum>
   <w:abstractNum w:abstractNumId="5" w15:restartNumberingAfterBreak="0">
-    <w:nsid w:val="71BE5531"/>
+    <w:nsid w:val="749E1397"/>
     <w:multiLevelType w:val="multilevel"/>
-    <w:tmpl w:val="F0404A30"/>
+    <w:tmpl w:val="677806CA"/>
     <w:lvl w:ilvl="0">
       <w:start w:val="1"/>
       <w:numFmt w:val="bullet"/>
@@ -45329,23 +45331,23 @@
       </w:rPr>
     </w:lvl>
   </w:abstractNum>
-  <w:num w:numId="1" w16cid:durableId="324938149">
+  <w:num w:numId="1" w16cid:durableId="1386492530">
     <w:abstractNumId w:val="2"/>
   </w:num>
-  <w:num w:numId="2" w16cid:durableId="1470786181">
+  <w:num w:numId="2" w16cid:durableId="761609784">
+    <w:abstractNumId w:val="1"/>
+  </w:num>
+  <w:num w:numId="3" w16cid:durableId="1212112013">
+    <w:abstractNumId w:val="4"/>
+  </w:num>
+  <w:num w:numId="4" w16cid:durableId="1510756936">
+    <w:abstractNumId w:val="5"/>
+  </w:num>
+  <w:num w:numId="5" w16cid:durableId="505749075">
     <w:abstractNumId w:val="0"/>
   </w:num>
-  <w:num w:numId="3" w16cid:durableId="1563442319">
+  <w:num w:numId="6" w16cid:durableId="817187602">
     <w:abstractNumId w:val="3"/>
-  </w:num>
-  <w:num w:numId="4" w16cid:durableId="306201086">
-    <w:abstractNumId w:val="1"/>
-  </w:num>
-  <w:num w:numId="5" w16cid:durableId="1598757301">
-    <w:abstractNumId w:val="4"/>
-  </w:num>
-  <w:num w:numId="6" w16cid:durableId="1287349334">
-    <w:abstractNumId w:val="5"/>
   </w:num>
 </w:numbering>
 </file>
@@ -46092,7 +46094,7 @@
     <w:link w:val="HeaderChar"/>
     <w:uiPriority w:val="99"/>
     <w:unhideWhenUsed/>
-    <w:rsid w:val="00C65E15"/>
+    <w:rsid w:val="00EF4CB0"/>
     <w:pPr>
       <w:tabs>
         <w:tab w:val="center" w:pos="4680"/>
@@ -46105,7 +46107,7 @@
     <w:basedOn w:val="DefaultParagraphFont"/>
     <w:link w:val="Header"/>
     <w:uiPriority w:val="99"/>
-    <w:rsid w:val="00C65E15"/>
+    <w:rsid w:val="00EF4CB0"/>
     <w:rPr>
       <w:rFonts w:eastAsiaTheme="minorEastAsia"/>
       <w:sz w:val="24"/>
@@ -46118,7 +46120,7 @@
     <w:link w:val="FooterChar"/>
     <w:uiPriority w:val="99"/>
     <w:unhideWhenUsed/>
-    <w:rsid w:val="00C65E15"/>
+    <w:rsid w:val="00EF4CB0"/>
     <w:pPr>
       <w:tabs>
         <w:tab w:val="center" w:pos="4680"/>
@@ -46131,7 +46133,7 @@
     <w:basedOn w:val="DefaultParagraphFont"/>
     <w:link w:val="Footer"/>
     <w:uiPriority w:val="99"/>
-    <w:rsid w:val="00C65E15"/>
+    <w:rsid w:val="00EF4CB0"/>
     <w:rPr>
       <w:rFonts w:eastAsiaTheme="minorEastAsia"/>
       <w:sz w:val="24"/>
@@ -46144,7 +46146,7 @@
     <w:uiPriority w:val="99"/>
     <w:semiHidden/>
     <w:unhideWhenUsed/>
-    <w:rsid w:val="00C65E15"/>
+    <w:rsid w:val="00EF4CB0"/>
   </w:style>
   <w:style w:type="character" w:styleId="Hyperlink">
     <w:name w:val="Hyperlink"/>
@@ -46152,7 +46154,7 @@
     <w:uiPriority w:val="99"/>
     <w:semiHidden/>
     <w:unhideWhenUsed/>
-    <w:rsid w:val="00C65E15"/>
+    <w:rsid w:val="00EF4CB0"/>
     <w:rPr>
       <w:color w:val="auto"/>
       <w:u w:val="single"/>
@@ -46165,7 +46167,7 @@
     <w:autoRedefine/>
     <w:uiPriority w:val="39"/>
     <w:unhideWhenUsed/>
-    <w:rsid w:val="00C65E15"/>
+    <w:rsid w:val="00EF4CB0"/>
     <w:pPr>
       <w:spacing w:after="100" w:line="360" w:lineRule="auto"/>
     </w:pPr>
@@ -46177,7 +46179,7 @@
     <w:autoRedefine/>
     <w:uiPriority w:val="39"/>
     <w:unhideWhenUsed/>
-    <w:rsid w:val="00C65E15"/>
+    <w:rsid w:val="00EF4CB0"/>
     <w:pPr>
       <w:spacing w:after="100" w:line="360" w:lineRule="auto"/>
       <w:ind w:left="240"/>
@@ -46191,7 +46193,7 @@
     <w:uiPriority w:val="39"/>
     <w:semiHidden/>
     <w:unhideWhenUsed/>
-    <w:rsid w:val="00C65E15"/>
+    <w:rsid w:val="00EF4CB0"/>
     <w:pPr>
       <w:spacing w:after="100" w:line="360" w:lineRule="auto"/>
       <w:ind w:left="480"/>

</xml_diff>

<commit_message>
Add related work on gem identification and rule-based expert systems
</commit_message>
<xml_diff>
--- a/gem_expert/docs/Gemstone_Identification_Assistant_Report.docx
+++ b/gem_expert/docs/Gemstone_Identification_Assistant_Report.docx
@@ -145,7 +145,7 @@
         </w:rPr>
         <w:br w:type="page"/>
       </w:r>
-      <w:bookmarkStart w:id="0" w:name="_Toc241602106"/>
+      <w:bookmarkStart w:id="0" w:name="_Toc241603496"/>
       <w:r>
         <w:rPr>
           <w:rFonts w:eastAsia="Times New Roman"/>
@@ -285,7 +285,7 @@
         <w:rPr>
           <w:noProof/>
         </w:rPr>
-        <w:instrText xml:space="preserve"> PAGEREF _Toc241602106 \h </w:instrText>
+        <w:instrText xml:space="preserve"> PAGEREF _Toc241603496 \h </w:instrText>
       </w:r>
       <w:r>
         <w:rPr>
@@ -347,7 +347,7 @@
         <w:rPr>
           <w:noProof/>
         </w:rPr>
-        <w:instrText xml:space="preserve"> PAGEREF _Toc241602107 \h </w:instrText>
+        <w:instrText xml:space="preserve"> PAGEREF _Toc241603497 \h </w:instrText>
       </w:r>
       <w:r>
         <w:rPr>
@@ -409,7 +409,7 @@
         <w:rPr>
           <w:noProof/>
         </w:rPr>
-        <w:instrText xml:space="preserve"> PAGEREF _Toc241602108 \h </w:instrText>
+        <w:instrText xml:space="preserve"> PAGEREF _Toc241603498 \h </w:instrText>
       </w:r>
       <w:r>
         <w:rPr>
@@ -471,7 +471,7 @@
         <w:rPr>
           <w:noProof/>
         </w:rPr>
-        <w:instrText xml:space="preserve"> PAGEREF _Toc241602109 \h </w:instrText>
+        <w:instrText xml:space="preserve"> PAGEREF _Toc241603499 \h </w:instrText>
       </w:r>
       <w:r>
         <w:rPr>
@@ -533,7 +533,7 @@
         <w:rPr>
           <w:noProof/>
         </w:rPr>
-        <w:instrText xml:space="preserve"> PAGEREF _Toc241602110 \h </w:instrText>
+        <w:instrText xml:space="preserve"> PAGEREF _Toc241603500 \h </w:instrText>
       </w:r>
       <w:r>
         <w:rPr>
@@ -595,7 +595,7 @@
         <w:rPr>
           <w:noProof/>
         </w:rPr>
-        <w:instrText xml:space="preserve"> PAGEREF _Toc241602111 \h </w:instrText>
+        <w:instrText xml:space="preserve"> PAGEREF _Toc241603501 \h </w:instrText>
       </w:r>
       <w:r>
         <w:rPr>
@@ -657,7 +657,7 @@
         <w:rPr>
           <w:noProof/>
         </w:rPr>
-        <w:instrText xml:space="preserve"> PAGEREF _Toc241602112 \h </w:instrText>
+        <w:instrText xml:space="preserve"> PAGEREF _Toc241603502 \h </w:instrText>
       </w:r>
       <w:r>
         <w:rPr>
@@ -719,7 +719,7 @@
         <w:rPr>
           <w:noProof/>
         </w:rPr>
-        <w:instrText xml:space="preserve"> PAGEREF _Toc241602113 \h </w:instrText>
+        <w:instrText xml:space="preserve"> PAGEREF _Toc241603503 \h </w:instrText>
       </w:r>
       <w:r>
         <w:rPr>
@@ -781,7 +781,7 @@
         <w:rPr>
           <w:noProof/>
         </w:rPr>
-        <w:instrText xml:space="preserve"> PAGEREF _Toc241602114 \h </w:instrText>
+        <w:instrText xml:space="preserve"> PAGEREF _Toc241603504 \h </w:instrText>
       </w:r>
       <w:r>
         <w:rPr>
@@ -843,7 +843,7 @@
         <w:rPr>
           <w:noProof/>
         </w:rPr>
-        <w:instrText xml:space="preserve"> PAGEREF _Toc241602115 \h </w:instrText>
+        <w:instrText xml:space="preserve"> PAGEREF _Toc241603505 \h </w:instrText>
       </w:r>
       <w:r>
         <w:rPr>
@@ -905,7 +905,7 @@
         <w:rPr>
           <w:noProof/>
         </w:rPr>
-        <w:instrText xml:space="preserve"> PAGEREF _Toc241602116 \h </w:instrText>
+        <w:instrText xml:space="preserve"> PAGEREF _Toc241603506 \h </w:instrText>
       </w:r>
       <w:r>
         <w:rPr>
@@ -967,7 +967,7 @@
         <w:rPr>
           <w:noProof/>
         </w:rPr>
-        <w:instrText xml:space="preserve"> PAGEREF _Toc241602117 \h </w:instrText>
+        <w:instrText xml:space="preserve"> PAGEREF _Toc241603507 \h </w:instrText>
       </w:r>
       <w:r>
         <w:rPr>
@@ -984,7 +984,7 @@
         <w:rPr>
           <w:noProof/>
         </w:rPr>
-        <w:t>10</w:t>
+        <w:t>11</w:t>
       </w:r>
       <w:r>
         <w:rPr>
@@ -1029,7 +1029,7 @@
         <w:rPr>
           <w:noProof/>
         </w:rPr>
-        <w:instrText xml:space="preserve"> PAGEREF _Toc241602118 \h </w:instrText>
+        <w:instrText xml:space="preserve"> PAGEREF _Toc241603508 \h </w:instrText>
       </w:r>
       <w:r>
         <w:rPr>
@@ -1046,7 +1046,7 @@
         <w:rPr>
           <w:noProof/>
         </w:rPr>
-        <w:t>14</w:t>
+        <w:t>15</w:t>
       </w:r>
       <w:r>
         <w:rPr>
@@ -1091,7 +1091,7 @@
         <w:rPr>
           <w:noProof/>
         </w:rPr>
-        <w:instrText xml:space="preserve"> PAGEREF _Toc241602119 \h </w:instrText>
+        <w:instrText xml:space="preserve"> PAGEREF _Toc241603509 \h </w:instrText>
       </w:r>
       <w:r>
         <w:rPr>
@@ -1153,7 +1153,7 @@
         <w:rPr>
           <w:noProof/>
         </w:rPr>
-        <w:instrText xml:space="preserve"> PAGEREF _Toc241602120 \h </w:instrText>
+        <w:instrText xml:space="preserve"> PAGEREF _Toc241603510 \h </w:instrText>
       </w:r>
       <w:r>
         <w:rPr>
@@ -1215,7 +1215,7 @@
         <w:rPr>
           <w:noProof/>
         </w:rPr>
-        <w:instrText xml:space="preserve"> PAGEREF _Toc241602121 \h </w:instrText>
+        <w:instrText xml:space="preserve"> PAGEREF _Toc241603511 \h </w:instrText>
       </w:r>
       <w:r>
         <w:rPr>
@@ -1277,7 +1277,7 @@
         <w:rPr>
           <w:noProof/>
         </w:rPr>
-        <w:instrText xml:space="preserve"> PAGEREF _Toc241602122 \h </w:instrText>
+        <w:instrText xml:space="preserve"> PAGEREF _Toc241603512 \h </w:instrText>
       </w:r>
       <w:r>
         <w:rPr>
@@ -1294,7 +1294,7 @@
         <w:rPr>
           <w:noProof/>
         </w:rPr>
-        <w:t>19</w:t>
+        <w:t>20</w:t>
       </w:r>
       <w:r>
         <w:rPr>
@@ -1339,7 +1339,7 @@
         <w:rPr>
           <w:noProof/>
         </w:rPr>
-        <w:instrText xml:space="preserve"> PAGEREF _Toc241602123 \h </w:instrText>
+        <w:instrText xml:space="preserve"> PAGEREF _Toc241603513 \h </w:instrText>
       </w:r>
       <w:r>
         <w:rPr>
@@ -1401,7 +1401,7 @@
         <w:rPr>
           <w:noProof/>
         </w:rPr>
-        <w:instrText xml:space="preserve"> PAGEREF _Toc241602124 \h </w:instrText>
+        <w:instrText xml:space="preserve"> PAGEREF _Toc241603514 \h </w:instrText>
       </w:r>
       <w:r>
         <w:rPr>
@@ -1463,7 +1463,7 @@
         <w:rPr>
           <w:noProof/>
         </w:rPr>
-        <w:instrText xml:space="preserve"> PAGEREF _Toc241602125 \h </w:instrText>
+        <w:instrText xml:space="preserve"> PAGEREF _Toc241603515 \h </w:instrText>
       </w:r>
       <w:r>
         <w:rPr>
@@ -1525,7 +1525,7 @@
         <w:rPr>
           <w:noProof/>
         </w:rPr>
-        <w:instrText xml:space="preserve"> PAGEREF _Toc241602126 \h </w:instrText>
+        <w:instrText xml:space="preserve"> PAGEREF _Toc241603516 \h </w:instrText>
       </w:r>
       <w:r>
         <w:rPr>
@@ -1587,7 +1587,7 @@
         <w:rPr>
           <w:noProof/>
         </w:rPr>
-        <w:instrText xml:space="preserve"> PAGEREF _Toc241602127 \h </w:instrText>
+        <w:instrText xml:space="preserve"> PAGEREF _Toc241603517 \h </w:instrText>
       </w:r>
       <w:r>
         <w:rPr>
@@ -1649,7 +1649,7 @@
         <w:rPr>
           <w:noProof/>
         </w:rPr>
-        <w:instrText xml:space="preserve"> PAGEREF _Toc241602128 \h </w:instrText>
+        <w:instrText xml:space="preserve"> PAGEREF _Toc241603518 \h </w:instrText>
       </w:r>
       <w:r>
         <w:rPr>
@@ -1711,7 +1711,7 @@
         <w:rPr>
           <w:noProof/>
         </w:rPr>
-        <w:instrText xml:space="preserve"> PAGEREF _Toc241602129 \h </w:instrText>
+        <w:instrText xml:space="preserve"> PAGEREF _Toc241603519 \h </w:instrText>
       </w:r>
       <w:r>
         <w:rPr>
@@ -1773,7 +1773,7 @@
         <w:rPr>
           <w:noProof/>
         </w:rPr>
-        <w:instrText xml:space="preserve"> PAGEREF _Toc241602130 \h </w:instrText>
+        <w:instrText xml:space="preserve"> PAGEREF _Toc241603520 \h </w:instrText>
       </w:r>
       <w:r>
         <w:rPr>
@@ -1835,7 +1835,7 @@
         <w:rPr>
           <w:noProof/>
         </w:rPr>
-        <w:instrText xml:space="preserve"> PAGEREF _Toc241602131 \h </w:instrText>
+        <w:instrText xml:space="preserve"> PAGEREF _Toc241603521 \h </w:instrText>
       </w:r>
       <w:r>
         <w:rPr>
@@ -1898,7 +1898,7 @@
         <w:rPr>
           <w:noProof/>
         </w:rPr>
-        <w:instrText xml:space="preserve"> PAGEREF _Toc241602132 \h </w:instrText>
+        <w:instrText xml:space="preserve"> PAGEREF _Toc241603522 \h </w:instrText>
       </w:r>
       <w:r>
         <w:rPr>
@@ -1960,7 +1960,7 @@
         <w:rPr>
           <w:noProof/>
         </w:rPr>
-        <w:instrText xml:space="preserve"> PAGEREF _Toc241602133 \h </w:instrText>
+        <w:instrText xml:space="preserve"> PAGEREF _Toc241603523 \h </w:instrText>
       </w:r>
       <w:r>
         <w:rPr>
@@ -2022,7 +2022,7 @@
         <w:rPr>
           <w:noProof/>
         </w:rPr>
-        <w:instrText xml:space="preserve"> PAGEREF _Toc241602134 \h </w:instrText>
+        <w:instrText xml:space="preserve"> PAGEREF _Toc241603524 \h </w:instrText>
       </w:r>
       <w:r>
         <w:rPr>
@@ -2084,7 +2084,7 @@
         <w:rPr>
           <w:noProof/>
         </w:rPr>
-        <w:instrText xml:space="preserve"> PAGEREF _Toc241602135 \h </w:instrText>
+        <w:instrText xml:space="preserve"> PAGEREF _Toc241603525 \h </w:instrText>
       </w:r>
       <w:r>
         <w:rPr>
@@ -2146,7 +2146,7 @@
         <w:rPr>
           <w:noProof/>
         </w:rPr>
-        <w:instrText xml:space="preserve"> PAGEREF _Toc241602136 \h </w:instrText>
+        <w:instrText xml:space="preserve"> PAGEREF _Toc241603526 \h </w:instrText>
       </w:r>
       <w:r>
         <w:rPr>
@@ -2208,7 +2208,7 @@
         <w:rPr>
           <w:noProof/>
         </w:rPr>
-        <w:instrText xml:space="preserve"> PAGEREF _Toc241602137 \h </w:instrText>
+        <w:instrText xml:space="preserve"> PAGEREF _Toc241603527 \h </w:instrText>
       </w:r>
       <w:r>
         <w:rPr>
@@ -2270,7 +2270,7 @@
         <w:rPr>
           <w:noProof/>
         </w:rPr>
-        <w:instrText xml:space="preserve"> PAGEREF _Toc241602138 \h </w:instrText>
+        <w:instrText xml:space="preserve"> PAGEREF _Toc241603528 \h </w:instrText>
       </w:r>
       <w:r>
         <w:rPr>
@@ -2332,7 +2332,7 @@
         <w:rPr>
           <w:noProof/>
         </w:rPr>
-        <w:instrText xml:space="preserve"> PAGEREF _Toc241602139 \h </w:instrText>
+        <w:instrText xml:space="preserve"> PAGEREF _Toc241603529 \h </w:instrText>
       </w:r>
       <w:r>
         <w:rPr>
@@ -2394,7 +2394,7 @@
         <w:rPr>
           <w:noProof/>
         </w:rPr>
-        <w:instrText xml:space="preserve"> PAGEREF _Toc241602140 \h </w:instrText>
+        <w:instrText xml:space="preserve"> PAGEREF _Toc241603530 \h </w:instrText>
       </w:r>
       <w:r>
         <w:rPr>
@@ -2456,7 +2456,7 @@
         <w:rPr>
           <w:noProof/>
         </w:rPr>
-        <w:instrText xml:space="preserve"> PAGEREF _Toc241602141 \h </w:instrText>
+        <w:instrText xml:space="preserve"> PAGEREF _Toc241603531 \h </w:instrText>
       </w:r>
       <w:r>
         <w:rPr>
@@ -2518,7 +2518,7 @@
         <w:rPr>
           <w:noProof/>
         </w:rPr>
-        <w:instrText xml:space="preserve"> PAGEREF _Toc241602142 \h </w:instrText>
+        <w:instrText xml:space="preserve"> PAGEREF _Toc241603532 \h </w:instrText>
       </w:r>
       <w:r>
         <w:rPr>
@@ -2580,7 +2580,7 @@
         <w:rPr>
           <w:noProof/>
         </w:rPr>
-        <w:instrText xml:space="preserve"> PAGEREF _Toc241602143 \h </w:instrText>
+        <w:instrText xml:space="preserve"> PAGEREF _Toc241603533 \h </w:instrText>
       </w:r>
       <w:r>
         <w:rPr>
@@ -2642,7 +2642,7 @@
         <w:rPr>
           <w:noProof/>
         </w:rPr>
-        <w:instrText xml:space="preserve"> PAGEREF _Toc241602144 \h </w:instrText>
+        <w:instrText xml:space="preserve"> PAGEREF _Toc241603534 \h </w:instrText>
       </w:r>
       <w:r>
         <w:rPr>
@@ -2704,7 +2704,7 @@
         <w:rPr>
           <w:noProof/>
         </w:rPr>
-        <w:instrText xml:space="preserve"> PAGEREF _Toc241602145 \h </w:instrText>
+        <w:instrText xml:space="preserve"> PAGEREF _Toc241603535 \h </w:instrText>
       </w:r>
       <w:r>
         <w:rPr>
@@ -2766,7 +2766,7 @@
         <w:rPr>
           <w:noProof/>
         </w:rPr>
-        <w:instrText xml:space="preserve"> PAGEREF _Toc241602146 \h </w:instrText>
+        <w:instrText xml:space="preserve"> PAGEREF _Toc241603536 \h </w:instrText>
       </w:r>
       <w:r>
         <w:rPr>
@@ -2828,7 +2828,7 @@
         <w:rPr>
           <w:noProof/>
         </w:rPr>
-        <w:instrText xml:space="preserve"> PAGEREF _Toc241602147 \h </w:instrText>
+        <w:instrText xml:space="preserve"> PAGEREF _Toc241603537 \h </w:instrText>
       </w:r>
       <w:r>
         <w:rPr>
@@ -2890,7 +2890,7 @@
         <w:rPr>
           <w:noProof/>
         </w:rPr>
-        <w:instrText xml:space="preserve"> PAGEREF _Toc241602148 \h </w:instrText>
+        <w:instrText xml:space="preserve"> PAGEREF _Toc241603538 \h </w:instrText>
       </w:r>
       <w:r>
         <w:rPr>
@@ -2907,7 +2907,7 @@
         <w:rPr>
           <w:noProof/>
         </w:rPr>
-        <w:t>43</w:t>
+        <w:t>44</w:t>
       </w:r>
       <w:r>
         <w:rPr>
@@ -2952,7 +2952,7 @@
         <w:rPr>
           <w:noProof/>
         </w:rPr>
-        <w:instrText xml:space="preserve"> PAGEREF _Toc241602149 \h </w:instrText>
+        <w:instrText xml:space="preserve"> PAGEREF _Toc241603539 \h </w:instrText>
       </w:r>
       <w:r>
         <w:rPr>
@@ -2969,7 +2969,7 @@
         <w:rPr>
           <w:noProof/>
         </w:rPr>
-        <w:t>50</w:t>
+        <w:t>51</w:t>
       </w:r>
       <w:r>
         <w:rPr>
@@ -3014,7 +3014,7 @@
         <w:rPr>
           <w:noProof/>
         </w:rPr>
-        <w:instrText xml:space="preserve"> PAGEREF _Toc241602150 \h </w:instrText>
+        <w:instrText xml:space="preserve"> PAGEREF _Toc241603540 \h </w:instrText>
       </w:r>
       <w:r>
         <w:rPr>
@@ -3031,7 +3031,7 @@
         <w:rPr>
           <w:noProof/>
         </w:rPr>
-        <w:t>51</w:t>
+        <w:t>52</w:t>
       </w:r>
       <w:r>
         <w:rPr>
@@ -3062,7 +3062,7 @@
         </w:rPr>
         <w:br w:type="page"/>
       </w:r>
-      <w:bookmarkStart w:id="1" w:name="_Toc241602107"/>
+      <w:bookmarkStart w:id="1" w:name="_Toc241603497"/>
       <w:r>
         <w:rPr>
           <w:rFonts w:eastAsia="Times New Roman"/>
@@ -3079,7 +3079,7 @@
           <w:rFonts w:eastAsia="Times New Roman"/>
         </w:rPr>
       </w:pPr>
-      <w:bookmarkStart w:id="2" w:name="_Toc241602108"/>
+      <w:bookmarkStart w:id="2" w:name="_Toc241603498"/>
       <w:r>
         <w:rPr>
           <w:rFonts w:eastAsia="Times New Roman"/>
@@ -3106,7 +3106,7 @@
           <w:rFonts w:eastAsia="Times New Roman"/>
         </w:rPr>
       </w:pPr>
-      <w:bookmarkStart w:id="3" w:name="_Toc241602109"/>
+      <w:bookmarkStart w:id="3" w:name="_Toc241603499"/>
       <w:r>
         <w:rPr>
           <w:rFonts w:eastAsia="Times New Roman"/>
@@ -3143,7 +3143,7 @@
           <w:rFonts w:eastAsia="Times New Roman"/>
         </w:rPr>
       </w:pPr>
-      <w:bookmarkStart w:id="4" w:name="_Toc241602110"/>
+      <w:bookmarkStart w:id="4" w:name="_Toc241603500"/>
       <w:r>
         <w:rPr>
           <w:rFonts w:eastAsia="Times New Roman"/>
@@ -3301,7 +3301,7 @@
           <w:rFonts w:eastAsia="Times New Roman"/>
         </w:rPr>
       </w:pPr>
-      <w:bookmarkStart w:id="5" w:name="_Toc241602111"/>
+      <w:bookmarkStart w:id="5" w:name="_Toc241603501"/>
       <w:r>
         <w:rPr>
           <w:rFonts w:eastAsia="Times New Roman"/>
@@ -3315,10 +3315,10 @@
         <w:pStyle w:val="NormalWeb"/>
       </w:pPr>
       <w:r>
-        <w:t>The system specialises in ten gem species that are common in Sri Lanka (corundum, spinel, garnet, chrysoberyl, zircon, topaz, tourmaline, quartz, orthoclase feldspar and beryl), eighteen named varieties (</w:t>
-      </w:r>
-      <w:r>
-        <w:t>for example ruby, blue sapphire, padparadscha, alexandrite, cat's-eye chrysoberyl, moonstone, hessonite and aquamarine) and the two most common imitation materials, glass and cubic zirconia. It reasons from six observable properties: refractive index (RI), specific gravity (SG), optic character, body colour, optical phenomenon and the dominant inclusion type.</w:t>
+        <w:t>The system specialises in ten gem species that are common in Sri Lanka (corundum, spinel, garnet, chrysoberyl, zircon, topaz, tourmaline, quartz, orthoclase feldspar and beryl), eighteen named varieti</w:t>
+      </w:r>
+      <w:r>
+        <w:t>es (for example ruby, blue sapphire, padparadscha, alexandrite, cat's-eye chrysoberyl, moonstone, hessonite and aquamarine) and the two most common imitation materials, glass and cubic zirconia. It reasons from six observable properties: refractive index (RI), specific gravity (SG), optic character, body colour, optical phenomenon and the dominant inclusion type.</w:t>
       </w:r>
     </w:p>
     <w:p>
@@ -3328,7 +3328,7 @@
           <w:rFonts w:eastAsia="Times New Roman"/>
         </w:rPr>
       </w:pPr>
-      <w:bookmarkStart w:id="6" w:name="_Toc241602112"/>
+      <w:bookmarkStart w:id="6" w:name="_Toc241603502"/>
       <w:r>
         <w:rPr>
           <w:rFonts w:eastAsia="Times New Roman"/>
@@ -4208,7 +4208,7 @@
           <w:rFonts w:eastAsia="Times New Roman"/>
         </w:rPr>
       </w:pPr>
-      <w:bookmarkStart w:id="7" w:name="_Toc241602113"/>
+      <w:bookmarkStart w:id="7" w:name="_Toc241603503"/>
       <w:r>
         <w:rPr>
           <w:rFonts w:eastAsia="Times New Roman"/>
@@ -4246,7 +4246,7 @@
           <w:rFonts w:eastAsia="Times New Roman"/>
         </w:rPr>
       </w:pPr>
-      <w:bookmarkStart w:id="8" w:name="_Toc241602114"/>
+      <w:bookmarkStart w:id="8" w:name="_Toc241603504"/>
       <w:r>
         <w:rPr>
           <w:rFonts w:eastAsia="Times New Roman"/>
@@ -4273,7 +4273,7 @@
           <w:noProof/>
         </w:rPr>
         <w:drawing>
-          <wp:inline distT="0" distB="0" distL="0" distR="0" wp14:anchorId="62630D6B" wp14:editId="401D3F97">
+          <wp:inline distT="0" distB="0" distL="0" distR="0" wp14:anchorId="5CF7F422" wp14:editId="437B8E00">
             <wp:extent cx="5715000" cy="1272540"/>
             <wp:effectExtent l="0" t="0" r="0" b="3810"/>
             <wp:docPr id="1" name="Picture 1"/>
@@ -4338,7 +4338,7 @@
           <w:rFonts w:eastAsia="Times New Roman"/>
         </w:rPr>
       </w:pPr>
-      <w:bookmarkStart w:id="9" w:name="_Toc241602115"/>
+      <w:bookmarkStart w:id="9" w:name="_Toc241603505"/>
       <w:r>
         <w:rPr>
           <w:rFonts w:eastAsia="Times New Roman"/>
@@ -7519,7 +7519,7 @@
           <w:rFonts w:eastAsia="Times New Roman"/>
         </w:rPr>
       </w:pPr>
-      <w:bookmarkStart w:id="10" w:name="_Toc241602116"/>
+      <w:bookmarkStart w:id="10" w:name="_Toc241603506"/>
       <w:r>
         <w:rPr>
           <w:rFonts w:eastAsia="Times New Roman"/>
@@ -7625,13 +7625,13 @@
         <w:rPr>
           <w:rFonts w:eastAsia="Times New Roman"/>
         </w:rPr>
-        <w:t xml:space="preserve"> is data-dr</w:t>
+        <w:t xml:space="preserve"> is dat</w:t>
       </w:r>
       <w:r>
         <w:rPr>
           <w:rFonts w:eastAsia="Times New Roman"/>
         </w:rPr>
-        <w:t xml:space="preserve">iven. Starting from the known facts, the engine repeatedly finds a rule whose conditions are all satisfied, adds its conclusion to working memory, and stops when no rule can add anything new. When several rules are applicable, a </w:t>
+        <w:t xml:space="preserve">a-driven. Starting from the known facts, the engine repeatedly finds a rule whose conditions are all satisfied, adds its conclusion to working memory, and stops when no rule can add anything new. When several rules are applicable, a </w:t>
       </w:r>
       <w:r>
         <w:rPr>
@@ -7737,21 +7737,82 @@
     </w:p>
     <w:p>
       <w:pPr>
-        <w:pStyle w:val="note"/>
-        <w:spacing w:before="0" w:beforeAutospacing="0" w:after="120"/>
-      </w:pPr>
-      <w:r>
-        <w:t>[Add here 2-3 published papers on gemstone identification systems or rule-based expert systems in mineralogy/gemmology found on Google Scholar, and state how this system differs, e.g. its Sri Lankan focus, certainty factors, three reasoning modes and plain-language explanation facility. Add them to the reference list.]</w:t>
+        <w:pStyle w:val="NormalWeb"/>
+      </w:pPr>
+      <w:r>
+        <w:rPr>
+          <w:b/>
+          <w:bCs/>
+        </w:rPr>
+        <w:t>Related work on gemstone identification.</w:t>
+      </w:r>
+      <w:r>
+        <w:t xml:space="preserve"> </w:t>
+      </w:r>
+      <w:r>
+        <w:t>Most published work on gem identification concentrates on laboratory instruments. Fritsch and Stockton [21] showed how infrared spectroscopy can simplify identification by comparing a stone's spectrum with a library of standard reference spectra. Jenkins and Larsen [23] described identification with Raman spectroscopy, noting that gems are usually examined by trained personnel using a variety of methods. Karampelas et al. [22] review the instruments that help to meet the challenges of the modern gem market,</w:t>
+      </w:r>
+      <w:r>
+        <w:t xml:space="preserve"> where treatments are widespread and the origin of a gem has become more important than in the past. These methods are accurate, but they need laboratory equipment and specialist training that a buyer in a local market rarely has. More recently, Raheem et al. [24] used convolutional neural networks to improve the accuracy of gemstone identification from images. This is the machine-learning direction discussed in Section 7.2: such models can be accurate on photographs, but they do not explain their decisions</w:t>
+      </w:r>
+      <w:r>
+        <w:t xml:space="preserve"> and cannot use RI, SG or optic character.</w:t>
       </w:r>
     </w:p>
     <w:p>
       <w:pPr>
+        <w:pStyle w:val="NormalWeb"/>
+      </w:pPr>
+      <w:r>
+        <w:rPr>
+          <w:b/>
+          <w:bCs/>
+        </w:rPr>
+        <w:t>Related work on rule-based expert systems.</w:t>
+      </w:r>
+      <w:r>
+        <w:t xml:space="preserve"> </w:t>
+      </w:r>
+      <w:r>
+        <w:t>Buchanan and Duda [25] surveyed the principles of rule-based expert systems and the production-system model on which this project is built. Grosan and Abraham [26] and Abraham [27] describe the architecture of such systems, including the explanation facility that allows a user to understand how the system arrived at a conclusion. Clancey [28], working from MYCIN, asked how domain-independent strategic knowledge can be represented in a rule-based system so that its reasoning can be explained and taught, whic</w:t>
+      </w:r>
+      <w:r>
+        <w:t>h supports this project's emphasis on justifying every conclusion.</w:t>
+      </w:r>
+    </w:p>
+    <w:p>
+      <w:pPr>
+        <w:pStyle w:val="NormalWeb"/>
+      </w:pPr>
+      <w:r>
+        <w:rPr>
+          <w:b/>
+          <w:bCs/>
+        </w:rPr>
+        <w:t>How this system differs.</w:t>
+      </w:r>
+      <w:r>
+        <w:t xml:space="preserve"> </w:t>
+      </w:r>
+      <w:r>
+        <w:t>Compared with the instrumental studies [21]-[23], the Gemstone Identification Assistant works from the basic readings and observations available to a buyer or student (a refractometer, a hydrostatic balance, a polariscope and a loupe) and gives a first opinion rather than a laboratory result. Compared with image-based classification [24], every conclusion is explained step by step and linked to a published source. Building on the rule-based principles in [25]-[28], it adds a focus on Sri Lankan gems and the</w:t>
+      </w:r>
+      <w:r>
+        <w:t xml:space="preserve"> local trade, three reasoning modes over one rule base (forward chaining, backward chaining and an interactive </w:t>
+      </w:r>
+      <w:r>
+        <w:lastRenderedPageBreak/>
+        <w:t>consultation), certainty factors that turn incomplete data into ranked candidates with a suggested next measurement, and plain-language How, Why and Why-not explanations with reasoning diagrams for non-experts.</w:t>
+      </w:r>
+    </w:p>
+    <w:p>
+      <w:pPr>
         <w:pStyle w:val="Heading2"/>
         <w:rPr>
           <w:rFonts w:eastAsia="Times New Roman"/>
         </w:rPr>
       </w:pPr>
-      <w:bookmarkStart w:id="11" w:name="_Toc241602117"/>
+      <w:bookmarkStart w:id="11" w:name="_Toc241603507"/>
       <w:r>
         <w:rPr>
           <w:rFonts w:eastAsia="Times New Roman"/>
@@ -7926,7 +7987,6 @@
           <w:b/>
           <w:bCs/>
         </w:rPr>
-        <w:lastRenderedPageBreak/>
         <w:t>"Over the limit" as a reading.</w:t>
       </w:r>
       <w:r>
@@ -7954,6 +8014,7 @@
         <w:pStyle w:val="tcaption"/>
       </w:pPr>
       <w:r>
+        <w:lastRenderedPageBreak/>
         <w:t>Table 3. Knowledge acquisition table (representative entries; KE = knowledge engineer decision)</w:t>
       </w:r>
     </w:p>
@@ -10888,7 +10949,6 @@
                 <w:sz w:val="20"/>
                 <w:szCs w:val="20"/>
               </w:rPr>
-              <w:lastRenderedPageBreak/>
               <w:t>K15</w:t>
             </w:r>
           </w:p>
@@ -11269,6 +11329,7 @@
                 <w:sz w:val="20"/>
                 <w:szCs w:val="20"/>
               </w:rPr>
+              <w:lastRenderedPageBreak/>
               <w:t>K17</w:t>
             </w:r>
           </w:p>
@@ -13169,7 +13230,6 @@
                 <w:sz w:val="20"/>
                 <w:szCs w:val="20"/>
               </w:rPr>
-              <w:lastRenderedPageBreak/>
               <w:t>K27</w:t>
             </w:r>
           </w:p>
@@ -13360,6 +13420,7 @@
                 <w:sz w:val="20"/>
                 <w:szCs w:val="20"/>
               </w:rPr>
+              <w:lastRenderedPageBreak/>
               <w:t>K28</w:t>
             </w:r>
           </w:p>
@@ -15640,7 +15701,6 @@
                 <w:sz w:val="20"/>
                 <w:szCs w:val="20"/>
               </w:rPr>
-              <w:lastRenderedPageBreak/>
               <w:t>K40</w:t>
             </w:r>
           </w:p>
@@ -15831,6 +15891,7 @@
                 <w:sz w:val="20"/>
                 <w:szCs w:val="20"/>
               </w:rPr>
+              <w:lastRenderedPageBreak/>
               <w:t>K41</w:t>
             </w:r>
           </w:p>
@@ -16001,7 +16062,7 @@
           <w:rFonts w:eastAsia="Times New Roman"/>
         </w:rPr>
       </w:pPr>
-      <w:bookmarkStart w:id="12" w:name="_Toc241602118"/>
+      <w:bookmarkStart w:id="12" w:name="_Toc241603508"/>
       <w:r>
         <w:rPr>
           <w:rFonts w:eastAsia="Times New Roman"/>
@@ -16662,7 +16723,6 @@
                 <w:sz w:val="20"/>
                 <w:szCs w:val="20"/>
               </w:rPr>
-              <w:lastRenderedPageBreak/>
               <w:t>hardness(Gem, H), birefringence(Gem, B)</w:t>
             </w:r>
           </w:p>
@@ -16742,6 +16802,7 @@
                 <w:sz w:val="20"/>
                 <w:szCs w:val="20"/>
               </w:rPr>
+              <w:lastRenderedPageBreak/>
               <w:t>colour(Gem, C), typical_colour(Gem, C)</w:t>
             </w:r>
           </w:p>
@@ -17513,9 +17574,8 @@
         <w:rPr>
           <w:noProof/>
         </w:rPr>
-        <w:lastRenderedPageBreak/>
         <w:drawing>
-          <wp:inline distT="0" distB="0" distL="0" distR="0" wp14:anchorId="51D8438E" wp14:editId="608A9905">
+          <wp:inline distT="0" distB="0" distL="0" distR="0" wp14:anchorId="364BD0F9" wp14:editId="6A6518F6">
             <wp:extent cx="5524500" cy="3208020"/>
             <wp:effectExtent l="0" t="0" r="0" b="0"/>
             <wp:docPr id="2" name="Picture 2"/>
@@ -17582,6 +17642,7 @@
           <w:b/>
           <w:bCs/>
         </w:rPr>
+        <w:lastRenderedPageBreak/>
         <w:t>How to read a rule.</w:t>
       </w:r>
       <w:r>
@@ -18169,7 +18230,6 @@
                 <w:sz w:val="20"/>
                 <w:szCs w:val="20"/>
               </w:rPr>
-              <w:lastRenderedPageBreak/>
               <w:t>4. Advice</w:t>
             </w:r>
           </w:p>
@@ -18288,7 +18348,7 @@
           <w:rFonts w:eastAsia="Times New Roman"/>
         </w:rPr>
       </w:pPr>
-      <w:bookmarkStart w:id="13" w:name="_Toc241602119"/>
+      <w:bookmarkStart w:id="13" w:name="_Toc241603509"/>
       <w:r>
         <w:rPr>
           <w:rFonts w:eastAsia="Times New Roman"/>
@@ -18345,6 +18405,7 @@
         <w:pStyle w:val="NormalWeb"/>
       </w:pPr>
       <w:r>
+        <w:lastRenderedPageBreak/>
         <w:t>User inputs have CF 1.0. A reading inside a gem's published range has CF 1.0, while a reading that fits only because of the measurement tolerance has CF 0.7. When a second rule supports a fact that is already believed, the two certainties are combined:</w:t>
       </w:r>
     </w:p>
@@ -19258,7 +19319,6 @@
         <w:pStyle w:val="NormalWeb"/>
       </w:pPr>
       <w:r>
-        <w:lastRenderedPageBreak/>
         <w:t>The values encode the knowledge engineer's judgement of how conclusive each piece of evidence is. Species rules are high (0.90-0.95) because three independent measurements agree, but not 1.0 because ranges can overlap. Colour-based varieties are lower where the colour boundary is subjective (padparadscha 0.70). Origin rules range from 0.95 for curved striae, which the literature treats as diagnostic of flame-fusion synthesis [1], down to 0.60 for fingerprints, which can also occur in flux-grown synthetics [</w:t>
       </w:r>
       <w:r>
@@ -19281,7 +19341,7 @@
           <w:rFonts w:eastAsia="Times New Roman"/>
         </w:rPr>
       </w:pPr>
-      <w:bookmarkStart w:id="14" w:name="_Toc241602120"/>
+      <w:bookmarkStart w:id="14" w:name="_Toc241603510"/>
       <w:r>
         <w:rPr>
           <w:rFonts w:eastAsia="Times New Roman"/>
@@ -19297,7 +19357,7 @@
           <w:rFonts w:eastAsia="Times New Roman"/>
         </w:rPr>
       </w:pPr>
-      <w:bookmarkStart w:id="15" w:name="_Toc241602121"/>
+      <w:bookmarkStart w:id="15" w:name="_Toc241603511"/>
       <w:r>
         <w:rPr>
           <w:rFonts w:eastAsia="Times New Roman"/>
@@ -19311,7 +19371,11 @@
         <w:pStyle w:val="NormalWeb"/>
       </w:pPr>
       <w:r>
-        <w:t xml:space="preserve">The system follows the classic expert system architecture (Figure 3). The knowledge base (knowledge_base.pl) contains only domain knowledge and no reasoning code. The inference engine (engine.pl) contains only domain-independent reasoning and explanation code. Adding a new gem therefore means adding facts and rules; no engine code changes. Working memory is declared </w:t>
+        <w:t xml:space="preserve">The system follows the classic expert system architecture (Figure 3). The knowledge base (knowledge_base.pl) contains only domain knowledge and no reasoning code. The inference engine (engine.pl) contains only domain-independent reasoning and explanation code. Adding </w:t>
+      </w:r>
+      <w:r>
+        <w:lastRenderedPageBreak/>
+        <w:t xml:space="preserve">a new gem therefore means adding facts and rules; no engine code changes. Working memory is declared </w:t>
       </w:r>
       <w:r>
         <w:rPr>
@@ -19332,9 +19396,8 @@
         <w:rPr>
           <w:noProof/>
         </w:rPr>
-        <w:lastRenderedPageBreak/>
         <w:drawing>
-          <wp:inline distT="0" distB="0" distL="0" distR="0" wp14:anchorId="726A4B39" wp14:editId="04B2F5C1">
+          <wp:inline distT="0" distB="0" distL="0" distR="0" wp14:anchorId="3498F5D7" wp14:editId="12629119">
             <wp:extent cx="5715000" cy="3954780"/>
             <wp:effectExtent l="0" t="0" r="0" b="7620"/>
             <wp:docPr id="3" name="Picture 3"/>
@@ -20145,11 +20208,12 @@
           <w:rFonts w:eastAsia="Times New Roman"/>
         </w:rPr>
       </w:pPr>
-      <w:bookmarkStart w:id="16" w:name="_Toc241602122"/>
+      <w:bookmarkStart w:id="16" w:name="_Toc241603512"/>
       <w:r>
         <w:rPr>
           <w:rFonts w:eastAsia="Times New Roman"/>
         </w:rPr>
+        <w:lastRenderedPageBreak/>
         <w:t>3.2 Forward chaining (Identify mode)</w:t>
       </w:r>
       <w:bookmarkEnd w:id="16"/>
@@ -20167,7 +20231,6 @@
         <w:pStyle w:val="HTMLPreformatted"/>
       </w:pPr>
       <w:r>
-        <w:lastRenderedPageBreak/>
         <w:t>forward_chain :-</w:t>
       </w:r>
     </w:p>
@@ -20341,7 +20404,7 @@
           <w:rFonts w:eastAsia="Times New Roman"/>
         </w:rPr>
       </w:pPr>
-      <w:bookmarkStart w:id="17" w:name="_Toc241602123"/>
+      <w:bookmarkStart w:id="17" w:name="_Toc241603513"/>
       <w:r>
         <w:rPr>
           <w:rFonts w:eastAsia="Times New Roman"/>
@@ -20705,7 +20768,7 @@
           <w:rFonts w:eastAsia="Times New Roman"/>
         </w:rPr>
       </w:pPr>
-      <w:bookmarkStart w:id="18" w:name="_Toc241602124"/>
+      <w:bookmarkStart w:id="18" w:name="_Toc241603514"/>
       <w:r>
         <w:rPr>
           <w:rFonts w:eastAsia="Times New Roman"/>
@@ -20824,7 +20887,7 @@
           <w:rFonts w:eastAsia="Times New Roman"/>
         </w:rPr>
       </w:pPr>
-      <w:bookmarkStart w:id="19" w:name="_Toc241602125"/>
+      <w:bookmarkStart w:id="19" w:name="_Toc241603515"/>
       <w:r>
         <w:rPr>
           <w:rFonts w:eastAsia="Times New Roman"/>
@@ -20933,7 +20996,7 @@
           <w:noProof/>
         </w:rPr>
         <w:drawing>
-          <wp:inline distT="0" distB="0" distL="0" distR="0" wp14:anchorId="64872D1A" wp14:editId="031CAB75">
+          <wp:inline distT="0" distB="0" distL="0" distR="0" wp14:anchorId="2D1B7617" wp14:editId="20240755">
             <wp:extent cx="4480560" cy="4960620"/>
             <wp:effectExtent l="0" t="0" r="0" b="0"/>
             <wp:docPr id="4" name="Picture 4"/>
@@ -20998,7 +21061,7 @@
           <w:rFonts w:eastAsia="Times New Roman"/>
         </w:rPr>
       </w:pPr>
-      <w:bookmarkStart w:id="20" w:name="_Toc241602126"/>
+      <w:bookmarkStart w:id="20" w:name="_Toc241603516"/>
       <w:r>
         <w:rPr>
           <w:rFonts w:eastAsia="Times New Roman"/>
@@ -21177,7 +21240,7 @@
           <w:rFonts w:eastAsia="Times New Roman"/>
         </w:rPr>
       </w:pPr>
-      <w:bookmarkStart w:id="21" w:name="_Toc241602127"/>
+      <w:bookmarkStart w:id="21" w:name="_Toc241603517"/>
       <w:r>
         <w:rPr>
           <w:rFonts w:eastAsia="Times New Roman"/>
@@ -21444,7 +21507,7 @@
           <w:noProof/>
         </w:rPr>
         <w:drawing>
-          <wp:inline distT="0" distB="0" distL="0" distR="0" wp14:anchorId="3CA59A61" wp14:editId="2E296275">
+          <wp:inline distT="0" distB="0" distL="0" distR="0" wp14:anchorId="141E270C" wp14:editId="73795FF1">
             <wp:extent cx="5334000" cy="3528060"/>
             <wp:effectExtent l="0" t="0" r="0" b="0"/>
             <wp:docPr id="5" name="Picture 5"/>
@@ -21513,7 +21576,7 @@
         </w:rPr>
         <w:lastRenderedPageBreak/>
         <w:drawing>
-          <wp:inline distT="0" distB="0" distL="0" distR="0" wp14:anchorId="48E8CEE8" wp14:editId="77C566DB">
+          <wp:inline distT="0" distB="0" distL="0" distR="0" wp14:anchorId="413DBD53" wp14:editId="1B87E564">
             <wp:extent cx="4953000" cy="7604760"/>
             <wp:effectExtent l="0" t="0" r="0" b="0"/>
             <wp:docPr id="6" name="Picture 6"/>
@@ -21582,7 +21645,7 @@
         </w:rPr>
         <w:lastRenderedPageBreak/>
         <w:drawing>
-          <wp:inline distT="0" distB="0" distL="0" distR="0" wp14:anchorId="5DFC5792" wp14:editId="1ABFDC94">
+          <wp:inline distT="0" distB="0" distL="0" distR="0" wp14:anchorId="036EE0A4" wp14:editId="61F597C5">
             <wp:extent cx="4480560" cy="3589020"/>
             <wp:effectExtent l="0" t="0" r="0" b="0"/>
             <wp:docPr id="7" name="Picture 7"/>
@@ -21650,7 +21713,7 @@
           <w:noProof/>
         </w:rPr>
         <w:drawing>
-          <wp:inline distT="0" distB="0" distL="0" distR="0" wp14:anchorId="1FE2DD7B" wp14:editId="6EE5ECDF">
+          <wp:inline distT="0" distB="0" distL="0" distR="0" wp14:anchorId="2E9A09DC" wp14:editId="0ECECEBB">
             <wp:extent cx="5334000" cy="3268980"/>
             <wp:effectExtent l="0" t="0" r="0" b="7620"/>
             <wp:docPr id="8" name="Picture 8"/>
@@ -21715,7 +21778,7 @@
           <w:rFonts w:eastAsia="Times New Roman"/>
         </w:rPr>
       </w:pPr>
-      <w:bookmarkStart w:id="22" w:name="_Toc241602128"/>
+      <w:bookmarkStart w:id="22" w:name="_Toc241603518"/>
       <w:r>
         <w:rPr>
           <w:rFonts w:eastAsia="Times New Roman"/>
@@ -22962,7 +23025,7 @@
           <w:rFonts w:eastAsia="Times New Roman"/>
         </w:rPr>
       </w:pPr>
-      <w:bookmarkStart w:id="23" w:name="_Toc241602129"/>
+      <w:bookmarkStart w:id="23" w:name="_Toc241603519"/>
       <w:r>
         <w:rPr>
           <w:rFonts w:eastAsia="Times New Roman"/>
@@ -23003,7 +23066,7 @@
           <w:rFonts w:eastAsia="Times New Roman"/>
         </w:rPr>
       </w:pPr>
-      <w:bookmarkStart w:id="24" w:name="_Toc241602130"/>
+      <w:bookmarkStart w:id="24" w:name="_Toc241603520"/>
       <w:r>
         <w:rPr>
           <w:rFonts w:eastAsia="Times New Roman"/>
@@ -23110,10 +23173,10 @@
         <w:pStyle w:val="HTMLPreformatted"/>
       </w:pPr>
       <w:r>
-        <w:t xml:space="preserve">       why: Corundum is doubly refractive (unia</w:t>
-      </w:r>
-      <w:r>
-        <w:t>xial) with RI about 1.762-1.770 and SG about 4.00. [source: gia]</w:t>
+        <w:t xml:space="preserve">       </w:t>
+      </w:r>
+      <w:r>
+        <w:t>why: Corundum is doubly refractive (uniaxial) with RI about 1.762-1.770 and SG about 4.00. [source: gia]</w:t>
       </w:r>
     </w:p>
     <w:p>
@@ -23177,7 +23240,10 @@
         <w:pStyle w:val="HTMLPreformatted"/>
       </w:pPr>
       <w:r>
-        <w:t xml:space="preserve">   Blue sapphire (Corundum) - Strong match; Origin: Likely natural</w:t>
+        <w:t xml:space="preserve">   </w:t>
+      </w:r>
+      <w:r>
+        <w:t>Blue sapphire (Corundum) - Strong match; Origin: Likely natural</w:t>
       </w:r>
     </w:p>
     <w:p>
@@ -23185,10 +23251,7 @@
         <w:pStyle w:val="HTMLPreformatted"/>
       </w:pPr>
       <w:r>
-        <w:t xml:space="preserve">   </w:t>
-      </w:r>
-      <w:r>
-        <w:t>Recommendation: obtain an NGJA or other accredited laboratory certificate before purchase.</w:t>
+        <w:t xml:space="preserve">   Recommendation: obtain an NGJA or other accredited laboratory certificate before purchase.</w:t>
       </w:r>
     </w:p>
     <w:p>
@@ -23210,7 +23273,7 @@
         </w:rPr>
         <w:lastRenderedPageBreak/>
         <w:drawing>
-          <wp:inline distT="0" distB="0" distL="0" distR="0" wp14:anchorId="7F210545" wp14:editId="793E4931">
+          <wp:inline distT="0" distB="0" distL="0" distR="0" wp14:anchorId="4F064187" wp14:editId="7B6260DA">
             <wp:extent cx="4480560" cy="5646420"/>
             <wp:effectExtent l="0" t="0" r="0" b="0"/>
             <wp:docPr id="9" name="Picture 9"/>
@@ -23275,7 +23338,7 @@
           <w:rFonts w:eastAsia="Times New Roman"/>
         </w:rPr>
       </w:pPr>
-      <w:bookmarkStart w:id="25" w:name="_Toc241602131"/>
+      <w:bookmarkStart w:id="25" w:name="_Toc241603521"/>
       <w:r>
         <w:rPr>
           <w:rFonts w:eastAsia="Times New Roman"/>
@@ -23314,7 +23377,10 @@
         <w:pStyle w:val="HTMLPreformatted"/>
       </w:pPr>
       <w:r>
-        <w:t xml:space="preserve">    AND NOT Effect: Star THEN Variety: Ruby.</w:t>
+        <w:t xml:space="preserve">    </w:t>
+      </w:r>
+      <w:r>
+        <w:t>AND NOT Effect: Star THEN Variety: Ruby.</w:t>
       </w:r>
     </w:p>
     <w:p>
@@ -23338,10 +23404,7 @@
         <w:pStyle w:val="HTMLPreformatted"/>
       </w:pPr>
       <w:r>
-        <w:t xml:space="preserve">  </w:t>
-      </w:r>
-      <w:r>
-        <w:t>- To test rule r1 I need to know: the optic character.</w:t>
+        <w:t xml:space="preserve">  - To test rule r1 I need to know: the optic character.</w:t>
       </w:r>
     </w:p>
     <w:p>
@@ -23354,7 +23417,7 @@
           <w:noProof/>
         </w:rPr>
         <w:drawing>
-          <wp:inline distT="0" distB="0" distL="0" distR="0" wp14:anchorId="52F4D506" wp14:editId="70AA293A">
+          <wp:inline distT="0" distB="0" distL="0" distR="0" wp14:anchorId="0924F05D" wp14:editId="61EE04F1">
             <wp:extent cx="4290060" cy="3398520"/>
             <wp:effectExtent l="0" t="0" r="0" b="0"/>
             <wp:docPr id="10" name="Picture 10"/>
@@ -23419,7 +23482,7 @@
           <w:rFonts w:eastAsia="Times New Roman"/>
         </w:rPr>
       </w:pPr>
-      <w:bookmarkStart w:id="26" w:name="_Toc241602132"/>
+      <w:bookmarkStart w:id="26" w:name="_Toc241603522"/>
       <w:r>
         <w:rPr>
           <w:rFonts w:eastAsia="Times New Roman"/>
@@ -23457,7 +23520,7 @@
         </w:rPr>
         <w:lastRenderedPageBreak/>
         <w:drawing>
-          <wp:inline distT="0" distB="0" distL="0" distR="0" wp14:anchorId="49759E10" wp14:editId="7E462E69">
+          <wp:inline distT="0" distB="0" distL="0" distR="0" wp14:anchorId="6949587A" wp14:editId="4B5AC10D">
             <wp:extent cx="4480560" cy="1325880"/>
             <wp:effectExtent l="0" t="0" r="0" b="7620"/>
             <wp:docPr id="11" name="Picture 11"/>
@@ -23522,7 +23585,7 @@
           <w:rFonts w:eastAsia="Times New Roman"/>
         </w:rPr>
       </w:pPr>
-      <w:bookmarkStart w:id="27" w:name="_Toc241602133"/>
+      <w:bookmarkStart w:id="27" w:name="_Toc241603523"/>
       <w:r>
         <w:rPr>
           <w:rFonts w:eastAsia="Times New Roman"/>
@@ -23552,7 +23615,7 @@
           <w:noProof/>
         </w:rPr>
         <w:drawing>
-          <wp:inline distT="0" distB="0" distL="0" distR="0" wp14:anchorId="1A059274" wp14:editId="39A550EF">
+          <wp:inline distT="0" distB="0" distL="0" distR="0" wp14:anchorId="11B3B241" wp14:editId="3CBF989C">
             <wp:extent cx="4480560" cy="4655820"/>
             <wp:effectExtent l="0" t="0" r="0" b="0"/>
             <wp:docPr id="12" name="Picture 12"/>
@@ -23621,7 +23684,7 @@
         </w:rPr>
         <w:lastRenderedPageBreak/>
         <w:drawing>
-          <wp:inline distT="0" distB="0" distL="0" distR="0" wp14:anchorId="653463C0" wp14:editId="02554BB8">
+          <wp:inline distT="0" distB="0" distL="0" distR="0" wp14:anchorId="24C05B91" wp14:editId="5D0F5443">
             <wp:extent cx="4480560" cy="3733800"/>
             <wp:effectExtent l="0" t="0" r="0" b="0"/>
             <wp:docPr id="13" name="Picture 13"/>
@@ -23686,7 +23749,7 @@
           <w:rFonts w:eastAsia="Times New Roman"/>
         </w:rPr>
       </w:pPr>
-      <w:bookmarkStart w:id="28" w:name="_Toc241602134"/>
+      <w:bookmarkStart w:id="28" w:name="_Toc241603524"/>
       <w:r>
         <w:rPr>
           <w:rFonts w:eastAsia="Times New Roman"/>
@@ -23702,7 +23765,7 @@
           <w:rFonts w:eastAsia="Times New Roman"/>
         </w:rPr>
       </w:pPr>
-      <w:bookmarkStart w:id="29" w:name="_Toc241602135"/>
+      <w:bookmarkStart w:id="29" w:name="_Toc241603525"/>
       <w:r>
         <w:rPr>
           <w:rFonts w:eastAsia="Times New Roman"/>
@@ -23726,7 +23789,7 @@
           <w:rFonts w:eastAsia="Times New Roman"/>
         </w:rPr>
       </w:pPr>
-      <w:bookmarkStart w:id="30" w:name="_Toc241602136"/>
+      <w:bookmarkStart w:id="30" w:name="_Toc241603526"/>
       <w:r>
         <w:rPr>
           <w:rFonts w:eastAsia="Times New Roman"/>
@@ -29361,7 +29424,7 @@
           <w:rFonts w:eastAsia="Times New Roman"/>
         </w:rPr>
       </w:pPr>
-      <w:bookmarkStart w:id="31" w:name="_Toc241602137"/>
+      <w:bookmarkStart w:id="31" w:name="_Toc241603527"/>
       <w:r>
         <w:rPr>
           <w:rFonts w:eastAsia="Times New Roman"/>
@@ -30129,7 +30192,7 @@
           <w:rFonts w:eastAsia="Times New Roman"/>
         </w:rPr>
       </w:pPr>
-      <w:bookmarkStart w:id="32" w:name="_Toc241602138"/>
+      <w:bookmarkStart w:id="32" w:name="_Toc241603528"/>
       <w:r>
         <w:rPr>
           <w:rFonts w:eastAsia="Times New Roman"/>
@@ -31122,7 +31185,7 @@
           <w:rFonts w:eastAsia="Times New Roman"/>
         </w:rPr>
       </w:pPr>
-      <w:bookmarkStart w:id="33" w:name="_Toc241602139"/>
+      <w:bookmarkStart w:id="33" w:name="_Toc241603529"/>
       <w:r>
         <w:rPr>
           <w:rFonts w:eastAsia="Times New Roman"/>
@@ -32116,7 +32179,7 @@
           <w:rFonts w:eastAsia="Times New Roman"/>
         </w:rPr>
       </w:pPr>
-      <w:bookmarkStart w:id="34" w:name="_Toc241602140"/>
+      <w:bookmarkStart w:id="34" w:name="_Toc241603530"/>
       <w:r>
         <w:rPr>
           <w:rFonts w:eastAsia="Times New Roman"/>
@@ -32150,7 +32213,7 @@
           <w:rFonts w:eastAsia="Times New Roman"/>
         </w:rPr>
       </w:pPr>
-      <w:bookmarkStart w:id="35" w:name="_Toc241602141"/>
+      <w:bookmarkStart w:id="35" w:name="_Toc241603531"/>
       <w:r>
         <w:rPr>
           <w:rFonts w:eastAsia="Times New Roman"/>
@@ -32166,7 +32229,7 @@
           <w:rFonts w:eastAsia="Times New Roman"/>
         </w:rPr>
       </w:pPr>
-      <w:bookmarkStart w:id="36" w:name="_Toc241602142"/>
+      <w:bookmarkStart w:id="36" w:name="_Toc241603532"/>
       <w:r>
         <w:rPr>
           <w:rFonts w:eastAsia="Times New Roman"/>
@@ -32212,7 +32275,7 @@
           <w:rFonts w:eastAsia="Times New Roman"/>
         </w:rPr>
       </w:pPr>
-      <w:bookmarkStart w:id="37" w:name="_Toc241602143"/>
+      <w:bookmarkStart w:id="37" w:name="_Toc241603533"/>
       <w:r>
         <w:rPr>
           <w:rFonts w:eastAsia="Times New Roman"/>
@@ -32236,13 +32299,13 @@
         <w:t>why</w:t>
       </w:r>
       <w:r>
-        <w:t xml:space="preserve"> a stone was classified as a sapphire, they need large labelled data sets that do not exist for Sri Lankan stones and their treatments, and a photograph cannot capture RI, SG or optic character. This rule-ba</w:t>
-      </w:r>
-      <w:r>
-        <w:t>sed system is transparent. Every conclusion can be traced to named rules and published sources, and it is easy to correct when an expert disagrees. Rudin [19] argues that for high-stakes decisions, interpretable models should be preferred to explaining black boxes after the fact. A buyer deciding whether to spend a large sum on a stone is making exactly that kind of decision, which is why explainability was treated as a core requirement. The weakness of the symbolic approach is the knowledge acquisition bot</w:t>
-      </w:r>
-      <w:r>
-        <w:t>tleneck: every rule must be written and justified by hand, and the system knows nothing outside its rules. A hybrid, in which image recognition proposes candidates that the rule base then checks and explains, is a promising direction.</w:t>
+        <w:t xml:space="preserve"> </w:t>
+      </w:r>
+      <w:r>
+        <w:t xml:space="preserve">a stone was classified as a sapphire, they need large labelled data sets that do not exist for Sri Lankan stones and their treatments, and a photograph cannot capture RI, SG or optic character. This rule-based system is transparent. Every conclusion can be traced to named rules and published sources, and it is easy to correct when an expert disagrees. Rudin [19] argues that for high-stakes decisions, interpretable models should be preferred to explaining black boxes after the fact. A buyer deciding whether </w:t>
+      </w:r>
+      <w:r>
+        <w:t>to spend a large sum on a stone is making exactly that kind of decision, which is why explainability was treated as a core requirement. The weakness of the symbolic approach is the knowledge acquisition bottleneck: every rule must be written and justified by hand, and the system knows nothing outside its rules. A hybrid, in which image recognition proposes candidates that the rule base then checks and explains, is a promising direction.</w:t>
       </w:r>
     </w:p>
     <w:p>
@@ -32252,7 +32315,7 @@
           <w:rFonts w:eastAsia="Times New Roman"/>
         </w:rPr>
       </w:pPr>
-      <w:bookmarkStart w:id="38" w:name="_Toc241602144"/>
+      <w:bookmarkStart w:id="38" w:name="_Toc241603534"/>
       <w:r>
         <w:rPr>
           <w:rFonts w:eastAsia="Times New Roman"/>
@@ -32503,7 +32566,7 @@
           <w:rFonts w:eastAsia="Times New Roman"/>
         </w:rPr>
       </w:pPr>
-      <w:bookmarkStart w:id="39" w:name="_Toc241602145"/>
+      <w:bookmarkStart w:id="39" w:name="_Toc241603535"/>
       <w:r>
         <w:rPr>
           <w:rFonts w:eastAsia="Times New Roman"/>
@@ -32614,7 +32677,7 @@
           <w:rFonts w:eastAsia="Times New Roman"/>
         </w:rPr>
       </w:pPr>
-      <w:bookmarkStart w:id="40" w:name="_Toc241602146"/>
+      <w:bookmarkStart w:id="40" w:name="_Toc241603536"/>
       <w:r>
         <w:rPr>
           <w:rFonts w:eastAsia="Times New Roman"/>
@@ -32654,7 +32717,7 @@
         </w:rPr>
         <w:br w:type="page"/>
       </w:r>
-      <w:bookmarkStart w:id="41" w:name="_Toc241602147"/>
+      <w:bookmarkStart w:id="41" w:name="_Toc241603537"/>
       <w:r>
         <w:rPr>
           <w:rFonts w:eastAsia="Times New Roman"/>
@@ -32670,7 +32733,7 @@
         <w:spacing w:before="0" w:beforeAutospacing="0" w:after="120"/>
       </w:pPr>
       <w:r>
-        <w:t>[Check each reference, especially edition numbers and years, against the copy you actually used.]</w:t>
+        <w:t>[Check each reference, especially edition numbers and years, against the copy you actually used. For [21]-[28], click "Cite" then "IEEE" under each result on Google Scholar and compare; in [24], replace [conference name] with the full conference name.]</w:t>
       </w:r>
     </w:p>
     <w:p>
@@ -33016,6 +33079,159 @@
     </w:p>
     <w:p>
       <w:pPr>
+        <w:pStyle w:val="ref"/>
+        <w:spacing w:before="0" w:beforeAutospacing="0" w:after="120"/>
+      </w:pPr>
+      <w:r>
+        <w:t xml:space="preserve">[21] E. Fritsch and C. M. Stockton, "Infrared spectroscopy in gem identification," </w:t>
+      </w:r>
+      <w:r>
+        <w:rPr>
+          <w:i/>
+          <w:iCs/>
+        </w:rPr>
+        <w:t>Gems &amp; Gemology</w:t>
+      </w:r>
+      <w:r>
+        <w:t>, vol. 23, no. 1, pp. 18-26, 1987.</w:t>
+      </w:r>
+    </w:p>
+    <w:p>
+      <w:pPr>
+        <w:pStyle w:val="ref"/>
+        <w:spacing w:before="0" w:beforeAutospacing="0" w:after="120"/>
+      </w:pPr>
+      <w:r>
+        <w:t xml:space="preserve">[22] S. Karampelas, L. Kiefert, D. Bersani, and P. Vandenabeele, </w:t>
+      </w:r>
+      <w:r>
+        <w:rPr>
+          <w:i/>
+          <w:iCs/>
+        </w:rPr>
+        <w:t>Gems and Gemmology: An Introduction for Archaeologists, Art-Historians and Conservators</w:t>
+      </w:r>
+      <w:r>
+        <w:t>. Cham, Switzerland: Springer, 2020.</w:t>
+      </w:r>
+    </w:p>
+    <w:p>
+      <w:pPr>
+        <w:pStyle w:val="ref"/>
+        <w:spacing w:before="0" w:beforeAutospacing="0" w:after="120"/>
+      </w:pPr>
+      <w:r>
+        <w:t xml:space="preserve">[23] A. L. Jenkins and R. A. Larsen, "Gemstone identification using Raman spectroscopy," </w:t>
+      </w:r>
+      <w:r>
+        <w:rPr>
+          <w:i/>
+          <w:iCs/>
+        </w:rPr>
+        <w:t>Spectroscopy</w:t>
+      </w:r>
+      <w:r>
+        <w:t>, vol. 19, no. 4, 2004.</w:t>
+      </w:r>
+    </w:p>
+    <w:p>
+      <w:pPr>
+        <w:pStyle w:val="ref"/>
+        <w:spacing w:before="0" w:beforeAutospacing="0" w:after="120"/>
+      </w:pPr>
+      <w:r>
+        <w:t xml:space="preserve">[24] R. Raheem, W. Ahmad, and S. M. Adnan, "Improving gemstone identification accuracy using convolutional neural networks," in </w:t>
+      </w:r>
+      <w:r>
+        <w:rPr>
+          <w:i/>
+          <w:iCs/>
+        </w:rPr>
+        <w:t>Proc. International Conference on [conference name]</w:t>
+      </w:r>
+      <w:r>
+        <w:t>, IEEE, 2024.</w:t>
+      </w:r>
+    </w:p>
+    <w:p>
+      <w:pPr>
+        <w:pStyle w:val="ref"/>
+        <w:spacing w:before="0" w:beforeAutospacing="0" w:after="120"/>
+      </w:pPr>
+      <w:r>
+        <w:t xml:space="preserve">[25] B. G. Buchanan and R. O. Duda, "Principles of rule-based expert systems," </w:t>
+      </w:r>
+      <w:r>
+        <w:rPr>
+          <w:i/>
+          <w:iCs/>
+        </w:rPr>
+        <w:t>Advances in Computers</w:t>
+      </w:r>
+      <w:r>
+        <w:t>, vol. 22, pp. 163-216, 1983.</w:t>
+      </w:r>
+    </w:p>
+    <w:p>
+      <w:pPr>
+        <w:pStyle w:val="ref"/>
+        <w:spacing w:before="0" w:beforeAutospacing="0" w:after="120"/>
+      </w:pPr>
+      <w:r>
+        <w:t xml:space="preserve">[26] C. Grosan and A. Abraham, "Rule-based expert systems," in </w:t>
+      </w:r>
+      <w:r>
+        <w:rPr>
+          <w:i/>
+          <w:iCs/>
+        </w:rPr>
+        <w:t>Intelligent Systems: A Modern Approach</w:t>
+      </w:r>
+      <w:r>
+        <w:t>. Berlin, Germany: Springer, 2011, pp. 149-185.</w:t>
+      </w:r>
+    </w:p>
+    <w:p>
+      <w:pPr>
+        <w:pStyle w:val="ref"/>
+        <w:spacing w:before="0" w:beforeAutospacing="0" w:after="120"/>
+      </w:pPr>
+      <w:r>
+        <w:lastRenderedPageBreak/>
+        <w:t xml:space="preserve">[27] A. Abraham, "Rule-based expert systems," in </w:t>
+      </w:r>
+      <w:r>
+        <w:rPr>
+          <w:i/>
+          <w:iCs/>
+        </w:rPr>
+        <w:t>Handbook of Measuring System Design</w:t>
+      </w:r>
+      <w:r>
+        <w:t>, P. H. Sydenham and R. Thorn, Eds. Chichester, U.K.: Wiley, 2005.</w:t>
+      </w:r>
+    </w:p>
+    <w:p>
+      <w:pPr>
+        <w:pStyle w:val="ref"/>
+        <w:spacing w:before="0" w:beforeAutospacing="0" w:after="120"/>
+      </w:pPr>
+      <w:r>
+        <w:t xml:space="preserve">[28] W. J. Clancey, "The epistemology of a rule-based expert system - A framework for explanation," </w:t>
+      </w:r>
+      <w:r>
+        <w:rPr>
+          <w:i/>
+          <w:iCs/>
+        </w:rPr>
+        <w:t>Artificial Intelligence</w:t>
+      </w:r>
+      <w:r>
+        <w:t>, vol. 20, no. 3, pp. 215-251, 1983.</w:t>
+      </w:r>
+    </w:p>
+    <w:p>
+      <w:pPr>
         <w:pStyle w:val="Heading1"/>
         <w:rPr>
           <w:rFonts w:eastAsia="Times New Roman"/>
@@ -33027,7 +33243,7 @@
         </w:rPr>
         <w:br w:type="page"/>
       </w:r>
-      <w:bookmarkStart w:id="42" w:name="_Toc241602148"/>
+      <w:bookmarkStart w:id="42" w:name="_Toc241603538"/>
       <w:r>
         <w:rPr>
           <w:rFonts w:eastAsia="Times New Roman"/>
@@ -46237,7 +46453,7 @@
         </w:rPr>
         <w:br w:type="page"/>
       </w:r>
-      <w:bookmarkStart w:id="43" w:name="_Toc241602149"/>
+      <w:bookmarkStart w:id="43" w:name="_Toc241603539"/>
       <w:r>
         <w:rPr>
           <w:rFonts w:eastAsia="Times New Roman"/>
@@ -46719,7 +46935,7 @@
           <w:rFonts w:eastAsia="Times New Roman"/>
         </w:rPr>
       </w:pPr>
-      <w:bookmarkStart w:id="44" w:name="_Toc241602150"/>
+      <w:bookmarkStart w:id="44" w:name="_Toc241603540"/>
       <w:r>
         <w:rPr>
           <w:rFonts w:eastAsia="Times New Roman"/>
@@ -47231,9 +47447,9 @@
 <file path=word/numbering.xml><?xml version="1.0" encoding="utf-8"?>
 <w:numbering xmlns:wpc="http://schemas.microsoft.com/office/word/2010/wordprocessingCanvas" xmlns:cx="http://schemas.microsoft.com/office/drawing/2014/chartex" xmlns:cx1="http://schemas.microsoft.com/office/drawing/2015/9/8/chartex" xmlns:cx2="http://schemas.microsoft.com/office/drawing/2015/10/21/chartex" xmlns:cx3="http://schemas.microsoft.com/office/drawing/2016/5/9/chartex" xmlns:cx4="http://schemas.microsoft.com/office/drawing/2016/5/10/chartex" xmlns:cx5="http://schemas.microsoft.com/office/drawing/2016/5/11/chartex" xmlns:cx6="http://schemas.microsoft.com/office/drawing/2016/5/12/chartex" xmlns:cx7="http://schemas.microsoft.com/office/drawing/2016/5/13/chartex" xmlns:cx8="http://schemas.microsoft.com/office/drawing/2016/5/14/chartex" xmlns:mc="http://schemas.openxmlformats.org/markup-compatibility/2006" xmlns:aink="http://schemas.microsoft.com/office/drawing/2016/ink" xmlns:am3d="http://schemas.microsoft.com/office/drawing/2017/model3d" xmlns:o="urn:schemas-microsoft-com:office:office" xmlns:oel="http://schemas.microsoft.com/office/2019/extlst" xmlns:r="http://schemas.openxmlformats.org/officeDocument/2006/relationships" xmlns:m="http://schemas.openxmlformats.org/officeDocument/2006/math" xmlns:v="urn:schemas-microsoft-com:vml" xmlns:wp14="http://schemas.microsoft.com/office/word/2010/wordprocessingDrawing" xmlns:wp="http://schemas.openxmlformats.org/drawingml/2006/wordprocessingDrawing" xmlns:w10="urn:schemas-microsoft-com:office:word" xmlns:w="http://schemas.openxmlformats.org/wordprocessingml/2006/main" xmlns:w14="http://schemas.microsoft.com/office/word/2010/wordml" xmlns:w15="http://schemas.microsoft.com/office/word/2012/wordml" xmlns:w16cex="http://schemas.microsoft.com/office/word/2018/wordml/cex" xmlns:w16cid="http://schemas.microsoft.com/office/word/2016/wordml/cid" xmlns:w16="http://schemas.microsoft.com/office/word/2018/wordml" xmlns:w16du="http://schemas.microsoft.com/office/word/2023/wordml/word16du" xmlns:w16sdtdh="http://schemas.microsoft.com/office/word/2020/wordml/sdtdatahash" xmlns:w16sdtfl="http://schemas.microsoft.com/office/word/2024/wordml/sdtformatlock" xmlns:w16se="http://schemas.microsoft.com/office/word/2015/wordml/symex" xmlns:wpg="http://schemas.microsoft.com/office/word/2010/wordprocessingGroup" xmlns:wpi="http://schemas.microsoft.com/office/word/2010/wordprocessingInk" xmlns:wne="http://schemas.microsoft.com/office/word/2006/wordml" xmlns:wps="http://schemas.microsoft.com/office/word/2010/wordprocessingShape" mc:Ignorable="w14 w15 w16se w16cid w16 w16cex w16sdtdh w16sdtfl w16du wp14">
   <w:abstractNum w:abstractNumId="0" w15:restartNumberingAfterBreak="0">
-    <w:nsid w:val="016946AC"/>
+    <w:nsid w:val="067575EA"/>
     <w:multiLevelType w:val="multilevel"/>
-    <w:tmpl w:val="F11EB456"/>
+    <w:tmpl w:val="ADE84968"/>
     <w:lvl w:ilvl="0">
       <w:start w:val="1"/>
       <w:numFmt w:val="bullet"/>
@@ -47380,9 +47596,122 @@
     </w:lvl>
   </w:abstractNum>
   <w:abstractNum w:abstractNumId="1" w15:restartNumberingAfterBreak="0">
-    <w:nsid w:val="084F60D8"/>
+    <w:nsid w:val="0B8D49A8"/>
     <w:multiLevelType w:val="multilevel"/>
-    <w:tmpl w:val="FBCC6F8A"/>
+    <w:tmpl w:val="AF98F57E"/>
+    <w:lvl w:ilvl="0">
+      <w:start w:val="1"/>
+      <w:numFmt w:val="decimal"/>
+      <w:lvlText w:val="%1."/>
+      <w:lvlJc w:val="left"/>
+      <w:pPr>
+        <w:tabs>
+          <w:tab w:val="num" w:pos="720"/>
+        </w:tabs>
+        <w:ind w:left="720" w:hanging="360"/>
+      </w:pPr>
+    </w:lvl>
+    <w:lvl w:ilvl="1" w:tentative="1">
+      <w:start w:val="1"/>
+      <w:numFmt w:val="decimal"/>
+      <w:lvlText w:val="%2."/>
+      <w:lvlJc w:val="left"/>
+      <w:pPr>
+        <w:tabs>
+          <w:tab w:val="num" w:pos="1440"/>
+        </w:tabs>
+        <w:ind w:left="1440" w:hanging="360"/>
+      </w:pPr>
+    </w:lvl>
+    <w:lvl w:ilvl="2" w:tentative="1">
+      <w:start w:val="1"/>
+      <w:numFmt w:val="decimal"/>
+      <w:lvlText w:val="%3."/>
+      <w:lvlJc w:val="left"/>
+      <w:pPr>
+        <w:tabs>
+          <w:tab w:val="num" w:pos="2160"/>
+        </w:tabs>
+        <w:ind w:left="2160" w:hanging="360"/>
+      </w:pPr>
+    </w:lvl>
+    <w:lvl w:ilvl="3" w:tentative="1">
+      <w:start w:val="1"/>
+      <w:numFmt w:val="decimal"/>
+      <w:lvlText w:val="%4."/>
+      <w:lvlJc w:val="left"/>
+      <w:pPr>
+        <w:tabs>
+          <w:tab w:val="num" w:pos="2880"/>
+        </w:tabs>
+        <w:ind w:left="2880" w:hanging="360"/>
+      </w:pPr>
+    </w:lvl>
+    <w:lvl w:ilvl="4" w:tentative="1">
+      <w:start w:val="1"/>
+      <w:numFmt w:val="decimal"/>
+      <w:lvlText w:val="%5."/>
+      <w:lvlJc w:val="left"/>
+      <w:pPr>
+        <w:tabs>
+          <w:tab w:val="num" w:pos="3600"/>
+        </w:tabs>
+        <w:ind w:left="3600" w:hanging="360"/>
+      </w:pPr>
+    </w:lvl>
+    <w:lvl w:ilvl="5" w:tentative="1">
+      <w:start w:val="1"/>
+      <w:numFmt w:val="decimal"/>
+      <w:lvlText w:val="%6."/>
+      <w:lvlJc w:val="left"/>
+      <w:pPr>
+        <w:tabs>
+          <w:tab w:val="num" w:pos="4320"/>
+        </w:tabs>
+        <w:ind w:left="4320" w:hanging="360"/>
+      </w:pPr>
+    </w:lvl>
+    <w:lvl w:ilvl="6" w:tentative="1">
+      <w:start w:val="1"/>
+      <w:numFmt w:val="decimal"/>
+      <w:lvlText w:val="%7."/>
+      <w:lvlJc w:val="left"/>
+      <w:pPr>
+        <w:tabs>
+          <w:tab w:val="num" w:pos="5040"/>
+        </w:tabs>
+        <w:ind w:left="5040" w:hanging="360"/>
+      </w:pPr>
+    </w:lvl>
+    <w:lvl w:ilvl="7" w:tentative="1">
+      <w:start w:val="1"/>
+      <w:numFmt w:val="decimal"/>
+      <w:lvlText w:val="%8."/>
+      <w:lvlJc w:val="left"/>
+      <w:pPr>
+        <w:tabs>
+          <w:tab w:val="num" w:pos="5760"/>
+        </w:tabs>
+        <w:ind w:left="5760" w:hanging="360"/>
+      </w:pPr>
+    </w:lvl>
+    <w:lvl w:ilvl="8" w:tentative="1">
+      <w:start w:val="1"/>
+      <w:numFmt w:val="decimal"/>
+      <w:lvlText w:val="%9."/>
+      <w:lvlJc w:val="left"/>
+      <w:pPr>
+        <w:tabs>
+          <w:tab w:val="num" w:pos="6480"/>
+        </w:tabs>
+        <w:ind w:left="6480" w:hanging="360"/>
+      </w:pPr>
+    </w:lvl>
+  </w:abstractNum>
+  <w:abstractNum w:abstractNumId="2" w15:restartNumberingAfterBreak="0">
+    <w:nsid w:val="197B4392"/>
+    <w:multiLevelType w:val="multilevel"/>
+    <w:tmpl w:val="FA4C020C"/>
     <w:lvl w:ilvl="0">
       <w:start w:val="1"/>
       <w:numFmt w:val="bullet"/>
@@ -47528,123 +47857,10 @@
       </w:rPr>
     </w:lvl>
   </w:abstractNum>
-  <w:abstractNum w:abstractNumId="2" w15:restartNumberingAfterBreak="0">
-    <w:nsid w:val="0BC07BA7"/>
+  <w:abstractNum w:abstractNumId="3" w15:restartNumberingAfterBreak="0">
+    <w:nsid w:val="212302DD"/>
     <w:multiLevelType w:val="multilevel"/>
-    <w:tmpl w:val="E65E426E"/>
-    <w:lvl w:ilvl="0">
-      <w:start w:val="1"/>
-      <w:numFmt w:val="decimal"/>
-      <w:lvlText w:val="%1."/>
-      <w:lvlJc w:val="left"/>
-      <w:pPr>
-        <w:tabs>
-          <w:tab w:val="num" w:pos="720"/>
-        </w:tabs>
-        <w:ind w:left="720" w:hanging="360"/>
-      </w:pPr>
-    </w:lvl>
-    <w:lvl w:ilvl="1" w:tentative="1">
-      <w:start w:val="1"/>
-      <w:numFmt w:val="decimal"/>
-      <w:lvlText w:val="%2."/>
-      <w:lvlJc w:val="left"/>
-      <w:pPr>
-        <w:tabs>
-          <w:tab w:val="num" w:pos="1440"/>
-        </w:tabs>
-        <w:ind w:left="1440" w:hanging="360"/>
-      </w:pPr>
-    </w:lvl>
-    <w:lvl w:ilvl="2" w:tentative="1">
-      <w:start w:val="1"/>
-      <w:numFmt w:val="decimal"/>
-      <w:lvlText w:val="%3."/>
-      <w:lvlJc w:val="left"/>
-      <w:pPr>
-        <w:tabs>
-          <w:tab w:val="num" w:pos="2160"/>
-        </w:tabs>
-        <w:ind w:left="2160" w:hanging="360"/>
-      </w:pPr>
-    </w:lvl>
-    <w:lvl w:ilvl="3" w:tentative="1">
-      <w:start w:val="1"/>
-      <w:numFmt w:val="decimal"/>
-      <w:lvlText w:val="%4."/>
-      <w:lvlJc w:val="left"/>
-      <w:pPr>
-        <w:tabs>
-          <w:tab w:val="num" w:pos="2880"/>
-        </w:tabs>
-        <w:ind w:left="2880" w:hanging="360"/>
-      </w:pPr>
-    </w:lvl>
-    <w:lvl w:ilvl="4" w:tentative="1">
-      <w:start w:val="1"/>
-      <w:numFmt w:val="decimal"/>
-      <w:lvlText w:val="%5."/>
-      <w:lvlJc w:val="left"/>
-      <w:pPr>
-        <w:tabs>
-          <w:tab w:val="num" w:pos="3600"/>
-        </w:tabs>
-        <w:ind w:left="3600" w:hanging="360"/>
-      </w:pPr>
-    </w:lvl>
-    <w:lvl w:ilvl="5" w:tentative="1">
-      <w:start w:val="1"/>
-      <w:numFmt w:val="decimal"/>
-      <w:lvlText w:val="%6."/>
-      <w:lvlJc w:val="left"/>
-      <w:pPr>
-        <w:tabs>
-          <w:tab w:val="num" w:pos="4320"/>
-        </w:tabs>
-        <w:ind w:left="4320" w:hanging="360"/>
-      </w:pPr>
-    </w:lvl>
-    <w:lvl w:ilvl="6" w:tentative="1">
-      <w:start w:val="1"/>
-      <w:numFmt w:val="decimal"/>
-      <w:lvlText w:val="%7."/>
-      <w:lvlJc w:val="left"/>
-      <w:pPr>
-        <w:tabs>
-          <w:tab w:val="num" w:pos="5040"/>
-        </w:tabs>
-        <w:ind w:left="5040" w:hanging="360"/>
-      </w:pPr>
-    </w:lvl>
-    <w:lvl w:ilvl="7" w:tentative="1">
-      <w:start w:val="1"/>
-      <w:numFmt w:val="decimal"/>
-      <w:lvlText w:val="%8."/>
-      <w:lvlJc w:val="left"/>
-      <w:pPr>
-        <w:tabs>
-          <w:tab w:val="num" w:pos="5760"/>
-        </w:tabs>
-        <w:ind w:left="5760" w:hanging="360"/>
-      </w:pPr>
-    </w:lvl>
-    <w:lvl w:ilvl="8" w:tentative="1">
-      <w:start w:val="1"/>
-      <w:numFmt w:val="decimal"/>
-      <w:lvlText w:val="%9."/>
-      <w:lvlJc w:val="left"/>
-      <w:pPr>
-        <w:tabs>
-          <w:tab w:val="num" w:pos="6480"/>
-        </w:tabs>
-        <w:ind w:left="6480" w:hanging="360"/>
-      </w:pPr>
-    </w:lvl>
-  </w:abstractNum>
-  <w:abstractNum w:abstractNumId="3" w15:restartNumberingAfterBreak="0">
-    <w:nsid w:val="0E34039F"/>
-    <w:multiLevelType w:val="multilevel"/>
-    <w:tmpl w:val="1F4C3222"/>
+    <w:tmpl w:val="18327E7E"/>
     <w:lvl w:ilvl="0">
       <w:start w:val="1"/>
       <w:numFmt w:val="bullet"/>
@@ -47791,122 +48007,9 @@
     </w:lvl>
   </w:abstractNum>
   <w:abstractNum w:abstractNumId="4" w15:restartNumberingAfterBreak="0">
-    <w:nsid w:val="249E0977"/>
+    <w:nsid w:val="55FC7673"/>
     <w:multiLevelType w:val="multilevel"/>
-    <w:tmpl w:val="BA54A760"/>
-    <w:lvl w:ilvl="0">
-      <w:start w:val="1"/>
-      <w:numFmt w:val="decimal"/>
-      <w:lvlText w:val="%1."/>
-      <w:lvlJc w:val="left"/>
-      <w:pPr>
-        <w:tabs>
-          <w:tab w:val="num" w:pos="720"/>
-        </w:tabs>
-        <w:ind w:left="720" w:hanging="360"/>
-      </w:pPr>
-    </w:lvl>
-    <w:lvl w:ilvl="1" w:tentative="1">
-      <w:start w:val="1"/>
-      <w:numFmt w:val="decimal"/>
-      <w:lvlText w:val="%2."/>
-      <w:lvlJc w:val="left"/>
-      <w:pPr>
-        <w:tabs>
-          <w:tab w:val="num" w:pos="1440"/>
-        </w:tabs>
-        <w:ind w:left="1440" w:hanging="360"/>
-      </w:pPr>
-    </w:lvl>
-    <w:lvl w:ilvl="2" w:tentative="1">
-      <w:start w:val="1"/>
-      <w:numFmt w:val="decimal"/>
-      <w:lvlText w:val="%3."/>
-      <w:lvlJc w:val="left"/>
-      <w:pPr>
-        <w:tabs>
-          <w:tab w:val="num" w:pos="2160"/>
-        </w:tabs>
-        <w:ind w:left="2160" w:hanging="360"/>
-      </w:pPr>
-    </w:lvl>
-    <w:lvl w:ilvl="3" w:tentative="1">
-      <w:start w:val="1"/>
-      <w:numFmt w:val="decimal"/>
-      <w:lvlText w:val="%4."/>
-      <w:lvlJc w:val="left"/>
-      <w:pPr>
-        <w:tabs>
-          <w:tab w:val="num" w:pos="2880"/>
-        </w:tabs>
-        <w:ind w:left="2880" w:hanging="360"/>
-      </w:pPr>
-    </w:lvl>
-    <w:lvl w:ilvl="4" w:tentative="1">
-      <w:start w:val="1"/>
-      <w:numFmt w:val="decimal"/>
-      <w:lvlText w:val="%5."/>
-      <w:lvlJc w:val="left"/>
-      <w:pPr>
-        <w:tabs>
-          <w:tab w:val="num" w:pos="3600"/>
-        </w:tabs>
-        <w:ind w:left="3600" w:hanging="360"/>
-      </w:pPr>
-    </w:lvl>
-    <w:lvl w:ilvl="5" w:tentative="1">
-      <w:start w:val="1"/>
-      <w:numFmt w:val="decimal"/>
-      <w:lvlText w:val="%6."/>
-      <w:lvlJc w:val="left"/>
-      <w:pPr>
-        <w:tabs>
-          <w:tab w:val="num" w:pos="4320"/>
-        </w:tabs>
-        <w:ind w:left="4320" w:hanging="360"/>
-      </w:pPr>
-    </w:lvl>
-    <w:lvl w:ilvl="6" w:tentative="1">
-      <w:start w:val="1"/>
-      <w:numFmt w:val="decimal"/>
-      <w:lvlText w:val="%7."/>
-      <w:lvlJc w:val="left"/>
-      <w:pPr>
-        <w:tabs>
-          <w:tab w:val="num" w:pos="5040"/>
-        </w:tabs>
-        <w:ind w:left="5040" w:hanging="360"/>
-      </w:pPr>
-    </w:lvl>
-    <w:lvl w:ilvl="7" w:tentative="1">
-      <w:start w:val="1"/>
-      <w:numFmt w:val="decimal"/>
-      <w:lvlText w:val="%8."/>
-      <w:lvlJc w:val="left"/>
-      <w:pPr>
-        <w:tabs>
-          <w:tab w:val="num" w:pos="5760"/>
-        </w:tabs>
-        <w:ind w:left="5760" w:hanging="360"/>
-      </w:pPr>
-    </w:lvl>
-    <w:lvl w:ilvl="8" w:tentative="1">
-      <w:start w:val="1"/>
-      <w:numFmt w:val="decimal"/>
-      <w:lvlText w:val="%9."/>
-      <w:lvlJc w:val="left"/>
-      <w:pPr>
-        <w:tabs>
-          <w:tab w:val="num" w:pos="6480"/>
-        </w:tabs>
-        <w:ind w:left="6480" w:hanging="360"/>
-      </w:pPr>
-    </w:lvl>
-  </w:abstractNum>
-  <w:abstractNum w:abstractNumId="5" w15:restartNumberingAfterBreak="0">
-    <w:nsid w:val="367D0BF2"/>
-    <w:multiLevelType w:val="multilevel"/>
-    <w:tmpl w:val="C6B0CBEA"/>
+    <w:tmpl w:val="F5FEB320"/>
     <w:lvl w:ilvl="0">
       <w:start w:val="1"/>
       <w:numFmt w:val="bullet"/>
@@ -48052,10 +48155,123 @@
       </w:rPr>
     </w:lvl>
   </w:abstractNum>
+  <w:abstractNum w:abstractNumId="5" w15:restartNumberingAfterBreak="0">
+    <w:nsid w:val="6413790C"/>
+    <w:multiLevelType w:val="multilevel"/>
+    <w:tmpl w:val="105E2C4E"/>
+    <w:lvl w:ilvl="0">
+      <w:start w:val="1"/>
+      <w:numFmt w:val="decimal"/>
+      <w:lvlText w:val="%1."/>
+      <w:lvlJc w:val="left"/>
+      <w:pPr>
+        <w:tabs>
+          <w:tab w:val="num" w:pos="720"/>
+        </w:tabs>
+        <w:ind w:left="720" w:hanging="360"/>
+      </w:pPr>
+    </w:lvl>
+    <w:lvl w:ilvl="1" w:tentative="1">
+      <w:start w:val="1"/>
+      <w:numFmt w:val="decimal"/>
+      <w:lvlText w:val="%2."/>
+      <w:lvlJc w:val="left"/>
+      <w:pPr>
+        <w:tabs>
+          <w:tab w:val="num" w:pos="1440"/>
+        </w:tabs>
+        <w:ind w:left="1440" w:hanging="360"/>
+      </w:pPr>
+    </w:lvl>
+    <w:lvl w:ilvl="2" w:tentative="1">
+      <w:start w:val="1"/>
+      <w:numFmt w:val="decimal"/>
+      <w:lvlText w:val="%3."/>
+      <w:lvlJc w:val="left"/>
+      <w:pPr>
+        <w:tabs>
+          <w:tab w:val="num" w:pos="2160"/>
+        </w:tabs>
+        <w:ind w:left="2160" w:hanging="360"/>
+      </w:pPr>
+    </w:lvl>
+    <w:lvl w:ilvl="3" w:tentative="1">
+      <w:start w:val="1"/>
+      <w:numFmt w:val="decimal"/>
+      <w:lvlText w:val="%4."/>
+      <w:lvlJc w:val="left"/>
+      <w:pPr>
+        <w:tabs>
+          <w:tab w:val="num" w:pos="2880"/>
+        </w:tabs>
+        <w:ind w:left="2880" w:hanging="360"/>
+      </w:pPr>
+    </w:lvl>
+    <w:lvl w:ilvl="4" w:tentative="1">
+      <w:start w:val="1"/>
+      <w:numFmt w:val="decimal"/>
+      <w:lvlText w:val="%5."/>
+      <w:lvlJc w:val="left"/>
+      <w:pPr>
+        <w:tabs>
+          <w:tab w:val="num" w:pos="3600"/>
+        </w:tabs>
+        <w:ind w:left="3600" w:hanging="360"/>
+      </w:pPr>
+    </w:lvl>
+    <w:lvl w:ilvl="5" w:tentative="1">
+      <w:start w:val="1"/>
+      <w:numFmt w:val="decimal"/>
+      <w:lvlText w:val="%6."/>
+      <w:lvlJc w:val="left"/>
+      <w:pPr>
+        <w:tabs>
+          <w:tab w:val="num" w:pos="4320"/>
+        </w:tabs>
+        <w:ind w:left="4320" w:hanging="360"/>
+      </w:pPr>
+    </w:lvl>
+    <w:lvl w:ilvl="6" w:tentative="1">
+      <w:start w:val="1"/>
+      <w:numFmt w:val="decimal"/>
+      <w:lvlText w:val="%7."/>
+      <w:lvlJc w:val="left"/>
+      <w:pPr>
+        <w:tabs>
+          <w:tab w:val="num" w:pos="5040"/>
+        </w:tabs>
+        <w:ind w:left="5040" w:hanging="360"/>
+      </w:pPr>
+    </w:lvl>
+    <w:lvl w:ilvl="7" w:tentative="1">
+      <w:start w:val="1"/>
+      <w:numFmt w:val="decimal"/>
+      <w:lvlText w:val="%8."/>
+      <w:lvlJc w:val="left"/>
+      <w:pPr>
+        <w:tabs>
+          <w:tab w:val="num" w:pos="5760"/>
+        </w:tabs>
+        <w:ind w:left="5760" w:hanging="360"/>
+      </w:pPr>
+    </w:lvl>
+    <w:lvl w:ilvl="8" w:tentative="1">
+      <w:start w:val="1"/>
+      <w:numFmt w:val="decimal"/>
+      <w:lvlText w:val="%9."/>
+      <w:lvlJc w:val="left"/>
+      <w:pPr>
+        <w:tabs>
+          <w:tab w:val="num" w:pos="6480"/>
+        </w:tabs>
+        <w:ind w:left="6480" w:hanging="360"/>
+      </w:pPr>
+    </w:lvl>
+  </w:abstractNum>
   <w:abstractNum w:abstractNumId="6" w15:restartNumberingAfterBreak="0">
-    <w:nsid w:val="58796F98"/>
+    <w:nsid w:val="643801DE"/>
     <w:multiLevelType w:val="multilevel"/>
-    <w:tmpl w:val="C8308838"/>
+    <w:tmpl w:val="7F3202B2"/>
     <w:lvl w:ilvl="0">
       <w:start w:val="1"/>
       <w:numFmt w:val="bullet"/>
@@ -48201,25 +48417,25 @@
       </w:rPr>
     </w:lvl>
   </w:abstractNum>
-  <w:num w:numId="1" w16cid:durableId="1699697607">
+  <w:num w:numId="1" w16cid:durableId="1109281517">
+    <w:abstractNumId w:val="1"/>
+  </w:num>
+  <w:num w:numId="2" w16cid:durableId="1125582216">
+    <w:abstractNumId w:val="4"/>
+  </w:num>
+  <w:num w:numId="3" w16cid:durableId="233667251">
+    <w:abstractNumId w:val="5"/>
+  </w:num>
+  <w:num w:numId="4" w16cid:durableId="1423913093">
+    <w:abstractNumId w:val="0"/>
+  </w:num>
+  <w:num w:numId="5" w16cid:durableId="513962124">
+    <w:abstractNumId w:val="3"/>
+  </w:num>
+  <w:num w:numId="6" w16cid:durableId="37977515">
     <w:abstractNumId w:val="2"/>
   </w:num>
-  <w:num w:numId="2" w16cid:durableId="1338650183">
-    <w:abstractNumId w:val="3"/>
-  </w:num>
-  <w:num w:numId="3" w16cid:durableId="1013603315">
-    <w:abstractNumId w:val="4"/>
-  </w:num>
-  <w:num w:numId="4" w16cid:durableId="1323434016">
-    <w:abstractNumId w:val="1"/>
-  </w:num>
-  <w:num w:numId="5" w16cid:durableId="1626621281">
-    <w:abstractNumId w:val="0"/>
-  </w:num>
-  <w:num w:numId="6" w16cid:durableId="807665799">
-    <w:abstractNumId w:val="5"/>
-  </w:num>
-  <w:num w:numId="7" w16cid:durableId="916598845">
+  <w:num w:numId="7" w16cid:durableId="1844202084">
     <w:abstractNumId w:val="6"/>
   </w:num>
 </w:numbering>
@@ -48977,7 +49193,7 @@
     <w:link w:val="HeaderChar"/>
     <w:uiPriority w:val="99"/>
     <w:unhideWhenUsed/>
-    <w:rsid w:val="00E47CC8"/>
+    <w:rsid w:val="00FB7031"/>
     <w:pPr>
       <w:tabs>
         <w:tab w:val="center" w:pos="4680"/>
@@ -48990,7 +49206,7 @@
     <w:basedOn w:val="DefaultParagraphFont"/>
     <w:link w:val="Header"/>
     <w:uiPriority w:val="99"/>
-    <w:rsid w:val="00E47CC8"/>
+    <w:rsid w:val="00FB7031"/>
     <w:rPr>
       <w:rFonts w:eastAsiaTheme="minorEastAsia"/>
       <w:sz w:val="24"/>
@@ -49003,7 +49219,7 @@
     <w:link w:val="FooterChar"/>
     <w:uiPriority w:val="99"/>
     <w:unhideWhenUsed/>
-    <w:rsid w:val="00E47CC8"/>
+    <w:rsid w:val="00FB7031"/>
     <w:pPr>
       <w:tabs>
         <w:tab w:val="center" w:pos="4680"/>
@@ -49016,7 +49232,7 @@
     <w:basedOn w:val="DefaultParagraphFont"/>
     <w:link w:val="Footer"/>
     <w:uiPriority w:val="99"/>
-    <w:rsid w:val="00E47CC8"/>
+    <w:rsid w:val="00FB7031"/>
     <w:rPr>
       <w:rFonts w:eastAsiaTheme="minorEastAsia"/>
       <w:sz w:val="24"/>
@@ -49029,7 +49245,7 @@
     <w:uiPriority w:val="99"/>
     <w:semiHidden/>
     <w:unhideWhenUsed/>
-    <w:rsid w:val="00E47CC8"/>
+    <w:rsid w:val="00FB7031"/>
   </w:style>
   <w:style w:type="character" w:styleId="Hyperlink">
     <w:name w:val="Hyperlink"/>
@@ -49037,7 +49253,7 @@
     <w:uiPriority w:val="99"/>
     <w:semiHidden/>
     <w:unhideWhenUsed/>
-    <w:rsid w:val="00E47CC8"/>
+    <w:rsid w:val="00FB7031"/>
     <w:rPr>
       <w:color w:val="auto"/>
       <w:u w:val="single"/>
@@ -49050,7 +49266,7 @@
     <w:autoRedefine/>
     <w:uiPriority w:val="39"/>
     <w:unhideWhenUsed/>
-    <w:rsid w:val="00E47CC8"/>
+    <w:rsid w:val="00FB7031"/>
     <w:pPr>
       <w:spacing w:after="100" w:line="360" w:lineRule="auto"/>
     </w:pPr>
@@ -49062,7 +49278,7 @@
     <w:autoRedefine/>
     <w:uiPriority w:val="39"/>
     <w:unhideWhenUsed/>
-    <w:rsid w:val="00E47CC8"/>
+    <w:rsid w:val="00FB7031"/>
     <w:pPr>
       <w:spacing w:after="100" w:line="360" w:lineRule="auto"/>
       <w:ind w:left="240"/>
@@ -49076,7 +49292,7 @@
     <w:uiPriority w:val="39"/>
     <w:semiHidden/>
     <w:unhideWhenUsed/>
-    <w:rsid w:val="00E47CC8"/>
+    <w:rsid w:val="00FB7031"/>
     <w:pPr>
       <w:spacing w:after="100" w:line="360" w:lineRule="auto"/>
       <w:ind w:left="480"/>

</xml_diff>

<commit_message>
Remove reminder notes from the report
</commit_message>
<xml_diff>
--- a/gem_expert/docs/Gemstone_Identification_Assistant_Report.docx
+++ b/gem_expert/docs/Gemstone_Identification_Assistant_Report.docx
@@ -145,7 +145,7 @@
         </w:rPr>
         <w:br w:type="page"/>
       </w:r>
-      <w:bookmarkStart w:id="0" w:name="_Toc241603496"/>
+      <w:bookmarkStart w:id="0" w:name="_Toc241604124"/>
       <w:r>
         <w:rPr>
           <w:rFonts w:eastAsia="Times New Roman"/>
@@ -285,7 +285,7 @@
         <w:rPr>
           <w:noProof/>
         </w:rPr>
-        <w:instrText xml:space="preserve"> PAGEREF _Toc241603496 \h </w:instrText>
+        <w:instrText xml:space="preserve"> PAGEREF _Toc241604124 \h </w:instrText>
       </w:r>
       <w:r>
         <w:rPr>
@@ -347,7 +347,7 @@
         <w:rPr>
           <w:noProof/>
         </w:rPr>
-        <w:instrText xml:space="preserve"> PAGEREF _Toc241603497 \h </w:instrText>
+        <w:instrText xml:space="preserve"> PAGEREF _Toc241604125 \h </w:instrText>
       </w:r>
       <w:r>
         <w:rPr>
@@ -409,7 +409,7 @@
         <w:rPr>
           <w:noProof/>
         </w:rPr>
-        <w:instrText xml:space="preserve"> PAGEREF _Toc241603498 \h </w:instrText>
+        <w:instrText xml:space="preserve"> PAGEREF _Toc241604126 \h </w:instrText>
       </w:r>
       <w:r>
         <w:rPr>
@@ -471,7 +471,7 @@
         <w:rPr>
           <w:noProof/>
         </w:rPr>
-        <w:instrText xml:space="preserve"> PAGEREF _Toc241603499 \h </w:instrText>
+        <w:instrText xml:space="preserve"> PAGEREF _Toc241604127 \h </w:instrText>
       </w:r>
       <w:r>
         <w:rPr>
@@ -533,7 +533,7 @@
         <w:rPr>
           <w:noProof/>
         </w:rPr>
-        <w:instrText xml:space="preserve"> PAGEREF _Toc241603500 \h </w:instrText>
+        <w:instrText xml:space="preserve"> PAGEREF _Toc241604128 \h </w:instrText>
       </w:r>
       <w:r>
         <w:rPr>
@@ -595,7 +595,7 @@
         <w:rPr>
           <w:noProof/>
         </w:rPr>
-        <w:instrText xml:space="preserve"> PAGEREF _Toc241603501 \h </w:instrText>
+        <w:instrText xml:space="preserve"> PAGEREF _Toc241604129 \h </w:instrText>
       </w:r>
       <w:r>
         <w:rPr>
@@ -657,7 +657,7 @@
         <w:rPr>
           <w:noProof/>
         </w:rPr>
-        <w:instrText xml:space="preserve"> PAGEREF _Toc241603502 \h </w:instrText>
+        <w:instrText xml:space="preserve"> PAGEREF _Toc241604130 \h </w:instrText>
       </w:r>
       <w:r>
         <w:rPr>
@@ -719,7 +719,7 @@
         <w:rPr>
           <w:noProof/>
         </w:rPr>
-        <w:instrText xml:space="preserve"> PAGEREF _Toc241603503 \h </w:instrText>
+        <w:instrText xml:space="preserve"> PAGEREF _Toc241604131 \h </w:instrText>
       </w:r>
       <w:r>
         <w:rPr>
@@ -781,7 +781,7 @@
         <w:rPr>
           <w:noProof/>
         </w:rPr>
-        <w:instrText xml:space="preserve"> PAGEREF _Toc241603504 \h </w:instrText>
+        <w:instrText xml:space="preserve"> PAGEREF _Toc241604132 \h </w:instrText>
       </w:r>
       <w:r>
         <w:rPr>
@@ -843,7 +843,7 @@
         <w:rPr>
           <w:noProof/>
         </w:rPr>
-        <w:instrText xml:space="preserve"> PAGEREF _Toc241603505 \h </w:instrText>
+        <w:instrText xml:space="preserve"> PAGEREF _Toc241604133 \h </w:instrText>
       </w:r>
       <w:r>
         <w:rPr>
@@ -905,7 +905,7 @@
         <w:rPr>
           <w:noProof/>
         </w:rPr>
-        <w:instrText xml:space="preserve"> PAGEREF _Toc241603506 \h </w:instrText>
+        <w:instrText xml:space="preserve"> PAGEREF _Toc241604134 \h </w:instrText>
       </w:r>
       <w:r>
         <w:rPr>
@@ -967,7 +967,7 @@
         <w:rPr>
           <w:noProof/>
         </w:rPr>
-        <w:instrText xml:space="preserve"> PAGEREF _Toc241603507 \h </w:instrText>
+        <w:instrText xml:space="preserve"> PAGEREF _Toc241604135 \h </w:instrText>
       </w:r>
       <w:r>
         <w:rPr>
@@ -1029,7 +1029,7 @@
         <w:rPr>
           <w:noProof/>
         </w:rPr>
-        <w:instrText xml:space="preserve"> PAGEREF _Toc241603508 \h </w:instrText>
+        <w:instrText xml:space="preserve"> PAGEREF _Toc241604136 \h </w:instrText>
       </w:r>
       <w:r>
         <w:rPr>
@@ -1091,7 +1091,7 @@
         <w:rPr>
           <w:noProof/>
         </w:rPr>
-        <w:instrText xml:space="preserve"> PAGEREF _Toc241603509 \h </w:instrText>
+        <w:instrText xml:space="preserve"> PAGEREF _Toc241604137 \h </w:instrText>
       </w:r>
       <w:r>
         <w:rPr>
@@ -1153,7 +1153,7 @@
         <w:rPr>
           <w:noProof/>
         </w:rPr>
-        <w:instrText xml:space="preserve"> PAGEREF _Toc241603510 \h </w:instrText>
+        <w:instrText xml:space="preserve"> PAGEREF _Toc241604138 \h </w:instrText>
       </w:r>
       <w:r>
         <w:rPr>
@@ -1215,7 +1215,7 @@
         <w:rPr>
           <w:noProof/>
         </w:rPr>
-        <w:instrText xml:space="preserve"> PAGEREF _Toc241603511 \h </w:instrText>
+        <w:instrText xml:space="preserve"> PAGEREF _Toc241604139 \h </w:instrText>
       </w:r>
       <w:r>
         <w:rPr>
@@ -1277,7 +1277,7 @@
         <w:rPr>
           <w:noProof/>
         </w:rPr>
-        <w:instrText xml:space="preserve"> PAGEREF _Toc241603512 \h </w:instrText>
+        <w:instrText xml:space="preserve"> PAGEREF _Toc241604140 \h </w:instrText>
       </w:r>
       <w:r>
         <w:rPr>
@@ -1339,7 +1339,7 @@
         <w:rPr>
           <w:noProof/>
         </w:rPr>
-        <w:instrText xml:space="preserve"> PAGEREF _Toc241603513 \h </w:instrText>
+        <w:instrText xml:space="preserve"> PAGEREF _Toc241604141 \h </w:instrText>
       </w:r>
       <w:r>
         <w:rPr>
@@ -1401,7 +1401,7 @@
         <w:rPr>
           <w:noProof/>
         </w:rPr>
-        <w:instrText xml:space="preserve"> PAGEREF _Toc241603514 \h </w:instrText>
+        <w:instrText xml:space="preserve"> PAGEREF _Toc241604142 \h </w:instrText>
       </w:r>
       <w:r>
         <w:rPr>
@@ -1463,7 +1463,7 @@
         <w:rPr>
           <w:noProof/>
         </w:rPr>
-        <w:instrText xml:space="preserve"> PAGEREF _Toc241603515 \h </w:instrText>
+        <w:instrText xml:space="preserve"> PAGEREF _Toc241604143 \h </w:instrText>
       </w:r>
       <w:r>
         <w:rPr>
@@ -1525,7 +1525,7 @@
         <w:rPr>
           <w:noProof/>
         </w:rPr>
-        <w:instrText xml:space="preserve"> PAGEREF _Toc241603516 \h </w:instrText>
+        <w:instrText xml:space="preserve"> PAGEREF _Toc241604144 \h </w:instrText>
       </w:r>
       <w:r>
         <w:rPr>
@@ -1587,7 +1587,7 @@
         <w:rPr>
           <w:noProof/>
         </w:rPr>
-        <w:instrText xml:space="preserve"> PAGEREF _Toc241603517 \h </w:instrText>
+        <w:instrText xml:space="preserve"> PAGEREF _Toc241604145 \h </w:instrText>
       </w:r>
       <w:r>
         <w:rPr>
@@ -1649,7 +1649,7 @@
         <w:rPr>
           <w:noProof/>
         </w:rPr>
-        <w:instrText xml:space="preserve"> PAGEREF _Toc241603518 \h </w:instrText>
+        <w:instrText xml:space="preserve"> PAGEREF _Toc241604146 \h </w:instrText>
       </w:r>
       <w:r>
         <w:rPr>
@@ -1711,7 +1711,7 @@
         <w:rPr>
           <w:noProof/>
         </w:rPr>
-        <w:instrText xml:space="preserve"> PAGEREF _Toc241603519 \h </w:instrText>
+        <w:instrText xml:space="preserve"> PAGEREF _Toc241604147 \h </w:instrText>
       </w:r>
       <w:r>
         <w:rPr>
@@ -1773,7 +1773,7 @@
         <w:rPr>
           <w:noProof/>
         </w:rPr>
-        <w:instrText xml:space="preserve"> PAGEREF _Toc241603520 \h </w:instrText>
+        <w:instrText xml:space="preserve"> PAGEREF _Toc241604148 \h </w:instrText>
       </w:r>
       <w:r>
         <w:rPr>
@@ -1835,7 +1835,7 @@
         <w:rPr>
           <w:noProof/>
         </w:rPr>
-        <w:instrText xml:space="preserve"> PAGEREF _Toc241603521 \h </w:instrText>
+        <w:instrText xml:space="preserve"> PAGEREF _Toc241604149 \h </w:instrText>
       </w:r>
       <w:r>
         <w:rPr>
@@ -1898,7 +1898,7 @@
         <w:rPr>
           <w:noProof/>
         </w:rPr>
-        <w:instrText xml:space="preserve"> PAGEREF _Toc241603522 \h </w:instrText>
+        <w:instrText xml:space="preserve"> PAGEREF _Toc241604150 \h </w:instrText>
       </w:r>
       <w:r>
         <w:rPr>
@@ -1960,7 +1960,7 @@
         <w:rPr>
           <w:noProof/>
         </w:rPr>
-        <w:instrText xml:space="preserve"> PAGEREF _Toc241603523 \h </w:instrText>
+        <w:instrText xml:space="preserve"> PAGEREF _Toc241604151 \h </w:instrText>
       </w:r>
       <w:r>
         <w:rPr>
@@ -2022,7 +2022,7 @@
         <w:rPr>
           <w:noProof/>
         </w:rPr>
-        <w:instrText xml:space="preserve"> PAGEREF _Toc241603524 \h </w:instrText>
+        <w:instrText xml:space="preserve"> PAGEREF _Toc241604152 \h </w:instrText>
       </w:r>
       <w:r>
         <w:rPr>
@@ -2084,7 +2084,7 @@
         <w:rPr>
           <w:noProof/>
         </w:rPr>
-        <w:instrText xml:space="preserve"> PAGEREF _Toc241603525 \h </w:instrText>
+        <w:instrText xml:space="preserve"> PAGEREF _Toc241604153 \h </w:instrText>
       </w:r>
       <w:r>
         <w:rPr>
@@ -2146,7 +2146,7 @@
         <w:rPr>
           <w:noProof/>
         </w:rPr>
-        <w:instrText xml:space="preserve"> PAGEREF _Toc241603526 \h </w:instrText>
+        <w:instrText xml:space="preserve"> PAGEREF _Toc241604154 \h </w:instrText>
       </w:r>
       <w:r>
         <w:rPr>
@@ -2208,7 +2208,7 @@
         <w:rPr>
           <w:noProof/>
         </w:rPr>
-        <w:instrText xml:space="preserve"> PAGEREF _Toc241603527 \h </w:instrText>
+        <w:instrText xml:space="preserve"> PAGEREF _Toc241604155 \h </w:instrText>
       </w:r>
       <w:r>
         <w:rPr>
@@ -2270,7 +2270,7 @@
         <w:rPr>
           <w:noProof/>
         </w:rPr>
-        <w:instrText xml:space="preserve"> PAGEREF _Toc241603528 \h </w:instrText>
+        <w:instrText xml:space="preserve"> PAGEREF _Toc241604156 \h </w:instrText>
       </w:r>
       <w:r>
         <w:rPr>
@@ -2332,7 +2332,7 @@
         <w:rPr>
           <w:noProof/>
         </w:rPr>
-        <w:instrText xml:space="preserve"> PAGEREF _Toc241603529 \h </w:instrText>
+        <w:instrText xml:space="preserve"> PAGEREF _Toc241604157 \h </w:instrText>
       </w:r>
       <w:r>
         <w:rPr>
@@ -2394,7 +2394,7 @@
         <w:rPr>
           <w:noProof/>
         </w:rPr>
-        <w:instrText xml:space="preserve"> PAGEREF _Toc241603530 \h </w:instrText>
+        <w:instrText xml:space="preserve"> PAGEREF _Toc241604158 \h </w:instrText>
       </w:r>
       <w:r>
         <w:rPr>
@@ -2456,7 +2456,7 @@
         <w:rPr>
           <w:noProof/>
         </w:rPr>
-        <w:instrText xml:space="preserve"> PAGEREF _Toc241603531 \h </w:instrText>
+        <w:instrText xml:space="preserve"> PAGEREF _Toc241604159 \h </w:instrText>
       </w:r>
       <w:r>
         <w:rPr>
@@ -2518,7 +2518,7 @@
         <w:rPr>
           <w:noProof/>
         </w:rPr>
-        <w:instrText xml:space="preserve"> PAGEREF _Toc241603532 \h </w:instrText>
+        <w:instrText xml:space="preserve"> PAGEREF _Toc241604160 \h </w:instrText>
       </w:r>
       <w:r>
         <w:rPr>
@@ -2580,7 +2580,7 @@
         <w:rPr>
           <w:noProof/>
         </w:rPr>
-        <w:instrText xml:space="preserve"> PAGEREF _Toc241603533 \h </w:instrText>
+        <w:instrText xml:space="preserve"> PAGEREF _Toc241604161 \h </w:instrText>
       </w:r>
       <w:r>
         <w:rPr>
@@ -2642,7 +2642,7 @@
         <w:rPr>
           <w:noProof/>
         </w:rPr>
-        <w:instrText xml:space="preserve"> PAGEREF _Toc241603534 \h </w:instrText>
+        <w:instrText xml:space="preserve"> PAGEREF _Toc241604162 \h </w:instrText>
       </w:r>
       <w:r>
         <w:rPr>
@@ -2704,7 +2704,7 @@
         <w:rPr>
           <w:noProof/>
         </w:rPr>
-        <w:instrText xml:space="preserve"> PAGEREF _Toc241603535 \h </w:instrText>
+        <w:instrText xml:space="preserve"> PAGEREF _Toc241604163 \h </w:instrText>
       </w:r>
       <w:r>
         <w:rPr>
@@ -2766,7 +2766,7 @@
         <w:rPr>
           <w:noProof/>
         </w:rPr>
-        <w:instrText xml:space="preserve"> PAGEREF _Toc241603536 \h </w:instrText>
+        <w:instrText xml:space="preserve"> PAGEREF _Toc241604164 \h </w:instrText>
       </w:r>
       <w:r>
         <w:rPr>
@@ -2828,7 +2828,7 @@
         <w:rPr>
           <w:noProof/>
         </w:rPr>
-        <w:instrText xml:space="preserve"> PAGEREF _Toc241603537 \h </w:instrText>
+        <w:instrText xml:space="preserve"> PAGEREF _Toc241604165 \h </w:instrText>
       </w:r>
       <w:r>
         <w:rPr>
@@ -2890,7 +2890,7 @@
         <w:rPr>
           <w:noProof/>
         </w:rPr>
-        <w:instrText xml:space="preserve"> PAGEREF _Toc241603538 \h </w:instrText>
+        <w:instrText xml:space="preserve"> PAGEREF _Toc241604166 \h </w:instrText>
       </w:r>
       <w:r>
         <w:rPr>
@@ -2952,7 +2952,7 @@
         <w:rPr>
           <w:noProof/>
         </w:rPr>
-        <w:instrText xml:space="preserve"> PAGEREF _Toc241603539 \h </w:instrText>
+        <w:instrText xml:space="preserve"> PAGEREF _Toc241604167 \h </w:instrText>
       </w:r>
       <w:r>
         <w:rPr>
@@ -3014,7 +3014,7 @@
         <w:rPr>
           <w:noProof/>
         </w:rPr>
-        <w:instrText xml:space="preserve"> PAGEREF _Toc241603540 \h </w:instrText>
+        <w:instrText xml:space="preserve"> PAGEREF _Toc241604168 \h </w:instrText>
       </w:r>
       <w:r>
         <w:rPr>
@@ -3062,7 +3062,7 @@
         </w:rPr>
         <w:br w:type="page"/>
       </w:r>
-      <w:bookmarkStart w:id="1" w:name="_Toc241603497"/>
+      <w:bookmarkStart w:id="1" w:name="_Toc241604125"/>
       <w:r>
         <w:rPr>
           <w:rFonts w:eastAsia="Times New Roman"/>
@@ -3079,7 +3079,7 @@
           <w:rFonts w:eastAsia="Times New Roman"/>
         </w:rPr>
       </w:pPr>
-      <w:bookmarkStart w:id="2" w:name="_Toc241603498"/>
+      <w:bookmarkStart w:id="2" w:name="_Toc241604126"/>
       <w:r>
         <w:rPr>
           <w:rFonts w:eastAsia="Times New Roman"/>
@@ -3106,7 +3106,7 @@
           <w:rFonts w:eastAsia="Times New Roman"/>
         </w:rPr>
       </w:pPr>
-      <w:bookmarkStart w:id="3" w:name="_Toc241603499"/>
+      <w:bookmarkStart w:id="3" w:name="_Toc241604127"/>
       <w:r>
         <w:rPr>
           <w:rFonts w:eastAsia="Times New Roman"/>
@@ -3143,7 +3143,7 @@
           <w:rFonts w:eastAsia="Times New Roman"/>
         </w:rPr>
       </w:pPr>
-      <w:bookmarkStart w:id="4" w:name="_Toc241603500"/>
+      <w:bookmarkStart w:id="4" w:name="_Toc241604128"/>
       <w:r>
         <w:rPr>
           <w:rFonts w:eastAsia="Times New Roman"/>
@@ -3301,7 +3301,7 @@
           <w:rFonts w:eastAsia="Times New Roman"/>
         </w:rPr>
       </w:pPr>
-      <w:bookmarkStart w:id="5" w:name="_Toc241603501"/>
+      <w:bookmarkStart w:id="5" w:name="_Toc241604129"/>
       <w:r>
         <w:rPr>
           <w:rFonts w:eastAsia="Times New Roman"/>
@@ -3328,7 +3328,7 @@
           <w:rFonts w:eastAsia="Times New Roman"/>
         </w:rPr>
       </w:pPr>
-      <w:bookmarkStart w:id="6" w:name="_Toc241603502"/>
+      <w:bookmarkStart w:id="6" w:name="_Toc241604130"/>
       <w:r>
         <w:rPr>
           <w:rFonts w:eastAsia="Times New Roman"/>
@@ -4208,7 +4208,7 @@
           <w:rFonts w:eastAsia="Times New Roman"/>
         </w:rPr>
       </w:pPr>
-      <w:bookmarkStart w:id="7" w:name="_Toc241603503"/>
+      <w:bookmarkStart w:id="7" w:name="_Toc241604131"/>
       <w:r>
         <w:rPr>
           <w:rFonts w:eastAsia="Times New Roman"/>
@@ -4246,7 +4246,7 @@
           <w:rFonts w:eastAsia="Times New Roman"/>
         </w:rPr>
       </w:pPr>
-      <w:bookmarkStart w:id="8" w:name="_Toc241603504"/>
+      <w:bookmarkStart w:id="8" w:name="_Toc241604132"/>
       <w:r>
         <w:rPr>
           <w:rFonts w:eastAsia="Times New Roman"/>
@@ -4273,7 +4273,7 @@
           <w:noProof/>
         </w:rPr>
         <w:drawing>
-          <wp:inline distT="0" distB="0" distL="0" distR="0" wp14:anchorId="5CF7F422" wp14:editId="437B8E00">
+          <wp:inline distT="0" distB="0" distL="0" distR="0" wp14:anchorId="356853A4" wp14:editId="42A31C27">
             <wp:extent cx="5715000" cy="1272540"/>
             <wp:effectExtent l="0" t="0" r="0" b="3810"/>
             <wp:docPr id="1" name="Picture 1"/>
@@ -4338,7 +4338,7 @@
           <w:rFonts w:eastAsia="Times New Roman"/>
         </w:rPr>
       </w:pPr>
-      <w:bookmarkStart w:id="9" w:name="_Toc241603505"/>
+      <w:bookmarkStart w:id="9" w:name="_Toc241604133"/>
       <w:r>
         <w:rPr>
           <w:rFonts w:eastAsia="Times New Roman"/>
@@ -7519,7 +7519,7 @@
           <w:rFonts w:eastAsia="Times New Roman"/>
         </w:rPr>
       </w:pPr>
-      <w:bookmarkStart w:id="10" w:name="_Toc241603506"/>
+      <w:bookmarkStart w:id="10" w:name="_Toc241604134"/>
       <w:r>
         <w:rPr>
           <w:rFonts w:eastAsia="Times New Roman"/>
@@ -7812,7 +7812,7 @@
           <w:rFonts w:eastAsia="Times New Roman"/>
         </w:rPr>
       </w:pPr>
-      <w:bookmarkStart w:id="11" w:name="_Toc241603507"/>
+      <w:bookmarkStart w:id="11" w:name="_Toc241604135"/>
       <w:r>
         <w:rPr>
           <w:rFonts w:eastAsia="Times New Roman"/>
@@ -16048,21 +16048,12 @@
     </w:tbl>
     <w:p>
       <w:pPr>
-        <w:pStyle w:val="note"/>
-        <w:spacing w:before="0" w:beforeAutospacing="0" w:after="120"/>
-      </w:pPr>
-      <w:r>
-        <w:t>[Check every value and statement in Tables 2 and 3 against the cited source before submission, and adjust the source column if needed.]</w:t>
-      </w:r>
-    </w:p>
-    <w:p>
-      <w:pPr>
         <w:pStyle w:val="Heading2"/>
         <w:rPr>
           <w:rFonts w:eastAsia="Times New Roman"/>
         </w:rPr>
       </w:pPr>
-      <w:bookmarkStart w:id="12" w:name="_Toc241603508"/>
+      <w:bookmarkStart w:id="12" w:name="_Toc241604136"/>
       <w:r>
         <w:rPr>
           <w:rFonts w:eastAsia="Times New Roman"/>
@@ -16802,7 +16793,6 @@
                 <w:sz w:val="20"/>
                 <w:szCs w:val="20"/>
               </w:rPr>
-              <w:lastRenderedPageBreak/>
               <w:t>colour(Gem, C), typical_colour(Gem, C)</w:t>
             </w:r>
           </w:p>
@@ -16882,6 +16872,7 @@
                 <w:sz w:val="20"/>
                 <w:szCs w:val="20"/>
               </w:rPr>
+              <w:lastRenderedPageBreak/>
               <w:t>phenomenon(Gem, P)</w:t>
             </w:r>
           </w:p>
@@ -17575,7 +17566,7 @@
           <w:noProof/>
         </w:rPr>
         <w:drawing>
-          <wp:inline distT="0" distB="0" distL="0" distR="0" wp14:anchorId="364BD0F9" wp14:editId="6A6518F6">
+          <wp:inline distT="0" distB="0" distL="0" distR="0" wp14:anchorId="6478BC8B" wp14:editId="3BF1B46A">
             <wp:extent cx="5524500" cy="3208020"/>
             <wp:effectExtent l="0" t="0" r="0" b="0"/>
             <wp:docPr id="2" name="Picture 2"/>
@@ -18348,7 +18339,7 @@
           <w:rFonts w:eastAsia="Times New Roman"/>
         </w:rPr>
       </w:pPr>
-      <w:bookmarkStart w:id="13" w:name="_Toc241603509"/>
+      <w:bookmarkStart w:id="13" w:name="_Toc241604137"/>
       <w:r>
         <w:rPr>
           <w:rFonts w:eastAsia="Times New Roman"/>
@@ -19327,21 +19318,12 @@
     </w:p>
     <w:p>
       <w:pPr>
-        <w:pStyle w:val="note"/>
-        <w:spacing w:before="0" w:beforeAutospacing="0" w:after="120"/>
-      </w:pPr>
-      <w:r>
-        <w:t>[Be ready to justify these values in the viva; adjust them if your own reading of the sources suggests different weights.]</w:t>
-      </w:r>
-    </w:p>
-    <w:p>
-      <w:pPr>
         <w:pStyle w:val="Heading1"/>
         <w:rPr>
           <w:rFonts w:eastAsia="Times New Roman"/>
         </w:rPr>
       </w:pPr>
-      <w:bookmarkStart w:id="14" w:name="_Toc241603510"/>
+      <w:bookmarkStart w:id="14" w:name="_Toc241604138"/>
       <w:r>
         <w:rPr>
           <w:rFonts w:eastAsia="Times New Roman"/>
@@ -19357,7 +19339,7 @@
           <w:rFonts w:eastAsia="Times New Roman"/>
         </w:rPr>
       </w:pPr>
-      <w:bookmarkStart w:id="15" w:name="_Toc241603511"/>
+      <w:bookmarkStart w:id="15" w:name="_Toc241604139"/>
       <w:r>
         <w:rPr>
           <w:rFonts w:eastAsia="Times New Roman"/>
@@ -19371,11 +19353,11 @@
         <w:pStyle w:val="NormalWeb"/>
       </w:pPr>
       <w:r>
-        <w:t xml:space="preserve">The system follows the classic expert system architecture (Figure 3). The knowledge base (knowledge_base.pl) contains only domain knowledge and no reasoning code. The inference engine (engine.pl) contains only domain-independent reasoning and explanation code. Adding </w:t>
+        <w:t xml:space="preserve">The system follows the classic expert system architecture (Figure 3). The knowledge base (knowledge_base.pl) contains only domain knowledge and no reasoning code. The inference engine (engine.pl) contains only domain-independent reasoning and explanation code. Adding a new gem therefore means adding facts and rules; no engine code changes. Working memory </w:t>
       </w:r>
       <w:r>
         <w:lastRenderedPageBreak/>
-        <w:t xml:space="preserve">a new gem therefore means adding facts and rules; no engine code changes. Working memory is declared </w:t>
+        <w:t xml:space="preserve">is declared </w:t>
       </w:r>
       <w:r>
         <w:rPr>
@@ -19397,7 +19379,7 @@
           <w:noProof/>
         </w:rPr>
         <w:drawing>
-          <wp:inline distT="0" distB="0" distL="0" distR="0" wp14:anchorId="3498F5D7" wp14:editId="12629119">
+          <wp:inline distT="0" distB="0" distL="0" distR="0" wp14:anchorId="4502CA64" wp14:editId="746E0639">
             <wp:extent cx="5715000" cy="3954780"/>
             <wp:effectExtent l="0" t="0" r="0" b="7620"/>
             <wp:docPr id="3" name="Picture 3"/>
@@ -20208,7 +20190,7 @@
           <w:rFonts w:eastAsia="Times New Roman"/>
         </w:rPr>
       </w:pPr>
-      <w:bookmarkStart w:id="16" w:name="_Toc241603512"/>
+      <w:bookmarkStart w:id="16" w:name="_Toc241604140"/>
       <w:r>
         <w:rPr>
           <w:rFonts w:eastAsia="Times New Roman"/>
@@ -20292,7 +20274,10 @@
         <w:pStyle w:val="HTMLPreformatted"/>
       </w:pPr>
       <w:r>
-        <w:t xml:space="preserve">    rule(Id, Conds, Concl),       % next rule, in knowledge-base order</w:t>
+        <w:t xml:space="preserve">    rule(Id, Conds, Concl),       </w:t>
+      </w:r>
+      <w:r>
+        <w:t>% next rule, in knowledge-base order</w:t>
       </w:r>
     </w:p>
     <w:p>
@@ -20300,10 +20285,7 @@
         <w:pStyle w:val="HTMLPreformatted"/>
       </w:pPr>
       <w:r>
-        <w:t xml:space="preserve">    </w:t>
-      </w:r>
-      <w:r>
-        <w:t>all_true(Conds),              % all its conditions are true</w:t>
+        <w:t xml:space="preserve">    all_true(Conds),              % all its conditions are true</w:t>
       </w:r>
     </w:p>
     <w:p>
@@ -20404,7 +20386,7 @@
           <w:rFonts w:eastAsia="Times New Roman"/>
         </w:rPr>
       </w:pPr>
-      <w:bookmarkStart w:id="17" w:name="_Toc241603513"/>
+      <w:bookmarkStart w:id="17" w:name="_Toc241604141"/>
       <w:r>
         <w:rPr>
           <w:rFonts w:eastAsia="Times New Roman"/>
@@ -20768,7 +20750,7 @@
           <w:rFonts w:eastAsia="Times New Roman"/>
         </w:rPr>
       </w:pPr>
-      <w:bookmarkStart w:id="18" w:name="_Toc241603514"/>
+      <w:bookmarkStart w:id="18" w:name="_Toc241604142"/>
       <w:r>
         <w:rPr>
           <w:rFonts w:eastAsia="Times New Roman"/>
@@ -20887,7 +20869,7 @@
           <w:rFonts w:eastAsia="Times New Roman"/>
         </w:rPr>
       </w:pPr>
-      <w:bookmarkStart w:id="19" w:name="_Toc241603515"/>
+      <w:bookmarkStart w:id="19" w:name="_Toc241604143"/>
       <w:r>
         <w:rPr>
           <w:rFonts w:eastAsia="Times New Roman"/>
@@ -20996,7 +20978,7 @@
           <w:noProof/>
         </w:rPr>
         <w:drawing>
-          <wp:inline distT="0" distB="0" distL="0" distR="0" wp14:anchorId="2D1B7617" wp14:editId="20240755">
+          <wp:inline distT="0" distB="0" distL="0" distR="0" wp14:anchorId="08A2EE2E" wp14:editId="77C233B0">
             <wp:extent cx="4480560" cy="4960620"/>
             <wp:effectExtent l="0" t="0" r="0" b="0"/>
             <wp:docPr id="4" name="Picture 4"/>
@@ -21061,7 +21043,7 @@
           <w:rFonts w:eastAsia="Times New Roman"/>
         </w:rPr>
       </w:pPr>
-      <w:bookmarkStart w:id="20" w:name="_Toc241603516"/>
+      <w:bookmarkStart w:id="20" w:name="_Toc241604144"/>
       <w:r>
         <w:rPr>
           <w:rFonts w:eastAsia="Times New Roman"/>
@@ -21240,7 +21222,7 @@
           <w:rFonts w:eastAsia="Times New Roman"/>
         </w:rPr>
       </w:pPr>
-      <w:bookmarkStart w:id="21" w:name="_Toc241603517"/>
+      <w:bookmarkStart w:id="21" w:name="_Toc241604145"/>
       <w:r>
         <w:rPr>
           <w:rFonts w:eastAsia="Times New Roman"/>
@@ -21507,7 +21489,7 @@
           <w:noProof/>
         </w:rPr>
         <w:drawing>
-          <wp:inline distT="0" distB="0" distL="0" distR="0" wp14:anchorId="141E270C" wp14:editId="73795FF1">
+          <wp:inline distT="0" distB="0" distL="0" distR="0" wp14:anchorId="7B822ED5" wp14:editId="7E072D9E">
             <wp:extent cx="5334000" cy="3528060"/>
             <wp:effectExtent l="0" t="0" r="0" b="0"/>
             <wp:docPr id="5" name="Picture 5"/>
@@ -21576,7 +21558,7 @@
         </w:rPr>
         <w:lastRenderedPageBreak/>
         <w:drawing>
-          <wp:inline distT="0" distB="0" distL="0" distR="0" wp14:anchorId="413DBD53" wp14:editId="1B87E564">
+          <wp:inline distT="0" distB="0" distL="0" distR="0" wp14:anchorId="0CBC204B" wp14:editId="4D760A31">
             <wp:extent cx="4953000" cy="7604760"/>
             <wp:effectExtent l="0" t="0" r="0" b="0"/>
             <wp:docPr id="6" name="Picture 6"/>
@@ -21645,7 +21627,7 @@
         </w:rPr>
         <w:lastRenderedPageBreak/>
         <w:drawing>
-          <wp:inline distT="0" distB="0" distL="0" distR="0" wp14:anchorId="036EE0A4" wp14:editId="61F597C5">
+          <wp:inline distT="0" distB="0" distL="0" distR="0" wp14:anchorId="43EF7975" wp14:editId="3E4C0529">
             <wp:extent cx="4480560" cy="3589020"/>
             <wp:effectExtent l="0" t="0" r="0" b="0"/>
             <wp:docPr id="7" name="Picture 7"/>
@@ -21713,7 +21695,7 @@
           <w:noProof/>
         </w:rPr>
         <w:drawing>
-          <wp:inline distT="0" distB="0" distL="0" distR="0" wp14:anchorId="2E9A09DC" wp14:editId="0ECECEBB">
+          <wp:inline distT="0" distB="0" distL="0" distR="0" wp14:anchorId="60EE0971" wp14:editId="3C3ADD6E">
             <wp:extent cx="5334000" cy="3268980"/>
             <wp:effectExtent l="0" t="0" r="0" b="7620"/>
             <wp:docPr id="8" name="Picture 8"/>
@@ -21778,7 +21760,7 @@
           <w:rFonts w:eastAsia="Times New Roman"/>
         </w:rPr>
       </w:pPr>
-      <w:bookmarkStart w:id="22" w:name="_Toc241603518"/>
+      <w:bookmarkStart w:id="22" w:name="_Toc241604146"/>
       <w:r>
         <w:rPr>
           <w:rFonts w:eastAsia="Times New Roman"/>
@@ -23011,21 +22993,12 @@
     </w:tbl>
     <w:p>
       <w:pPr>
-        <w:pStyle w:val="note"/>
-        <w:spacing w:before="0" w:beforeAutospacing="0" w:after="120"/>
-      </w:pPr>
-      <w:r>
-        <w:t>[Line numbers refer to the submitted version of engine.pl and query_parser.pl; re-check them if you edit those files.]</w:t>
-      </w:r>
-    </w:p>
-    <w:p>
-      <w:pPr>
         <w:pStyle w:val="Heading1"/>
         <w:rPr>
           <w:rFonts w:eastAsia="Times New Roman"/>
         </w:rPr>
       </w:pPr>
-      <w:bookmarkStart w:id="23" w:name="_Toc241603519"/>
+      <w:bookmarkStart w:id="23" w:name="_Toc241604147"/>
       <w:r>
         <w:rPr>
           <w:rFonts w:eastAsia="Times New Roman"/>
@@ -23046,14 +23019,7 @@
           <w:b/>
           <w:bCs/>
         </w:rPr>
-        <w:t xml:space="preserve">user input → facts → </w:t>
-      </w:r>
-      <w:r>
-        <w:rPr>
-          <w:b/>
-          <w:bCs/>
-        </w:rPr>
-        <w:t>rules fired → reasoning → conclusion</w:t>
+        <w:t>user input → facts → rules fired → reasoning → conclusion</w:t>
       </w:r>
       <w:r>
         <w:t>. The system provides this chain at two levels of detail, for users and for examiners, and answers the three classic explanation questions: How, Why and Why not [11], [12].</w:t>
@@ -23066,7 +23032,7 @@
           <w:rFonts w:eastAsia="Times New Roman"/>
         </w:rPr>
       </w:pPr>
-      <w:bookmarkStart w:id="24" w:name="_Toc241603520"/>
+      <w:bookmarkStart w:id="24" w:name="_Toc241604148"/>
       <w:r>
         <w:rPr>
           <w:rFonts w:eastAsia="Times New Roman"/>
@@ -23106,10 +23072,7 @@
         <w:pStyle w:val="HTMLPreformatted"/>
       </w:pPr>
       <w:r>
-        <w:t xml:space="preserve">   </w:t>
-      </w:r>
-      <w:r>
-        <w:t>RI = 1.765 / SG = 4.0 / Optic character = uniaxial / Colour = blue / Inclusion = silk</w:t>
+        <w:t xml:space="preserve">   RI = 1.765 / SG = 4.0 / Optic character = uniaxial / Colour = blue / Inclusion = silk</w:t>
       </w:r>
     </w:p>
     <w:p>
@@ -23173,10 +23136,7 @@
         <w:pStyle w:val="HTMLPreformatted"/>
       </w:pPr>
       <w:r>
-        <w:t xml:space="preserve">       </w:t>
-      </w:r>
-      <w:r>
-        <w:t>why: Corundum is doubly refractive (uniaxial) with RI about 1.762-1.770 and SG about 4.00. [source: gia]</w:t>
+        <w:t xml:space="preserve">       why: Corundum is doubly refractive (uniaxial) with RI about 1.762-1.770 and SG about 4.00. [source: gia]</w:t>
       </w:r>
     </w:p>
     <w:p>
@@ -23184,7 +23144,10 @@
         <w:pStyle w:val="HTMLPreformatted"/>
       </w:pPr>
       <w:r>
-        <w:t xml:space="preserve">       certainty: rule CF 0.95 x weakest condition 1.00 = 0.95</w:t>
+        <w:t xml:space="preserve">       </w:t>
+      </w:r>
+      <w:r>
+        <w:t>certainty: rule CF 0.95 x weakest condition 1.00 = 0.95</w:t>
       </w:r>
     </w:p>
     <w:p>
@@ -23240,10 +23203,7 @@
         <w:pStyle w:val="HTMLPreformatted"/>
       </w:pPr>
       <w:r>
-        <w:t xml:space="preserve">   </w:t>
-      </w:r>
-      <w:r>
-        <w:t>Blue sapphire (Corundum) - Strong match; Origin: Likely natural</w:t>
+        <w:t xml:space="preserve">   Blue sapphire (Corundum) - Strong match; Origin: Likely natural</w:t>
       </w:r>
     </w:p>
     <w:p>
@@ -23251,7 +23211,10 @@
         <w:pStyle w:val="HTMLPreformatted"/>
       </w:pPr>
       <w:r>
-        <w:t xml:space="preserve">   Recommendation: obtain an NGJA or other accredited laboratory certificate before purchase.</w:t>
+        <w:t xml:space="preserve">   </w:t>
+      </w:r>
+      <w:r>
+        <w:t>Recommendation: obtain an NGJA or other accredited laboratory certificate before purchase.</w:t>
       </w:r>
     </w:p>
     <w:p>
@@ -23273,7 +23236,7 @@
         </w:rPr>
         <w:lastRenderedPageBreak/>
         <w:drawing>
-          <wp:inline distT="0" distB="0" distL="0" distR="0" wp14:anchorId="4F064187" wp14:editId="7B6260DA">
+          <wp:inline distT="0" distB="0" distL="0" distR="0" wp14:anchorId="72CFAC3E" wp14:editId="2E59AFDB">
             <wp:extent cx="4480560" cy="5646420"/>
             <wp:effectExtent l="0" t="0" r="0" b="0"/>
             <wp:docPr id="9" name="Picture 9"/>
@@ -23338,7 +23301,7 @@
           <w:rFonts w:eastAsia="Times New Roman"/>
         </w:rPr>
       </w:pPr>
-      <w:bookmarkStart w:id="25" w:name="_Toc241603521"/>
+      <w:bookmarkStart w:id="25" w:name="_Toc241604149"/>
       <w:r>
         <w:rPr>
           <w:rFonts w:eastAsia="Times New Roman"/>
@@ -23377,10 +23340,7 @@
         <w:pStyle w:val="HTMLPreformatted"/>
       </w:pPr>
       <w:r>
-        <w:t xml:space="preserve">    </w:t>
-      </w:r>
-      <w:r>
-        <w:t>AND NOT Effect: Star THEN Variety: Ruby.</w:t>
+        <w:t xml:space="preserve">    AND NOT Effect: Star THEN Variety: Ruby.</w:t>
       </w:r>
     </w:p>
     <w:p>
@@ -23404,7 +23364,10 @@
         <w:pStyle w:val="HTMLPreformatted"/>
       </w:pPr>
       <w:r>
-        <w:t xml:space="preserve">  - To test rule r1 I need to know: the optic character.</w:t>
+        <w:t xml:space="preserve">  </w:t>
+      </w:r>
+      <w:r>
+        <w:t>- To test rule r1 I need to know: the optic character.</w:t>
       </w:r>
     </w:p>
     <w:p>
@@ -23417,7 +23380,7 @@
           <w:noProof/>
         </w:rPr>
         <w:drawing>
-          <wp:inline distT="0" distB="0" distL="0" distR="0" wp14:anchorId="0924F05D" wp14:editId="61EE04F1">
+          <wp:inline distT="0" distB="0" distL="0" distR="0" wp14:anchorId="0AAC91BD" wp14:editId="7F99A5F7">
             <wp:extent cx="4290060" cy="3398520"/>
             <wp:effectExtent l="0" t="0" r="0" b="0"/>
             <wp:docPr id="10" name="Picture 10"/>
@@ -23482,7 +23445,7 @@
           <w:rFonts w:eastAsia="Times New Roman"/>
         </w:rPr>
       </w:pPr>
-      <w:bookmarkStart w:id="26" w:name="_Toc241603522"/>
+      <w:bookmarkStart w:id="26" w:name="_Toc241604150"/>
       <w:r>
         <w:rPr>
           <w:rFonts w:eastAsia="Times New Roman"/>
@@ -23520,7 +23483,7 @@
         </w:rPr>
         <w:lastRenderedPageBreak/>
         <w:drawing>
-          <wp:inline distT="0" distB="0" distL="0" distR="0" wp14:anchorId="6949587A" wp14:editId="4B5AC10D">
+          <wp:inline distT="0" distB="0" distL="0" distR="0" wp14:anchorId="096AA03E" wp14:editId="42689DDB">
             <wp:extent cx="4480560" cy="1325880"/>
             <wp:effectExtent l="0" t="0" r="0" b="7620"/>
             <wp:docPr id="11" name="Picture 11"/>
@@ -23585,7 +23548,7 @@
           <w:rFonts w:eastAsia="Times New Roman"/>
         </w:rPr>
       </w:pPr>
-      <w:bookmarkStart w:id="27" w:name="_Toc241603523"/>
+      <w:bookmarkStart w:id="27" w:name="_Toc241604151"/>
       <w:r>
         <w:rPr>
           <w:rFonts w:eastAsia="Times New Roman"/>
@@ -23615,7 +23578,7 @@
           <w:noProof/>
         </w:rPr>
         <w:drawing>
-          <wp:inline distT="0" distB="0" distL="0" distR="0" wp14:anchorId="11B3B241" wp14:editId="3CBF989C">
+          <wp:inline distT="0" distB="0" distL="0" distR="0" wp14:anchorId="31342795" wp14:editId="12C3D205">
             <wp:extent cx="4480560" cy="4655820"/>
             <wp:effectExtent l="0" t="0" r="0" b="0"/>
             <wp:docPr id="12" name="Picture 12"/>
@@ -23684,7 +23647,7 @@
         </w:rPr>
         <w:lastRenderedPageBreak/>
         <w:drawing>
-          <wp:inline distT="0" distB="0" distL="0" distR="0" wp14:anchorId="24C05B91" wp14:editId="5D0F5443">
+          <wp:inline distT="0" distB="0" distL="0" distR="0" wp14:anchorId="66CD48A8" wp14:editId="6F2252CA">
             <wp:extent cx="4480560" cy="3733800"/>
             <wp:effectExtent l="0" t="0" r="0" b="0"/>
             <wp:docPr id="13" name="Picture 13"/>
@@ -23749,7 +23712,7 @@
           <w:rFonts w:eastAsia="Times New Roman"/>
         </w:rPr>
       </w:pPr>
-      <w:bookmarkStart w:id="28" w:name="_Toc241603524"/>
+      <w:bookmarkStart w:id="28" w:name="_Toc241604152"/>
       <w:r>
         <w:rPr>
           <w:rFonts w:eastAsia="Times New Roman"/>
@@ -23765,7 +23728,7 @@
           <w:rFonts w:eastAsia="Times New Roman"/>
         </w:rPr>
       </w:pPr>
-      <w:bookmarkStart w:id="29" w:name="_Toc241603525"/>
+      <w:bookmarkStart w:id="29" w:name="_Toc241604153"/>
       <w:r>
         <w:rPr>
           <w:rFonts w:eastAsia="Times New Roman"/>
@@ -23789,7 +23752,7 @@
           <w:rFonts w:eastAsia="Times New Roman"/>
         </w:rPr>
       </w:pPr>
-      <w:bookmarkStart w:id="30" w:name="_Toc241603526"/>
+      <w:bookmarkStart w:id="30" w:name="_Toc241604154"/>
       <w:r>
         <w:rPr>
           <w:rFonts w:eastAsia="Times New Roman"/>
@@ -29424,7 +29387,7 @@
           <w:rFonts w:eastAsia="Times New Roman"/>
         </w:rPr>
       </w:pPr>
-      <w:bookmarkStart w:id="31" w:name="_Toc241603527"/>
+      <w:bookmarkStart w:id="31" w:name="_Toc241604155"/>
       <w:r>
         <w:rPr>
           <w:rFonts w:eastAsia="Times New Roman"/>
@@ -30192,7 +30155,7 @@
           <w:rFonts w:eastAsia="Times New Roman"/>
         </w:rPr>
       </w:pPr>
-      <w:bookmarkStart w:id="32" w:name="_Toc241603528"/>
+      <w:bookmarkStart w:id="32" w:name="_Toc241604156"/>
       <w:r>
         <w:rPr>
           <w:rFonts w:eastAsia="Times New Roman"/>
@@ -31185,7 +31148,7 @@
           <w:rFonts w:eastAsia="Times New Roman"/>
         </w:rPr>
       </w:pPr>
-      <w:bookmarkStart w:id="33" w:name="_Toc241603529"/>
+      <w:bookmarkStart w:id="33" w:name="_Toc241604157"/>
       <w:r>
         <w:rPr>
           <w:rFonts w:eastAsia="Times New Roman"/>
@@ -32179,7 +32142,7 @@
           <w:rFonts w:eastAsia="Times New Roman"/>
         </w:rPr>
       </w:pPr>
-      <w:bookmarkStart w:id="34" w:name="_Toc241603530"/>
+      <w:bookmarkStart w:id="34" w:name="_Toc241604158"/>
       <w:r>
         <w:rPr>
           <w:rFonts w:eastAsia="Times New Roman"/>
@@ -32213,7 +32176,7 @@
           <w:rFonts w:eastAsia="Times New Roman"/>
         </w:rPr>
       </w:pPr>
-      <w:bookmarkStart w:id="35" w:name="_Toc241603531"/>
+      <w:bookmarkStart w:id="35" w:name="_Toc241604159"/>
       <w:r>
         <w:rPr>
           <w:rFonts w:eastAsia="Times New Roman"/>
@@ -32229,7 +32192,7 @@
           <w:rFonts w:eastAsia="Times New Roman"/>
         </w:rPr>
       </w:pPr>
-      <w:bookmarkStart w:id="36" w:name="_Toc241603532"/>
+      <w:bookmarkStart w:id="36" w:name="_Toc241604160"/>
       <w:r>
         <w:rPr>
           <w:rFonts w:eastAsia="Times New Roman"/>
@@ -32275,7 +32238,7 @@
           <w:rFonts w:eastAsia="Times New Roman"/>
         </w:rPr>
       </w:pPr>
-      <w:bookmarkStart w:id="37" w:name="_Toc241603533"/>
+      <w:bookmarkStart w:id="37" w:name="_Toc241604161"/>
       <w:r>
         <w:rPr>
           <w:rFonts w:eastAsia="Times New Roman"/>
@@ -32315,7 +32278,7 @@
           <w:rFonts w:eastAsia="Times New Roman"/>
         </w:rPr>
       </w:pPr>
-      <w:bookmarkStart w:id="38" w:name="_Toc241603534"/>
+      <w:bookmarkStart w:id="38" w:name="_Toc241604162"/>
       <w:r>
         <w:rPr>
           <w:rFonts w:eastAsia="Times New Roman"/>
@@ -32566,7 +32529,7 @@
           <w:rFonts w:eastAsia="Times New Roman"/>
         </w:rPr>
       </w:pPr>
-      <w:bookmarkStart w:id="39" w:name="_Toc241603535"/>
+      <w:bookmarkStart w:id="39" w:name="_Toc241604163"/>
       <w:r>
         <w:rPr>
           <w:rFonts w:eastAsia="Times New Roman"/>
@@ -32677,7 +32640,7 @@
           <w:rFonts w:eastAsia="Times New Roman"/>
         </w:rPr>
       </w:pPr>
-      <w:bookmarkStart w:id="40" w:name="_Toc241603536"/>
+      <w:bookmarkStart w:id="40" w:name="_Toc241604164"/>
       <w:r>
         <w:rPr>
           <w:rFonts w:eastAsia="Times New Roman"/>
@@ -32717,7 +32680,7 @@
         </w:rPr>
         <w:br w:type="page"/>
       </w:r>
-      <w:bookmarkStart w:id="41" w:name="_Toc241603537"/>
+      <w:bookmarkStart w:id="41" w:name="_Toc241604165"/>
       <w:r>
         <w:rPr>
           <w:rFonts w:eastAsia="Times New Roman"/>
@@ -32729,11 +32692,11 @@
     </w:p>
     <w:p>
       <w:pPr>
-        <w:pStyle w:val="note"/>
+        <w:pStyle w:val="ref"/>
         <w:spacing w:before="0" w:beforeAutospacing="0" w:after="120"/>
       </w:pPr>
       <w:r>
-        <w:t>[Check each reference, especially edition numbers and years, against the copy you actually used. For [21]-[28], click "Cite" then "IEEE" under each result on Google Scholar and compare; in [24], replace [conference name] with the full conference name.]</w:t>
+        <w:t>[1] Gemological Institute of America, "GIA Gem Encyclopedia." [Online]. Available: https://www.gia.edu/gem-encyclopedia</w:t>
       </w:r>
     </w:p>
     <w:p>
@@ -32742,7 +32705,17 @@
         <w:spacing w:before="0" w:beforeAutospacing="0" w:after="120"/>
       </w:pPr>
       <w:r>
-        <w:t>[1] Gemological Institute of America, "GIA Gem Encyclopedia." [Online]. Available: https://www.gia.edu/gem-encyclopedia</w:t>
+        <w:t xml:space="preserve">[2] R. Webster, </w:t>
+      </w:r>
+      <w:r>
+        <w:rPr>
+          <w:i/>
+          <w:iCs/>
+        </w:rPr>
+        <w:t>Gems: Their Sources, Descriptions and Identification</w:t>
+      </w:r>
+      <w:r>
+        <w:t>, 5th ed., P. G. Read, Ed. Oxford, U.K.: Butterworth-Heinemann, 1994.</w:t>
       </w:r>
     </w:p>
     <w:p>
@@ -32751,17 +32724,17 @@
         <w:spacing w:before="0" w:beforeAutospacing="0" w:after="120"/>
       </w:pPr>
       <w:r>
-        <w:t xml:space="preserve">[2] R. Webster, </w:t>
+        <w:t xml:space="preserve">[3] P. G. Read, </w:t>
       </w:r>
       <w:r>
         <w:rPr>
           <w:i/>
           <w:iCs/>
         </w:rPr>
-        <w:t>Gems: Their Sources, Descriptions and Identification</w:t>
-      </w:r>
-      <w:r>
-        <w:t>, 5th ed., P. G. Read, Ed. Oxford, U.K.: Butterworth-Heinemann, 1994.</w:t>
+        <w:t>Gemmology</w:t>
+      </w:r>
+      <w:r>
+        <w:t>, 3rd ed. Oxford, U.K.: Elsevier Butterworth-Heinemann, 2005.</w:t>
       </w:r>
     </w:p>
     <w:p>
@@ -32770,17 +32743,17 @@
         <w:spacing w:before="0" w:beforeAutospacing="0" w:after="120"/>
       </w:pPr>
       <w:r>
-        <w:t xml:space="preserve">[3] P. G. Read, </w:t>
+        <w:t xml:space="preserve">[4] A. Matlins and A. C. Bonanno, </w:t>
       </w:r>
       <w:r>
         <w:rPr>
           <w:i/>
           <w:iCs/>
         </w:rPr>
-        <w:t>Gemmology</w:t>
-      </w:r>
-      <w:r>
-        <w:t>, 3rd ed. Oxford, U.K.: Elsevier Butterworth-Heinemann, 2005.</w:t>
+        <w:t>Gem Identification Made Easy</w:t>
+      </w:r>
+      <w:r>
+        <w:t>, 5th ed. Woodstock, VT, USA: GemStone Press, 2013.</w:t>
       </w:r>
     </w:p>
     <w:p>
@@ -32789,17 +32762,44 @@
         <w:spacing w:before="0" w:beforeAutospacing="0" w:after="120"/>
       </w:pPr>
       <w:r>
-        <w:t xml:space="preserve">[4] A. Matlins and A. C. Bonanno, </w:t>
+        <w:t>[5] International Gem Society, "Gem identification articles." [Online]. Available: https://www.gemsociety.org</w:t>
+      </w:r>
+    </w:p>
+    <w:p>
+      <w:pPr>
+        <w:pStyle w:val="ref"/>
+        <w:spacing w:before="0" w:beforeAutospacing="0" w:after="120"/>
+      </w:pPr>
+      <w:r>
+        <w:t>[6] Gemdat.org, "Gemstone database." [Online]. Available: https://www.gemdat.org</w:t>
+      </w:r>
+    </w:p>
+    <w:p>
+      <w:pPr>
+        <w:pStyle w:val="ref"/>
+        <w:spacing w:before="0" w:beforeAutospacing="0" w:after="120"/>
+      </w:pPr>
+      <w:r>
+        <w:t>[7] National Gem and Jewellery Authority of Sri Lanka. [Online]. Available: https://www.ngja.gov.lk</w:t>
+      </w:r>
+    </w:p>
+    <w:p>
+      <w:pPr>
+        <w:pStyle w:val="ref"/>
+        <w:spacing w:before="0" w:beforeAutospacing="0" w:after="120"/>
+      </w:pPr>
+      <w:r>
+        <w:t xml:space="preserve">[8] E. H. Shortliffe, </w:t>
       </w:r>
       <w:r>
         <w:rPr>
           <w:i/>
           <w:iCs/>
         </w:rPr>
-        <w:t>Gem Identification Made Easy</w:t>
-      </w:r>
-      <w:r>
-        <w:t>, 5th ed. Woodstock, VT, USA: GemStone Press, 2013.</w:t>
+        <w:t>Computer-Based Medical Consultations: MYCIN</w:t>
+      </w:r>
+      <w:r>
+        <w:t>. New York, NY, USA: Elsevier, 1976.</w:t>
       </w:r>
     </w:p>
     <w:p>
@@ -32808,7 +32808,17 @@
         <w:spacing w:before="0" w:beforeAutospacing="0" w:after="120"/>
       </w:pPr>
       <w:r>
-        <w:t>[5] International Gem Society, "Gem identification articles." [Online]. Available: https://www.gemsociety.org</w:t>
+        <w:t xml:space="preserve">[9] B. G. Buchanan and E. H. Shortliffe, Eds., </w:t>
+      </w:r>
+      <w:r>
+        <w:rPr>
+          <w:i/>
+          <w:iCs/>
+        </w:rPr>
+        <w:t>Rule-Based Expert Systems: The MYCIN Experiments of the Stanford Heuristic Programming Project</w:t>
+      </w:r>
+      <w:r>
+        <w:t>. Reading, MA, USA: Addison-Wesley, 1984.</w:t>
       </w:r>
     </w:p>
     <w:p>
@@ -32817,7 +32827,17 @@
         <w:spacing w:before="0" w:beforeAutospacing="0" w:after="120"/>
       </w:pPr>
       <w:r>
-        <w:t>[6] Gemdat.org, "Gemstone database." [Online]. Available: https://www.gemdat.org</w:t>
+        <w:t xml:space="preserve">[10] P. Jackson, </w:t>
+      </w:r>
+      <w:r>
+        <w:rPr>
+          <w:i/>
+          <w:iCs/>
+        </w:rPr>
+        <w:t>Introduction to Expert Systems</w:t>
+      </w:r>
+      <w:r>
+        <w:t>, 3rd ed. Harlow, U.K.: Addison-Wesley, 1999.</w:t>
       </w:r>
     </w:p>
     <w:p>
@@ -32826,7 +32846,17 @@
         <w:spacing w:before="0" w:beforeAutospacing="0" w:after="120"/>
       </w:pPr>
       <w:r>
-        <w:t>[7] National Gem and Jewellery Authority of Sri Lanka. [Online]. Available: https://www.ngja.gov.lk</w:t>
+        <w:t xml:space="preserve">[11] J. C. Giarratano and G. D. Riley, </w:t>
+      </w:r>
+      <w:r>
+        <w:rPr>
+          <w:i/>
+          <w:iCs/>
+        </w:rPr>
+        <w:t>Expert Systems: Principles and Programming</w:t>
+      </w:r>
+      <w:r>
+        <w:t>, 4th ed. Boston, MA, USA: Thomson Course Technology, 2005.</w:t>
       </w:r>
     </w:p>
     <w:p>
@@ -32835,17 +32865,17 @@
         <w:spacing w:before="0" w:beforeAutospacing="0" w:after="120"/>
       </w:pPr>
       <w:r>
-        <w:t xml:space="preserve">[8] E. H. Shortliffe, </w:t>
+        <w:t xml:space="preserve">[12] I. Bratko, </w:t>
       </w:r>
       <w:r>
         <w:rPr>
           <w:i/>
           <w:iCs/>
         </w:rPr>
-        <w:t>Computer-Based Medical Consultations: MYCIN</w:t>
-      </w:r>
-      <w:r>
-        <w:t>. New York, NY, USA: Elsevier, 1976.</w:t>
+        <w:t>Prolog Programming for Artificial Intelligence</w:t>
+      </w:r>
+      <w:r>
+        <w:t>, 4th ed. Harlow, U.K.: Pearson Education, 2012.</w:t>
       </w:r>
     </w:p>
     <w:p>
@@ -32854,17 +32884,17 @@
         <w:spacing w:before="0" w:beforeAutospacing="0" w:after="120"/>
       </w:pPr>
       <w:r>
-        <w:t xml:space="preserve">[9] B. G. Buchanan and E. H. Shortliffe, Eds., </w:t>
+        <w:t xml:space="preserve">[13] D. Merritt, </w:t>
       </w:r>
       <w:r>
         <w:rPr>
           <w:i/>
           <w:iCs/>
         </w:rPr>
-        <w:t>Rule-Based Expert Systems: The MYCIN Experiments of the Stanford Heuristic Programming Project</w:t>
-      </w:r>
-      <w:r>
-        <w:t>. Reading, MA, USA: Addison-Wesley, 1984.</w:t>
+        <w:t>Building Expert Systems in Prolog</w:t>
+      </w:r>
+      <w:r>
+        <w:t>. New York, NY, USA: Springer-Verlag, 1989.</w:t>
       </w:r>
     </w:p>
     <w:p>
@@ -32873,17 +32903,17 @@
         <w:spacing w:before="0" w:beforeAutospacing="0" w:after="120"/>
       </w:pPr>
       <w:r>
-        <w:t xml:space="preserve">[10] P. Jackson, </w:t>
+        <w:t xml:space="preserve">[14] L. Sterling and E. Shapiro, </w:t>
       </w:r>
       <w:r>
         <w:rPr>
           <w:i/>
           <w:iCs/>
         </w:rPr>
-        <w:t>Introduction to Expert Systems</w:t>
-      </w:r>
-      <w:r>
-        <w:t>, 3rd ed. Harlow, U.K.: Addison-Wesley, 1999.</w:t>
+        <w:t>The Art of Prolog</w:t>
+      </w:r>
+      <w:r>
+        <w:t>, 2nd ed. Cambridge, MA, USA: MIT Press, 1994.</w:t>
       </w:r>
     </w:p>
     <w:p>
@@ -32892,17 +32922,18 @@
         <w:spacing w:before="0" w:beforeAutospacing="0" w:after="120"/>
       </w:pPr>
       <w:r>
-        <w:t xml:space="preserve">[11] J. C. Giarratano and G. D. Riley, </w:t>
+        <w:lastRenderedPageBreak/>
+        <w:t xml:space="preserve">[15] F. C. N. Pereira and D. H. D. Warren, "Definite clause grammars for language analysis - A survey of the formalism and a comparison with augmented transition networks," </w:t>
       </w:r>
       <w:r>
         <w:rPr>
           <w:i/>
           <w:iCs/>
         </w:rPr>
-        <w:t>Expert Systems: Principles and Programming</w:t>
-      </w:r>
-      <w:r>
-        <w:t>, 4th ed. Boston, MA, USA: Thomson Course Technology, 2005.</w:t>
+        <w:t>Artificial Intelligence</w:t>
+      </w:r>
+      <w:r>
+        <w:t>, vol. 13, no. 3, pp. 231-278, 1980.</w:t>
       </w:r>
     </w:p>
     <w:p>
@@ -32911,17 +32942,17 @@
         <w:spacing w:before="0" w:beforeAutospacing="0" w:after="120"/>
       </w:pPr>
       <w:r>
-        <w:t xml:space="preserve">[12] I. Bratko, </w:t>
+        <w:t xml:space="preserve">[16] J. Wielemaker, T. Schrijvers, M. Triska, and T. Lager, "SWI-Prolog," </w:t>
       </w:r>
       <w:r>
         <w:rPr>
           <w:i/>
           <w:iCs/>
         </w:rPr>
-        <w:t>Prolog Programming for Artificial Intelligence</w:t>
-      </w:r>
-      <w:r>
-        <w:t>, 4th ed. Harlow, U.K.: Pearson Education, 2012.</w:t>
+        <w:t>Theory and Practice of Logic Programming</w:t>
+      </w:r>
+      <w:r>
+        <w:t>, vol. 12, no. 1-2, pp. 67-96, 2012.</w:t>
       </w:r>
     </w:p>
     <w:p>
@@ -32930,17 +32961,17 @@
         <w:spacing w:before="0" w:beforeAutospacing="0" w:after="120"/>
       </w:pPr>
       <w:r>
-        <w:t xml:space="preserve">[13] D. Merritt, </w:t>
+        <w:t xml:space="preserve">[17] S. Russell and P. Norvig, </w:t>
       </w:r>
       <w:r>
         <w:rPr>
           <w:i/>
           <w:iCs/>
         </w:rPr>
-        <w:t>Building Expert Systems in Prolog</w:t>
-      </w:r>
-      <w:r>
-        <w:t>. New York, NY, USA: Springer-Verlag, 1989.</w:t>
+        <w:t>Artificial Intelligence: A Modern Approach</w:t>
+      </w:r>
+      <w:r>
+        <w:t>, 4th ed. Hoboken, NJ, USA: Pearson, 2020.</w:t>
       </w:r>
     </w:p>
     <w:p>
@@ -32949,18 +32980,17 @@
         <w:spacing w:before="0" w:beforeAutospacing="0" w:after="120"/>
       </w:pPr>
       <w:r>
-        <w:lastRenderedPageBreak/>
-        <w:t xml:space="preserve">[14] L. Sterling and E. Shapiro, </w:t>
+        <w:t xml:space="preserve">[18] A. S. Elstein, L. S. Shulman, and S. A. Sprafka, </w:t>
       </w:r>
       <w:r>
         <w:rPr>
           <w:i/>
           <w:iCs/>
         </w:rPr>
-        <w:t>The Art of Prolog</w:t>
-      </w:r>
-      <w:r>
-        <w:t>, 2nd ed. Cambridge, MA, USA: MIT Press, 1994.</w:t>
+        <w:t>Medical Problem Solving: An Analysis of Clinical Reasoning</w:t>
+      </w:r>
+      <w:r>
+        <w:t>. Cambridge, MA, USA: Harvard University Press, 1978.</w:t>
       </w:r>
     </w:p>
     <w:p>
@@ -32969,17 +32999,17 @@
         <w:spacing w:before="0" w:beforeAutospacing="0" w:after="120"/>
       </w:pPr>
       <w:r>
-        <w:t xml:space="preserve">[15] F. C. N. Pereira and D. H. D. Warren, "Definite clause grammars for language analysis - A survey of the formalism and a comparison with augmented transition networks," </w:t>
+        <w:t xml:space="preserve">[19] C. Rudin, "Stop explaining black box machine learning models for high stakes decisions and use interpretable models instead," </w:t>
       </w:r>
       <w:r>
         <w:rPr>
           <w:i/>
           <w:iCs/>
         </w:rPr>
-        <w:t>Artificial Intelligence</w:t>
-      </w:r>
-      <w:r>
-        <w:t>, vol. 13, no. 3, pp. 231-278, 1980.</w:t>
+        <w:t>Nature Machine Intelligence</w:t>
+      </w:r>
+      <w:r>
+        <w:t>, vol. 1, no. 5, pp. 206-215, 2019.</w:t>
       </w:r>
     </w:p>
     <w:p>
@@ -32988,17 +33018,17 @@
         <w:spacing w:before="0" w:beforeAutospacing="0" w:after="120"/>
       </w:pPr>
       <w:r>
-        <w:t xml:space="preserve">[16] J. Wielemaker, T. Schrijvers, M. Triska, and T. Lager, "SWI-Prolog," </w:t>
+        <w:t xml:space="preserve">[20] W. R. Swartout, "XPLAIN: A system for creating and explaining expert consulting programs," </w:t>
       </w:r>
       <w:r>
         <w:rPr>
           <w:i/>
           <w:iCs/>
         </w:rPr>
-        <w:t>Theory and Practice of Logic Programming</w:t>
-      </w:r>
-      <w:r>
-        <w:t>, vol. 12, no. 1-2, pp. 67-96, 2012.</w:t>
+        <w:t>Artificial Intelligence</w:t>
+      </w:r>
+      <w:r>
+        <w:t>, vol. 21, no. 3, pp. 285-325, 1983.</w:t>
       </w:r>
     </w:p>
     <w:p>
@@ -33007,17 +33037,17 @@
         <w:spacing w:before="0" w:beforeAutospacing="0" w:after="120"/>
       </w:pPr>
       <w:r>
-        <w:t xml:space="preserve">[17] S. Russell and P. Norvig, </w:t>
+        <w:t xml:space="preserve">[21] E. Fritsch and C. M. Stockton, "Infrared spectroscopy in gem identification," </w:t>
       </w:r>
       <w:r>
         <w:rPr>
           <w:i/>
           <w:iCs/>
         </w:rPr>
-        <w:t>Artificial Intelligence: A Modern Approach</w:t>
-      </w:r>
-      <w:r>
-        <w:t>, 4th ed. Hoboken, NJ, USA: Pearson, 2020.</w:t>
+        <w:t>Gems &amp; Gemology</w:t>
+      </w:r>
+      <w:r>
+        <w:t>, vol. 23, no. 1, pp. 18-26, 1987.</w:t>
       </w:r>
     </w:p>
     <w:p>
@@ -33026,17 +33056,17 @@
         <w:spacing w:before="0" w:beforeAutospacing="0" w:after="120"/>
       </w:pPr>
       <w:r>
-        <w:t xml:space="preserve">[18] A. S. Elstein, L. S. Shulman, and S. A. Sprafka, </w:t>
+        <w:t xml:space="preserve">[22] S. Karampelas, L. Kiefert, D. Bersani, and P. Vandenabeele, </w:t>
       </w:r>
       <w:r>
         <w:rPr>
           <w:i/>
           <w:iCs/>
         </w:rPr>
-        <w:t>Medical Problem Solving: An Analysis of Clinical Reasoning</w:t>
-      </w:r>
-      <w:r>
-        <w:t>. Cambridge, MA, USA: Harvard University Press, 1978.</w:t>
+        <w:t>Gems and Gemmology: An Introduction for Archaeologists, Art-Historians and Conservators</w:t>
+      </w:r>
+      <w:r>
+        <w:t>. Cham, Switzerland: Springer, 2020.</w:t>
       </w:r>
     </w:p>
     <w:p>
@@ -33045,17 +33075,17 @@
         <w:spacing w:before="0" w:beforeAutospacing="0" w:after="120"/>
       </w:pPr>
       <w:r>
-        <w:t xml:space="preserve">[19] C. Rudin, "Stop explaining black box machine learning models for high stakes decisions and use interpretable models instead," </w:t>
+        <w:t xml:space="preserve">[23] A. L. Jenkins and R. A. Larsen, "Gemstone identification using Raman spectroscopy," </w:t>
       </w:r>
       <w:r>
         <w:rPr>
           <w:i/>
           <w:iCs/>
         </w:rPr>
-        <w:t>Nature Machine Intelligence</w:t>
-      </w:r>
-      <w:r>
-        <w:t>, vol. 1, no. 5, pp. 206-215, 2019.</w:t>
+        <w:t>Spectroscopy</w:t>
+      </w:r>
+      <w:r>
+        <w:t>, vol. 19, no. 4, 2004.</w:t>
       </w:r>
     </w:p>
     <w:p>
@@ -33064,17 +33094,26 @@
         <w:spacing w:before="0" w:beforeAutospacing="0" w:after="120"/>
       </w:pPr>
       <w:r>
-        <w:t xml:space="preserve">[20] W. R. Swartout, "XPLAIN: A system for creating and explaining expert consulting programs," </w:t>
+        <w:t>[24] R. Raheem, W. Ahmad, and S. M. Adnan, "Improving gemstone identification accuracy using convolutional neural networks," presented at an IEEE International Conference, 2024. [Online]. Available: IEEE Xplore.</w:t>
+      </w:r>
+    </w:p>
+    <w:p>
+      <w:pPr>
+        <w:pStyle w:val="ref"/>
+        <w:spacing w:before="0" w:beforeAutospacing="0" w:after="120"/>
+      </w:pPr>
+      <w:r>
+        <w:t xml:space="preserve">[25] B. G. Buchanan and R. O. Duda, "Principles of rule-based expert systems," </w:t>
       </w:r>
       <w:r>
         <w:rPr>
           <w:i/>
           <w:iCs/>
         </w:rPr>
-        <w:t>Artificial Intelligence</w:t>
-      </w:r>
-      <w:r>
-        <w:t>, vol. 21, no. 3, pp. 285-325, 1983.</w:t>
+        <w:t>Advances in Computers</w:t>
+      </w:r>
+      <w:r>
+        <w:t>, vol. 22, pp. 163-216, 1983.</w:t>
       </w:r>
     </w:p>
     <w:p>
@@ -33083,17 +33122,17 @@
         <w:spacing w:before="0" w:beforeAutospacing="0" w:after="120"/>
       </w:pPr>
       <w:r>
-        <w:t xml:space="preserve">[21] E. Fritsch and C. M. Stockton, "Infrared spectroscopy in gem identification," </w:t>
+        <w:t xml:space="preserve">[26] C. Grosan and A. Abraham, "Rule-based expert systems," in </w:t>
       </w:r>
       <w:r>
         <w:rPr>
           <w:i/>
           <w:iCs/>
         </w:rPr>
-        <w:t>Gems &amp; Gemology</w:t>
-      </w:r>
-      <w:r>
-        <w:t>, vol. 23, no. 1, pp. 18-26, 1987.</w:t>
+        <w:t>Intelligent Systems: A Modern Approach</w:t>
+      </w:r>
+      <w:r>
+        <w:t>. Berlin, Germany: Springer, 2011, pp. 149-185.</w:t>
       </w:r>
     </w:p>
     <w:p>
@@ -33102,17 +33141,17 @@
         <w:spacing w:before="0" w:beforeAutospacing="0" w:after="120"/>
       </w:pPr>
       <w:r>
-        <w:t xml:space="preserve">[22] S. Karampelas, L. Kiefert, D. Bersani, and P. Vandenabeele, </w:t>
+        <w:t xml:space="preserve">[27] A. Abraham, "Rule-based expert systems," in </w:t>
       </w:r>
       <w:r>
         <w:rPr>
           <w:i/>
           <w:iCs/>
         </w:rPr>
-        <w:t>Gems and Gemmology: An Introduction for Archaeologists, Art-Historians and Conservators</w:t>
-      </w:r>
-      <w:r>
-        <w:t>. Cham, Switzerland: Springer, 2020.</w:t>
+        <w:t>Handbook of Measuring System Design</w:t>
+      </w:r>
+      <w:r>
+        <w:t>, P. H. Sydenham and R. Thorn, Eds. Chichester, U.K.: Wiley, 2005.</w:t>
       </w:r>
     </w:p>
     <w:p>
@@ -33121,117 +33160,22 @@
         <w:spacing w:before="0" w:beforeAutospacing="0" w:after="120"/>
       </w:pPr>
       <w:r>
-        <w:t xml:space="preserve">[23] A. L. Jenkins and R. A. Larsen, "Gemstone identification using Raman spectroscopy," </w:t>
+        <w:lastRenderedPageBreak/>
+        <w:t xml:space="preserve">[28] W. J. Clancey, "The epistemology of a rule-based expert system - A framework for explanation," </w:t>
       </w:r>
       <w:r>
         <w:rPr>
           <w:i/>
           <w:iCs/>
         </w:rPr>
-        <w:t>Spectroscopy</w:t>
-      </w:r>
-      <w:r>
-        <w:t>, vol. 19, no. 4, 2004.</w:t>
+        <w:t>Artificial Intelligence</w:t>
+      </w:r>
+      <w:r>
+        <w:t>, vol. 20, no. 3, pp. 215-251, 1983.</w:t>
       </w:r>
     </w:p>
     <w:p>
       <w:pPr>
-        <w:pStyle w:val="ref"/>
-        <w:spacing w:before="0" w:beforeAutospacing="0" w:after="120"/>
-      </w:pPr>
-      <w:r>
-        <w:t xml:space="preserve">[24] R. Raheem, W. Ahmad, and S. M. Adnan, "Improving gemstone identification accuracy using convolutional neural networks," in </w:t>
-      </w:r>
-      <w:r>
-        <w:rPr>
-          <w:i/>
-          <w:iCs/>
-        </w:rPr>
-        <w:t>Proc. International Conference on [conference name]</w:t>
-      </w:r>
-      <w:r>
-        <w:t>, IEEE, 2024.</w:t>
-      </w:r>
-    </w:p>
-    <w:p>
-      <w:pPr>
-        <w:pStyle w:val="ref"/>
-        <w:spacing w:before="0" w:beforeAutospacing="0" w:after="120"/>
-      </w:pPr>
-      <w:r>
-        <w:t xml:space="preserve">[25] B. G. Buchanan and R. O. Duda, "Principles of rule-based expert systems," </w:t>
-      </w:r>
-      <w:r>
-        <w:rPr>
-          <w:i/>
-          <w:iCs/>
-        </w:rPr>
-        <w:t>Advances in Computers</w:t>
-      </w:r>
-      <w:r>
-        <w:t>, vol. 22, pp. 163-216, 1983.</w:t>
-      </w:r>
-    </w:p>
-    <w:p>
-      <w:pPr>
-        <w:pStyle w:val="ref"/>
-        <w:spacing w:before="0" w:beforeAutospacing="0" w:after="120"/>
-      </w:pPr>
-      <w:r>
-        <w:t xml:space="preserve">[26] C. Grosan and A. Abraham, "Rule-based expert systems," in </w:t>
-      </w:r>
-      <w:r>
-        <w:rPr>
-          <w:i/>
-          <w:iCs/>
-        </w:rPr>
-        <w:t>Intelligent Systems: A Modern Approach</w:t>
-      </w:r>
-      <w:r>
-        <w:t>. Berlin, Germany: Springer, 2011, pp. 149-185.</w:t>
-      </w:r>
-    </w:p>
-    <w:p>
-      <w:pPr>
-        <w:pStyle w:val="ref"/>
-        <w:spacing w:before="0" w:beforeAutospacing="0" w:after="120"/>
-      </w:pPr>
-      <w:r>
-        <w:lastRenderedPageBreak/>
-        <w:t xml:space="preserve">[27] A. Abraham, "Rule-based expert systems," in </w:t>
-      </w:r>
-      <w:r>
-        <w:rPr>
-          <w:i/>
-          <w:iCs/>
-        </w:rPr>
-        <w:t>Handbook of Measuring System Design</w:t>
-      </w:r>
-      <w:r>
-        <w:t>, P. H. Sydenham and R. Thorn, Eds. Chichester, U.K.: Wiley, 2005.</w:t>
-      </w:r>
-    </w:p>
-    <w:p>
-      <w:pPr>
-        <w:pStyle w:val="ref"/>
-        <w:spacing w:before="0" w:beforeAutospacing="0" w:after="120"/>
-      </w:pPr>
-      <w:r>
-        <w:t xml:space="preserve">[28] W. J. Clancey, "The epistemology of a rule-based expert system - A framework for explanation," </w:t>
-      </w:r>
-      <w:r>
-        <w:rPr>
-          <w:i/>
-          <w:iCs/>
-        </w:rPr>
-        <w:t>Artificial Intelligence</w:t>
-      </w:r>
-      <w:r>
-        <w:t>, vol. 20, no. 3, pp. 215-251, 1983.</w:t>
-      </w:r>
-    </w:p>
-    <w:p>
-      <w:pPr>
         <w:pStyle w:val="Heading1"/>
         <w:rPr>
           <w:rFonts w:eastAsia="Times New Roman"/>
@@ -33243,7 +33187,7 @@
         </w:rPr>
         <w:br w:type="page"/>
       </w:r>
-      <w:bookmarkStart w:id="42" w:name="_Toc241603538"/>
+      <w:bookmarkStart w:id="42" w:name="_Toc241604166"/>
       <w:r>
         <w:rPr>
           <w:rFonts w:eastAsia="Times New Roman"/>
@@ -46453,7 +46397,7 @@
         </w:rPr>
         <w:br w:type="page"/>
       </w:r>
-      <w:bookmarkStart w:id="43" w:name="_Toc241603539"/>
+      <w:bookmarkStart w:id="43" w:name="_Toc241604167"/>
       <w:r>
         <w:rPr>
           <w:rFonts w:eastAsia="Times New Roman"/>
@@ -46935,7 +46879,7 @@
           <w:rFonts w:eastAsia="Times New Roman"/>
         </w:rPr>
       </w:pPr>
-      <w:bookmarkStart w:id="44" w:name="_Toc241603540"/>
+      <w:bookmarkStart w:id="44" w:name="_Toc241604168"/>
       <w:r>
         <w:rPr>
           <w:rFonts w:eastAsia="Times New Roman"/>
@@ -47447,9 +47391,122 @@
 <file path=word/numbering.xml><?xml version="1.0" encoding="utf-8"?>
 <w:numbering xmlns:wpc="http://schemas.microsoft.com/office/word/2010/wordprocessingCanvas" xmlns:cx="http://schemas.microsoft.com/office/drawing/2014/chartex" xmlns:cx1="http://schemas.microsoft.com/office/drawing/2015/9/8/chartex" xmlns:cx2="http://schemas.microsoft.com/office/drawing/2015/10/21/chartex" xmlns:cx3="http://schemas.microsoft.com/office/drawing/2016/5/9/chartex" xmlns:cx4="http://schemas.microsoft.com/office/drawing/2016/5/10/chartex" xmlns:cx5="http://schemas.microsoft.com/office/drawing/2016/5/11/chartex" xmlns:cx6="http://schemas.microsoft.com/office/drawing/2016/5/12/chartex" xmlns:cx7="http://schemas.microsoft.com/office/drawing/2016/5/13/chartex" xmlns:cx8="http://schemas.microsoft.com/office/drawing/2016/5/14/chartex" xmlns:mc="http://schemas.openxmlformats.org/markup-compatibility/2006" xmlns:aink="http://schemas.microsoft.com/office/drawing/2016/ink" xmlns:am3d="http://schemas.microsoft.com/office/drawing/2017/model3d" xmlns:o="urn:schemas-microsoft-com:office:office" xmlns:oel="http://schemas.microsoft.com/office/2019/extlst" xmlns:r="http://schemas.openxmlformats.org/officeDocument/2006/relationships" xmlns:m="http://schemas.openxmlformats.org/officeDocument/2006/math" xmlns:v="urn:schemas-microsoft-com:vml" xmlns:wp14="http://schemas.microsoft.com/office/word/2010/wordprocessingDrawing" xmlns:wp="http://schemas.openxmlformats.org/drawingml/2006/wordprocessingDrawing" xmlns:w10="urn:schemas-microsoft-com:office:word" xmlns:w="http://schemas.openxmlformats.org/wordprocessingml/2006/main" xmlns:w14="http://schemas.microsoft.com/office/word/2010/wordml" xmlns:w15="http://schemas.microsoft.com/office/word/2012/wordml" xmlns:w16cex="http://schemas.microsoft.com/office/word/2018/wordml/cex" xmlns:w16cid="http://schemas.microsoft.com/office/word/2016/wordml/cid" xmlns:w16="http://schemas.microsoft.com/office/word/2018/wordml" xmlns:w16du="http://schemas.microsoft.com/office/word/2023/wordml/word16du" xmlns:w16sdtdh="http://schemas.microsoft.com/office/word/2020/wordml/sdtdatahash" xmlns:w16sdtfl="http://schemas.microsoft.com/office/word/2024/wordml/sdtformatlock" xmlns:w16se="http://schemas.microsoft.com/office/word/2015/wordml/symex" xmlns:wpg="http://schemas.microsoft.com/office/word/2010/wordprocessingGroup" xmlns:wpi="http://schemas.microsoft.com/office/word/2010/wordprocessingInk" xmlns:wne="http://schemas.microsoft.com/office/word/2006/wordml" xmlns:wps="http://schemas.microsoft.com/office/word/2010/wordprocessingShape" mc:Ignorable="w14 w15 w16se w16cid w16 w16cex w16sdtdh w16sdtfl w16du wp14">
   <w:abstractNum w:abstractNumId="0" w15:restartNumberingAfterBreak="0">
-    <w:nsid w:val="067575EA"/>
+    <w:nsid w:val="0C652C08"/>
     <w:multiLevelType w:val="multilevel"/>
-    <w:tmpl w:val="ADE84968"/>
+    <w:tmpl w:val="C25E0E64"/>
+    <w:lvl w:ilvl="0">
+      <w:start w:val="1"/>
+      <w:numFmt w:val="decimal"/>
+      <w:lvlText w:val="%1."/>
+      <w:lvlJc w:val="left"/>
+      <w:pPr>
+        <w:tabs>
+          <w:tab w:val="num" w:pos="720"/>
+        </w:tabs>
+        <w:ind w:left="720" w:hanging="360"/>
+      </w:pPr>
+    </w:lvl>
+    <w:lvl w:ilvl="1" w:tentative="1">
+      <w:start w:val="1"/>
+      <w:numFmt w:val="decimal"/>
+      <w:lvlText w:val="%2."/>
+      <w:lvlJc w:val="left"/>
+      <w:pPr>
+        <w:tabs>
+          <w:tab w:val="num" w:pos="1440"/>
+        </w:tabs>
+        <w:ind w:left="1440" w:hanging="360"/>
+      </w:pPr>
+    </w:lvl>
+    <w:lvl w:ilvl="2" w:tentative="1">
+      <w:start w:val="1"/>
+      <w:numFmt w:val="decimal"/>
+      <w:lvlText w:val="%3."/>
+      <w:lvlJc w:val="left"/>
+      <w:pPr>
+        <w:tabs>
+          <w:tab w:val="num" w:pos="2160"/>
+        </w:tabs>
+        <w:ind w:left="2160" w:hanging="360"/>
+      </w:pPr>
+    </w:lvl>
+    <w:lvl w:ilvl="3" w:tentative="1">
+      <w:start w:val="1"/>
+      <w:numFmt w:val="decimal"/>
+      <w:lvlText w:val="%4."/>
+      <w:lvlJc w:val="left"/>
+      <w:pPr>
+        <w:tabs>
+          <w:tab w:val="num" w:pos="2880"/>
+        </w:tabs>
+        <w:ind w:left="2880" w:hanging="360"/>
+      </w:pPr>
+    </w:lvl>
+    <w:lvl w:ilvl="4" w:tentative="1">
+      <w:start w:val="1"/>
+      <w:numFmt w:val="decimal"/>
+      <w:lvlText w:val="%5."/>
+      <w:lvlJc w:val="left"/>
+      <w:pPr>
+        <w:tabs>
+          <w:tab w:val="num" w:pos="3600"/>
+        </w:tabs>
+        <w:ind w:left="3600" w:hanging="360"/>
+      </w:pPr>
+    </w:lvl>
+    <w:lvl w:ilvl="5" w:tentative="1">
+      <w:start w:val="1"/>
+      <w:numFmt w:val="decimal"/>
+      <w:lvlText w:val="%6."/>
+      <w:lvlJc w:val="left"/>
+      <w:pPr>
+        <w:tabs>
+          <w:tab w:val="num" w:pos="4320"/>
+        </w:tabs>
+        <w:ind w:left="4320" w:hanging="360"/>
+      </w:pPr>
+    </w:lvl>
+    <w:lvl w:ilvl="6" w:tentative="1">
+      <w:start w:val="1"/>
+      <w:numFmt w:val="decimal"/>
+      <w:lvlText w:val="%7."/>
+      <w:lvlJc w:val="left"/>
+      <w:pPr>
+        <w:tabs>
+          <w:tab w:val="num" w:pos="5040"/>
+        </w:tabs>
+        <w:ind w:left="5040" w:hanging="360"/>
+      </w:pPr>
+    </w:lvl>
+    <w:lvl w:ilvl="7" w:tentative="1">
+      <w:start w:val="1"/>
+      <w:numFmt w:val="decimal"/>
+      <w:lvlText w:val="%8."/>
+      <w:lvlJc w:val="left"/>
+      <w:pPr>
+        <w:tabs>
+          <w:tab w:val="num" w:pos="5760"/>
+        </w:tabs>
+        <w:ind w:left="5760" w:hanging="360"/>
+      </w:pPr>
+    </w:lvl>
+    <w:lvl w:ilvl="8" w:tentative="1">
+      <w:start w:val="1"/>
+      <w:numFmt w:val="decimal"/>
+      <w:lvlText w:val="%9."/>
+      <w:lvlJc w:val="left"/>
+      <w:pPr>
+        <w:tabs>
+          <w:tab w:val="num" w:pos="6480"/>
+        </w:tabs>
+        <w:ind w:left="6480" w:hanging="360"/>
+      </w:pPr>
+    </w:lvl>
+  </w:abstractNum>
+  <w:abstractNum w:abstractNumId="1" w15:restartNumberingAfterBreak="0">
+    <w:nsid w:val="1402556E"/>
+    <w:multiLevelType w:val="multilevel"/>
+    <w:tmpl w:val="445497E2"/>
     <w:lvl w:ilvl="0">
       <w:start w:val="1"/>
       <w:numFmt w:val="bullet"/>
@@ -47595,10 +47652,10 @@
       </w:rPr>
     </w:lvl>
   </w:abstractNum>
-  <w:abstractNum w:abstractNumId="1" w15:restartNumberingAfterBreak="0">
-    <w:nsid w:val="0B8D49A8"/>
+  <w:abstractNum w:abstractNumId="2" w15:restartNumberingAfterBreak="0">
+    <w:nsid w:val="33B736AF"/>
     <w:multiLevelType w:val="multilevel"/>
-    <w:tmpl w:val="AF98F57E"/>
+    <w:tmpl w:val="33022EDE"/>
     <w:lvl w:ilvl="0">
       <w:start w:val="1"/>
       <w:numFmt w:val="decimal"/>
@@ -47708,10 +47765,10 @@
       </w:pPr>
     </w:lvl>
   </w:abstractNum>
-  <w:abstractNum w:abstractNumId="2" w15:restartNumberingAfterBreak="0">
-    <w:nsid w:val="197B4392"/>
+  <w:abstractNum w:abstractNumId="3" w15:restartNumberingAfterBreak="0">
+    <w:nsid w:val="3C7C1914"/>
     <w:multiLevelType w:val="multilevel"/>
-    <w:tmpl w:val="FA4C020C"/>
+    <w:tmpl w:val="B1A46A02"/>
     <w:lvl w:ilvl="0">
       <w:start w:val="1"/>
       <w:numFmt w:val="bullet"/>
@@ -47857,10 +47914,10 @@
       </w:rPr>
     </w:lvl>
   </w:abstractNum>
-  <w:abstractNum w:abstractNumId="3" w15:restartNumberingAfterBreak="0">
-    <w:nsid w:val="212302DD"/>
+  <w:abstractNum w:abstractNumId="4" w15:restartNumberingAfterBreak="0">
+    <w:nsid w:val="56BB1B36"/>
     <w:multiLevelType w:val="multilevel"/>
-    <w:tmpl w:val="18327E7E"/>
+    <w:tmpl w:val="53EAC6AA"/>
     <w:lvl w:ilvl="0">
       <w:start w:val="1"/>
       <w:numFmt w:val="bullet"/>
@@ -48006,10 +48063,10 @@
       </w:rPr>
     </w:lvl>
   </w:abstractNum>
-  <w:abstractNum w:abstractNumId="4" w15:restartNumberingAfterBreak="0">
-    <w:nsid w:val="55FC7673"/>
+  <w:abstractNum w:abstractNumId="5" w15:restartNumberingAfterBreak="0">
+    <w:nsid w:val="573976BB"/>
     <w:multiLevelType w:val="multilevel"/>
-    <w:tmpl w:val="F5FEB320"/>
+    <w:tmpl w:val="69D6C1EA"/>
     <w:lvl w:ilvl="0">
       <w:start w:val="1"/>
       <w:numFmt w:val="bullet"/>
@@ -48155,123 +48212,10 @@
       </w:rPr>
     </w:lvl>
   </w:abstractNum>
-  <w:abstractNum w:abstractNumId="5" w15:restartNumberingAfterBreak="0">
-    <w:nsid w:val="6413790C"/>
+  <w:abstractNum w:abstractNumId="6" w15:restartNumberingAfterBreak="0">
+    <w:nsid w:val="73C81CB7"/>
     <w:multiLevelType w:val="multilevel"/>
-    <w:tmpl w:val="105E2C4E"/>
-    <w:lvl w:ilvl="0">
-      <w:start w:val="1"/>
-      <w:numFmt w:val="decimal"/>
-      <w:lvlText w:val="%1."/>
-      <w:lvlJc w:val="left"/>
-      <w:pPr>
-        <w:tabs>
-          <w:tab w:val="num" w:pos="720"/>
-        </w:tabs>
-        <w:ind w:left="720" w:hanging="360"/>
-      </w:pPr>
-    </w:lvl>
-    <w:lvl w:ilvl="1" w:tentative="1">
-      <w:start w:val="1"/>
-      <w:numFmt w:val="decimal"/>
-      <w:lvlText w:val="%2."/>
-      <w:lvlJc w:val="left"/>
-      <w:pPr>
-        <w:tabs>
-          <w:tab w:val="num" w:pos="1440"/>
-        </w:tabs>
-        <w:ind w:left="1440" w:hanging="360"/>
-      </w:pPr>
-    </w:lvl>
-    <w:lvl w:ilvl="2" w:tentative="1">
-      <w:start w:val="1"/>
-      <w:numFmt w:val="decimal"/>
-      <w:lvlText w:val="%3."/>
-      <w:lvlJc w:val="left"/>
-      <w:pPr>
-        <w:tabs>
-          <w:tab w:val="num" w:pos="2160"/>
-        </w:tabs>
-        <w:ind w:left="2160" w:hanging="360"/>
-      </w:pPr>
-    </w:lvl>
-    <w:lvl w:ilvl="3" w:tentative="1">
-      <w:start w:val="1"/>
-      <w:numFmt w:val="decimal"/>
-      <w:lvlText w:val="%4."/>
-      <w:lvlJc w:val="left"/>
-      <w:pPr>
-        <w:tabs>
-          <w:tab w:val="num" w:pos="2880"/>
-        </w:tabs>
-        <w:ind w:left="2880" w:hanging="360"/>
-      </w:pPr>
-    </w:lvl>
-    <w:lvl w:ilvl="4" w:tentative="1">
-      <w:start w:val="1"/>
-      <w:numFmt w:val="decimal"/>
-      <w:lvlText w:val="%5."/>
-      <w:lvlJc w:val="left"/>
-      <w:pPr>
-        <w:tabs>
-          <w:tab w:val="num" w:pos="3600"/>
-        </w:tabs>
-        <w:ind w:left="3600" w:hanging="360"/>
-      </w:pPr>
-    </w:lvl>
-    <w:lvl w:ilvl="5" w:tentative="1">
-      <w:start w:val="1"/>
-      <w:numFmt w:val="decimal"/>
-      <w:lvlText w:val="%6."/>
-      <w:lvlJc w:val="left"/>
-      <w:pPr>
-        <w:tabs>
-          <w:tab w:val="num" w:pos="4320"/>
-        </w:tabs>
-        <w:ind w:left="4320" w:hanging="360"/>
-      </w:pPr>
-    </w:lvl>
-    <w:lvl w:ilvl="6" w:tentative="1">
-      <w:start w:val="1"/>
-      <w:numFmt w:val="decimal"/>
-      <w:lvlText w:val="%7."/>
-      <w:lvlJc w:val="left"/>
-      <w:pPr>
-        <w:tabs>
-          <w:tab w:val="num" w:pos="5040"/>
-        </w:tabs>
-        <w:ind w:left="5040" w:hanging="360"/>
-      </w:pPr>
-    </w:lvl>
-    <w:lvl w:ilvl="7" w:tentative="1">
-      <w:start w:val="1"/>
-      <w:numFmt w:val="decimal"/>
-      <w:lvlText w:val="%8."/>
-      <w:lvlJc w:val="left"/>
-      <w:pPr>
-        <w:tabs>
-          <w:tab w:val="num" w:pos="5760"/>
-        </w:tabs>
-        <w:ind w:left="5760" w:hanging="360"/>
-      </w:pPr>
-    </w:lvl>
-    <w:lvl w:ilvl="8" w:tentative="1">
-      <w:start w:val="1"/>
-      <w:numFmt w:val="decimal"/>
-      <w:lvlText w:val="%9."/>
-      <w:lvlJc w:val="left"/>
-      <w:pPr>
-        <w:tabs>
-          <w:tab w:val="num" w:pos="6480"/>
-        </w:tabs>
-        <w:ind w:left="6480" w:hanging="360"/>
-      </w:pPr>
-    </w:lvl>
-  </w:abstractNum>
-  <w:abstractNum w:abstractNumId="6" w15:restartNumberingAfterBreak="0">
-    <w:nsid w:val="643801DE"/>
-    <w:multiLevelType w:val="multilevel"/>
-    <w:tmpl w:val="7F3202B2"/>
+    <w:tmpl w:val="9BF0E9F2"/>
     <w:lvl w:ilvl="0">
       <w:start w:val="1"/>
       <w:numFmt w:val="bullet"/>
@@ -48417,26 +48361,26 @@
       </w:rPr>
     </w:lvl>
   </w:abstractNum>
-  <w:num w:numId="1" w16cid:durableId="1109281517">
+  <w:num w:numId="1" w16cid:durableId="1197737578">
+    <w:abstractNumId w:val="0"/>
+  </w:num>
+  <w:num w:numId="2" w16cid:durableId="421533471">
     <w:abstractNumId w:val="1"/>
   </w:num>
-  <w:num w:numId="2" w16cid:durableId="1125582216">
-    <w:abstractNumId w:val="4"/>
+  <w:num w:numId="3" w16cid:durableId="536478458">
+    <w:abstractNumId w:val="2"/>
   </w:num>
-  <w:num w:numId="3" w16cid:durableId="233667251">
+  <w:num w:numId="4" w16cid:durableId="1296064667">
+    <w:abstractNumId w:val="6"/>
+  </w:num>
+  <w:num w:numId="5" w16cid:durableId="1809781023">
     <w:abstractNumId w:val="5"/>
   </w:num>
-  <w:num w:numId="4" w16cid:durableId="1423913093">
-    <w:abstractNumId w:val="0"/>
-  </w:num>
-  <w:num w:numId="5" w16cid:durableId="513962124">
+  <w:num w:numId="6" w16cid:durableId="789006729">
     <w:abstractNumId w:val="3"/>
   </w:num>
-  <w:num w:numId="6" w16cid:durableId="37977515">
-    <w:abstractNumId w:val="2"/>
-  </w:num>
-  <w:num w:numId="7" w16cid:durableId="1844202084">
-    <w:abstractNumId w:val="6"/>
+  <w:num w:numId="7" w16cid:durableId="2019229696">
+    <w:abstractNumId w:val="4"/>
   </w:num>
 </w:numbering>
 </file>
@@ -49193,7 +49137,7 @@
     <w:link w:val="HeaderChar"/>
     <w:uiPriority w:val="99"/>
     <w:unhideWhenUsed/>
-    <w:rsid w:val="00FB7031"/>
+    <w:rsid w:val="00AF0EC4"/>
     <w:pPr>
       <w:tabs>
         <w:tab w:val="center" w:pos="4680"/>
@@ -49206,7 +49150,7 @@
     <w:basedOn w:val="DefaultParagraphFont"/>
     <w:link w:val="Header"/>
     <w:uiPriority w:val="99"/>
-    <w:rsid w:val="00FB7031"/>
+    <w:rsid w:val="00AF0EC4"/>
     <w:rPr>
       <w:rFonts w:eastAsiaTheme="minorEastAsia"/>
       <w:sz w:val="24"/>
@@ -49219,7 +49163,7 @@
     <w:link w:val="FooterChar"/>
     <w:uiPriority w:val="99"/>
     <w:unhideWhenUsed/>
-    <w:rsid w:val="00FB7031"/>
+    <w:rsid w:val="00AF0EC4"/>
     <w:pPr>
       <w:tabs>
         <w:tab w:val="center" w:pos="4680"/>
@@ -49232,7 +49176,7 @@
     <w:basedOn w:val="DefaultParagraphFont"/>
     <w:link w:val="Footer"/>
     <w:uiPriority w:val="99"/>
-    <w:rsid w:val="00FB7031"/>
+    <w:rsid w:val="00AF0EC4"/>
     <w:rPr>
       <w:rFonts w:eastAsiaTheme="minorEastAsia"/>
       <w:sz w:val="24"/>
@@ -49245,7 +49189,7 @@
     <w:uiPriority w:val="99"/>
     <w:semiHidden/>
     <w:unhideWhenUsed/>
-    <w:rsid w:val="00FB7031"/>
+    <w:rsid w:val="00AF0EC4"/>
   </w:style>
   <w:style w:type="character" w:styleId="Hyperlink">
     <w:name w:val="Hyperlink"/>
@@ -49253,7 +49197,7 @@
     <w:uiPriority w:val="99"/>
     <w:semiHidden/>
     <w:unhideWhenUsed/>
-    <w:rsid w:val="00FB7031"/>
+    <w:rsid w:val="00AF0EC4"/>
     <w:rPr>
       <w:color w:val="auto"/>
       <w:u w:val="single"/>
@@ -49266,7 +49210,7 @@
     <w:autoRedefine/>
     <w:uiPriority w:val="39"/>
     <w:unhideWhenUsed/>
-    <w:rsid w:val="00FB7031"/>
+    <w:rsid w:val="00AF0EC4"/>
     <w:pPr>
       <w:spacing w:after="100" w:line="360" w:lineRule="auto"/>
     </w:pPr>
@@ -49278,7 +49222,7 @@
     <w:autoRedefine/>
     <w:uiPriority w:val="39"/>
     <w:unhideWhenUsed/>
-    <w:rsid w:val="00FB7031"/>
+    <w:rsid w:val="00AF0EC4"/>
     <w:pPr>
       <w:spacing w:after="100" w:line="360" w:lineRule="auto"/>
       <w:ind w:left="240"/>
@@ -49292,7 +49236,7 @@
     <w:uiPriority w:val="39"/>
     <w:semiHidden/>
     <w:unhideWhenUsed/>
-    <w:rsid w:val="00FB7031"/>
+    <w:rsid w:val="00AF0EC4"/>
     <w:pPr>
       <w:spacing w:after="100" w:line="360" w:lineRule="auto"/>
       <w:ind w:left="480"/>

</xml_diff>

<commit_message>
Clear startup instructions; online and ZIP download instructions in the manual
</commit_message>
<xml_diff>
--- a/gem_expert/docs/Gemstone_Identification_Assistant_Report.docx
+++ b/gem_expert/docs/Gemstone_Identification_Assistant_Report.docx
@@ -145,7 +145,7 @@
         </w:rPr>
         <w:br w:type="page"/>
       </w:r>
-      <w:bookmarkStart w:id="0" w:name="_Toc241604124"/>
+      <w:bookmarkStart w:id="0" w:name="_Toc241606723"/>
       <w:r>
         <w:rPr>
           <w:rFonts w:eastAsia="Times New Roman"/>
@@ -285,7 +285,7 @@
         <w:rPr>
           <w:noProof/>
         </w:rPr>
-        <w:instrText xml:space="preserve"> PAGEREF _Toc241604124 \h </w:instrText>
+        <w:instrText xml:space="preserve"> PAGEREF _Toc241606723 \h </w:instrText>
       </w:r>
       <w:r>
         <w:rPr>
@@ -347,7 +347,7 @@
         <w:rPr>
           <w:noProof/>
         </w:rPr>
-        <w:instrText xml:space="preserve"> PAGEREF _Toc241604125 \h </w:instrText>
+        <w:instrText xml:space="preserve"> PAGEREF _Toc241606724 \h </w:instrText>
       </w:r>
       <w:r>
         <w:rPr>
@@ -409,7 +409,7 @@
         <w:rPr>
           <w:noProof/>
         </w:rPr>
-        <w:instrText xml:space="preserve"> PAGEREF _Toc241604126 \h </w:instrText>
+        <w:instrText xml:space="preserve"> PAGEREF _Toc241606725 \h </w:instrText>
       </w:r>
       <w:r>
         <w:rPr>
@@ -471,7 +471,7 @@
         <w:rPr>
           <w:noProof/>
         </w:rPr>
-        <w:instrText xml:space="preserve"> PAGEREF _Toc241604127 \h </w:instrText>
+        <w:instrText xml:space="preserve"> PAGEREF _Toc241606726 \h </w:instrText>
       </w:r>
       <w:r>
         <w:rPr>
@@ -533,7 +533,7 @@
         <w:rPr>
           <w:noProof/>
         </w:rPr>
-        <w:instrText xml:space="preserve"> PAGEREF _Toc241604128 \h </w:instrText>
+        <w:instrText xml:space="preserve"> PAGEREF _Toc241606727 \h </w:instrText>
       </w:r>
       <w:r>
         <w:rPr>
@@ -595,7 +595,7 @@
         <w:rPr>
           <w:noProof/>
         </w:rPr>
-        <w:instrText xml:space="preserve"> PAGEREF _Toc241604129 \h </w:instrText>
+        <w:instrText xml:space="preserve"> PAGEREF _Toc241606728 \h </w:instrText>
       </w:r>
       <w:r>
         <w:rPr>
@@ -657,7 +657,7 @@
         <w:rPr>
           <w:noProof/>
         </w:rPr>
-        <w:instrText xml:space="preserve"> PAGEREF _Toc241604130 \h </w:instrText>
+        <w:instrText xml:space="preserve"> PAGEREF _Toc241606729 \h </w:instrText>
       </w:r>
       <w:r>
         <w:rPr>
@@ -719,7 +719,7 @@
         <w:rPr>
           <w:noProof/>
         </w:rPr>
-        <w:instrText xml:space="preserve"> PAGEREF _Toc241604131 \h </w:instrText>
+        <w:instrText xml:space="preserve"> PAGEREF _Toc241606730 \h </w:instrText>
       </w:r>
       <w:r>
         <w:rPr>
@@ -781,7 +781,7 @@
         <w:rPr>
           <w:noProof/>
         </w:rPr>
-        <w:instrText xml:space="preserve"> PAGEREF _Toc241604132 \h </w:instrText>
+        <w:instrText xml:space="preserve"> PAGEREF _Toc241606731 \h </w:instrText>
       </w:r>
       <w:r>
         <w:rPr>
@@ -843,7 +843,7 @@
         <w:rPr>
           <w:noProof/>
         </w:rPr>
-        <w:instrText xml:space="preserve"> PAGEREF _Toc241604133 \h </w:instrText>
+        <w:instrText xml:space="preserve"> PAGEREF _Toc241606732 \h </w:instrText>
       </w:r>
       <w:r>
         <w:rPr>
@@ -905,7 +905,7 @@
         <w:rPr>
           <w:noProof/>
         </w:rPr>
-        <w:instrText xml:space="preserve"> PAGEREF _Toc241604134 \h </w:instrText>
+        <w:instrText xml:space="preserve"> PAGEREF _Toc241606733 \h </w:instrText>
       </w:r>
       <w:r>
         <w:rPr>
@@ -967,7 +967,7 @@
         <w:rPr>
           <w:noProof/>
         </w:rPr>
-        <w:instrText xml:space="preserve"> PAGEREF _Toc241604135 \h </w:instrText>
+        <w:instrText xml:space="preserve"> PAGEREF _Toc241606734 \h </w:instrText>
       </w:r>
       <w:r>
         <w:rPr>
@@ -1029,7 +1029,7 @@
         <w:rPr>
           <w:noProof/>
         </w:rPr>
-        <w:instrText xml:space="preserve"> PAGEREF _Toc241604136 \h </w:instrText>
+        <w:instrText xml:space="preserve"> PAGEREF _Toc241606735 \h </w:instrText>
       </w:r>
       <w:r>
         <w:rPr>
@@ -1091,7 +1091,7 @@
         <w:rPr>
           <w:noProof/>
         </w:rPr>
-        <w:instrText xml:space="preserve"> PAGEREF _Toc241604137 \h </w:instrText>
+        <w:instrText xml:space="preserve"> PAGEREF _Toc241606736 \h </w:instrText>
       </w:r>
       <w:r>
         <w:rPr>
@@ -1153,7 +1153,7 @@
         <w:rPr>
           <w:noProof/>
         </w:rPr>
-        <w:instrText xml:space="preserve"> PAGEREF _Toc241604138 \h </w:instrText>
+        <w:instrText xml:space="preserve"> PAGEREF _Toc241606737 \h </w:instrText>
       </w:r>
       <w:r>
         <w:rPr>
@@ -1215,7 +1215,7 @@
         <w:rPr>
           <w:noProof/>
         </w:rPr>
-        <w:instrText xml:space="preserve"> PAGEREF _Toc241604139 \h </w:instrText>
+        <w:instrText xml:space="preserve"> PAGEREF _Toc241606738 \h </w:instrText>
       </w:r>
       <w:r>
         <w:rPr>
@@ -1277,7 +1277,7 @@
         <w:rPr>
           <w:noProof/>
         </w:rPr>
-        <w:instrText xml:space="preserve"> PAGEREF _Toc241604140 \h </w:instrText>
+        <w:instrText xml:space="preserve"> PAGEREF _Toc241606739 \h </w:instrText>
       </w:r>
       <w:r>
         <w:rPr>
@@ -1339,7 +1339,7 @@
         <w:rPr>
           <w:noProof/>
         </w:rPr>
-        <w:instrText xml:space="preserve"> PAGEREF _Toc241604141 \h </w:instrText>
+        <w:instrText xml:space="preserve"> PAGEREF _Toc241606740 \h </w:instrText>
       </w:r>
       <w:r>
         <w:rPr>
@@ -1401,7 +1401,7 @@
         <w:rPr>
           <w:noProof/>
         </w:rPr>
-        <w:instrText xml:space="preserve"> PAGEREF _Toc241604142 \h </w:instrText>
+        <w:instrText xml:space="preserve"> PAGEREF _Toc241606741 \h </w:instrText>
       </w:r>
       <w:r>
         <w:rPr>
@@ -1463,7 +1463,7 @@
         <w:rPr>
           <w:noProof/>
         </w:rPr>
-        <w:instrText xml:space="preserve"> PAGEREF _Toc241604143 \h </w:instrText>
+        <w:instrText xml:space="preserve"> PAGEREF _Toc241606742 \h </w:instrText>
       </w:r>
       <w:r>
         <w:rPr>
@@ -1525,7 +1525,7 @@
         <w:rPr>
           <w:noProof/>
         </w:rPr>
-        <w:instrText xml:space="preserve"> PAGEREF _Toc241604144 \h </w:instrText>
+        <w:instrText xml:space="preserve"> PAGEREF _Toc241606743 \h </w:instrText>
       </w:r>
       <w:r>
         <w:rPr>
@@ -1587,7 +1587,7 @@
         <w:rPr>
           <w:noProof/>
         </w:rPr>
-        <w:instrText xml:space="preserve"> PAGEREF _Toc241604145 \h </w:instrText>
+        <w:instrText xml:space="preserve"> PAGEREF _Toc241606744 \h </w:instrText>
       </w:r>
       <w:r>
         <w:rPr>
@@ -1649,7 +1649,7 @@
         <w:rPr>
           <w:noProof/>
         </w:rPr>
-        <w:instrText xml:space="preserve"> PAGEREF _Toc241604146 \h </w:instrText>
+        <w:instrText xml:space="preserve"> PAGEREF _Toc241606745 \h </w:instrText>
       </w:r>
       <w:r>
         <w:rPr>
@@ -1666,7 +1666,7 @@
         <w:rPr>
           <w:noProof/>
         </w:rPr>
-        <w:t>28</w:t>
+        <w:t>29</w:t>
       </w:r>
       <w:r>
         <w:rPr>
@@ -1711,7 +1711,7 @@
         <w:rPr>
           <w:noProof/>
         </w:rPr>
-        <w:instrText xml:space="preserve"> PAGEREF _Toc241604147 \h </w:instrText>
+        <w:instrText xml:space="preserve"> PAGEREF _Toc241606746 \h </w:instrText>
       </w:r>
       <w:r>
         <w:rPr>
@@ -1728,7 +1728,7 @@
         <w:rPr>
           <w:noProof/>
         </w:rPr>
-        <w:t>28</w:t>
+        <w:t>29</w:t>
       </w:r>
       <w:r>
         <w:rPr>
@@ -1773,7 +1773,7 @@
         <w:rPr>
           <w:noProof/>
         </w:rPr>
-        <w:instrText xml:space="preserve"> PAGEREF _Toc241604148 \h </w:instrText>
+        <w:instrText xml:space="preserve"> PAGEREF _Toc241606747 \h </w:instrText>
       </w:r>
       <w:r>
         <w:rPr>
@@ -1790,7 +1790,7 @@
         <w:rPr>
           <w:noProof/>
         </w:rPr>
-        <w:t>28</w:t>
+        <w:t>29</w:t>
       </w:r>
       <w:r>
         <w:rPr>
@@ -1835,7 +1835,7 @@
         <w:rPr>
           <w:noProof/>
         </w:rPr>
-        <w:instrText xml:space="preserve"> PAGEREF _Toc241604149 \h </w:instrText>
+        <w:instrText xml:space="preserve"> PAGEREF _Toc241606748 \h </w:instrText>
       </w:r>
       <w:r>
         <w:rPr>
@@ -1852,7 +1852,7 @@
         <w:rPr>
           <w:noProof/>
         </w:rPr>
-        <w:t>30</w:t>
+        <w:t>31</w:t>
       </w:r>
       <w:r>
         <w:rPr>
@@ -1898,7 +1898,7 @@
         <w:rPr>
           <w:noProof/>
         </w:rPr>
-        <w:instrText xml:space="preserve"> PAGEREF _Toc241604150 \h </w:instrText>
+        <w:instrText xml:space="preserve"> PAGEREF _Toc241606749 \h </w:instrText>
       </w:r>
       <w:r>
         <w:rPr>
@@ -1915,7 +1915,7 @@
         <w:rPr>
           <w:noProof/>
         </w:rPr>
-        <w:t>31</w:t>
+        <w:t>32</w:t>
       </w:r>
       <w:r>
         <w:rPr>
@@ -1960,7 +1960,7 @@
         <w:rPr>
           <w:noProof/>
         </w:rPr>
-        <w:instrText xml:space="preserve"> PAGEREF _Toc241604151 \h </w:instrText>
+        <w:instrText xml:space="preserve"> PAGEREF _Toc241606750 \h </w:instrText>
       </w:r>
       <w:r>
         <w:rPr>
@@ -1977,7 +1977,7 @@
         <w:rPr>
           <w:noProof/>
         </w:rPr>
-        <w:t>32</w:t>
+        <w:t>33</w:t>
       </w:r>
       <w:r>
         <w:rPr>
@@ -2022,7 +2022,7 @@
         <w:rPr>
           <w:noProof/>
         </w:rPr>
-        <w:instrText xml:space="preserve"> PAGEREF _Toc241604152 \h </w:instrText>
+        <w:instrText xml:space="preserve"> PAGEREF _Toc241606751 \h </w:instrText>
       </w:r>
       <w:r>
         <w:rPr>
@@ -2039,7 +2039,7 @@
         <w:rPr>
           <w:noProof/>
         </w:rPr>
-        <w:t>33</w:t>
+        <w:t>34</w:t>
       </w:r>
       <w:r>
         <w:rPr>
@@ -2084,7 +2084,7 @@
         <w:rPr>
           <w:noProof/>
         </w:rPr>
-        <w:instrText xml:space="preserve"> PAGEREF _Toc241604153 \h </w:instrText>
+        <w:instrText xml:space="preserve"> PAGEREF _Toc241606752 \h </w:instrText>
       </w:r>
       <w:r>
         <w:rPr>
@@ -2101,7 +2101,7 @@
         <w:rPr>
           <w:noProof/>
         </w:rPr>
-        <w:t>33</w:t>
+        <w:t>34</w:t>
       </w:r>
       <w:r>
         <w:rPr>
@@ -2146,7 +2146,7 @@
         <w:rPr>
           <w:noProof/>
         </w:rPr>
-        <w:instrText xml:space="preserve"> PAGEREF _Toc241604154 \h </w:instrText>
+        <w:instrText xml:space="preserve"> PAGEREF _Toc241606753 \h </w:instrText>
       </w:r>
       <w:r>
         <w:rPr>
@@ -2163,7 +2163,7 @@
         <w:rPr>
           <w:noProof/>
         </w:rPr>
-        <w:t>33</w:t>
+        <w:t>34</w:t>
       </w:r>
       <w:r>
         <w:rPr>
@@ -2208,7 +2208,7 @@
         <w:rPr>
           <w:noProof/>
         </w:rPr>
-        <w:instrText xml:space="preserve"> PAGEREF _Toc241604155 \h </w:instrText>
+        <w:instrText xml:space="preserve"> PAGEREF _Toc241606754 \h </w:instrText>
       </w:r>
       <w:r>
         <w:rPr>
@@ -2225,7 +2225,7 @@
         <w:rPr>
           <w:noProof/>
         </w:rPr>
-        <w:t>35</w:t>
+        <w:t>36</w:t>
       </w:r>
       <w:r>
         <w:rPr>
@@ -2270,7 +2270,7 @@
         <w:rPr>
           <w:noProof/>
         </w:rPr>
-        <w:instrText xml:space="preserve"> PAGEREF _Toc241604156 \h </w:instrText>
+        <w:instrText xml:space="preserve"> PAGEREF _Toc241606755 \h </w:instrText>
       </w:r>
       <w:r>
         <w:rPr>
@@ -2287,7 +2287,7 @@
         <w:rPr>
           <w:noProof/>
         </w:rPr>
-        <w:t>36</w:t>
+        <w:t>37</w:t>
       </w:r>
       <w:r>
         <w:rPr>
@@ -2332,7 +2332,7 @@
         <w:rPr>
           <w:noProof/>
         </w:rPr>
-        <w:instrText xml:space="preserve"> PAGEREF _Toc241604157 \h </w:instrText>
+        <w:instrText xml:space="preserve"> PAGEREF _Toc241606756 \h </w:instrText>
       </w:r>
       <w:r>
         <w:rPr>
@@ -2349,7 +2349,7 @@
         <w:rPr>
           <w:noProof/>
         </w:rPr>
-        <w:t>36</w:t>
+        <w:t>37</w:t>
       </w:r>
       <w:r>
         <w:rPr>
@@ -2394,7 +2394,7 @@
         <w:rPr>
           <w:noProof/>
         </w:rPr>
-        <w:instrText xml:space="preserve"> PAGEREF _Toc241604158 \h </w:instrText>
+        <w:instrText xml:space="preserve"> PAGEREF _Toc241606757 \h </w:instrText>
       </w:r>
       <w:r>
         <w:rPr>
@@ -2411,7 +2411,7 @@
         <w:rPr>
           <w:noProof/>
         </w:rPr>
-        <w:t>37</w:t>
+        <w:t>38</w:t>
       </w:r>
       <w:r>
         <w:rPr>
@@ -2456,7 +2456,7 @@
         <w:rPr>
           <w:noProof/>
         </w:rPr>
-        <w:instrText xml:space="preserve"> PAGEREF _Toc241604159 \h </w:instrText>
+        <w:instrText xml:space="preserve"> PAGEREF _Toc241606758 \h </w:instrText>
       </w:r>
       <w:r>
         <w:rPr>
@@ -2473,7 +2473,7 @@
         <w:rPr>
           <w:noProof/>
         </w:rPr>
-        <w:t>37</w:t>
+        <w:t>38</w:t>
       </w:r>
       <w:r>
         <w:rPr>
@@ -2518,7 +2518,7 @@
         <w:rPr>
           <w:noProof/>
         </w:rPr>
-        <w:instrText xml:space="preserve"> PAGEREF _Toc241604160 \h </w:instrText>
+        <w:instrText xml:space="preserve"> PAGEREF _Toc241606759 \h </w:instrText>
       </w:r>
       <w:r>
         <w:rPr>
@@ -2535,7 +2535,7 @@
         <w:rPr>
           <w:noProof/>
         </w:rPr>
-        <w:t>37</w:t>
+        <w:t>38</w:t>
       </w:r>
       <w:r>
         <w:rPr>
@@ -2580,7 +2580,7 @@
         <w:rPr>
           <w:noProof/>
         </w:rPr>
-        <w:instrText xml:space="preserve"> PAGEREF _Toc241604161 \h </w:instrText>
+        <w:instrText xml:space="preserve"> PAGEREF _Toc241606760 \h </w:instrText>
       </w:r>
       <w:r>
         <w:rPr>
@@ -2597,7 +2597,7 @@
         <w:rPr>
           <w:noProof/>
         </w:rPr>
-        <w:t>38</w:t>
+        <w:t>39</w:t>
       </w:r>
       <w:r>
         <w:rPr>
@@ -2642,7 +2642,7 @@
         <w:rPr>
           <w:noProof/>
         </w:rPr>
-        <w:instrText xml:space="preserve"> PAGEREF _Toc241604162 \h </w:instrText>
+        <w:instrText xml:space="preserve"> PAGEREF _Toc241606761 \h </w:instrText>
       </w:r>
       <w:r>
         <w:rPr>
@@ -2659,7 +2659,7 @@
         <w:rPr>
           <w:noProof/>
         </w:rPr>
-        <w:t>38</w:t>
+        <w:t>39</w:t>
       </w:r>
       <w:r>
         <w:rPr>
@@ -2704,7 +2704,7 @@
         <w:rPr>
           <w:noProof/>
         </w:rPr>
-        <w:instrText xml:space="preserve"> PAGEREF _Toc241604163 \h </w:instrText>
+        <w:instrText xml:space="preserve"> PAGEREF _Toc241606762 \h </w:instrText>
       </w:r>
       <w:r>
         <w:rPr>
@@ -2721,7 +2721,7 @@
         <w:rPr>
           <w:noProof/>
         </w:rPr>
-        <w:t>39</w:t>
+        <w:t>40</w:t>
       </w:r>
       <w:r>
         <w:rPr>
@@ -2766,7 +2766,7 @@
         <w:rPr>
           <w:noProof/>
         </w:rPr>
-        <w:instrText xml:space="preserve"> PAGEREF _Toc241604164 \h </w:instrText>
+        <w:instrText xml:space="preserve"> PAGEREF _Toc241606763 \h </w:instrText>
       </w:r>
       <w:r>
         <w:rPr>
@@ -2783,7 +2783,7 @@
         <w:rPr>
           <w:noProof/>
         </w:rPr>
-        <w:t>39</w:t>
+        <w:t>40</w:t>
       </w:r>
       <w:r>
         <w:rPr>
@@ -2828,7 +2828,7 @@
         <w:rPr>
           <w:noProof/>
         </w:rPr>
-        <w:instrText xml:space="preserve"> PAGEREF _Toc241604165 \h </w:instrText>
+        <w:instrText xml:space="preserve"> PAGEREF _Toc241606764 \h </w:instrText>
       </w:r>
       <w:r>
         <w:rPr>
@@ -2845,7 +2845,7 @@
         <w:rPr>
           <w:noProof/>
         </w:rPr>
-        <w:t>41</w:t>
+        <w:t>42</w:t>
       </w:r>
       <w:r>
         <w:rPr>
@@ -2890,7 +2890,7 @@
         <w:rPr>
           <w:noProof/>
         </w:rPr>
-        <w:instrText xml:space="preserve"> PAGEREF _Toc241604166 \h </w:instrText>
+        <w:instrText xml:space="preserve"> PAGEREF _Toc241606765 \h </w:instrText>
       </w:r>
       <w:r>
         <w:rPr>
@@ -2907,7 +2907,7 @@
         <w:rPr>
           <w:noProof/>
         </w:rPr>
-        <w:t>44</w:t>
+        <w:t>45</w:t>
       </w:r>
       <w:r>
         <w:rPr>
@@ -2952,7 +2952,7 @@
         <w:rPr>
           <w:noProof/>
         </w:rPr>
-        <w:instrText xml:space="preserve"> PAGEREF _Toc241604167 \h </w:instrText>
+        <w:instrText xml:space="preserve"> PAGEREF _Toc241606766 \h </w:instrText>
       </w:r>
       <w:r>
         <w:rPr>
@@ -2969,7 +2969,7 @@
         <w:rPr>
           <w:noProof/>
         </w:rPr>
-        <w:t>51</w:t>
+        <w:t>52</w:t>
       </w:r>
       <w:r>
         <w:rPr>
@@ -3014,7 +3014,7 @@
         <w:rPr>
           <w:noProof/>
         </w:rPr>
-        <w:instrText xml:space="preserve"> PAGEREF _Toc241604168 \h </w:instrText>
+        <w:instrText xml:space="preserve"> PAGEREF _Toc241606767 \h </w:instrText>
       </w:r>
       <w:r>
         <w:rPr>
@@ -3031,7 +3031,7 @@
         <w:rPr>
           <w:noProof/>
         </w:rPr>
-        <w:t>52</w:t>
+        <w:t>53</w:t>
       </w:r>
       <w:r>
         <w:rPr>
@@ -3062,7 +3062,7 @@
         </w:rPr>
         <w:br w:type="page"/>
       </w:r>
-      <w:bookmarkStart w:id="1" w:name="_Toc241604125"/>
+      <w:bookmarkStart w:id="1" w:name="_Toc241606724"/>
       <w:r>
         <w:rPr>
           <w:rFonts w:eastAsia="Times New Roman"/>
@@ -3079,7 +3079,7 @@
           <w:rFonts w:eastAsia="Times New Roman"/>
         </w:rPr>
       </w:pPr>
-      <w:bookmarkStart w:id="2" w:name="_Toc241604126"/>
+      <w:bookmarkStart w:id="2" w:name="_Toc241606725"/>
       <w:r>
         <w:rPr>
           <w:rFonts w:eastAsia="Times New Roman"/>
@@ -3106,7 +3106,7 @@
           <w:rFonts w:eastAsia="Times New Roman"/>
         </w:rPr>
       </w:pPr>
-      <w:bookmarkStart w:id="3" w:name="_Toc241604127"/>
+      <w:bookmarkStart w:id="3" w:name="_Toc241606726"/>
       <w:r>
         <w:rPr>
           <w:rFonts w:eastAsia="Times New Roman"/>
@@ -3143,7 +3143,7 @@
           <w:rFonts w:eastAsia="Times New Roman"/>
         </w:rPr>
       </w:pPr>
-      <w:bookmarkStart w:id="4" w:name="_Toc241604128"/>
+      <w:bookmarkStart w:id="4" w:name="_Toc241606727"/>
       <w:r>
         <w:rPr>
           <w:rFonts w:eastAsia="Times New Roman"/>
@@ -3301,7 +3301,7 @@
           <w:rFonts w:eastAsia="Times New Roman"/>
         </w:rPr>
       </w:pPr>
-      <w:bookmarkStart w:id="5" w:name="_Toc241604129"/>
+      <w:bookmarkStart w:id="5" w:name="_Toc241606728"/>
       <w:r>
         <w:rPr>
           <w:rFonts w:eastAsia="Times New Roman"/>
@@ -3328,7 +3328,7 @@
           <w:rFonts w:eastAsia="Times New Roman"/>
         </w:rPr>
       </w:pPr>
-      <w:bookmarkStart w:id="6" w:name="_Toc241604130"/>
+      <w:bookmarkStart w:id="6" w:name="_Toc241606729"/>
       <w:r>
         <w:rPr>
           <w:rFonts w:eastAsia="Times New Roman"/>
@@ -4208,7 +4208,7 @@
           <w:rFonts w:eastAsia="Times New Roman"/>
         </w:rPr>
       </w:pPr>
-      <w:bookmarkStart w:id="7" w:name="_Toc241604131"/>
+      <w:bookmarkStart w:id="7" w:name="_Toc241606730"/>
       <w:r>
         <w:rPr>
           <w:rFonts w:eastAsia="Times New Roman"/>
@@ -4246,7 +4246,7 @@
           <w:rFonts w:eastAsia="Times New Roman"/>
         </w:rPr>
       </w:pPr>
-      <w:bookmarkStart w:id="8" w:name="_Toc241604132"/>
+      <w:bookmarkStart w:id="8" w:name="_Toc241606731"/>
       <w:r>
         <w:rPr>
           <w:rFonts w:eastAsia="Times New Roman"/>
@@ -4273,7 +4273,7 @@
           <w:noProof/>
         </w:rPr>
         <w:drawing>
-          <wp:inline distT="0" distB="0" distL="0" distR="0" wp14:anchorId="356853A4" wp14:editId="42A31C27">
+          <wp:inline distT="0" distB="0" distL="0" distR="0" wp14:anchorId="1B00C57D" wp14:editId="325F1339">
             <wp:extent cx="5715000" cy="1272540"/>
             <wp:effectExtent l="0" t="0" r="0" b="3810"/>
             <wp:docPr id="1" name="Picture 1"/>
@@ -4338,7 +4338,7 @@
           <w:rFonts w:eastAsia="Times New Roman"/>
         </w:rPr>
       </w:pPr>
-      <w:bookmarkStart w:id="9" w:name="_Toc241604133"/>
+      <w:bookmarkStart w:id="9" w:name="_Toc241606732"/>
       <w:r>
         <w:rPr>
           <w:rFonts w:eastAsia="Times New Roman"/>
@@ -7519,7 +7519,7 @@
           <w:rFonts w:eastAsia="Times New Roman"/>
         </w:rPr>
       </w:pPr>
-      <w:bookmarkStart w:id="10" w:name="_Toc241604134"/>
+      <w:bookmarkStart w:id="10" w:name="_Toc241606733"/>
       <w:r>
         <w:rPr>
           <w:rFonts w:eastAsia="Times New Roman"/>
@@ -7812,7 +7812,7 @@
           <w:rFonts w:eastAsia="Times New Roman"/>
         </w:rPr>
       </w:pPr>
-      <w:bookmarkStart w:id="11" w:name="_Toc241604135"/>
+      <w:bookmarkStart w:id="11" w:name="_Toc241606734"/>
       <w:r>
         <w:rPr>
           <w:rFonts w:eastAsia="Times New Roman"/>
@@ -16053,7 +16053,7 @@
           <w:rFonts w:eastAsia="Times New Roman"/>
         </w:rPr>
       </w:pPr>
-      <w:bookmarkStart w:id="12" w:name="_Toc241604136"/>
+      <w:bookmarkStart w:id="12" w:name="_Toc241606735"/>
       <w:r>
         <w:rPr>
           <w:rFonts w:eastAsia="Times New Roman"/>
@@ -17566,7 +17566,7 @@
           <w:noProof/>
         </w:rPr>
         <w:drawing>
-          <wp:inline distT="0" distB="0" distL="0" distR="0" wp14:anchorId="6478BC8B" wp14:editId="3BF1B46A">
+          <wp:inline distT="0" distB="0" distL="0" distR="0" wp14:anchorId="5F6C9F79" wp14:editId="7F8F2A84">
             <wp:extent cx="5524500" cy="3208020"/>
             <wp:effectExtent l="0" t="0" r="0" b="0"/>
             <wp:docPr id="2" name="Picture 2"/>
@@ -18339,7 +18339,7 @@
           <w:rFonts w:eastAsia="Times New Roman"/>
         </w:rPr>
       </w:pPr>
-      <w:bookmarkStart w:id="13" w:name="_Toc241604137"/>
+      <w:bookmarkStart w:id="13" w:name="_Toc241606736"/>
       <w:r>
         <w:rPr>
           <w:rFonts w:eastAsia="Times New Roman"/>
@@ -19323,7 +19323,7 @@
           <w:rFonts w:eastAsia="Times New Roman"/>
         </w:rPr>
       </w:pPr>
-      <w:bookmarkStart w:id="14" w:name="_Toc241604138"/>
+      <w:bookmarkStart w:id="14" w:name="_Toc241606737"/>
       <w:r>
         <w:rPr>
           <w:rFonts w:eastAsia="Times New Roman"/>
@@ -19339,7 +19339,7 @@
           <w:rFonts w:eastAsia="Times New Roman"/>
         </w:rPr>
       </w:pPr>
-      <w:bookmarkStart w:id="15" w:name="_Toc241604139"/>
+      <w:bookmarkStart w:id="15" w:name="_Toc241606738"/>
       <w:r>
         <w:rPr>
           <w:rFonts w:eastAsia="Times New Roman"/>
@@ -19379,7 +19379,7 @@
           <w:noProof/>
         </w:rPr>
         <w:drawing>
-          <wp:inline distT="0" distB="0" distL="0" distR="0" wp14:anchorId="4502CA64" wp14:editId="746E0639">
+          <wp:inline distT="0" distB="0" distL="0" distR="0" wp14:anchorId="4ECD3919" wp14:editId="1AF9E33C">
             <wp:extent cx="5715000" cy="3954780"/>
             <wp:effectExtent l="0" t="0" r="0" b="7620"/>
             <wp:docPr id="3" name="Picture 3"/>
@@ -20190,7 +20190,7 @@
           <w:rFonts w:eastAsia="Times New Roman"/>
         </w:rPr>
       </w:pPr>
-      <w:bookmarkStart w:id="16" w:name="_Toc241604140"/>
+      <w:bookmarkStart w:id="16" w:name="_Toc241606739"/>
       <w:r>
         <w:rPr>
           <w:rFonts w:eastAsia="Times New Roman"/>
@@ -20386,7 +20386,7 @@
           <w:rFonts w:eastAsia="Times New Roman"/>
         </w:rPr>
       </w:pPr>
-      <w:bookmarkStart w:id="17" w:name="_Toc241604141"/>
+      <w:bookmarkStart w:id="17" w:name="_Toc241606740"/>
       <w:r>
         <w:rPr>
           <w:rFonts w:eastAsia="Times New Roman"/>
@@ -20750,7 +20750,7 @@
           <w:rFonts w:eastAsia="Times New Roman"/>
         </w:rPr>
       </w:pPr>
-      <w:bookmarkStart w:id="18" w:name="_Toc241604142"/>
+      <w:bookmarkStart w:id="18" w:name="_Toc241606741"/>
       <w:r>
         <w:rPr>
           <w:rFonts w:eastAsia="Times New Roman"/>
@@ -20869,7 +20869,7 @@
           <w:rFonts w:eastAsia="Times New Roman"/>
         </w:rPr>
       </w:pPr>
-      <w:bookmarkStart w:id="19" w:name="_Toc241604143"/>
+      <w:bookmarkStart w:id="19" w:name="_Toc241606742"/>
       <w:r>
         <w:rPr>
           <w:rFonts w:eastAsia="Times New Roman"/>
@@ -20978,7 +20978,7 @@
           <w:noProof/>
         </w:rPr>
         <w:drawing>
-          <wp:inline distT="0" distB="0" distL="0" distR="0" wp14:anchorId="08A2EE2E" wp14:editId="77C233B0">
+          <wp:inline distT="0" distB="0" distL="0" distR="0" wp14:anchorId="50BEBFBE" wp14:editId="7CA8072D">
             <wp:extent cx="4480560" cy="4960620"/>
             <wp:effectExtent l="0" t="0" r="0" b="0"/>
             <wp:docPr id="4" name="Picture 4"/>
@@ -21043,7 +21043,7 @@
           <w:rFonts w:eastAsia="Times New Roman"/>
         </w:rPr>
       </w:pPr>
-      <w:bookmarkStart w:id="20" w:name="_Toc241604144"/>
+      <w:bookmarkStart w:id="20" w:name="_Toc241606743"/>
       <w:r>
         <w:rPr>
           <w:rFonts w:eastAsia="Times New Roman"/>
@@ -21222,7 +21222,7 @@
           <w:rFonts w:eastAsia="Times New Roman"/>
         </w:rPr>
       </w:pPr>
-      <w:bookmarkStart w:id="21" w:name="_Toc241604145"/>
+      <w:bookmarkStart w:id="21" w:name="_Toc241606744"/>
       <w:r>
         <w:rPr>
           <w:rFonts w:eastAsia="Times New Roman"/>
@@ -21240,6 +21240,43 @@
       </w:r>
       <w:r>
         <w:t xml:space="preserve"> console interface provides the same functions as a backup. Full instructions are in the separate User Manual.</w:t>
+      </w:r>
+    </w:p>
+    <w:p>
+      <w:pPr>
+        <w:pStyle w:val="NormalWeb"/>
+      </w:pPr>
+      <w:r>
+        <w:rPr>
+          <w:b/>
+          <w:bCs/>
+        </w:rPr>
+        <w:t>Online deployment.</w:t>
+      </w:r>
+      <w:r>
+        <w:t xml:space="preserve"> Because all reasoning runs on the server and the browser only receives finished pages, users do not need Prolog installed. The system is packaged as a Docker container based on the official SWI-Prolog image and deployed on the Render cloud platform at </w:t>
+      </w:r>
+      <w:r>
+        <w:rPr>
+          <w:b/>
+          <w:bCs/>
+        </w:rPr>
+        <w:t>https://gemstone-identification-assistant.onrender.com</w:t>
+      </w:r>
+      <w:r>
+        <w:t xml:space="preserve">. A </w:t>
+      </w:r>
+      <w:r>
+        <w:rPr>
+          <w:rStyle w:val="code1"/>
+        </w:rPr>
+        <w:t>serve/0</w:t>
+      </w:r>
+      <w:r>
+        <w:t xml:space="preserve"> </w:t>
+      </w:r>
+      <w:r>
+        <w:t>entry point starts the server on the port supplied by the host. Working memory is thread-local, so several users can consult the system at the same time without affecting each other's results.</w:t>
       </w:r>
     </w:p>
     <w:p>
@@ -21268,13 +21305,20 @@
           <w:b/>
           <w:bCs/>
         </w:rPr>
+        <w:lastRenderedPageBreak/>
         <w:t>Pictures instead of terms.</w:t>
       </w:r>
       <w:r>
         <w:rPr>
           <w:rFonts w:eastAsia="Times New Roman"/>
         </w:rPr>
-        <w:t xml:space="preserve"> Colour is chosen from swatches, optical effects and inclusions from small drawings of what they look like under a loupe, and the optic character from drawings of what is seen in the polariscope and conoscope ("stays dark", "blinks light and dark", "dark cross", "curved bars"), because a beginner may not know the words "silk", "fingerprint" or "biaxial" (Figure 6).</w:t>
+        <w:t xml:space="preserve"> </w:t>
+      </w:r>
+      <w:r>
+        <w:rPr>
+          <w:rFonts w:eastAsia="Times New Roman"/>
+        </w:rPr>
+        <w:t>Colour is chosen from swatches, optical effects and inclusions from small drawings of what they look like under a loupe, and the optic character from drawings of what is seen in the polariscope and conoscope ("stays dark", "blinks light and dark", "dark cross", "curved bars"), because a beginner may not know the words "silk", "fingerprint" or "biaxial" (Figure 6).</w:t>
       </w:r>
     </w:p>
     <w:p>
@@ -21295,14 +21339,19 @@
           <w:b/>
           <w:bCs/>
         </w:rPr>
-        <w:lastRenderedPageBreak/>
         <w:t>Checking readings as they are typed.</w:t>
       </w:r>
       <w:r>
         <w:rPr>
           <w:rFonts w:eastAsia="Times New Roman"/>
         </w:rPr>
-        <w:t xml:space="preserve"> As an RI or SG value is entered, the page immediately says which gems it fits, warns about unusual values, and blocks impossible ones once the box is left (Figure 8). Under each box a "normal range" line gives the range covered by the knowledge base, with a link to the range of every gem. The ranges are sent from the knowledge base, so the page and the rules always agree.</w:t>
+        <w:t xml:space="preserve"> </w:t>
+      </w:r>
+      <w:r>
+        <w:rPr>
+          <w:rFonts w:eastAsia="Times New Roman"/>
+        </w:rPr>
+        <w:t>As an RI or SG value is entered, the page immediately says which gems it fits, warns about unusual values, and blocks impossible ones once the box is left (Figure 8). Under each box a "normal range" line gives the range covered by the knowledge base, with a link to the range of every gem. The ranges are sent from the knowledge base, so the page and the rules always agree.</w:t>
       </w:r>
     </w:p>
     <w:p>
@@ -21488,8 +21537,9 @@
         <w:rPr>
           <w:noProof/>
         </w:rPr>
+        <w:lastRenderedPageBreak/>
         <w:drawing>
-          <wp:inline distT="0" distB="0" distL="0" distR="0" wp14:anchorId="7B822ED5" wp14:editId="7E072D9E">
+          <wp:inline distT="0" distB="0" distL="0" distR="0" wp14:anchorId="53F01ECB" wp14:editId="539F2276">
             <wp:extent cx="5334000" cy="3528060"/>
             <wp:effectExtent l="0" t="0" r="0" b="0"/>
             <wp:docPr id="5" name="Picture 5"/>
@@ -21558,7 +21608,7 @@
         </w:rPr>
         <w:lastRenderedPageBreak/>
         <w:drawing>
-          <wp:inline distT="0" distB="0" distL="0" distR="0" wp14:anchorId="0CBC204B" wp14:editId="4D760A31">
+          <wp:inline distT="0" distB="0" distL="0" distR="0" wp14:anchorId="788CEB38" wp14:editId="75EEC95E">
             <wp:extent cx="4953000" cy="7604760"/>
             <wp:effectExtent l="0" t="0" r="0" b="0"/>
             <wp:docPr id="6" name="Picture 6"/>
@@ -21627,7 +21677,7 @@
         </w:rPr>
         <w:lastRenderedPageBreak/>
         <w:drawing>
-          <wp:inline distT="0" distB="0" distL="0" distR="0" wp14:anchorId="43EF7975" wp14:editId="3E4C0529">
+          <wp:inline distT="0" distB="0" distL="0" distR="0" wp14:anchorId="20C0A79E" wp14:editId="1C9FFFCD">
             <wp:extent cx="4480560" cy="3589020"/>
             <wp:effectExtent l="0" t="0" r="0" b="0"/>
             <wp:docPr id="7" name="Picture 7"/>
@@ -21695,7 +21745,7 @@
           <w:noProof/>
         </w:rPr>
         <w:drawing>
-          <wp:inline distT="0" distB="0" distL="0" distR="0" wp14:anchorId="60EE0971" wp14:editId="3C3ADD6E">
+          <wp:inline distT="0" distB="0" distL="0" distR="0" wp14:anchorId="68F704C3" wp14:editId="386FE75E">
             <wp:extent cx="5334000" cy="3268980"/>
             <wp:effectExtent l="0" t="0" r="0" b="7620"/>
             <wp:docPr id="8" name="Picture 8"/>
@@ -21760,7 +21810,7 @@
           <w:rFonts w:eastAsia="Times New Roman"/>
         </w:rPr>
       </w:pPr>
-      <w:bookmarkStart w:id="22" w:name="_Toc241604146"/>
+      <w:bookmarkStart w:id="22" w:name="_Toc241606745"/>
       <w:r>
         <w:rPr>
           <w:rFonts w:eastAsia="Times New Roman"/>
@@ -22998,7 +23048,7 @@
           <w:rFonts w:eastAsia="Times New Roman"/>
         </w:rPr>
       </w:pPr>
-      <w:bookmarkStart w:id="23" w:name="_Toc241604147"/>
+      <w:bookmarkStart w:id="23" w:name="_Toc241606746"/>
       <w:r>
         <w:rPr>
           <w:rFonts w:eastAsia="Times New Roman"/>
@@ -23032,7 +23082,7 @@
           <w:rFonts w:eastAsia="Times New Roman"/>
         </w:rPr>
       </w:pPr>
-      <w:bookmarkStart w:id="24" w:name="_Toc241604148"/>
+      <w:bookmarkStart w:id="24" w:name="_Toc241606747"/>
       <w:r>
         <w:rPr>
           <w:rFonts w:eastAsia="Times New Roman"/>
@@ -23236,7 +23286,7 @@
         </w:rPr>
         <w:lastRenderedPageBreak/>
         <w:drawing>
-          <wp:inline distT="0" distB="0" distL="0" distR="0" wp14:anchorId="72CFAC3E" wp14:editId="2E59AFDB">
+          <wp:inline distT="0" distB="0" distL="0" distR="0" wp14:anchorId="7D68E2B7" wp14:editId="6059A755">
             <wp:extent cx="4480560" cy="5646420"/>
             <wp:effectExtent l="0" t="0" r="0" b="0"/>
             <wp:docPr id="9" name="Picture 9"/>
@@ -23301,7 +23351,7 @@
           <w:rFonts w:eastAsia="Times New Roman"/>
         </w:rPr>
       </w:pPr>
-      <w:bookmarkStart w:id="25" w:name="_Toc241604149"/>
+      <w:bookmarkStart w:id="25" w:name="_Toc241606748"/>
       <w:r>
         <w:rPr>
           <w:rFonts w:eastAsia="Times New Roman"/>
@@ -23380,7 +23430,7 @@
           <w:noProof/>
         </w:rPr>
         <w:drawing>
-          <wp:inline distT="0" distB="0" distL="0" distR="0" wp14:anchorId="0AAC91BD" wp14:editId="7F99A5F7">
+          <wp:inline distT="0" distB="0" distL="0" distR="0" wp14:anchorId="7A8AF67E" wp14:editId="41AF223E">
             <wp:extent cx="4290060" cy="3398520"/>
             <wp:effectExtent l="0" t="0" r="0" b="0"/>
             <wp:docPr id="10" name="Picture 10"/>
@@ -23445,7 +23495,7 @@
           <w:rFonts w:eastAsia="Times New Roman"/>
         </w:rPr>
       </w:pPr>
-      <w:bookmarkStart w:id="26" w:name="_Toc241604150"/>
+      <w:bookmarkStart w:id="26" w:name="_Toc241606749"/>
       <w:r>
         <w:rPr>
           <w:rFonts w:eastAsia="Times New Roman"/>
@@ -23483,7 +23533,7 @@
         </w:rPr>
         <w:lastRenderedPageBreak/>
         <w:drawing>
-          <wp:inline distT="0" distB="0" distL="0" distR="0" wp14:anchorId="096AA03E" wp14:editId="42689DDB">
+          <wp:inline distT="0" distB="0" distL="0" distR="0" wp14:anchorId="0725EB55" wp14:editId="58316C31">
             <wp:extent cx="4480560" cy="1325880"/>
             <wp:effectExtent l="0" t="0" r="0" b="7620"/>
             <wp:docPr id="11" name="Picture 11"/>
@@ -23548,7 +23598,7 @@
           <w:rFonts w:eastAsia="Times New Roman"/>
         </w:rPr>
       </w:pPr>
-      <w:bookmarkStart w:id="27" w:name="_Toc241604151"/>
+      <w:bookmarkStart w:id="27" w:name="_Toc241606750"/>
       <w:r>
         <w:rPr>
           <w:rFonts w:eastAsia="Times New Roman"/>
@@ -23578,7 +23628,7 @@
           <w:noProof/>
         </w:rPr>
         <w:drawing>
-          <wp:inline distT="0" distB="0" distL="0" distR="0" wp14:anchorId="31342795" wp14:editId="12C3D205">
+          <wp:inline distT="0" distB="0" distL="0" distR="0" wp14:anchorId="2856DD97" wp14:editId="7289C4ED">
             <wp:extent cx="4480560" cy="4655820"/>
             <wp:effectExtent l="0" t="0" r="0" b="0"/>
             <wp:docPr id="12" name="Picture 12"/>
@@ -23647,7 +23697,7 @@
         </w:rPr>
         <w:lastRenderedPageBreak/>
         <w:drawing>
-          <wp:inline distT="0" distB="0" distL="0" distR="0" wp14:anchorId="66CD48A8" wp14:editId="6F2252CA">
+          <wp:inline distT="0" distB="0" distL="0" distR="0" wp14:anchorId="66956E1C" wp14:editId="3B0EEC51">
             <wp:extent cx="4480560" cy="3733800"/>
             <wp:effectExtent l="0" t="0" r="0" b="0"/>
             <wp:docPr id="13" name="Picture 13"/>
@@ -23712,7 +23762,7 @@
           <w:rFonts w:eastAsia="Times New Roman"/>
         </w:rPr>
       </w:pPr>
-      <w:bookmarkStart w:id="28" w:name="_Toc241604152"/>
+      <w:bookmarkStart w:id="28" w:name="_Toc241606751"/>
       <w:r>
         <w:rPr>
           <w:rFonts w:eastAsia="Times New Roman"/>
@@ -23728,7 +23778,7 @@
           <w:rFonts w:eastAsia="Times New Roman"/>
         </w:rPr>
       </w:pPr>
-      <w:bookmarkStart w:id="29" w:name="_Toc241604153"/>
+      <w:bookmarkStart w:id="29" w:name="_Toc241606752"/>
       <w:r>
         <w:rPr>
           <w:rFonts w:eastAsia="Times New Roman"/>
@@ -23752,7 +23802,7 @@
           <w:rFonts w:eastAsia="Times New Roman"/>
         </w:rPr>
       </w:pPr>
-      <w:bookmarkStart w:id="30" w:name="_Toc241604154"/>
+      <w:bookmarkStart w:id="30" w:name="_Toc241606753"/>
       <w:r>
         <w:rPr>
           <w:rFonts w:eastAsia="Times New Roman"/>
@@ -29387,7 +29437,7 @@
           <w:rFonts w:eastAsia="Times New Roman"/>
         </w:rPr>
       </w:pPr>
-      <w:bookmarkStart w:id="31" w:name="_Toc241604155"/>
+      <w:bookmarkStart w:id="31" w:name="_Toc241606754"/>
       <w:r>
         <w:rPr>
           <w:rFonts w:eastAsia="Times New Roman"/>
@@ -30155,7 +30205,7 @@
           <w:rFonts w:eastAsia="Times New Roman"/>
         </w:rPr>
       </w:pPr>
-      <w:bookmarkStart w:id="32" w:name="_Toc241604156"/>
+      <w:bookmarkStart w:id="32" w:name="_Toc241606755"/>
       <w:r>
         <w:rPr>
           <w:rFonts w:eastAsia="Times New Roman"/>
@@ -31148,7 +31198,7 @@
           <w:rFonts w:eastAsia="Times New Roman"/>
         </w:rPr>
       </w:pPr>
-      <w:bookmarkStart w:id="33" w:name="_Toc241604157"/>
+      <w:bookmarkStart w:id="33" w:name="_Toc241606756"/>
       <w:r>
         <w:rPr>
           <w:rFonts w:eastAsia="Times New Roman"/>
@@ -32142,7 +32192,7 @@
           <w:rFonts w:eastAsia="Times New Roman"/>
         </w:rPr>
       </w:pPr>
-      <w:bookmarkStart w:id="34" w:name="_Toc241604158"/>
+      <w:bookmarkStart w:id="34" w:name="_Toc241606757"/>
       <w:r>
         <w:rPr>
           <w:rFonts w:eastAsia="Times New Roman"/>
@@ -32166,7 +32216,20 @@
         <w:t>Gemstone Identification Assistant - User Manual</w:t>
       </w:r>
       <w:r>
-        <w:t>. It covers the required software, installation of SWI-Prolog, starting the web and console interfaces, the meaning of each input field and where to obtain it, worked examples with screenshots, the three reasoning modes, troubleshooting, and how to run the automated tests.</w:t>
+        <w:t>. It describes the two ways to use the system: the online version at</w:t>
+      </w:r>
+      <w:r>
+        <w:t xml:space="preserve"> </w:t>
+      </w:r>
+      <w:r>
+        <w:rPr>
+          <w:b/>
+          <w:bCs/>
+        </w:rPr>
+        <w:t>https://gemstone-identification-assistant.onrender.com</w:t>
+      </w:r>
+      <w:r>
+        <w:t>, which needs only a web browser, and running it on one's own computer by downloading the project ZIP file from GitHub and starting it from the Command Prompt. It covers the required software, installation of SWI-Prolog, starting the web and console interfaces, the meaning of each input field and where to obtain it, worked examples with screenshots, the three reasoning modes, troubleshooting, and how to run the automated tests.</w:t>
       </w:r>
     </w:p>
     <w:p>
@@ -32176,7 +32239,7 @@
           <w:rFonts w:eastAsia="Times New Roman"/>
         </w:rPr>
       </w:pPr>
-      <w:bookmarkStart w:id="35" w:name="_Toc241604159"/>
+      <w:bookmarkStart w:id="35" w:name="_Toc241606758"/>
       <w:r>
         <w:rPr>
           <w:rFonts w:eastAsia="Times New Roman"/>
@@ -32192,7 +32255,7 @@
           <w:rFonts w:eastAsia="Times New Roman"/>
         </w:rPr>
       </w:pPr>
-      <w:bookmarkStart w:id="36" w:name="_Toc241604160"/>
+      <w:bookmarkStart w:id="36" w:name="_Toc241606759"/>
       <w:r>
         <w:rPr>
           <w:rFonts w:eastAsia="Times New Roman"/>
@@ -32216,11 +32279,11 @@
         <w:t>hypothesise-and-test</w:t>
       </w:r>
       <w:r>
-        <w:t xml:space="preserve">: the expert selects the tests that would confirm or rule out that hypothesis and abandons it as soon as a test contradicts it. Studies of expert diagnostic reasoning describe the same hypothetico-deductive pattern [18]. The consultation mode models it directly. It forms a hypothesis from the rule order, asks only for the evidence that hypothesis needs, and moves to </w:t>
+        <w:t xml:space="preserve">: the expert selects the tests that would confirm or rule out that hypothesis and abandons it as </w:t>
       </w:r>
       <w:r>
         <w:lastRenderedPageBreak/>
-        <w:t>the next hypothesis on failure. Test case 17 shows the effect: an isotropic reading rules out ruby after a single question.</w:t>
+        <w:t>soon as a test contradicts it. Studies of expert diagnostic reasoning describe the same hypothetico-deductive pattern [18]. The consultation mode models it directly. It forms a hypothesis from the rule order, asks only for the evidence that hypothesis needs, and moves to the next hypothesis on failure. Test case 17 shows the effect: an isotropic reading rules out ruby after a single question.</w:t>
       </w:r>
     </w:p>
     <w:p>
@@ -32238,7 +32301,7 @@
           <w:rFonts w:eastAsia="Times New Roman"/>
         </w:rPr>
       </w:pPr>
-      <w:bookmarkStart w:id="37" w:name="_Toc241604161"/>
+      <w:bookmarkStart w:id="37" w:name="_Toc241606760"/>
       <w:r>
         <w:rPr>
           <w:rFonts w:eastAsia="Times New Roman"/>
@@ -32278,7 +32341,7 @@
           <w:rFonts w:eastAsia="Times New Roman"/>
         </w:rPr>
       </w:pPr>
-      <w:bookmarkStart w:id="38" w:name="_Toc241604162"/>
+      <w:bookmarkStart w:id="38" w:name="_Toc241606761"/>
       <w:r>
         <w:rPr>
           <w:rFonts w:eastAsia="Times New Roman"/>
@@ -32359,6 +32422,7 @@
           <w:b/>
           <w:bCs/>
         </w:rPr>
+        <w:lastRenderedPageBreak/>
         <w:t>Unused properties.</w:t>
       </w:r>
       <w:r>
@@ -32392,7 +32456,6 @@
           <w:b/>
           <w:bCs/>
         </w:rPr>
-        <w:lastRenderedPageBreak/>
         <w:t>Treatments.</w:t>
       </w:r>
       <w:r>
@@ -32529,7 +32592,7 @@
           <w:rFonts w:eastAsia="Times New Roman"/>
         </w:rPr>
       </w:pPr>
-      <w:bookmarkStart w:id="39" w:name="_Toc241604163"/>
+      <w:bookmarkStart w:id="39" w:name="_Toc241606762"/>
       <w:r>
         <w:rPr>
           <w:rFonts w:eastAsia="Times New Roman"/>
@@ -32640,7 +32703,7 @@
           <w:rFonts w:eastAsia="Times New Roman"/>
         </w:rPr>
       </w:pPr>
-      <w:bookmarkStart w:id="40" w:name="_Toc241604164"/>
+      <w:bookmarkStart w:id="40" w:name="_Toc241606763"/>
       <w:r>
         <w:rPr>
           <w:rFonts w:eastAsia="Times New Roman"/>
@@ -32654,17 +32717,17 @@
         <w:pStyle w:val="NormalWeb"/>
       </w:pPr>
       <w:r>
-        <w:t>This project designed and implemented a rule-based expert system that identifies common Sri Lankan gemstones, detects synthetics and imitations, and explains its reasoning. Knowledge from recognised gemmological sources was systematically acquired, documented and represented as 297 facts and 62 production rules in four chained layers, with a certainty factor and a literature source for every rule. One rule base supports three reasoning modes: forward chaining for identification, backward chaining for verify</w:t>
-      </w:r>
-      <w:r>
-        <w:t xml:space="preserve">ing a claim, and an interactive </w:t>
+        <w:t xml:space="preserve">This project designed and implemented a rule-based expert system that identifies common Sri Lankan gemstones, detects synthetics and imitations, and explains its reasoning. Knowledge from recognised gemmological sources was systematically acquired, documented and </w:t>
       </w:r>
       <w:r>
         <w:lastRenderedPageBreak/>
-        <w:t>consultation that asks only for the facts it needs. A full How, Why and Why-not explanation facility, reasoning diagrams, a plain-English question interface and a web interface make the reasoning transparent to non-experts, and features such as picture-based inputs, live checking of readings and the next-measurement hint make it practical for people without gemmological training. All 20 documented test cases and 47 automated tests pass. The system meets its objectives as a to</w:t>
-      </w:r>
-      <w:r>
-        <w:t>ol for a first opinion. Its main limitations, the absence of real-world validation and several unmodelled gemmological properties, define clear next steps. Above all, the project shows why a transparent, explainable system is appropriate when a person's money depends on its answer.</w:t>
+        <w:t>represented as 297 facts and 62 production rules in four chained layers, with a certainty factor and a literature source for every rule. One rule base supports three reasoning modes: forward chaining for identification, backward chaining for verifying a claim, and an interactive consultation that asks only for the facts it needs. A full How, Why and Why-not explanation facility, reasoning diagrams, a plain-English question interface and a web interface make the reasoning transparent to non-experts, and feat</w:t>
+      </w:r>
+      <w:r>
+        <w:t>ures such as picture-based inputs, live checking of readings and the next-measurement hint make it practical for people without gemmological training. All 20 documented test cases and 47 automated tests pass. The system meets its objectives as a tool for a first opinion. Its main limitations, the absence of real-world validation and several unmodelled gemmological properties, define clear next steps. Above all, the project shows why a transparent, explainable system is appropriate when a person's money depe</w:t>
+      </w:r>
+      <w:r>
+        <w:t>nds on its answer.</w:t>
       </w:r>
     </w:p>
     <w:p>
@@ -32680,7 +32743,7 @@
         </w:rPr>
         <w:br w:type="page"/>
       </w:r>
-      <w:bookmarkStart w:id="41" w:name="_Toc241604165"/>
+      <w:bookmarkStart w:id="41" w:name="_Toc241606764"/>
       <w:r>
         <w:rPr>
           <w:rFonts w:eastAsia="Times New Roman"/>
@@ -33187,7 +33250,7 @@
         </w:rPr>
         <w:br w:type="page"/>
       </w:r>
-      <w:bookmarkStart w:id="42" w:name="_Toc241604166"/>
+      <w:bookmarkStart w:id="42" w:name="_Toc241606765"/>
       <w:r>
         <w:rPr>
           <w:rFonts w:eastAsia="Times New Roman"/>
@@ -46397,7 +46460,7 @@
         </w:rPr>
         <w:br w:type="page"/>
       </w:r>
-      <w:bookmarkStart w:id="43" w:name="_Toc241604167"/>
+      <w:bookmarkStart w:id="43" w:name="_Toc241606766"/>
       <w:r>
         <w:rPr>
           <w:rFonts w:eastAsia="Times New Roman"/>
@@ -46879,7 +46942,7 @@
           <w:rFonts w:eastAsia="Times New Roman"/>
         </w:rPr>
       </w:pPr>
-      <w:bookmarkStart w:id="44" w:name="_Toc241604168"/>
+      <w:bookmarkStart w:id="44" w:name="_Toc241606767"/>
       <w:r>
         <w:rPr>
           <w:rFonts w:eastAsia="Times New Roman"/>
@@ -47391,122 +47454,9 @@
 <file path=word/numbering.xml><?xml version="1.0" encoding="utf-8"?>
 <w:numbering xmlns:wpc="http://schemas.microsoft.com/office/word/2010/wordprocessingCanvas" xmlns:cx="http://schemas.microsoft.com/office/drawing/2014/chartex" xmlns:cx1="http://schemas.microsoft.com/office/drawing/2015/9/8/chartex" xmlns:cx2="http://schemas.microsoft.com/office/drawing/2015/10/21/chartex" xmlns:cx3="http://schemas.microsoft.com/office/drawing/2016/5/9/chartex" xmlns:cx4="http://schemas.microsoft.com/office/drawing/2016/5/10/chartex" xmlns:cx5="http://schemas.microsoft.com/office/drawing/2016/5/11/chartex" xmlns:cx6="http://schemas.microsoft.com/office/drawing/2016/5/12/chartex" xmlns:cx7="http://schemas.microsoft.com/office/drawing/2016/5/13/chartex" xmlns:cx8="http://schemas.microsoft.com/office/drawing/2016/5/14/chartex" xmlns:mc="http://schemas.openxmlformats.org/markup-compatibility/2006" xmlns:aink="http://schemas.microsoft.com/office/drawing/2016/ink" xmlns:am3d="http://schemas.microsoft.com/office/drawing/2017/model3d" xmlns:o="urn:schemas-microsoft-com:office:office" xmlns:oel="http://schemas.microsoft.com/office/2019/extlst" xmlns:r="http://schemas.openxmlformats.org/officeDocument/2006/relationships" xmlns:m="http://schemas.openxmlformats.org/officeDocument/2006/math" xmlns:v="urn:schemas-microsoft-com:vml" xmlns:wp14="http://schemas.microsoft.com/office/word/2010/wordprocessingDrawing" xmlns:wp="http://schemas.openxmlformats.org/drawingml/2006/wordprocessingDrawing" xmlns:w10="urn:schemas-microsoft-com:office:word" xmlns:w="http://schemas.openxmlformats.org/wordprocessingml/2006/main" xmlns:w14="http://schemas.microsoft.com/office/word/2010/wordml" xmlns:w15="http://schemas.microsoft.com/office/word/2012/wordml" xmlns:w16cex="http://schemas.microsoft.com/office/word/2018/wordml/cex" xmlns:w16cid="http://schemas.microsoft.com/office/word/2016/wordml/cid" xmlns:w16="http://schemas.microsoft.com/office/word/2018/wordml" xmlns:w16du="http://schemas.microsoft.com/office/word/2023/wordml/word16du" xmlns:w16sdtdh="http://schemas.microsoft.com/office/word/2020/wordml/sdtdatahash" xmlns:w16sdtfl="http://schemas.microsoft.com/office/word/2024/wordml/sdtformatlock" xmlns:w16se="http://schemas.microsoft.com/office/word/2015/wordml/symex" xmlns:wpg="http://schemas.microsoft.com/office/word/2010/wordprocessingGroup" xmlns:wpi="http://schemas.microsoft.com/office/word/2010/wordprocessingInk" xmlns:wne="http://schemas.microsoft.com/office/word/2006/wordml" xmlns:wps="http://schemas.microsoft.com/office/word/2010/wordprocessingShape" mc:Ignorable="w14 w15 w16se w16cid w16 w16cex w16sdtdh w16sdtfl w16du wp14">
   <w:abstractNum w:abstractNumId="0" w15:restartNumberingAfterBreak="0">
-    <w:nsid w:val="0C652C08"/>
+    <w:nsid w:val="0EC83959"/>
     <w:multiLevelType w:val="multilevel"/>
-    <w:tmpl w:val="C25E0E64"/>
-    <w:lvl w:ilvl="0">
-      <w:start w:val="1"/>
-      <w:numFmt w:val="decimal"/>
-      <w:lvlText w:val="%1."/>
-      <w:lvlJc w:val="left"/>
-      <w:pPr>
-        <w:tabs>
-          <w:tab w:val="num" w:pos="720"/>
-        </w:tabs>
-        <w:ind w:left="720" w:hanging="360"/>
-      </w:pPr>
-    </w:lvl>
-    <w:lvl w:ilvl="1" w:tentative="1">
-      <w:start w:val="1"/>
-      <w:numFmt w:val="decimal"/>
-      <w:lvlText w:val="%2."/>
-      <w:lvlJc w:val="left"/>
-      <w:pPr>
-        <w:tabs>
-          <w:tab w:val="num" w:pos="1440"/>
-        </w:tabs>
-        <w:ind w:left="1440" w:hanging="360"/>
-      </w:pPr>
-    </w:lvl>
-    <w:lvl w:ilvl="2" w:tentative="1">
-      <w:start w:val="1"/>
-      <w:numFmt w:val="decimal"/>
-      <w:lvlText w:val="%3."/>
-      <w:lvlJc w:val="left"/>
-      <w:pPr>
-        <w:tabs>
-          <w:tab w:val="num" w:pos="2160"/>
-        </w:tabs>
-        <w:ind w:left="2160" w:hanging="360"/>
-      </w:pPr>
-    </w:lvl>
-    <w:lvl w:ilvl="3" w:tentative="1">
-      <w:start w:val="1"/>
-      <w:numFmt w:val="decimal"/>
-      <w:lvlText w:val="%4."/>
-      <w:lvlJc w:val="left"/>
-      <w:pPr>
-        <w:tabs>
-          <w:tab w:val="num" w:pos="2880"/>
-        </w:tabs>
-        <w:ind w:left="2880" w:hanging="360"/>
-      </w:pPr>
-    </w:lvl>
-    <w:lvl w:ilvl="4" w:tentative="1">
-      <w:start w:val="1"/>
-      <w:numFmt w:val="decimal"/>
-      <w:lvlText w:val="%5."/>
-      <w:lvlJc w:val="left"/>
-      <w:pPr>
-        <w:tabs>
-          <w:tab w:val="num" w:pos="3600"/>
-        </w:tabs>
-        <w:ind w:left="3600" w:hanging="360"/>
-      </w:pPr>
-    </w:lvl>
-    <w:lvl w:ilvl="5" w:tentative="1">
-      <w:start w:val="1"/>
-      <w:numFmt w:val="decimal"/>
-      <w:lvlText w:val="%6."/>
-      <w:lvlJc w:val="left"/>
-      <w:pPr>
-        <w:tabs>
-          <w:tab w:val="num" w:pos="4320"/>
-        </w:tabs>
-        <w:ind w:left="4320" w:hanging="360"/>
-      </w:pPr>
-    </w:lvl>
-    <w:lvl w:ilvl="6" w:tentative="1">
-      <w:start w:val="1"/>
-      <w:numFmt w:val="decimal"/>
-      <w:lvlText w:val="%7."/>
-      <w:lvlJc w:val="left"/>
-      <w:pPr>
-        <w:tabs>
-          <w:tab w:val="num" w:pos="5040"/>
-        </w:tabs>
-        <w:ind w:left="5040" w:hanging="360"/>
-      </w:pPr>
-    </w:lvl>
-    <w:lvl w:ilvl="7" w:tentative="1">
-      <w:start w:val="1"/>
-      <w:numFmt w:val="decimal"/>
-      <w:lvlText w:val="%8."/>
-      <w:lvlJc w:val="left"/>
-      <w:pPr>
-        <w:tabs>
-          <w:tab w:val="num" w:pos="5760"/>
-        </w:tabs>
-        <w:ind w:left="5760" w:hanging="360"/>
-      </w:pPr>
-    </w:lvl>
-    <w:lvl w:ilvl="8" w:tentative="1">
-      <w:start w:val="1"/>
-      <w:numFmt w:val="decimal"/>
-      <w:lvlText w:val="%9."/>
-      <w:lvlJc w:val="left"/>
-      <w:pPr>
-        <w:tabs>
-          <w:tab w:val="num" w:pos="6480"/>
-        </w:tabs>
-        <w:ind w:left="6480" w:hanging="360"/>
-      </w:pPr>
-    </w:lvl>
-  </w:abstractNum>
-  <w:abstractNum w:abstractNumId="1" w15:restartNumberingAfterBreak="0">
-    <w:nsid w:val="1402556E"/>
-    <w:multiLevelType w:val="multilevel"/>
-    <w:tmpl w:val="445497E2"/>
+    <w:tmpl w:val="8D52F45E"/>
     <w:lvl w:ilvl="0">
       <w:start w:val="1"/>
       <w:numFmt w:val="bullet"/>
@@ -47652,123 +47602,10 @@
       </w:rPr>
     </w:lvl>
   </w:abstractNum>
-  <w:abstractNum w:abstractNumId="2" w15:restartNumberingAfterBreak="0">
-    <w:nsid w:val="33B736AF"/>
+  <w:abstractNum w:abstractNumId="1" w15:restartNumberingAfterBreak="0">
+    <w:nsid w:val="334F1FA5"/>
     <w:multiLevelType w:val="multilevel"/>
-    <w:tmpl w:val="33022EDE"/>
-    <w:lvl w:ilvl="0">
-      <w:start w:val="1"/>
-      <w:numFmt w:val="decimal"/>
-      <w:lvlText w:val="%1."/>
-      <w:lvlJc w:val="left"/>
-      <w:pPr>
-        <w:tabs>
-          <w:tab w:val="num" w:pos="720"/>
-        </w:tabs>
-        <w:ind w:left="720" w:hanging="360"/>
-      </w:pPr>
-    </w:lvl>
-    <w:lvl w:ilvl="1" w:tentative="1">
-      <w:start w:val="1"/>
-      <w:numFmt w:val="decimal"/>
-      <w:lvlText w:val="%2."/>
-      <w:lvlJc w:val="left"/>
-      <w:pPr>
-        <w:tabs>
-          <w:tab w:val="num" w:pos="1440"/>
-        </w:tabs>
-        <w:ind w:left="1440" w:hanging="360"/>
-      </w:pPr>
-    </w:lvl>
-    <w:lvl w:ilvl="2" w:tentative="1">
-      <w:start w:val="1"/>
-      <w:numFmt w:val="decimal"/>
-      <w:lvlText w:val="%3."/>
-      <w:lvlJc w:val="left"/>
-      <w:pPr>
-        <w:tabs>
-          <w:tab w:val="num" w:pos="2160"/>
-        </w:tabs>
-        <w:ind w:left="2160" w:hanging="360"/>
-      </w:pPr>
-    </w:lvl>
-    <w:lvl w:ilvl="3" w:tentative="1">
-      <w:start w:val="1"/>
-      <w:numFmt w:val="decimal"/>
-      <w:lvlText w:val="%4."/>
-      <w:lvlJc w:val="left"/>
-      <w:pPr>
-        <w:tabs>
-          <w:tab w:val="num" w:pos="2880"/>
-        </w:tabs>
-        <w:ind w:left="2880" w:hanging="360"/>
-      </w:pPr>
-    </w:lvl>
-    <w:lvl w:ilvl="4" w:tentative="1">
-      <w:start w:val="1"/>
-      <w:numFmt w:val="decimal"/>
-      <w:lvlText w:val="%5."/>
-      <w:lvlJc w:val="left"/>
-      <w:pPr>
-        <w:tabs>
-          <w:tab w:val="num" w:pos="3600"/>
-        </w:tabs>
-        <w:ind w:left="3600" w:hanging="360"/>
-      </w:pPr>
-    </w:lvl>
-    <w:lvl w:ilvl="5" w:tentative="1">
-      <w:start w:val="1"/>
-      <w:numFmt w:val="decimal"/>
-      <w:lvlText w:val="%6."/>
-      <w:lvlJc w:val="left"/>
-      <w:pPr>
-        <w:tabs>
-          <w:tab w:val="num" w:pos="4320"/>
-        </w:tabs>
-        <w:ind w:left="4320" w:hanging="360"/>
-      </w:pPr>
-    </w:lvl>
-    <w:lvl w:ilvl="6" w:tentative="1">
-      <w:start w:val="1"/>
-      <w:numFmt w:val="decimal"/>
-      <w:lvlText w:val="%7."/>
-      <w:lvlJc w:val="left"/>
-      <w:pPr>
-        <w:tabs>
-          <w:tab w:val="num" w:pos="5040"/>
-        </w:tabs>
-        <w:ind w:left="5040" w:hanging="360"/>
-      </w:pPr>
-    </w:lvl>
-    <w:lvl w:ilvl="7" w:tentative="1">
-      <w:start w:val="1"/>
-      <w:numFmt w:val="decimal"/>
-      <w:lvlText w:val="%8."/>
-      <w:lvlJc w:val="left"/>
-      <w:pPr>
-        <w:tabs>
-          <w:tab w:val="num" w:pos="5760"/>
-        </w:tabs>
-        <w:ind w:left="5760" w:hanging="360"/>
-      </w:pPr>
-    </w:lvl>
-    <w:lvl w:ilvl="8" w:tentative="1">
-      <w:start w:val="1"/>
-      <w:numFmt w:val="decimal"/>
-      <w:lvlText w:val="%9."/>
-      <w:lvlJc w:val="left"/>
-      <w:pPr>
-        <w:tabs>
-          <w:tab w:val="num" w:pos="6480"/>
-        </w:tabs>
-        <w:ind w:left="6480" w:hanging="360"/>
-      </w:pPr>
-    </w:lvl>
-  </w:abstractNum>
-  <w:abstractNum w:abstractNumId="3" w15:restartNumberingAfterBreak="0">
-    <w:nsid w:val="3C7C1914"/>
-    <w:multiLevelType w:val="multilevel"/>
-    <w:tmpl w:val="B1A46A02"/>
+    <w:tmpl w:val="5A222164"/>
     <w:lvl w:ilvl="0">
       <w:start w:val="1"/>
       <w:numFmt w:val="bullet"/>
@@ -47914,10 +47751,10 @@
       </w:rPr>
     </w:lvl>
   </w:abstractNum>
-  <w:abstractNum w:abstractNumId="4" w15:restartNumberingAfterBreak="0">
-    <w:nsid w:val="56BB1B36"/>
+  <w:abstractNum w:abstractNumId="2" w15:restartNumberingAfterBreak="0">
+    <w:nsid w:val="42E4585A"/>
     <w:multiLevelType w:val="multilevel"/>
-    <w:tmpl w:val="53EAC6AA"/>
+    <w:tmpl w:val="62C20818"/>
     <w:lvl w:ilvl="0">
       <w:start w:val="1"/>
       <w:numFmt w:val="bullet"/>
@@ -48063,10 +47900,10 @@
       </w:rPr>
     </w:lvl>
   </w:abstractNum>
-  <w:abstractNum w:abstractNumId="5" w15:restartNumberingAfterBreak="0">
-    <w:nsid w:val="573976BB"/>
+  <w:abstractNum w:abstractNumId="3" w15:restartNumberingAfterBreak="0">
+    <w:nsid w:val="49062BC4"/>
     <w:multiLevelType w:val="multilevel"/>
-    <w:tmpl w:val="69D6C1EA"/>
+    <w:tmpl w:val="6D724A02"/>
     <w:lvl w:ilvl="0">
       <w:start w:val="1"/>
       <w:numFmt w:val="bullet"/>
@@ -48212,10 +48049,236 @@
       </w:rPr>
     </w:lvl>
   </w:abstractNum>
+  <w:abstractNum w:abstractNumId="4" w15:restartNumberingAfterBreak="0">
+    <w:nsid w:val="66D4148A"/>
+    <w:multiLevelType w:val="multilevel"/>
+    <w:tmpl w:val="56740AAA"/>
+    <w:lvl w:ilvl="0">
+      <w:start w:val="1"/>
+      <w:numFmt w:val="decimal"/>
+      <w:lvlText w:val="%1."/>
+      <w:lvlJc w:val="left"/>
+      <w:pPr>
+        <w:tabs>
+          <w:tab w:val="num" w:pos="720"/>
+        </w:tabs>
+        <w:ind w:left="720" w:hanging="360"/>
+      </w:pPr>
+    </w:lvl>
+    <w:lvl w:ilvl="1" w:tentative="1">
+      <w:start w:val="1"/>
+      <w:numFmt w:val="decimal"/>
+      <w:lvlText w:val="%2."/>
+      <w:lvlJc w:val="left"/>
+      <w:pPr>
+        <w:tabs>
+          <w:tab w:val="num" w:pos="1440"/>
+        </w:tabs>
+        <w:ind w:left="1440" w:hanging="360"/>
+      </w:pPr>
+    </w:lvl>
+    <w:lvl w:ilvl="2" w:tentative="1">
+      <w:start w:val="1"/>
+      <w:numFmt w:val="decimal"/>
+      <w:lvlText w:val="%3."/>
+      <w:lvlJc w:val="left"/>
+      <w:pPr>
+        <w:tabs>
+          <w:tab w:val="num" w:pos="2160"/>
+        </w:tabs>
+        <w:ind w:left="2160" w:hanging="360"/>
+      </w:pPr>
+    </w:lvl>
+    <w:lvl w:ilvl="3" w:tentative="1">
+      <w:start w:val="1"/>
+      <w:numFmt w:val="decimal"/>
+      <w:lvlText w:val="%4."/>
+      <w:lvlJc w:val="left"/>
+      <w:pPr>
+        <w:tabs>
+          <w:tab w:val="num" w:pos="2880"/>
+        </w:tabs>
+        <w:ind w:left="2880" w:hanging="360"/>
+      </w:pPr>
+    </w:lvl>
+    <w:lvl w:ilvl="4" w:tentative="1">
+      <w:start w:val="1"/>
+      <w:numFmt w:val="decimal"/>
+      <w:lvlText w:val="%5."/>
+      <w:lvlJc w:val="left"/>
+      <w:pPr>
+        <w:tabs>
+          <w:tab w:val="num" w:pos="3600"/>
+        </w:tabs>
+        <w:ind w:left="3600" w:hanging="360"/>
+      </w:pPr>
+    </w:lvl>
+    <w:lvl w:ilvl="5" w:tentative="1">
+      <w:start w:val="1"/>
+      <w:numFmt w:val="decimal"/>
+      <w:lvlText w:val="%6."/>
+      <w:lvlJc w:val="left"/>
+      <w:pPr>
+        <w:tabs>
+          <w:tab w:val="num" w:pos="4320"/>
+        </w:tabs>
+        <w:ind w:left="4320" w:hanging="360"/>
+      </w:pPr>
+    </w:lvl>
+    <w:lvl w:ilvl="6" w:tentative="1">
+      <w:start w:val="1"/>
+      <w:numFmt w:val="decimal"/>
+      <w:lvlText w:val="%7."/>
+      <w:lvlJc w:val="left"/>
+      <w:pPr>
+        <w:tabs>
+          <w:tab w:val="num" w:pos="5040"/>
+        </w:tabs>
+        <w:ind w:left="5040" w:hanging="360"/>
+      </w:pPr>
+    </w:lvl>
+    <w:lvl w:ilvl="7" w:tentative="1">
+      <w:start w:val="1"/>
+      <w:numFmt w:val="decimal"/>
+      <w:lvlText w:val="%8."/>
+      <w:lvlJc w:val="left"/>
+      <w:pPr>
+        <w:tabs>
+          <w:tab w:val="num" w:pos="5760"/>
+        </w:tabs>
+        <w:ind w:left="5760" w:hanging="360"/>
+      </w:pPr>
+    </w:lvl>
+    <w:lvl w:ilvl="8" w:tentative="1">
+      <w:start w:val="1"/>
+      <w:numFmt w:val="decimal"/>
+      <w:lvlText w:val="%9."/>
+      <w:lvlJc w:val="left"/>
+      <w:pPr>
+        <w:tabs>
+          <w:tab w:val="num" w:pos="6480"/>
+        </w:tabs>
+        <w:ind w:left="6480" w:hanging="360"/>
+      </w:pPr>
+    </w:lvl>
+  </w:abstractNum>
+  <w:abstractNum w:abstractNumId="5" w15:restartNumberingAfterBreak="0">
+    <w:nsid w:val="6BB3122E"/>
+    <w:multiLevelType w:val="multilevel"/>
+    <w:tmpl w:val="497EFAA8"/>
+    <w:lvl w:ilvl="0">
+      <w:start w:val="1"/>
+      <w:numFmt w:val="decimal"/>
+      <w:lvlText w:val="%1."/>
+      <w:lvlJc w:val="left"/>
+      <w:pPr>
+        <w:tabs>
+          <w:tab w:val="num" w:pos="720"/>
+        </w:tabs>
+        <w:ind w:left="720" w:hanging="360"/>
+      </w:pPr>
+    </w:lvl>
+    <w:lvl w:ilvl="1" w:tentative="1">
+      <w:start w:val="1"/>
+      <w:numFmt w:val="decimal"/>
+      <w:lvlText w:val="%2."/>
+      <w:lvlJc w:val="left"/>
+      <w:pPr>
+        <w:tabs>
+          <w:tab w:val="num" w:pos="1440"/>
+        </w:tabs>
+        <w:ind w:left="1440" w:hanging="360"/>
+      </w:pPr>
+    </w:lvl>
+    <w:lvl w:ilvl="2" w:tentative="1">
+      <w:start w:val="1"/>
+      <w:numFmt w:val="decimal"/>
+      <w:lvlText w:val="%3."/>
+      <w:lvlJc w:val="left"/>
+      <w:pPr>
+        <w:tabs>
+          <w:tab w:val="num" w:pos="2160"/>
+        </w:tabs>
+        <w:ind w:left="2160" w:hanging="360"/>
+      </w:pPr>
+    </w:lvl>
+    <w:lvl w:ilvl="3" w:tentative="1">
+      <w:start w:val="1"/>
+      <w:numFmt w:val="decimal"/>
+      <w:lvlText w:val="%4."/>
+      <w:lvlJc w:val="left"/>
+      <w:pPr>
+        <w:tabs>
+          <w:tab w:val="num" w:pos="2880"/>
+        </w:tabs>
+        <w:ind w:left="2880" w:hanging="360"/>
+      </w:pPr>
+    </w:lvl>
+    <w:lvl w:ilvl="4" w:tentative="1">
+      <w:start w:val="1"/>
+      <w:numFmt w:val="decimal"/>
+      <w:lvlText w:val="%5."/>
+      <w:lvlJc w:val="left"/>
+      <w:pPr>
+        <w:tabs>
+          <w:tab w:val="num" w:pos="3600"/>
+        </w:tabs>
+        <w:ind w:left="3600" w:hanging="360"/>
+      </w:pPr>
+    </w:lvl>
+    <w:lvl w:ilvl="5" w:tentative="1">
+      <w:start w:val="1"/>
+      <w:numFmt w:val="decimal"/>
+      <w:lvlText w:val="%6."/>
+      <w:lvlJc w:val="left"/>
+      <w:pPr>
+        <w:tabs>
+          <w:tab w:val="num" w:pos="4320"/>
+        </w:tabs>
+        <w:ind w:left="4320" w:hanging="360"/>
+      </w:pPr>
+    </w:lvl>
+    <w:lvl w:ilvl="6" w:tentative="1">
+      <w:start w:val="1"/>
+      <w:numFmt w:val="decimal"/>
+      <w:lvlText w:val="%7."/>
+      <w:lvlJc w:val="left"/>
+      <w:pPr>
+        <w:tabs>
+          <w:tab w:val="num" w:pos="5040"/>
+        </w:tabs>
+        <w:ind w:left="5040" w:hanging="360"/>
+      </w:pPr>
+    </w:lvl>
+    <w:lvl w:ilvl="7" w:tentative="1">
+      <w:start w:val="1"/>
+      <w:numFmt w:val="decimal"/>
+      <w:lvlText w:val="%8."/>
+      <w:lvlJc w:val="left"/>
+      <w:pPr>
+        <w:tabs>
+          <w:tab w:val="num" w:pos="5760"/>
+        </w:tabs>
+        <w:ind w:left="5760" w:hanging="360"/>
+      </w:pPr>
+    </w:lvl>
+    <w:lvl w:ilvl="8" w:tentative="1">
+      <w:start w:val="1"/>
+      <w:numFmt w:val="decimal"/>
+      <w:lvlText w:val="%9."/>
+      <w:lvlJc w:val="left"/>
+      <w:pPr>
+        <w:tabs>
+          <w:tab w:val="num" w:pos="6480"/>
+        </w:tabs>
+        <w:ind w:left="6480" w:hanging="360"/>
+      </w:pPr>
+    </w:lvl>
+  </w:abstractNum>
   <w:abstractNum w:abstractNumId="6" w15:restartNumberingAfterBreak="0">
-    <w:nsid w:val="73C81CB7"/>
+    <w:nsid w:val="6CE85870"/>
     <w:multiLevelType w:val="multilevel"/>
-    <w:tmpl w:val="9BF0E9F2"/>
+    <w:tmpl w:val="1D803FF0"/>
     <w:lvl w:ilvl="0">
       <w:start w:val="1"/>
       <w:numFmt w:val="bullet"/>
@@ -48361,26 +48424,26 @@
       </w:rPr>
     </w:lvl>
   </w:abstractNum>
-  <w:num w:numId="1" w16cid:durableId="1197737578">
+  <w:num w:numId="1" w16cid:durableId="1160997957">
+    <w:abstractNumId w:val="5"/>
+  </w:num>
+  <w:num w:numId="2" w16cid:durableId="560137788">
+    <w:abstractNumId w:val="1"/>
+  </w:num>
+  <w:num w:numId="3" w16cid:durableId="801649953">
+    <w:abstractNumId w:val="4"/>
+  </w:num>
+  <w:num w:numId="4" w16cid:durableId="772289694">
+    <w:abstractNumId w:val="6"/>
+  </w:num>
+  <w:num w:numId="5" w16cid:durableId="1277637296">
+    <w:abstractNumId w:val="3"/>
+  </w:num>
+  <w:num w:numId="6" w16cid:durableId="833498116">
     <w:abstractNumId w:val="0"/>
   </w:num>
-  <w:num w:numId="2" w16cid:durableId="421533471">
-    <w:abstractNumId w:val="1"/>
-  </w:num>
-  <w:num w:numId="3" w16cid:durableId="536478458">
+  <w:num w:numId="7" w16cid:durableId="1742214989">
     <w:abstractNumId w:val="2"/>
-  </w:num>
-  <w:num w:numId="4" w16cid:durableId="1296064667">
-    <w:abstractNumId w:val="6"/>
-  </w:num>
-  <w:num w:numId="5" w16cid:durableId="1809781023">
-    <w:abstractNumId w:val="5"/>
-  </w:num>
-  <w:num w:numId="6" w16cid:durableId="789006729">
-    <w:abstractNumId w:val="3"/>
-  </w:num>
-  <w:num w:numId="7" w16cid:durableId="2019229696">
-    <w:abstractNumId w:val="4"/>
   </w:num>
 </w:numbering>
 </file>
@@ -49137,7 +49200,7 @@
     <w:link w:val="HeaderChar"/>
     <w:uiPriority w:val="99"/>
     <w:unhideWhenUsed/>
-    <w:rsid w:val="00AF0EC4"/>
+    <w:rsid w:val="004B7F4C"/>
     <w:pPr>
       <w:tabs>
         <w:tab w:val="center" w:pos="4680"/>
@@ -49150,7 +49213,7 @@
     <w:basedOn w:val="DefaultParagraphFont"/>
     <w:link w:val="Header"/>
     <w:uiPriority w:val="99"/>
-    <w:rsid w:val="00AF0EC4"/>
+    <w:rsid w:val="004B7F4C"/>
     <w:rPr>
       <w:rFonts w:eastAsiaTheme="minorEastAsia"/>
       <w:sz w:val="24"/>
@@ -49163,7 +49226,7 @@
     <w:link w:val="FooterChar"/>
     <w:uiPriority w:val="99"/>
     <w:unhideWhenUsed/>
-    <w:rsid w:val="00AF0EC4"/>
+    <w:rsid w:val="004B7F4C"/>
     <w:pPr>
       <w:tabs>
         <w:tab w:val="center" w:pos="4680"/>
@@ -49176,7 +49239,7 @@
     <w:basedOn w:val="DefaultParagraphFont"/>
     <w:link w:val="Footer"/>
     <w:uiPriority w:val="99"/>
-    <w:rsid w:val="00AF0EC4"/>
+    <w:rsid w:val="004B7F4C"/>
     <w:rPr>
       <w:rFonts w:eastAsiaTheme="minorEastAsia"/>
       <w:sz w:val="24"/>
@@ -49189,7 +49252,7 @@
     <w:uiPriority w:val="99"/>
     <w:semiHidden/>
     <w:unhideWhenUsed/>
-    <w:rsid w:val="00AF0EC4"/>
+    <w:rsid w:val="004B7F4C"/>
   </w:style>
   <w:style w:type="character" w:styleId="Hyperlink">
     <w:name w:val="Hyperlink"/>
@@ -49197,7 +49260,7 @@
     <w:uiPriority w:val="99"/>
     <w:semiHidden/>
     <w:unhideWhenUsed/>
-    <w:rsid w:val="00AF0EC4"/>
+    <w:rsid w:val="004B7F4C"/>
     <w:rPr>
       <w:color w:val="auto"/>
       <w:u w:val="single"/>
@@ -49210,7 +49273,7 @@
     <w:autoRedefine/>
     <w:uiPriority w:val="39"/>
     <w:unhideWhenUsed/>
-    <w:rsid w:val="00AF0EC4"/>
+    <w:rsid w:val="004B7F4C"/>
     <w:pPr>
       <w:spacing w:after="100" w:line="360" w:lineRule="auto"/>
     </w:pPr>
@@ -49222,7 +49285,7 @@
     <w:autoRedefine/>
     <w:uiPriority w:val="39"/>
     <w:unhideWhenUsed/>
-    <w:rsid w:val="00AF0EC4"/>
+    <w:rsid w:val="004B7F4C"/>
     <w:pPr>
       <w:spacing w:after="100" w:line="360" w:lineRule="auto"/>
       <w:ind w:left="240"/>
@@ -49236,7 +49299,7 @@
     <w:uiPriority w:val="39"/>
     <w:semiHidden/>
     <w:unhideWhenUsed/>
-    <w:rsid w:val="00AF0EC4"/>
+    <w:rsid w:val="004B7F4C"/>
     <w:pPr>
       <w:spacing w:after="100" w:line="360" w:lineRule="auto"/>
       <w:ind w:left="480"/>

</xml_diff>